<commit_message>
feat(docs): added more content, finished docs
</commit_message>
<xml_diff>
--- a/documentation/dokumentacio.docx
+++ b/documentation/dokumentacio.docx
@@ -754,7 +754,7 @@
           <w:r>
             <w:fldChar w:fldCharType="separate"/>
           </w:r>
-          <w:hyperlink w:anchor="_Toc195619115" w:history="1">
+          <w:hyperlink w:anchor="_Toc195648504" w:history="1">
             <w:r>
               <w:rPr>
                 <w:rStyle w:val="Hiperhivatkozs"/>
@@ -800,7 +800,7 @@
                 <w:noProof/>
                 <w:webHidden/>
               </w:rPr>
-              <w:instrText xml:space="preserve"> PAGEREF _Toc195619115 \h </w:instrText>
+              <w:instrText xml:space="preserve"> PAGEREF _Toc195648504 \h </w:instrText>
             </w:r>
             <w:r>
               <w:rPr>
@@ -848,7 +848,7 @@
               <w14:ligatures w14:val="standardContextual"/>
             </w:rPr>
           </w:pPr>
-          <w:hyperlink w:anchor="_Toc195619116" w:history="1">
+          <w:hyperlink w:anchor="_Toc195648505" w:history="1">
             <w:r>
               <w:rPr>
                 <w:rStyle w:val="Hiperhivatkozs"/>
@@ -894,7 +894,7 @@
                 <w:noProof/>
                 <w:webHidden/>
               </w:rPr>
-              <w:instrText xml:space="preserve"> PAGEREF _Toc195619116 \h </w:instrText>
+              <w:instrText xml:space="preserve"> PAGEREF _Toc195648505 \h </w:instrText>
             </w:r>
             <w:r>
               <w:rPr>
@@ -942,7 +942,7 @@
               <w14:ligatures w14:val="standardContextual"/>
             </w:rPr>
           </w:pPr>
-          <w:hyperlink w:anchor="_Toc195619117" w:history="1">
+          <w:hyperlink w:anchor="_Toc195648506" w:history="1">
             <w:r>
               <w:rPr>
                 <w:rStyle w:val="Hiperhivatkozs"/>
@@ -988,7 +988,7 @@
                 <w:noProof/>
                 <w:webHidden/>
               </w:rPr>
-              <w:instrText xml:space="preserve"> PAGEREF _Toc195619117 \h </w:instrText>
+              <w:instrText xml:space="preserve"> PAGEREF _Toc195648506 \h </w:instrText>
             </w:r>
             <w:r>
               <w:rPr>
@@ -1036,7 +1036,7 @@
               <w14:ligatures w14:val="standardContextual"/>
             </w:rPr>
           </w:pPr>
-          <w:hyperlink w:anchor="_Toc195619118" w:history="1">
+          <w:hyperlink w:anchor="_Toc195648507" w:history="1">
             <w:r>
               <w:rPr>
                 <w:rStyle w:val="Hiperhivatkozs"/>
@@ -1082,7 +1082,7 @@
                 <w:noProof/>
                 <w:webHidden/>
               </w:rPr>
-              <w:instrText xml:space="preserve"> PAGEREF _Toc195619118 \h </w:instrText>
+              <w:instrText xml:space="preserve"> PAGEREF _Toc195648507 \h </w:instrText>
             </w:r>
             <w:r>
               <w:rPr>
@@ -1130,7 +1130,7 @@
               <w14:ligatures w14:val="standardContextual"/>
             </w:rPr>
           </w:pPr>
-          <w:hyperlink w:anchor="_Toc195619119" w:history="1">
+          <w:hyperlink w:anchor="_Toc195648508" w:history="1">
             <w:r>
               <w:rPr>
                 <w:rStyle w:val="Hiperhivatkozs"/>
@@ -1176,7 +1176,7 @@
                 <w:noProof/>
                 <w:webHidden/>
               </w:rPr>
-              <w:instrText xml:space="preserve"> PAGEREF _Toc195619119 \h </w:instrText>
+              <w:instrText xml:space="preserve"> PAGEREF _Toc195648508 \h </w:instrText>
             </w:r>
             <w:r>
               <w:rPr>
@@ -1224,7 +1224,7 @@
               <w14:ligatures w14:val="standardContextual"/>
             </w:rPr>
           </w:pPr>
-          <w:hyperlink w:anchor="_Toc195619120" w:history="1">
+          <w:hyperlink w:anchor="_Toc195648509" w:history="1">
             <w:r>
               <w:rPr>
                 <w:rStyle w:val="Hiperhivatkozs"/>
@@ -1270,7 +1270,7 @@
                 <w:noProof/>
                 <w:webHidden/>
               </w:rPr>
-              <w:instrText xml:space="preserve"> PAGEREF _Toc195619120 \h </w:instrText>
+              <w:instrText xml:space="preserve"> PAGEREF _Toc195648509 \h </w:instrText>
             </w:r>
             <w:r>
               <w:rPr>
@@ -1318,7 +1318,7 @@
               <w14:ligatures w14:val="standardContextual"/>
             </w:rPr>
           </w:pPr>
-          <w:hyperlink w:anchor="_Toc195619121" w:history="1">
+          <w:hyperlink w:anchor="_Toc195648510" w:history="1">
             <w:r>
               <w:rPr>
                 <w:rStyle w:val="Hiperhivatkozs"/>
@@ -1364,7 +1364,7 @@
                 <w:noProof/>
                 <w:webHidden/>
               </w:rPr>
-              <w:instrText xml:space="preserve"> PAGEREF _Toc195619121 \h </w:instrText>
+              <w:instrText xml:space="preserve"> PAGEREF _Toc195648510 \h </w:instrText>
             </w:r>
             <w:r>
               <w:rPr>
@@ -1412,7 +1412,7 @@
               <w14:ligatures w14:val="standardContextual"/>
             </w:rPr>
           </w:pPr>
-          <w:hyperlink w:anchor="_Toc195619122" w:history="1">
+          <w:hyperlink w:anchor="_Toc195648511" w:history="1">
             <w:r>
               <w:rPr>
                 <w:rStyle w:val="Hiperhivatkozs"/>
@@ -1466,7 +1466,7 @@
                 <w:noProof/>
                 <w:webHidden/>
               </w:rPr>
-              <w:instrText xml:space="preserve"> PAGEREF _Toc195619122 \h </w:instrText>
+              <w:instrText xml:space="preserve"> PAGEREF _Toc195648511 \h </w:instrText>
             </w:r>
             <w:r>
               <w:rPr>
@@ -1514,7 +1514,7 @@
               <w14:ligatures w14:val="standardContextual"/>
             </w:rPr>
           </w:pPr>
-          <w:hyperlink w:anchor="_Toc195619123" w:history="1">
+          <w:hyperlink w:anchor="_Toc195648512" w:history="1">
             <w:r>
               <w:rPr>
                 <w:rStyle w:val="Hiperhivatkozs"/>
@@ -1560,7 +1560,7 @@
                 <w:noProof/>
                 <w:webHidden/>
               </w:rPr>
-              <w:instrText xml:space="preserve"> PAGEREF _Toc195619123 \h </w:instrText>
+              <w:instrText xml:space="preserve"> PAGEREF _Toc195648512 \h </w:instrText>
             </w:r>
             <w:r>
               <w:rPr>
@@ -1608,7 +1608,7 @@
               <w14:ligatures w14:val="standardContextual"/>
             </w:rPr>
           </w:pPr>
-          <w:hyperlink w:anchor="_Toc195619124" w:history="1">
+          <w:hyperlink w:anchor="_Toc195648513" w:history="1">
             <w:r>
               <w:rPr>
                 <w:rStyle w:val="Hiperhivatkozs"/>
@@ -1654,7 +1654,7 @@
                 <w:noProof/>
                 <w:webHidden/>
               </w:rPr>
-              <w:instrText xml:space="preserve"> PAGEREF _Toc195619124 \h </w:instrText>
+              <w:instrText xml:space="preserve"> PAGEREF _Toc195648513 \h </w:instrText>
             </w:r>
             <w:r>
               <w:rPr>
@@ -1702,7 +1702,7 @@
               <w14:ligatures w14:val="standardContextual"/>
             </w:rPr>
           </w:pPr>
-          <w:hyperlink w:anchor="_Toc195619125" w:history="1">
+          <w:hyperlink w:anchor="_Toc195648514" w:history="1">
             <w:r>
               <w:rPr>
                 <w:rStyle w:val="Hiperhivatkozs"/>
@@ -1750,7 +1750,7 @@
                 <w:noProof/>
                 <w:webHidden/>
               </w:rPr>
-              <w:instrText xml:space="preserve"> PAGEREF _Toc195619125 \h </w:instrText>
+              <w:instrText xml:space="preserve"> PAGEREF _Toc195648514 \h </w:instrText>
             </w:r>
             <w:r>
               <w:rPr>
@@ -1798,7 +1798,7 @@
               <w14:ligatures w14:val="standardContextual"/>
             </w:rPr>
           </w:pPr>
-          <w:hyperlink w:anchor="_Toc195619126" w:history="1">
+          <w:hyperlink w:anchor="_Toc195648515" w:history="1">
             <w:r>
               <w:rPr>
                 <w:rStyle w:val="Hiperhivatkozs"/>
@@ -1846,7 +1846,7 @@
                 <w:noProof/>
                 <w:webHidden/>
               </w:rPr>
-              <w:instrText xml:space="preserve"> PAGEREF _Toc195619126 \h </w:instrText>
+              <w:instrText xml:space="preserve"> PAGEREF _Toc195648515 \h </w:instrText>
             </w:r>
             <w:r>
               <w:rPr>
@@ -1894,7 +1894,7 @@
               <w14:ligatures w14:val="standardContextual"/>
             </w:rPr>
           </w:pPr>
-          <w:hyperlink w:anchor="_Toc195619127" w:history="1">
+          <w:hyperlink w:anchor="_Toc195648516" w:history="1">
             <w:r>
               <w:rPr>
                 <w:rStyle w:val="Hiperhivatkozs"/>
@@ -1942,7 +1942,7 @@
                 <w:noProof/>
                 <w:webHidden/>
               </w:rPr>
-              <w:instrText xml:space="preserve"> PAGEREF _Toc195619127 \h </w:instrText>
+              <w:instrText xml:space="preserve"> PAGEREF _Toc195648516 \h </w:instrText>
             </w:r>
             <w:r>
               <w:rPr>
@@ -1990,7 +1990,7 @@
               <w14:ligatures w14:val="standardContextual"/>
             </w:rPr>
           </w:pPr>
-          <w:hyperlink w:anchor="_Toc195619128" w:history="1">
+          <w:hyperlink w:anchor="_Toc195648517" w:history="1">
             <w:r>
               <w:rPr>
                 <w:rStyle w:val="Hiperhivatkozs"/>
@@ -2036,7 +2036,7 @@
                 <w:noProof/>
                 <w:webHidden/>
               </w:rPr>
-              <w:instrText xml:space="preserve"> PAGEREF _Toc195619128 \h </w:instrText>
+              <w:instrText xml:space="preserve"> PAGEREF _Toc195648517 \h </w:instrText>
             </w:r>
             <w:r>
               <w:rPr>
@@ -2084,7 +2084,7 @@
               <w14:ligatures w14:val="standardContextual"/>
             </w:rPr>
           </w:pPr>
-          <w:hyperlink w:anchor="_Toc195619129" w:history="1">
+          <w:hyperlink w:anchor="_Toc195648518" w:history="1">
             <w:r>
               <w:rPr>
                 <w:rStyle w:val="Hiperhivatkozs"/>
@@ -2130,7 +2130,7 @@
                 <w:noProof/>
                 <w:webHidden/>
               </w:rPr>
-              <w:instrText xml:space="preserve"> PAGEREF _Toc195619129 \h </w:instrText>
+              <w:instrText xml:space="preserve"> PAGEREF _Toc195648518 \h </w:instrText>
             </w:r>
             <w:r>
               <w:rPr>
@@ -2178,7 +2178,7 @@
               <w14:ligatures w14:val="standardContextual"/>
             </w:rPr>
           </w:pPr>
-          <w:hyperlink w:anchor="_Toc195619130" w:history="1">
+          <w:hyperlink w:anchor="_Toc195648519" w:history="1">
             <w:r>
               <w:rPr>
                 <w:rStyle w:val="Hiperhivatkozs"/>
@@ -2224,7 +2224,7 @@
                 <w:noProof/>
                 <w:webHidden/>
               </w:rPr>
-              <w:instrText xml:space="preserve"> PAGEREF _Toc195619130 \h </w:instrText>
+              <w:instrText xml:space="preserve"> PAGEREF _Toc195648519 \h </w:instrText>
             </w:r>
             <w:r>
               <w:rPr>
@@ -2272,7 +2272,7 @@
               <w14:ligatures w14:val="standardContextual"/>
             </w:rPr>
           </w:pPr>
-          <w:hyperlink w:anchor="_Toc195619131" w:history="1">
+          <w:hyperlink w:anchor="_Toc195648520" w:history="1">
             <w:r>
               <w:rPr>
                 <w:rStyle w:val="Hiperhivatkozs"/>
@@ -2318,7 +2318,7 @@
                 <w:noProof/>
                 <w:webHidden/>
               </w:rPr>
-              <w:instrText xml:space="preserve"> PAGEREF _Toc195619131 \h </w:instrText>
+              <w:instrText xml:space="preserve"> PAGEREF _Toc195648520 \h </w:instrText>
             </w:r>
             <w:r>
               <w:rPr>
@@ -2366,7 +2366,7 @@
               <w14:ligatures w14:val="standardContextual"/>
             </w:rPr>
           </w:pPr>
-          <w:hyperlink w:anchor="_Toc195619132" w:history="1">
+          <w:hyperlink w:anchor="_Toc195648521" w:history="1">
             <w:r>
               <w:rPr>
                 <w:rStyle w:val="Hiperhivatkozs"/>
@@ -2412,7 +2412,7 @@
                 <w:noProof/>
                 <w:webHidden/>
               </w:rPr>
-              <w:instrText xml:space="preserve"> PAGEREF _Toc195619132 \h </w:instrText>
+              <w:instrText xml:space="preserve"> PAGEREF _Toc195648521 \h </w:instrText>
             </w:r>
             <w:r>
               <w:rPr>
@@ -2460,7 +2460,7 @@
               <w14:ligatures w14:val="standardContextual"/>
             </w:rPr>
           </w:pPr>
-          <w:hyperlink w:anchor="_Toc195619133" w:history="1">
+          <w:hyperlink w:anchor="_Toc195648522" w:history="1">
             <w:r>
               <w:rPr>
                 <w:rStyle w:val="Hiperhivatkozs"/>
@@ -2506,7 +2506,7 @@
                 <w:noProof/>
                 <w:webHidden/>
               </w:rPr>
-              <w:instrText xml:space="preserve"> PAGEREF _Toc195619133 \h </w:instrText>
+              <w:instrText xml:space="preserve"> PAGEREF _Toc195648522 \h </w:instrText>
             </w:r>
             <w:r>
               <w:rPr>
@@ -2554,7 +2554,7 @@
               <w14:ligatures w14:val="standardContextual"/>
             </w:rPr>
           </w:pPr>
-          <w:hyperlink w:anchor="_Toc195619134" w:history="1">
+          <w:hyperlink w:anchor="_Toc195648523" w:history="1">
             <w:r>
               <w:rPr>
                 <w:rStyle w:val="Hiperhivatkozs"/>
@@ -2600,7 +2600,7 @@
                 <w:noProof/>
                 <w:webHidden/>
               </w:rPr>
-              <w:instrText xml:space="preserve"> PAGEREF _Toc195619134 \h </w:instrText>
+              <w:instrText xml:space="preserve"> PAGEREF _Toc195648523 \h </w:instrText>
             </w:r>
             <w:r>
               <w:rPr>
@@ -2648,7 +2648,7 @@
               <w14:ligatures w14:val="standardContextual"/>
             </w:rPr>
           </w:pPr>
-          <w:hyperlink w:anchor="_Toc195619135" w:history="1">
+          <w:hyperlink w:anchor="_Toc195648524" w:history="1">
             <w:r>
               <w:rPr>
                 <w:rStyle w:val="Hiperhivatkozs"/>
@@ -2694,7 +2694,289 @@
                 <w:noProof/>
                 <w:webHidden/>
               </w:rPr>
-              <w:instrText xml:space="preserve"> PAGEREF _Toc195619135 \h </w:instrText>
+              <w:instrText xml:space="preserve"> PAGEREF _Toc195648524 \h </w:instrText>
+            </w:r>
+            <w:r>
+              <w:rPr>
+                <w:noProof/>
+                <w:webHidden/>
+              </w:rPr>
+            </w:r>
+            <w:r>
+              <w:rPr>
+                <w:noProof/>
+                <w:webHidden/>
+              </w:rPr>
+              <w:fldChar w:fldCharType="separate"/>
+            </w:r>
+            <w:r>
+              <w:rPr>
+                <w:noProof/>
+                <w:webHidden/>
+              </w:rPr>
+              <w:t>25</w:t>
+            </w:r>
+            <w:r>
+              <w:rPr>
+                <w:noProof/>
+                <w:webHidden/>
+              </w:rPr>
+              <w:fldChar w:fldCharType="end"/>
+            </w:r>
+          </w:hyperlink>
+        </w:p>
+        <w:p>
+          <w:pPr>
+            <w:pStyle w:val="TJ2"/>
+            <w:tabs>
+              <w:tab w:val="left" w:pos="960"/>
+              <w:tab w:val="right" w:leader="dot" w:pos="9062"/>
+            </w:tabs>
+            <w:rPr>
+              <w:rFonts w:eastAsiaTheme="minorEastAsia"/>
+              <w:noProof/>
+              <w:kern w:val="2"/>
+              <w:sz w:val="24"/>
+              <w:szCs w:val="24"/>
+              <w:lang w:eastAsia="hu-HU"/>
+              <w14:ligatures w14:val="standardContextual"/>
+            </w:rPr>
+          </w:pPr>
+          <w:hyperlink w:anchor="_Toc195648525" w:history="1">
+            <w:r>
+              <w:rPr>
+                <w:rStyle w:val="Hiperhivatkozs"/>
+                <w:noProof/>
+              </w:rPr>
+              <w:t>4.1.</w:t>
+            </w:r>
+            <w:r>
+              <w:rPr>
+                <w:rFonts w:eastAsiaTheme="minorEastAsia"/>
+                <w:noProof/>
+                <w:kern w:val="2"/>
+                <w:sz w:val="24"/>
+                <w:szCs w:val="24"/>
+                <w:lang w:eastAsia="hu-HU"/>
+                <w14:ligatures w14:val="standardContextual"/>
+              </w:rPr>
+              <w:tab/>
+            </w:r>
+            <w:r>
+              <w:rPr>
+                <w:rStyle w:val="Hiperhivatkozs"/>
+                <w:noProof/>
+              </w:rPr>
+              <w:t>Napi/Heti kihívások</w:t>
+            </w:r>
+            <w:r>
+              <w:rPr>
+                <w:noProof/>
+                <w:webHidden/>
+              </w:rPr>
+              <w:tab/>
+            </w:r>
+            <w:r>
+              <w:rPr>
+                <w:noProof/>
+                <w:webHidden/>
+              </w:rPr>
+              <w:fldChar w:fldCharType="begin"/>
+            </w:r>
+            <w:r>
+              <w:rPr>
+                <w:noProof/>
+                <w:webHidden/>
+              </w:rPr>
+              <w:instrText xml:space="preserve"> PAGEREF _Toc195648525 \h </w:instrText>
+            </w:r>
+            <w:r>
+              <w:rPr>
+                <w:noProof/>
+                <w:webHidden/>
+              </w:rPr>
+            </w:r>
+            <w:r>
+              <w:rPr>
+                <w:noProof/>
+                <w:webHidden/>
+              </w:rPr>
+              <w:fldChar w:fldCharType="separate"/>
+            </w:r>
+            <w:r>
+              <w:rPr>
+                <w:noProof/>
+                <w:webHidden/>
+              </w:rPr>
+              <w:t>25</w:t>
+            </w:r>
+            <w:r>
+              <w:rPr>
+                <w:noProof/>
+                <w:webHidden/>
+              </w:rPr>
+              <w:fldChar w:fldCharType="end"/>
+            </w:r>
+          </w:hyperlink>
+        </w:p>
+        <w:p>
+          <w:pPr>
+            <w:pStyle w:val="TJ2"/>
+            <w:tabs>
+              <w:tab w:val="left" w:pos="960"/>
+              <w:tab w:val="right" w:leader="dot" w:pos="9062"/>
+            </w:tabs>
+            <w:rPr>
+              <w:rFonts w:eastAsiaTheme="minorEastAsia"/>
+              <w:noProof/>
+              <w:kern w:val="2"/>
+              <w:sz w:val="24"/>
+              <w:szCs w:val="24"/>
+              <w:lang w:eastAsia="hu-HU"/>
+              <w14:ligatures w14:val="standardContextual"/>
+            </w:rPr>
+          </w:pPr>
+          <w:hyperlink w:anchor="_Toc195648526" w:history="1">
+            <w:r>
+              <w:rPr>
+                <w:rStyle w:val="Hiperhivatkozs"/>
+                <w:noProof/>
+              </w:rPr>
+              <w:t>4.2.</w:t>
+            </w:r>
+            <w:r>
+              <w:rPr>
+                <w:rFonts w:eastAsiaTheme="minorEastAsia"/>
+                <w:noProof/>
+                <w:kern w:val="2"/>
+                <w:sz w:val="24"/>
+                <w:szCs w:val="24"/>
+                <w:lang w:eastAsia="hu-HU"/>
+                <w14:ligatures w14:val="standardContextual"/>
+              </w:rPr>
+              <w:tab/>
+            </w:r>
+            <w:r>
+              <w:rPr>
+                <w:rStyle w:val="Hiperhivatkozs"/>
+                <w:noProof/>
+              </w:rPr>
+              <w:t>Közöségi funkciók</w:t>
+            </w:r>
+            <w:r>
+              <w:rPr>
+                <w:noProof/>
+                <w:webHidden/>
+              </w:rPr>
+              <w:tab/>
+            </w:r>
+            <w:r>
+              <w:rPr>
+                <w:noProof/>
+                <w:webHidden/>
+              </w:rPr>
+              <w:fldChar w:fldCharType="begin"/>
+            </w:r>
+            <w:r>
+              <w:rPr>
+                <w:noProof/>
+                <w:webHidden/>
+              </w:rPr>
+              <w:instrText xml:space="preserve"> PAGEREF _Toc195648526 \h </w:instrText>
+            </w:r>
+            <w:r>
+              <w:rPr>
+                <w:noProof/>
+                <w:webHidden/>
+              </w:rPr>
+            </w:r>
+            <w:r>
+              <w:rPr>
+                <w:noProof/>
+                <w:webHidden/>
+              </w:rPr>
+              <w:fldChar w:fldCharType="separate"/>
+            </w:r>
+            <w:r>
+              <w:rPr>
+                <w:noProof/>
+                <w:webHidden/>
+              </w:rPr>
+              <w:t>25</w:t>
+            </w:r>
+            <w:r>
+              <w:rPr>
+                <w:noProof/>
+                <w:webHidden/>
+              </w:rPr>
+              <w:fldChar w:fldCharType="end"/>
+            </w:r>
+          </w:hyperlink>
+        </w:p>
+        <w:p>
+          <w:pPr>
+            <w:pStyle w:val="TJ2"/>
+            <w:tabs>
+              <w:tab w:val="left" w:pos="960"/>
+              <w:tab w:val="right" w:leader="dot" w:pos="9062"/>
+            </w:tabs>
+            <w:rPr>
+              <w:rFonts w:eastAsiaTheme="minorEastAsia"/>
+              <w:noProof/>
+              <w:kern w:val="2"/>
+              <w:sz w:val="24"/>
+              <w:szCs w:val="24"/>
+              <w:lang w:eastAsia="hu-HU"/>
+              <w14:ligatures w14:val="standardContextual"/>
+            </w:rPr>
+          </w:pPr>
+          <w:hyperlink w:anchor="_Toc195648527" w:history="1">
+            <w:r>
+              <w:rPr>
+                <w:rStyle w:val="Hiperhivatkozs"/>
+                <w:noProof/>
+              </w:rPr>
+              <w:t>4.3.</w:t>
+            </w:r>
+            <w:r>
+              <w:rPr>
+                <w:rFonts w:eastAsiaTheme="minorEastAsia"/>
+                <w:noProof/>
+                <w:kern w:val="2"/>
+                <w:sz w:val="24"/>
+                <w:szCs w:val="24"/>
+                <w:lang w:eastAsia="hu-HU"/>
+                <w14:ligatures w14:val="standardContextual"/>
+              </w:rPr>
+              <w:tab/>
+            </w:r>
+            <w:r>
+              <w:rPr>
+                <w:rStyle w:val="Hiperhivatkozs"/>
+                <w:noProof/>
+              </w:rPr>
+              <w:t>Mobilapp</w:t>
+            </w:r>
+            <w:r>
+              <w:rPr>
+                <w:noProof/>
+                <w:webHidden/>
+              </w:rPr>
+              <w:tab/>
+            </w:r>
+            <w:r>
+              <w:rPr>
+                <w:noProof/>
+                <w:webHidden/>
+              </w:rPr>
+              <w:fldChar w:fldCharType="begin"/>
+            </w:r>
+            <w:r>
+              <w:rPr>
+                <w:noProof/>
+                <w:webHidden/>
+              </w:rPr>
+              <w:instrText xml:space="preserve"> PAGEREF _Toc195648527 \h </w:instrText>
             </w:r>
             <w:r>
               <w:rPr>
@@ -2757,7 +3039,7 @@
           <w:numId w:val="4"/>
         </w:numPr>
       </w:pPr>
-      <w:bookmarkStart w:id="0" w:name="_Toc195619115"/>
+      <w:bookmarkStart w:id="0" w:name="_Toc195648504"/>
       <w:r>
         <w:lastRenderedPageBreak/>
         <w:t>Bevezetés, megismerkedés a projekttel</w:t>
@@ -2923,7 +3205,7 @@
           <w:numId w:val="4"/>
         </w:numPr>
       </w:pPr>
-      <w:bookmarkStart w:id="1" w:name="_Toc195619116"/>
+      <w:bookmarkStart w:id="1" w:name="_Toc195648505"/>
       <w:r>
         <w:lastRenderedPageBreak/>
         <w:t>Fejlesztői dokumentáció</w:t>
@@ -2941,7 +3223,7 @@
       <w:r>
         <w:t xml:space="preserve"> </w:t>
       </w:r>
-      <w:bookmarkStart w:id="2" w:name="_Toc195619117"/>
+      <w:bookmarkStart w:id="2" w:name="_Toc195648506"/>
       <w:r>
         <w:t>Alkalmazott fejlesztői eszközök</w:t>
       </w:r>
@@ -3129,7 +3411,7 @@
       <w:r>
         <w:t xml:space="preserve"> </w:t>
       </w:r>
-      <w:bookmarkStart w:id="3" w:name="_Toc195619118"/>
+      <w:bookmarkStart w:id="3" w:name="_Toc195648507"/>
       <w:r>
         <w:t>Alkalmazott technológiák</w:t>
       </w:r>
@@ -3379,7 +3661,7 @@
       <w:r>
         <w:t xml:space="preserve"> </w:t>
       </w:r>
-      <w:bookmarkStart w:id="4" w:name="_Toc195619119"/>
+      <w:bookmarkStart w:id="4" w:name="_Toc195648508"/>
       <w:r>
         <w:t>Futtatási környezet</w:t>
       </w:r>
@@ -3401,7 +3683,7 @@
       <w:r>
         <w:t xml:space="preserve"> </w:t>
       </w:r>
-      <w:bookmarkStart w:id="5" w:name="_Toc195619120"/>
+      <w:bookmarkStart w:id="5" w:name="_Toc195648509"/>
       <w:r>
         <w:t>Fejlesztői ütemterv</w:t>
       </w:r>
@@ -3830,7 +4112,7 @@
       <w:r>
         <w:t xml:space="preserve"> </w:t>
       </w:r>
-      <w:bookmarkStart w:id="6" w:name="_Toc195619121"/>
+      <w:bookmarkStart w:id="6" w:name="_Toc195648510"/>
       <w:r>
         <w:t>Fejlesztés menete</w:t>
       </w:r>
@@ -3940,28 +4222,15 @@
       <w:pPr>
         <w:pStyle w:val="Kpalrs"/>
       </w:pPr>
-      <w:r>
-        <w:fldChar w:fldCharType="begin"/>
-      </w:r>
-      <w:r>
-        <w:instrText xml:space="preserve"> SEQ ábra \* ARABIC </w:instrText>
-      </w:r>
-      <w:r>
-        <w:fldChar w:fldCharType="separate"/>
-      </w:r>
-      <w:bookmarkStart w:id="7" w:name="_Toc195619188"/>
-      <w:r>
-        <w:rPr>
-          <w:noProof/>
-        </w:rPr>
-        <w:t>1</w:t>
-      </w:r>
-      <w:r>
-        <w:rPr>
-          <w:noProof/>
-        </w:rPr>
-        <w:fldChar w:fldCharType="end"/>
-      </w:r>
+      <w:fldSimple w:instr=" SEQ ábra \* ARABIC ">
+        <w:bookmarkStart w:id="7" w:name="_Toc195648528"/>
+        <w:r>
+          <w:rPr>
+            <w:noProof/>
+          </w:rPr>
+          <w:t>1</w:t>
+        </w:r>
+      </w:fldSimple>
       <w:r>
         <w:t xml:space="preserve">. ábra - A </w:t>
       </w:r>
@@ -4022,7 +4291,7 @@
         <w:lastRenderedPageBreak/>
         <w:t xml:space="preserve"> </w:t>
       </w:r>
-      <w:bookmarkStart w:id="8" w:name="_Toc195619122"/>
+      <w:bookmarkStart w:id="8" w:name="_Toc195648511"/>
       <w:r>
         <w:t>Webes projekt szerkezete</w:t>
       </w:r>
@@ -4398,28 +4667,15 @@
       <w:pPr>
         <w:pStyle w:val="Kpalrs"/>
       </w:pPr>
-      <w:r>
-        <w:fldChar w:fldCharType="begin"/>
-      </w:r>
-      <w:r>
-        <w:instrText xml:space="preserve"> SEQ ábra \* ARABIC </w:instrText>
-      </w:r>
-      <w:r>
-        <w:fldChar w:fldCharType="separate"/>
-      </w:r>
-      <w:bookmarkStart w:id="9" w:name="_Toc195619189"/>
-      <w:r>
-        <w:rPr>
-          <w:noProof/>
-        </w:rPr>
-        <w:t>2</w:t>
-      </w:r>
-      <w:r>
-        <w:rPr>
-          <w:noProof/>
-        </w:rPr>
-        <w:fldChar w:fldCharType="end"/>
-      </w:r>
+      <w:fldSimple w:instr=" SEQ ábra \* ARABIC ">
+        <w:bookmarkStart w:id="9" w:name="_Toc195648529"/>
+        <w:r>
+          <w:rPr>
+            <w:noProof/>
+          </w:rPr>
+          <w:t>2</w:t>
+        </w:r>
+      </w:fldSimple>
       <w:r>
         <w:t>. ábra - Web struktúrája, felépítése</w:t>
       </w:r>
@@ -4482,28 +4738,15 @@
           <w:docGrid w:linePitch="360"/>
         </w:sectPr>
       </w:pPr>
-      <w:r>
-        <w:fldChar w:fldCharType="begin"/>
-      </w:r>
-      <w:r>
-        <w:instrText xml:space="preserve"> SEQ ábra \* ARABIC </w:instrText>
-      </w:r>
-      <w:r>
-        <w:fldChar w:fldCharType="separate"/>
-      </w:r>
-      <w:bookmarkStart w:id="10" w:name="_Toc195619190"/>
-      <w:r>
-        <w:rPr>
-          <w:noProof/>
-        </w:rPr>
-        <w:t>3</w:t>
-      </w:r>
-      <w:r>
-        <w:rPr>
-          <w:noProof/>
-        </w:rPr>
-        <w:fldChar w:fldCharType="end"/>
-      </w:r>
+      <w:fldSimple w:instr=" SEQ ábra \* ARABIC ">
+        <w:bookmarkStart w:id="10" w:name="_Toc195648530"/>
+        <w:r>
+          <w:rPr>
+            <w:noProof/>
+          </w:rPr>
+          <w:t>3</w:t>
+        </w:r>
+      </w:fldSimple>
       <w:r>
         <w:t>. ábra - Az adatbázis meghívásához használt k</w:t>
       </w:r>
@@ -4524,7 +4767,7 @@
         <w:lastRenderedPageBreak/>
         <w:t xml:space="preserve"> </w:t>
       </w:r>
-      <w:bookmarkStart w:id="11" w:name="_Toc195619123"/>
+      <w:bookmarkStart w:id="11" w:name="_Toc195648512"/>
       <w:r>
         <w:t>Adatbáziskezelés és ORM (Objektum-relációs leképezés)</w:t>
       </w:r>
@@ -4801,7 +5044,7 @@
                               </w:rPr>
                               <w:fldChar w:fldCharType="separate"/>
                             </w:r>
-                            <w:bookmarkStart w:id="12" w:name="_Toc195619191"/>
+                            <w:bookmarkStart w:id="12" w:name="_Toc195648531"/>
                             <w:r>
                               <w:rPr>
                                 <w:noProof/>
@@ -4880,7 +5123,7 @@
                         </w:rPr>
                         <w:fldChar w:fldCharType="separate"/>
                       </w:r>
-                      <w:bookmarkStart w:id="13" w:name="_Toc195619191"/>
+                      <w:bookmarkStart w:id="13" w:name="_Toc195648531"/>
                       <w:r>
                         <w:rPr>
                           <w:noProof/>
@@ -5084,7 +5327,7 @@
                               </w:rPr>
                               <w:fldChar w:fldCharType="separate"/>
                             </w:r>
-                            <w:bookmarkStart w:id="14" w:name="_Toc195619192"/>
+                            <w:bookmarkStart w:id="14" w:name="_Toc195648532"/>
                             <w:r>
                               <w:rPr>
                                 <w:noProof/>
@@ -5166,7 +5409,7 @@
                         </w:rPr>
                         <w:fldChar w:fldCharType="separate"/>
                       </w:r>
-                      <w:bookmarkStart w:id="15" w:name="_Toc195619192"/>
+                      <w:bookmarkStart w:id="15" w:name="_Toc195648532"/>
                       <w:r>
                         <w:rPr>
                           <w:noProof/>
@@ -5343,7 +5586,7 @@
                               </w:rPr>
                               <w:fldChar w:fldCharType="separate"/>
                             </w:r>
-                            <w:bookmarkStart w:id="16" w:name="_Toc195619193"/>
+                            <w:bookmarkStart w:id="16" w:name="_Toc195648533"/>
                             <w:r>
                               <w:rPr>
                                 <w:noProof/>
@@ -5405,7 +5648,7 @@
                         </w:rPr>
                         <w:fldChar w:fldCharType="separate"/>
                       </w:r>
-                      <w:bookmarkStart w:id="17" w:name="_Toc195619193"/>
+                      <w:bookmarkStart w:id="17" w:name="_Toc195648533"/>
                       <w:r>
                         <w:rPr>
                           <w:noProof/>
@@ -5520,7 +5763,7 @@
       <w:r>
         <w:t xml:space="preserve"> </w:t>
       </w:r>
-      <w:bookmarkStart w:id="18" w:name="_Toc195619124"/>
+      <w:bookmarkStart w:id="18" w:name="_Toc195648513"/>
       <w:r>
         <w:t>Főbb algoritmusok</w:t>
       </w:r>
@@ -5544,7 +5787,7 @@
         </w:rPr>
         <w:t xml:space="preserve"> </w:t>
       </w:r>
-      <w:bookmarkStart w:id="19" w:name="_Toc195619125"/>
+      <w:bookmarkStart w:id="19" w:name="_Toc195648514"/>
       <w:r>
         <w:rPr>
           <w:bCs/>
@@ -5662,28 +5905,15 @@
       <w:pPr>
         <w:pStyle w:val="Kpalrs"/>
       </w:pPr>
-      <w:r>
-        <w:fldChar w:fldCharType="begin"/>
-      </w:r>
-      <w:r>
-        <w:instrText xml:space="preserve"> SEQ ábra \* ARABIC </w:instrText>
-      </w:r>
-      <w:r>
-        <w:fldChar w:fldCharType="separate"/>
-      </w:r>
-      <w:bookmarkStart w:id="20" w:name="_Toc195619194"/>
-      <w:r>
-        <w:rPr>
-          <w:noProof/>
-        </w:rPr>
-        <w:t>7</w:t>
-      </w:r>
-      <w:r>
-        <w:rPr>
-          <w:noProof/>
-        </w:rPr>
-        <w:fldChar w:fldCharType="end"/>
-      </w:r>
+      <w:fldSimple w:instr=" SEQ ábra \* ARABIC ">
+        <w:bookmarkStart w:id="20" w:name="_Toc195648534"/>
+        <w:r>
+          <w:rPr>
+            <w:noProof/>
+          </w:rPr>
+          <w:t>7</w:t>
+        </w:r>
+      </w:fldSimple>
       <w:r>
         <w:t>. ábra - A sötét / világos téma algoritmusa</w:t>
       </w:r>
@@ -5703,7 +5933,7 @@
           <w:bCs/>
         </w:rPr>
       </w:pPr>
-      <w:bookmarkStart w:id="21" w:name="_Toc195619126"/>
+      <w:bookmarkStart w:id="21" w:name="_Toc195648515"/>
       <w:r>
         <w:rPr>
           <w:bCs/>
@@ -5926,7 +6156,7 @@
                               </w:rPr>
                               <w:fldChar w:fldCharType="separate"/>
                             </w:r>
-                            <w:bookmarkStart w:id="22" w:name="_Toc195619195"/>
+                            <w:bookmarkStart w:id="22" w:name="_Toc195648535"/>
                             <w:r>
                               <w:rPr>
                                 <w:rFonts w:ascii="Calibri" w:hAnsi="Calibri" w:cs="Calibri"/>
@@ -5996,7 +6226,7 @@
                         </w:rPr>
                         <w:fldChar w:fldCharType="separate"/>
                       </w:r>
-                      <w:bookmarkStart w:id="23" w:name="_Toc195619195"/>
+                      <w:bookmarkStart w:id="23" w:name="_Toc195648535"/>
                       <w:r>
                         <w:rPr>
                           <w:rFonts w:ascii="Calibri" w:hAnsi="Calibri" w:cs="Calibri"/>
@@ -6096,28 +6326,15 @@
       <w:pPr>
         <w:pStyle w:val="Kpalrs"/>
       </w:pPr>
-      <w:r>
-        <w:fldChar w:fldCharType="begin"/>
-      </w:r>
-      <w:r>
-        <w:instrText xml:space="preserve"> SEQ ábra \* ARABIC </w:instrText>
-      </w:r>
-      <w:r>
-        <w:fldChar w:fldCharType="separate"/>
-      </w:r>
-      <w:bookmarkStart w:id="24" w:name="_Toc195619196"/>
-      <w:r>
-        <w:rPr>
-          <w:noProof/>
-        </w:rPr>
-        <w:t>9</w:t>
-      </w:r>
-      <w:r>
-        <w:rPr>
-          <w:noProof/>
-        </w:rPr>
-        <w:fldChar w:fldCharType="end"/>
-      </w:r>
+      <w:fldSimple w:instr=" SEQ ábra \* ARABIC ">
+        <w:bookmarkStart w:id="24" w:name="_Toc195648536"/>
+        <w:r>
+          <w:rPr>
+            <w:noProof/>
+          </w:rPr>
+          <w:t>9</w:t>
+        </w:r>
+      </w:fldSimple>
       <w:r>
         <w:t>. ábra - átalakítás a megfelelő formátumra</w:t>
       </w:r>
@@ -6173,7 +6390,7 @@
         <w:lastRenderedPageBreak/>
         <w:t xml:space="preserve">  </w:t>
       </w:r>
-      <w:bookmarkStart w:id="25" w:name="_Toc195619127"/>
+      <w:bookmarkStart w:id="25" w:name="_Toc195648516"/>
       <w:r>
         <w:rPr>
           <w:bCs/>
@@ -6447,28 +6664,15 @@
       <w:pPr>
         <w:pStyle w:val="Kpalrs"/>
       </w:pPr>
-      <w:r>
-        <w:fldChar w:fldCharType="begin"/>
-      </w:r>
-      <w:r>
-        <w:instrText xml:space="preserve"> SEQ ábra \* ARABIC </w:instrText>
-      </w:r>
-      <w:r>
-        <w:fldChar w:fldCharType="separate"/>
-      </w:r>
-      <w:bookmarkStart w:id="26" w:name="_Toc195619197"/>
-      <w:r>
-        <w:rPr>
-          <w:noProof/>
-        </w:rPr>
-        <w:t>10</w:t>
-      </w:r>
-      <w:r>
-        <w:rPr>
-          <w:noProof/>
-        </w:rPr>
-        <w:fldChar w:fldCharType="end"/>
-      </w:r>
+      <w:fldSimple w:instr=" SEQ ábra \* ARABIC ">
+        <w:bookmarkStart w:id="26" w:name="_Toc195648537"/>
+        <w:r>
+          <w:rPr>
+            <w:noProof/>
+          </w:rPr>
+          <w:t>10</w:t>
+        </w:r>
+      </w:fldSimple>
       <w:r>
         <w:t>. ábra - Kvíz lejátszásának valós idejű algoritmusa</w:t>
       </w:r>
@@ -6486,7 +6690,7 @@
         <w:lastRenderedPageBreak/>
         <w:t xml:space="preserve"> </w:t>
       </w:r>
-      <w:bookmarkStart w:id="27" w:name="_Toc195619128"/>
+      <w:bookmarkStart w:id="27" w:name="_Toc195648517"/>
       <w:r>
         <w:t>Az asztali alkalmazás felépítése, működése</w:t>
       </w:r>
@@ -6613,25 +6817,15 @@
       <w:pPr>
         <w:pStyle w:val="Kpalrs"/>
       </w:pPr>
-      <w:r>
-        <w:fldChar w:fldCharType="begin"/>
-      </w:r>
-      <w:r>
-        <w:instrText xml:space="preserve"> SEQ ábra \* ARABIC </w:instrText>
-      </w:r>
-      <w:r>
-        <w:fldChar w:fldCharType="separate"/>
-      </w:r>
-      <w:bookmarkStart w:id="28" w:name="_Toc195619198"/>
-      <w:r>
-        <w:rPr>
-          <w:noProof/>
-        </w:rPr>
-        <w:t>11</w:t>
-      </w:r>
-      <w:r>
-        <w:fldChar w:fldCharType="end"/>
-      </w:r>
+      <w:fldSimple w:instr=" SEQ ábra \* ARABIC ">
+        <w:bookmarkStart w:id="28" w:name="_Toc195648538"/>
+        <w:r>
+          <w:rPr>
+            <w:noProof/>
+          </w:rPr>
+          <w:t>11</w:t>
+        </w:r>
+      </w:fldSimple>
       <w:r>
         <w:t>. ábra - Az indítás után kapott felület</w:t>
       </w:r>
@@ -6687,25 +6881,15 @@
       <w:pPr>
         <w:pStyle w:val="Kpalrs"/>
       </w:pPr>
-      <w:r>
-        <w:fldChar w:fldCharType="begin"/>
-      </w:r>
-      <w:r>
-        <w:instrText xml:space="preserve"> SEQ ábra \* ARABIC </w:instrText>
-      </w:r>
-      <w:r>
-        <w:fldChar w:fldCharType="separate"/>
-      </w:r>
-      <w:bookmarkStart w:id="29" w:name="_Toc195619199"/>
-      <w:r>
-        <w:rPr>
-          <w:noProof/>
-        </w:rPr>
-        <w:t>12</w:t>
-      </w:r>
-      <w:r>
-        <w:fldChar w:fldCharType="end"/>
-      </w:r>
+      <w:fldSimple w:instr=" SEQ ábra \* ARABIC ">
+        <w:bookmarkStart w:id="29" w:name="_Toc195648539"/>
+        <w:r>
+          <w:rPr>
+            <w:noProof/>
+          </w:rPr>
+          <w:t>12</w:t>
+        </w:r>
+      </w:fldSimple>
       <w:r>
         <w:t>. ábra - Példa, hogy hogyan néz ki egy tábla szerkesztése</w:t>
       </w:r>
@@ -6719,7 +6903,7 @@
           <w:numId w:val="4"/>
         </w:numPr>
       </w:pPr>
-      <w:bookmarkStart w:id="30" w:name="_Toc195619129"/>
+      <w:bookmarkStart w:id="30" w:name="_Toc195648518"/>
       <w:r>
         <w:t>Felhasználói dokumentáció, felhasználói kézikönyv</w:t>
       </w:r>
@@ -6750,7 +6934,7 @@
           <w:numId w:val="4"/>
         </w:numPr>
       </w:pPr>
-      <w:bookmarkStart w:id="31" w:name="_Toc195619130"/>
+      <w:bookmarkStart w:id="31" w:name="_Toc195648519"/>
       <w:r>
         <w:t>Telepítési útmutató</w:t>
       </w:r>
@@ -6764,7 +6948,7 @@
           <w:numId w:val="4"/>
         </w:numPr>
       </w:pPr>
-      <w:bookmarkStart w:id="32" w:name="_Toc195619131"/>
+      <w:bookmarkStart w:id="32" w:name="_Toc195648520"/>
       <w:r>
         <w:t>A w</w:t>
       </w:r>
@@ -7930,7 +8114,7 @@
           <w:numId w:val="4"/>
         </w:numPr>
       </w:pPr>
-      <w:bookmarkStart w:id="33" w:name="_Toc195619132"/>
+      <w:bookmarkStart w:id="33" w:name="_Toc195648521"/>
       <w:r>
         <w:t>Az asztali alkalmazás telepítése</w:t>
       </w:r>
@@ -8094,7 +8278,7 @@
           <w:numId w:val="4"/>
         </w:numPr>
       </w:pPr>
-      <w:bookmarkStart w:id="34" w:name="_Toc195619133"/>
+      <w:bookmarkStart w:id="34" w:name="_Toc195648522"/>
       <w:r>
         <w:t>Vendég funkciók</w:t>
       </w:r>
@@ -8170,7 +8354,7 @@
                               </w:rPr>
                               <w:fldChar w:fldCharType="separate"/>
                             </w:r>
-                            <w:bookmarkStart w:id="35" w:name="_Toc195619200"/>
+                            <w:bookmarkStart w:id="35" w:name="_Toc195648540"/>
                             <w:r>
                               <w:rPr>
                                 <w:noProof/>
@@ -8234,7 +8418,7 @@
                         </w:rPr>
                         <w:fldChar w:fldCharType="separate"/>
                       </w:r>
-                      <w:bookmarkStart w:id="36" w:name="_Toc195619200"/>
+                      <w:bookmarkStart w:id="36" w:name="_Toc195648540"/>
                       <w:r>
                         <w:rPr>
                           <w:noProof/>
@@ -8782,7 +8966,7 @@
                               </w:rPr>
                               <w:fldChar w:fldCharType="separate"/>
                             </w:r>
-                            <w:bookmarkStart w:id="37" w:name="_Toc195619201"/>
+                            <w:bookmarkStart w:id="37" w:name="_Toc195648541"/>
                             <w:r>
                               <w:rPr>
                                 <w:noProof/>
@@ -8846,7 +9030,7 @@
                         </w:rPr>
                         <w:fldChar w:fldCharType="separate"/>
                       </w:r>
-                      <w:bookmarkStart w:id="38" w:name="_Toc195619201"/>
+                      <w:bookmarkStart w:id="38" w:name="_Toc195648541"/>
                       <w:r>
                         <w:rPr>
                           <w:noProof/>
@@ -8980,7 +9164,7 @@
       <w:r>
         <w:t xml:space="preserve"> </w:t>
       </w:r>
-      <w:bookmarkStart w:id="39" w:name="_Toc195619134"/>
+      <w:bookmarkStart w:id="39" w:name="_Toc195648523"/>
       <w:r>
         <w:t>Regisztrált profillal rendelkező felhasználói funkciók</w:t>
       </w:r>
@@ -9063,7 +9247,7 @@
                               </w:rPr>
                               <w:fldChar w:fldCharType="separate"/>
                             </w:r>
-                            <w:bookmarkStart w:id="40" w:name="_Toc195619202"/>
+                            <w:bookmarkStart w:id="40" w:name="_Toc195648542"/>
                             <w:r>
                               <w:rPr>
                                 <w:noProof/>
@@ -9133,7 +9317,7 @@
                         </w:rPr>
                         <w:fldChar w:fldCharType="separate"/>
                       </w:r>
-                      <w:bookmarkStart w:id="41" w:name="_Toc195619202"/>
+                      <w:bookmarkStart w:id="41" w:name="_Toc195648542"/>
                       <w:r>
                         <w:rPr>
                           <w:noProof/>
@@ -10050,28 +10234,15 @@
       <w:pPr>
         <w:pStyle w:val="Kpalrs"/>
       </w:pPr>
-      <w:r>
-        <w:fldChar w:fldCharType="begin"/>
-      </w:r>
-      <w:r>
-        <w:instrText xml:space="preserve"> SEQ ábra \* ARABIC </w:instrText>
-      </w:r>
-      <w:r>
-        <w:fldChar w:fldCharType="separate"/>
-      </w:r>
-      <w:bookmarkStart w:id="42" w:name="_Toc195619203"/>
-      <w:r>
-        <w:rPr>
-          <w:noProof/>
-        </w:rPr>
-        <w:t>16</w:t>
-      </w:r>
-      <w:r>
-        <w:rPr>
-          <w:noProof/>
-        </w:rPr>
-        <w:fldChar w:fldCharType="end"/>
-      </w:r>
+      <w:fldSimple w:instr=" SEQ ábra \* ARABIC ">
+        <w:bookmarkStart w:id="42" w:name="_Toc195648543"/>
+        <w:r>
+          <w:rPr>
+            <w:noProof/>
+          </w:rPr>
+          <w:t>16</w:t>
+        </w:r>
+      </w:fldSimple>
       <w:r>
         <w:t>. ábra - A profil oldal előnézete</w:t>
       </w:r>
@@ -10135,28 +10306,15 @@
                                 <w:szCs w:val="22"/>
                               </w:rPr>
                             </w:pPr>
-                            <w:r>
-                              <w:fldChar w:fldCharType="begin"/>
-                            </w:r>
-                            <w:r>
-                              <w:instrText xml:space="preserve"> SEQ ábra \* ARABIC </w:instrText>
-                            </w:r>
-                            <w:r>
-                              <w:fldChar w:fldCharType="separate"/>
-                            </w:r>
-                            <w:bookmarkStart w:id="43" w:name="_Toc195619204"/>
-                            <w:r>
-                              <w:rPr>
-                                <w:noProof/>
-                              </w:rPr>
-                              <w:t>17</w:t>
-                            </w:r>
-                            <w:r>
-                              <w:rPr>
-                                <w:noProof/>
-                              </w:rPr>
-                              <w:fldChar w:fldCharType="end"/>
-                            </w:r>
+                            <w:fldSimple w:instr=" SEQ ábra \* ARABIC ">
+                              <w:bookmarkStart w:id="43" w:name="_Toc195648544"/>
+                              <w:r>
+                                <w:rPr>
+                                  <w:noProof/>
+                                </w:rPr>
+                                <w:t>17</w:t>
+                              </w:r>
+                            </w:fldSimple>
                             <w:r>
                               <w:t>. ábra - A kvíz kártyának leírása</w:t>
                             </w:r>
@@ -10189,28 +10347,15 @@
                           <w:szCs w:val="22"/>
                         </w:rPr>
                       </w:pPr>
-                      <w:r>
-                        <w:fldChar w:fldCharType="begin"/>
-                      </w:r>
-                      <w:r>
-                        <w:instrText xml:space="preserve"> SEQ ábra \* ARABIC </w:instrText>
-                      </w:r>
-                      <w:r>
-                        <w:fldChar w:fldCharType="separate"/>
-                      </w:r>
-                      <w:bookmarkStart w:id="44" w:name="_Toc195619204"/>
-                      <w:r>
-                        <w:rPr>
-                          <w:noProof/>
-                        </w:rPr>
-                        <w:t>17</w:t>
-                      </w:r>
-                      <w:r>
-                        <w:rPr>
-                          <w:noProof/>
-                        </w:rPr>
-                        <w:fldChar w:fldCharType="end"/>
-                      </w:r>
+                      <w:fldSimple w:instr=" SEQ ábra \* ARABIC ">
+                        <w:bookmarkStart w:id="44" w:name="_Toc195648544"/>
+                        <w:r>
+                          <w:rPr>
+                            <w:noProof/>
+                          </w:rPr>
+                          <w:t>17</w:t>
+                        </w:r>
+                      </w:fldSimple>
                       <w:r>
                         <w:t>. ábra - A kvíz kártyának leírása</w:t>
                       </w:r>
@@ -10428,28 +10573,15 @@
                                 <w:szCs w:val="22"/>
                               </w:rPr>
                             </w:pPr>
-                            <w:r>
-                              <w:fldChar w:fldCharType="begin"/>
-                            </w:r>
-                            <w:r>
-                              <w:instrText xml:space="preserve"> SEQ ábra \* ARABIC </w:instrText>
-                            </w:r>
-                            <w:r>
-                              <w:fldChar w:fldCharType="separate"/>
-                            </w:r>
-                            <w:bookmarkStart w:id="45" w:name="_Toc195619205"/>
-                            <w:r>
-                              <w:rPr>
-                                <w:noProof/>
-                              </w:rPr>
-                              <w:t>18</w:t>
-                            </w:r>
-                            <w:r>
-                              <w:rPr>
-                                <w:noProof/>
-                              </w:rPr>
-                              <w:fldChar w:fldCharType="end"/>
-                            </w:r>
+                            <w:fldSimple w:instr=" SEQ ábra \* ARABIC ">
+                              <w:bookmarkStart w:id="45" w:name="_Toc195648545"/>
+                              <w:r>
+                                <w:rPr>
+                                  <w:noProof/>
+                                </w:rPr>
+                                <w:t>18</w:t>
+                              </w:r>
+                            </w:fldSimple>
                             <w:r>
                               <w:t>. ábra - legördülő menü a kvízek keresési szűkítéséhez</w:t>
                             </w:r>
@@ -10482,28 +10614,15 @@
                           <w:szCs w:val="22"/>
                         </w:rPr>
                       </w:pPr>
-                      <w:r>
-                        <w:fldChar w:fldCharType="begin"/>
-                      </w:r>
-                      <w:r>
-                        <w:instrText xml:space="preserve"> SEQ ábra \* ARABIC </w:instrText>
-                      </w:r>
-                      <w:r>
-                        <w:fldChar w:fldCharType="separate"/>
-                      </w:r>
-                      <w:bookmarkStart w:id="46" w:name="_Toc195619205"/>
-                      <w:r>
-                        <w:rPr>
-                          <w:noProof/>
-                        </w:rPr>
-                        <w:t>18</w:t>
-                      </w:r>
-                      <w:r>
-                        <w:rPr>
-                          <w:noProof/>
-                        </w:rPr>
-                        <w:fldChar w:fldCharType="end"/>
-                      </w:r>
+                      <w:fldSimple w:instr=" SEQ ábra \* ARABIC ">
+                        <w:bookmarkStart w:id="46" w:name="_Toc195648545"/>
+                        <w:r>
+                          <w:rPr>
+                            <w:noProof/>
+                          </w:rPr>
+                          <w:t>18</w:t>
+                        </w:r>
+                      </w:fldSimple>
                       <w:r>
                         <w:t>. ábra - legördülő menü a kvízek keresési szűkítéséhez</w:t>
                       </w:r>
@@ -10650,28 +10769,15 @@
                                 <w:szCs w:val="22"/>
                               </w:rPr>
                             </w:pPr>
-                            <w:r>
-                              <w:fldChar w:fldCharType="begin"/>
-                            </w:r>
-                            <w:r>
-                              <w:instrText xml:space="preserve"> SEQ ábra \* ARABIC </w:instrText>
-                            </w:r>
-                            <w:r>
-                              <w:fldChar w:fldCharType="separate"/>
-                            </w:r>
-                            <w:bookmarkStart w:id="47" w:name="_Toc195619206"/>
-                            <w:r>
-                              <w:rPr>
-                                <w:noProof/>
-                              </w:rPr>
-                              <w:t>19</w:t>
-                            </w:r>
-                            <w:r>
-                              <w:rPr>
-                                <w:noProof/>
-                              </w:rPr>
-                              <w:fldChar w:fldCharType="end"/>
-                            </w:r>
+                            <w:fldSimple w:instr=" SEQ ábra \* ARABIC ">
+                              <w:bookmarkStart w:id="47" w:name="_Toc195648546"/>
+                              <w:r>
+                                <w:rPr>
+                                  <w:noProof/>
+                                </w:rPr>
+                                <w:t>19</w:t>
+                              </w:r>
+                            </w:fldSimple>
                             <w:r>
                               <w:t>. ábra - keresés a kvízeim között</w:t>
                             </w:r>
@@ -10704,28 +10810,15 @@
                           <w:szCs w:val="22"/>
                         </w:rPr>
                       </w:pPr>
-                      <w:r>
-                        <w:fldChar w:fldCharType="begin"/>
-                      </w:r>
-                      <w:r>
-                        <w:instrText xml:space="preserve"> SEQ ábra \* ARABIC </w:instrText>
-                      </w:r>
-                      <w:r>
-                        <w:fldChar w:fldCharType="separate"/>
-                      </w:r>
-                      <w:bookmarkStart w:id="48" w:name="_Toc195619206"/>
-                      <w:r>
-                        <w:rPr>
-                          <w:noProof/>
-                        </w:rPr>
-                        <w:t>19</w:t>
-                      </w:r>
-                      <w:r>
-                        <w:rPr>
-                          <w:noProof/>
-                        </w:rPr>
-                        <w:fldChar w:fldCharType="end"/>
-                      </w:r>
+                      <w:fldSimple w:instr=" SEQ ábra \* ARABIC ">
+                        <w:bookmarkStart w:id="48" w:name="_Toc195648546"/>
+                        <w:r>
+                          <w:rPr>
+                            <w:noProof/>
+                          </w:rPr>
+                          <w:t>19</w:t>
+                        </w:r>
+                      </w:fldSimple>
                       <w:r>
                         <w:t>. ábra - keresés a kvízeim között</w:t>
                       </w:r>
@@ -10926,28 +11019,15 @@
                                 <w:szCs w:val="22"/>
                               </w:rPr>
                             </w:pPr>
-                            <w:r>
-                              <w:fldChar w:fldCharType="begin"/>
-                            </w:r>
-                            <w:r>
-                              <w:instrText xml:space="preserve"> SEQ ábra \* ARABIC </w:instrText>
-                            </w:r>
-                            <w:r>
-                              <w:fldChar w:fldCharType="separate"/>
-                            </w:r>
-                            <w:bookmarkStart w:id="49" w:name="_Toc195619207"/>
-                            <w:r>
-                              <w:rPr>
-                                <w:noProof/>
-                              </w:rPr>
-                              <w:t>20</w:t>
-                            </w:r>
-                            <w:r>
-                              <w:rPr>
-                                <w:noProof/>
-                              </w:rPr>
-                              <w:fldChar w:fldCharType="end"/>
-                            </w:r>
+                            <w:fldSimple w:instr=" SEQ ábra \* ARABIC ">
+                              <w:bookmarkStart w:id="49" w:name="_Toc195648547"/>
+                              <w:r>
+                                <w:rPr>
+                                  <w:noProof/>
+                                </w:rPr>
+                                <w:t>20</w:t>
+                              </w:r>
+                            </w:fldSimple>
                             <w:r>
                               <w:t>. ábra - kvíz létrehozása</w:t>
                             </w:r>
@@ -10980,28 +11060,15 @@
                           <w:szCs w:val="22"/>
                         </w:rPr>
                       </w:pPr>
-                      <w:r>
-                        <w:fldChar w:fldCharType="begin"/>
-                      </w:r>
-                      <w:r>
-                        <w:instrText xml:space="preserve"> SEQ ábra \* ARABIC </w:instrText>
-                      </w:r>
-                      <w:r>
-                        <w:fldChar w:fldCharType="separate"/>
-                      </w:r>
-                      <w:bookmarkStart w:id="50" w:name="_Toc195619207"/>
-                      <w:r>
-                        <w:rPr>
-                          <w:noProof/>
-                        </w:rPr>
-                        <w:t>20</w:t>
-                      </w:r>
-                      <w:r>
-                        <w:rPr>
-                          <w:noProof/>
-                        </w:rPr>
-                        <w:fldChar w:fldCharType="end"/>
-                      </w:r>
+                      <w:fldSimple w:instr=" SEQ ábra \* ARABIC ">
+                        <w:bookmarkStart w:id="50" w:name="_Toc195648547"/>
+                        <w:r>
+                          <w:rPr>
+                            <w:noProof/>
+                          </w:rPr>
+                          <w:t>20</w:t>
+                        </w:r>
+                      </w:fldSimple>
                       <w:r>
                         <w:t>. ábra - kvíz létrehozása</w:t>
                       </w:r>
@@ -11363,28 +11430,15 @@
       <w:pPr>
         <w:pStyle w:val="Kpalrs"/>
       </w:pPr>
-      <w:r>
-        <w:fldChar w:fldCharType="begin"/>
-      </w:r>
-      <w:r>
-        <w:instrText xml:space="preserve"> SEQ ábra \* ARABIC </w:instrText>
-      </w:r>
-      <w:r>
-        <w:fldChar w:fldCharType="separate"/>
-      </w:r>
-      <w:bookmarkStart w:id="51" w:name="_Toc195619208"/>
-      <w:r>
-        <w:rPr>
-          <w:noProof/>
-        </w:rPr>
-        <w:t>21</w:t>
-      </w:r>
-      <w:r>
-        <w:rPr>
-          <w:noProof/>
-        </w:rPr>
-        <w:fldChar w:fldCharType="end"/>
-      </w:r>
+      <w:fldSimple w:instr=" SEQ ábra \* ARABIC ">
+        <w:bookmarkStart w:id="51" w:name="_Toc195648548"/>
+        <w:r>
+          <w:rPr>
+            <w:noProof/>
+          </w:rPr>
+          <w:t>21</w:t>
+        </w:r>
+      </w:fldSimple>
       <w:r>
         <w:t>. ábra - kvíz szerkesztő, kérdések, válaszok</w:t>
       </w:r>
@@ -11597,28 +11651,15 @@
                                 <w:szCs w:val="22"/>
                               </w:rPr>
                             </w:pPr>
-                            <w:r>
-                              <w:fldChar w:fldCharType="begin"/>
-                            </w:r>
-                            <w:r>
-                              <w:instrText xml:space="preserve"> SEQ ábra \* ARABIC </w:instrText>
-                            </w:r>
-                            <w:r>
-                              <w:fldChar w:fldCharType="separate"/>
-                            </w:r>
-                            <w:bookmarkStart w:id="52" w:name="_Toc195619209"/>
-                            <w:r>
-                              <w:rPr>
-                                <w:noProof/>
-                              </w:rPr>
-                              <w:t>22</w:t>
-                            </w:r>
-                            <w:r>
-                              <w:rPr>
-                                <w:noProof/>
-                              </w:rPr>
-                              <w:fldChar w:fldCharType="end"/>
-                            </w:r>
+                            <w:fldSimple w:instr=" SEQ ábra \* ARABIC ">
+                              <w:bookmarkStart w:id="52" w:name="_Toc195648549"/>
+                              <w:r>
+                                <w:rPr>
+                                  <w:noProof/>
+                                </w:rPr>
+                                <w:t>22</w:t>
+                              </w:r>
+                            </w:fldSimple>
                             <w:r>
                               <w:t xml:space="preserve">. ábra - a négy </w:t>
                             </w:r>
@@ -11659,28 +11700,15 @@
                           <w:szCs w:val="22"/>
                         </w:rPr>
                       </w:pPr>
-                      <w:r>
-                        <w:fldChar w:fldCharType="begin"/>
-                      </w:r>
-                      <w:r>
-                        <w:instrText xml:space="preserve"> SEQ ábra \* ARABIC </w:instrText>
-                      </w:r>
-                      <w:r>
-                        <w:fldChar w:fldCharType="separate"/>
-                      </w:r>
-                      <w:bookmarkStart w:id="53" w:name="_Toc195619209"/>
-                      <w:r>
-                        <w:rPr>
-                          <w:noProof/>
-                        </w:rPr>
-                        <w:t>22</w:t>
-                      </w:r>
-                      <w:r>
-                        <w:rPr>
-                          <w:noProof/>
-                        </w:rPr>
-                        <w:fldChar w:fldCharType="end"/>
-                      </w:r>
+                      <w:fldSimple w:instr=" SEQ ábra \* ARABIC ">
+                        <w:bookmarkStart w:id="53" w:name="_Toc195648549"/>
+                        <w:r>
+                          <w:rPr>
+                            <w:noProof/>
+                          </w:rPr>
+                          <w:t>22</w:t>
+                        </w:r>
+                      </w:fldSimple>
                       <w:r>
                         <w:t xml:space="preserve">. ábra - a négy </w:t>
                       </w:r>
@@ -12579,28 +12607,15 @@
                                 <w:szCs w:val="22"/>
                               </w:rPr>
                             </w:pPr>
-                            <w:r>
-                              <w:fldChar w:fldCharType="begin"/>
-                            </w:r>
-                            <w:r>
-                              <w:instrText xml:space="preserve"> SEQ ábra \* ARABIC </w:instrText>
-                            </w:r>
-                            <w:r>
-                              <w:fldChar w:fldCharType="separate"/>
-                            </w:r>
-                            <w:bookmarkStart w:id="54" w:name="_Toc195619210"/>
-                            <w:r>
-                              <w:rPr>
-                                <w:noProof/>
-                              </w:rPr>
-                              <w:t>23</w:t>
-                            </w:r>
-                            <w:r>
-                              <w:rPr>
-                                <w:noProof/>
-                              </w:rPr>
-                              <w:fldChar w:fldCharType="end"/>
-                            </w:r>
+                            <w:fldSimple w:instr=" SEQ ábra \* ARABIC ">
+                              <w:bookmarkStart w:id="54" w:name="_Toc195648550"/>
+                              <w:r>
+                                <w:rPr>
+                                  <w:noProof/>
+                                </w:rPr>
+                                <w:t>23</w:t>
+                              </w:r>
+                            </w:fldSimple>
                             <w:r>
                               <w:t>. ábra - igaz - Hamis kérdés szerkesztő</w:t>
                             </w:r>
@@ -12633,28 +12648,15 @@
                           <w:szCs w:val="22"/>
                         </w:rPr>
                       </w:pPr>
-                      <w:r>
-                        <w:fldChar w:fldCharType="begin"/>
-                      </w:r>
-                      <w:r>
-                        <w:instrText xml:space="preserve"> SEQ ábra \* ARABIC </w:instrText>
-                      </w:r>
-                      <w:r>
-                        <w:fldChar w:fldCharType="separate"/>
-                      </w:r>
-                      <w:bookmarkStart w:id="55" w:name="_Toc195619210"/>
-                      <w:r>
-                        <w:rPr>
-                          <w:noProof/>
-                        </w:rPr>
-                        <w:t>23</w:t>
-                      </w:r>
-                      <w:r>
-                        <w:rPr>
-                          <w:noProof/>
-                        </w:rPr>
-                        <w:fldChar w:fldCharType="end"/>
-                      </w:r>
+                      <w:fldSimple w:instr=" SEQ ábra \* ARABIC ">
+                        <w:bookmarkStart w:id="55" w:name="_Toc195648550"/>
+                        <w:r>
+                          <w:rPr>
+                            <w:noProof/>
+                          </w:rPr>
+                          <w:t>23</w:t>
+                        </w:r>
+                      </w:fldSimple>
                       <w:r>
                         <w:t>. ábra - igaz - Hamis kérdés szerkesztő</w:t>
                       </w:r>
@@ -12795,28 +12797,15 @@
                                 <w:szCs w:val="22"/>
                               </w:rPr>
                             </w:pPr>
-                            <w:r>
-                              <w:fldChar w:fldCharType="begin"/>
-                            </w:r>
-                            <w:r>
-                              <w:instrText xml:space="preserve"> SEQ ábra \* ARABIC </w:instrText>
-                            </w:r>
-                            <w:r>
-                              <w:fldChar w:fldCharType="separate"/>
-                            </w:r>
-                            <w:bookmarkStart w:id="56" w:name="_Toc195619211"/>
-                            <w:r>
-                              <w:rPr>
-                                <w:noProof/>
-                              </w:rPr>
-                              <w:t>24</w:t>
-                            </w:r>
-                            <w:r>
-                              <w:rPr>
-                                <w:noProof/>
-                              </w:rPr>
-                              <w:fldChar w:fldCharType="end"/>
-                            </w:r>
+                            <w:fldSimple w:instr=" SEQ ábra \* ARABIC ">
+                              <w:bookmarkStart w:id="56" w:name="_Toc195648551"/>
+                              <w:r>
+                                <w:rPr>
+                                  <w:noProof/>
+                                </w:rPr>
+                                <w:t>24</w:t>
+                              </w:r>
+                            </w:fldSimple>
                             <w:r>
                               <w:t>. ábra - Feleletválasztós kérdés szerkesztő</w:t>
                             </w:r>
@@ -12849,28 +12838,15 @@
                           <w:szCs w:val="22"/>
                         </w:rPr>
                       </w:pPr>
-                      <w:r>
-                        <w:fldChar w:fldCharType="begin"/>
-                      </w:r>
-                      <w:r>
-                        <w:instrText xml:space="preserve"> SEQ ábra \* ARABIC </w:instrText>
-                      </w:r>
-                      <w:r>
-                        <w:fldChar w:fldCharType="separate"/>
-                      </w:r>
-                      <w:bookmarkStart w:id="57" w:name="_Toc195619211"/>
-                      <w:r>
-                        <w:rPr>
-                          <w:noProof/>
-                        </w:rPr>
-                        <w:t>24</w:t>
-                      </w:r>
-                      <w:r>
-                        <w:rPr>
-                          <w:noProof/>
-                        </w:rPr>
-                        <w:fldChar w:fldCharType="end"/>
-                      </w:r>
+                      <w:fldSimple w:instr=" SEQ ábra \* ARABIC ">
+                        <w:bookmarkStart w:id="57" w:name="_Toc195648551"/>
+                        <w:r>
+                          <w:rPr>
+                            <w:noProof/>
+                          </w:rPr>
+                          <w:t>24</w:t>
+                        </w:r>
+                      </w:fldSimple>
                       <w:r>
                         <w:t>. ábra - Feleletválasztós kérdés szerkesztő</w:t>
                       </w:r>
@@ -13040,7 +13016,7 @@
                               </w:rPr>
                               <w:fldChar w:fldCharType="separate"/>
                             </w:r>
-                            <w:bookmarkStart w:id="58" w:name="_Toc195619212"/>
+                            <w:bookmarkStart w:id="58" w:name="_Toc195648552"/>
                             <w:r>
                               <w:rPr>
                                 <w:noProof/>
@@ -13104,7 +13080,7 @@
                         </w:rPr>
                         <w:fldChar w:fldCharType="separate"/>
                       </w:r>
-                      <w:bookmarkStart w:id="59" w:name="_Toc195619212"/>
+                      <w:bookmarkStart w:id="59" w:name="_Toc195648552"/>
                       <w:r>
                         <w:rPr>
                           <w:noProof/>
@@ -13190,28 +13166,15 @@
                                 <w:szCs w:val="22"/>
                               </w:rPr>
                             </w:pPr>
-                            <w:r>
-                              <w:fldChar w:fldCharType="begin"/>
-                            </w:r>
-                            <w:r>
-                              <w:instrText xml:space="preserve"> SEQ ábra \* ARABIC </w:instrText>
-                            </w:r>
-                            <w:r>
-                              <w:fldChar w:fldCharType="separate"/>
-                            </w:r>
-                            <w:bookmarkStart w:id="60" w:name="_Toc195619213"/>
-                            <w:r>
-                              <w:rPr>
-                                <w:noProof/>
-                              </w:rPr>
-                              <w:t>26</w:t>
-                            </w:r>
-                            <w:r>
-                              <w:rPr>
-                                <w:noProof/>
-                              </w:rPr>
-                              <w:fldChar w:fldCharType="end"/>
-                            </w:r>
+                            <w:fldSimple w:instr=" SEQ ábra \* ARABIC ">
+                              <w:bookmarkStart w:id="60" w:name="_Toc195648553"/>
+                              <w:r>
+                                <w:rPr>
+                                  <w:noProof/>
+                                </w:rPr>
+                                <w:t>26</w:t>
+                              </w:r>
+                            </w:fldSimple>
                             <w:r>
                               <w:t>. ábra - Igaz - Hamis kártya</w:t>
                             </w:r>
@@ -13244,28 +13207,15 @@
                           <w:szCs w:val="22"/>
                         </w:rPr>
                       </w:pPr>
-                      <w:r>
-                        <w:fldChar w:fldCharType="begin"/>
-                      </w:r>
-                      <w:r>
-                        <w:instrText xml:space="preserve"> SEQ ábra \* ARABIC </w:instrText>
-                      </w:r>
-                      <w:r>
-                        <w:fldChar w:fldCharType="separate"/>
-                      </w:r>
-                      <w:bookmarkStart w:id="61" w:name="_Toc195619213"/>
-                      <w:r>
-                        <w:rPr>
-                          <w:noProof/>
-                        </w:rPr>
-                        <w:t>26</w:t>
-                      </w:r>
-                      <w:r>
-                        <w:rPr>
-                          <w:noProof/>
-                        </w:rPr>
-                        <w:fldChar w:fldCharType="end"/>
-                      </w:r>
+                      <w:fldSimple w:instr=" SEQ ábra \* ARABIC ">
+                        <w:bookmarkStart w:id="61" w:name="_Toc195648553"/>
+                        <w:r>
+                          <w:rPr>
+                            <w:noProof/>
+                          </w:rPr>
+                          <w:t>26</w:t>
+                        </w:r>
+                      </w:fldSimple>
                       <w:r>
                         <w:t>. ábra - Igaz - Hamis kártya</w:t>
                       </w:r>
@@ -13405,28 +13355,15 @@
                                 <w:szCs w:val="22"/>
                               </w:rPr>
                             </w:pPr>
-                            <w:r>
-                              <w:fldChar w:fldCharType="begin"/>
-                            </w:r>
-                            <w:r>
-                              <w:instrText xml:space="preserve"> SEQ ábra \* ARABIC </w:instrText>
-                            </w:r>
-                            <w:r>
-                              <w:fldChar w:fldCharType="separate"/>
-                            </w:r>
-                            <w:bookmarkStart w:id="62" w:name="_Toc195619214"/>
-                            <w:r>
-                              <w:rPr>
-                                <w:noProof/>
-                              </w:rPr>
-                              <w:t>27</w:t>
-                            </w:r>
-                            <w:r>
-                              <w:rPr>
-                                <w:noProof/>
-                              </w:rPr>
-                              <w:fldChar w:fldCharType="end"/>
-                            </w:r>
+                            <w:fldSimple w:instr=" SEQ ábra \* ARABIC ">
+                              <w:bookmarkStart w:id="62" w:name="_Toc195648554"/>
+                              <w:r>
+                                <w:rPr>
+                                  <w:noProof/>
+                                </w:rPr>
+                                <w:t>27</w:t>
+                              </w:r>
+                            </w:fldSimple>
                             <w:r>
                               <w:t>. ábra - feleletválasztós kártya</w:t>
                             </w:r>
@@ -13459,28 +13396,15 @@
                           <w:szCs w:val="22"/>
                         </w:rPr>
                       </w:pPr>
-                      <w:r>
-                        <w:fldChar w:fldCharType="begin"/>
-                      </w:r>
-                      <w:r>
-                        <w:instrText xml:space="preserve"> SEQ ábra \* ARABIC </w:instrText>
-                      </w:r>
-                      <w:r>
-                        <w:fldChar w:fldCharType="separate"/>
-                      </w:r>
-                      <w:bookmarkStart w:id="63" w:name="_Toc195619214"/>
-                      <w:r>
-                        <w:rPr>
-                          <w:noProof/>
-                        </w:rPr>
-                        <w:t>27</w:t>
-                      </w:r>
-                      <w:r>
-                        <w:rPr>
-                          <w:noProof/>
-                        </w:rPr>
-                        <w:fldChar w:fldCharType="end"/>
-                      </w:r>
+                      <w:fldSimple w:instr=" SEQ ábra \* ARABIC ">
+                        <w:bookmarkStart w:id="63" w:name="_Toc195648554"/>
+                        <w:r>
+                          <w:rPr>
+                            <w:noProof/>
+                          </w:rPr>
+                          <w:t>27</w:t>
+                        </w:r>
+                      </w:fldSimple>
                       <w:r>
                         <w:t>. ábra - feleletválasztós kártya</w:t>
                       </w:r>
@@ -13639,7 +13563,7 @@
                               </w:rPr>
                               <w:fldChar w:fldCharType="separate"/>
                             </w:r>
-                            <w:bookmarkStart w:id="64" w:name="_Toc195619215"/>
+                            <w:bookmarkStart w:id="64" w:name="_Toc195648555"/>
                             <w:r>
                               <w:rPr>
                                 <w:noProof/>
@@ -13703,7 +13627,7 @@
                         </w:rPr>
                         <w:fldChar w:fldCharType="separate"/>
                       </w:r>
-                      <w:bookmarkStart w:id="65" w:name="_Toc195619215"/>
+                      <w:bookmarkStart w:id="65" w:name="_Toc195648555"/>
                       <w:r>
                         <w:rPr>
                           <w:noProof/>
@@ -13813,7 +13737,7 @@
       <w:r>
         <w:t xml:space="preserve"> </w:t>
       </w:r>
-      <w:bookmarkStart w:id="66" w:name="_Toc195619135"/>
+      <w:bookmarkStart w:id="66" w:name="_Toc195648524"/>
       <w:r>
         <w:t>További fejlesztési lehetőségek</w:t>
       </w:r>
@@ -13841,8 +13765,119 @@
           <w:numId w:val="4"/>
         </w:numPr>
       </w:pPr>
+      <w:bookmarkStart w:id="67" w:name="_Toc195648525"/>
       <w:r>
         <w:t>Napi/Heti kihívások</w:t>
+      </w:r>
+      <w:bookmarkEnd w:id="67"/>
+    </w:p>
+    <w:p>
+      <w:r>
+        <w:t>Tervben van napi és heti kihívások bevezetése, amelyek rövid ideig elérhető, különleges kv</w:t>
+      </w:r>
+      <w:r>
+        <w:t>í</w:t>
+      </w:r>
+      <w:r>
+        <w:t>zeket kínálnának a felhasználóknak. Ezekkel szeretnénk ösztönözni a rendszeres visszatérést, miközben extra pontszerzési és versengési lehetőségeket biztosítunk azoknak, akik szeretik a kihívásokat.</w:t>
+      </w:r>
+    </w:p>
+    <w:p>
+      <w:pPr>
+        <w:pStyle w:val="Cmsor2"/>
+        <w:numPr>
+          <w:ilvl w:val="1"/>
+          <w:numId w:val="4"/>
+        </w:numPr>
+      </w:pPr>
+      <w:bookmarkStart w:id="68" w:name="_Toc195648526"/>
+      <w:r>
+        <w:t>Közöségi funkciók</w:t>
+      </w:r>
+      <w:bookmarkEnd w:id="68"/>
+      <w:r>
+        <w:t xml:space="preserve"> </w:t>
+      </w:r>
+    </w:p>
+    <w:p>
+      <w:r>
+        <w:t>Szeretnénk lehetőséget adni a felhasználóknak arra, hogy értékelhessék</w:t>
+      </w:r>
+      <w:r>
+        <w:t xml:space="preserve"> és megjegyzéseket adhassanak</w:t>
+      </w:r>
+      <w:r>
+        <w:t xml:space="preserve"> a kv</w:t>
+      </w:r>
+      <w:r>
+        <w:t>í</w:t>
+      </w:r>
+      <w:r>
+        <w:t>ze</w:t>
+      </w:r>
+      <w:r>
+        <w:t>khez</w:t>
+      </w:r>
+      <w:r>
+        <w:t xml:space="preserve">, ezzel is ösztönözve a visszajelzések és párbeszédek kialakulását. Emellett egy követési rendszert is </w:t>
+      </w:r>
+      <w:r>
+        <w:t>beleépítenén</w:t>
+      </w:r>
+      <w:r>
+        <w:t>k, ami segítené a felhasználókat abban, hogy könnyen nyomon követhessék kedvenc kv</w:t>
+      </w:r>
+      <w:r>
+        <w:t>í</w:t>
+      </w:r>
+      <w:r>
+        <w:t>z</w:t>
+      </w:r>
+      <w:r>
+        <w:t xml:space="preserve"> </w:t>
+      </w:r>
+      <w:r>
+        <w:t>készítőik vagy ismerőseik tevékenységét.</w:t>
+      </w:r>
+    </w:p>
+    <w:p>
+      <w:pPr>
+        <w:pStyle w:val="Cmsor2"/>
+        <w:numPr>
+          <w:ilvl w:val="1"/>
+          <w:numId w:val="4"/>
+        </w:numPr>
+      </w:pPr>
+      <w:r>
+        <w:t xml:space="preserve"> </w:t>
+      </w:r>
+      <w:bookmarkStart w:id="69" w:name="_Toc195648527"/>
+      <w:r>
+        <w:t>Mobilapp</w:t>
+      </w:r>
+      <w:bookmarkEnd w:id="69"/>
+    </w:p>
+    <w:p>
+      <w:r>
+        <w:t xml:space="preserve">A jövőben szeretnénk elkészíteni egy mobilalkalmazást is, amely még kényelmesebbé tenné a </w:t>
+      </w:r>
+      <w:r>
+        <w:t>kvízek</w:t>
+      </w:r>
+      <w:r>
+        <w:t xml:space="preserve"> elérését, akár útközben is. Az alkalmazás lehetőséget adna</w:t>
+      </w:r>
+      <w:r>
+        <w:t xml:space="preserve"> akár</w:t>
+      </w:r>
+      <w:r>
+        <w:t xml:space="preserve"> az offline használatra</w:t>
+      </w:r>
+      <w:r>
+        <w:t xml:space="preserve"> is</w:t>
+      </w:r>
+      <w:r>
+        <w:t>, valamint push értesítéseken keresztül segítene abban, hogy a felhasználók ne maradjanak le az új kihívásokról vagy eseményekről. Ez lenne a legnagyobb volumenű fejlesztés a tervek között, így egyelőre távolabbi célként szerepel, amely külön erőforrásokat és alaposabb előkészítést igényel.</w:t>
       </w:r>
     </w:p>
     <w:p>
@@ -13869,7 +13904,13 @@
           <w:tab w:val="right" w:leader="dot" w:pos="9062"/>
         </w:tabs>
         <w:rPr>
+          <w:rFonts w:eastAsiaTheme="minorEastAsia"/>
           <w:noProof/>
+          <w:kern w:val="2"/>
+          <w:sz w:val="24"/>
+          <w:szCs w:val="24"/>
+          <w:lang w:eastAsia="hu-HU"/>
+          <w14:ligatures w14:val="standardContextual"/>
         </w:rPr>
       </w:pPr>
       <w:r>
@@ -13881,7 +13922,7 @@
       <w:r>
         <w:fldChar w:fldCharType="separate"/>
       </w:r>
-      <w:hyperlink w:anchor="_Toc195619188" w:history="1">
+      <w:hyperlink w:anchor="_Toc195648528" w:history="1">
         <w:r>
           <w:rPr>
             <w:rStyle w:val="Hiperhivatkozs"/>
@@ -13908,7 +13949,7 @@
             <w:noProof/>
             <w:webHidden/>
           </w:rPr>
-          <w:instrText xml:space="preserve"> PAGEREF _Toc195619188 \h </w:instrText>
+          <w:instrText xml:space="preserve"> PAGEREF _Toc195648528 \h </w:instrText>
         </w:r>
         <w:r>
           <w:rPr>
@@ -13946,10 +13987,16 @@
           <w:tab w:val="right" w:leader="dot" w:pos="9062"/>
         </w:tabs>
         <w:rPr>
+          <w:rFonts w:eastAsiaTheme="minorEastAsia"/>
           <w:noProof/>
-        </w:rPr>
-      </w:pPr>
-      <w:hyperlink w:anchor="_Toc195619189" w:history="1">
+          <w:kern w:val="2"/>
+          <w:sz w:val="24"/>
+          <w:szCs w:val="24"/>
+          <w:lang w:eastAsia="hu-HU"/>
+          <w14:ligatures w14:val="standardContextual"/>
+        </w:rPr>
+      </w:pPr>
+      <w:hyperlink w:anchor="_Toc195648529" w:history="1">
         <w:r>
           <w:rPr>
             <w:rStyle w:val="Hiperhivatkozs"/>
@@ -13976,7 +14023,7 @@
             <w:noProof/>
             <w:webHidden/>
           </w:rPr>
-          <w:instrText xml:space="preserve"> PAGEREF _Toc195619189 \h </w:instrText>
+          <w:instrText xml:space="preserve"> PAGEREF _Toc195648529 \h </w:instrText>
         </w:r>
         <w:r>
           <w:rPr>
@@ -14014,10 +14061,16 @@
           <w:tab w:val="right" w:leader="dot" w:pos="9062"/>
         </w:tabs>
         <w:rPr>
+          <w:rFonts w:eastAsiaTheme="minorEastAsia"/>
           <w:noProof/>
-        </w:rPr>
-      </w:pPr>
-      <w:hyperlink w:anchor="_Toc195619190" w:history="1">
+          <w:kern w:val="2"/>
+          <w:sz w:val="24"/>
+          <w:szCs w:val="24"/>
+          <w:lang w:eastAsia="hu-HU"/>
+          <w14:ligatures w14:val="standardContextual"/>
+        </w:rPr>
+      </w:pPr>
+      <w:hyperlink w:anchor="_Toc195648530" w:history="1">
         <w:r>
           <w:rPr>
             <w:rStyle w:val="Hiperhivatkozs"/>
@@ -14044,7 +14097,7 @@
             <w:noProof/>
             <w:webHidden/>
           </w:rPr>
-          <w:instrText xml:space="preserve"> PAGEREF _Toc195619190 \h </w:instrText>
+          <w:instrText xml:space="preserve"> PAGEREF _Toc195648530 \h </w:instrText>
         </w:r>
         <w:r>
           <w:rPr>
@@ -14082,10 +14135,16 @@
           <w:tab w:val="right" w:leader="dot" w:pos="9062"/>
         </w:tabs>
         <w:rPr>
+          <w:rFonts w:eastAsiaTheme="minorEastAsia"/>
           <w:noProof/>
-        </w:rPr>
-      </w:pPr>
-      <w:hyperlink w:anchor="_Toc195619191" w:history="1">
+          <w:kern w:val="2"/>
+          <w:sz w:val="24"/>
+          <w:szCs w:val="24"/>
+          <w:lang w:eastAsia="hu-HU"/>
+          <w14:ligatures w14:val="standardContextual"/>
+        </w:rPr>
+      </w:pPr>
+      <w:hyperlink w:anchor="_Toc195648531" w:history="1">
         <w:r>
           <w:rPr>
             <w:rStyle w:val="Hiperhivatkozs"/>
@@ -14112,7 +14171,7 @@
             <w:noProof/>
             <w:webHidden/>
           </w:rPr>
-          <w:instrText xml:space="preserve"> PAGEREF _Toc195619191 \h </w:instrText>
+          <w:instrText xml:space="preserve"> PAGEREF _Toc195648531 \h </w:instrText>
         </w:r>
         <w:r>
           <w:rPr>
@@ -14150,10 +14209,16 @@
           <w:tab w:val="right" w:leader="dot" w:pos="9062"/>
         </w:tabs>
         <w:rPr>
+          <w:rFonts w:eastAsiaTheme="minorEastAsia"/>
           <w:noProof/>
-        </w:rPr>
-      </w:pPr>
-      <w:hyperlink w:anchor="_Toc195619192" w:history="1">
+          <w:kern w:val="2"/>
+          <w:sz w:val="24"/>
+          <w:szCs w:val="24"/>
+          <w:lang w:eastAsia="hu-HU"/>
+          <w14:ligatures w14:val="standardContextual"/>
+        </w:rPr>
+      </w:pPr>
+      <w:hyperlink w:anchor="_Toc195648532" w:history="1">
         <w:r>
           <w:rPr>
             <w:rStyle w:val="Hiperhivatkozs"/>
@@ -14180,7 +14245,7 @@
             <w:noProof/>
             <w:webHidden/>
           </w:rPr>
-          <w:instrText xml:space="preserve"> PAGEREF _Toc195619192 \h </w:instrText>
+          <w:instrText xml:space="preserve"> PAGEREF _Toc195648532 \h </w:instrText>
         </w:r>
         <w:r>
           <w:rPr>
@@ -14218,10 +14283,16 @@
           <w:tab w:val="right" w:leader="dot" w:pos="9062"/>
         </w:tabs>
         <w:rPr>
+          <w:rFonts w:eastAsiaTheme="minorEastAsia"/>
           <w:noProof/>
-        </w:rPr>
-      </w:pPr>
-      <w:hyperlink w:anchor="_Toc195619193" w:history="1">
+          <w:kern w:val="2"/>
+          <w:sz w:val="24"/>
+          <w:szCs w:val="24"/>
+          <w:lang w:eastAsia="hu-HU"/>
+          <w14:ligatures w14:val="standardContextual"/>
+        </w:rPr>
+      </w:pPr>
+      <w:hyperlink w:anchor="_Toc195648533" w:history="1">
         <w:r>
           <w:rPr>
             <w:rStyle w:val="Hiperhivatkozs"/>
@@ -14248,7 +14319,7 @@
             <w:noProof/>
             <w:webHidden/>
           </w:rPr>
-          <w:instrText xml:space="preserve"> PAGEREF _Toc195619193 \h </w:instrText>
+          <w:instrText xml:space="preserve"> PAGEREF _Toc195648533 \h </w:instrText>
         </w:r>
         <w:r>
           <w:rPr>
@@ -14286,10 +14357,16 @@
           <w:tab w:val="right" w:leader="dot" w:pos="9062"/>
         </w:tabs>
         <w:rPr>
+          <w:rFonts w:eastAsiaTheme="minorEastAsia"/>
           <w:noProof/>
-        </w:rPr>
-      </w:pPr>
-      <w:hyperlink w:anchor="_Toc195619194" w:history="1">
+          <w:kern w:val="2"/>
+          <w:sz w:val="24"/>
+          <w:szCs w:val="24"/>
+          <w:lang w:eastAsia="hu-HU"/>
+          <w14:ligatures w14:val="standardContextual"/>
+        </w:rPr>
+      </w:pPr>
+      <w:hyperlink w:anchor="_Toc195648534" w:history="1">
         <w:r>
           <w:rPr>
             <w:rStyle w:val="Hiperhivatkozs"/>
@@ -14316,7 +14393,7 @@
             <w:noProof/>
             <w:webHidden/>
           </w:rPr>
-          <w:instrText xml:space="preserve"> PAGEREF _Toc195619194 \h </w:instrText>
+          <w:instrText xml:space="preserve"> PAGEREF _Toc195648534 \h </w:instrText>
         </w:r>
         <w:r>
           <w:rPr>
@@ -14354,10 +14431,16 @@
           <w:tab w:val="right" w:leader="dot" w:pos="9062"/>
         </w:tabs>
         <w:rPr>
+          <w:rFonts w:eastAsiaTheme="minorEastAsia"/>
           <w:noProof/>
-        </w:rPr>
-      </w:pPr>
-      <w:hyperlink w:anchor="_Toc195619195" w:history="1">
+          <w:kern w:val="2"/>
+          <w:sz w:val="24"/>
+          <w:szCs w:val="24"/>
+          <w:lang w:eastAsia="hu-HU"/>
+          <w14:ligatures w14:val="standardContextual"/>
+        </w:rPr>
+      </w:pPr>
+      <w:hyperlink w:anchor="_Toc195648535" w:history="1">
         <w:r>
           <w:rPr>
             <w:rStyle w:val="Hiperhivatkozs"/>
@@ -14392,7 +14475,7 @@
             <w:noProof/>
             <w:webHidden/>
           </w:rPr>
-          <w:instrText xml:space="preserve"> PAGEREF _Toc195619195 \h </w:instrText>
+          <w:instrText xml:space="preserve"> PAGEREF _Toc195648535 \h </w:instrText>
         </w:r>
         <w:r>
           <w:rPr>
@@ -14430,10 +14513,16 @@
           <w:tab w:val="right" w:leader="dot" w:pos="9062"/>
         </w:tabs>
         <w:rPr>
+          <w:rFonts w:eastAsiaTheme="minorEastAsia"/>
           <w:noProof/>
-        </w:rPr>
-      </w:pPr>
-      <w:hyperlink w:anchor="_Toc195619196" w:history="1">
+          <w:kern w:val="2"/>
+          <w:sz w:val="24"/>
+          <w:szCs w:val="24"/>
+          <w:lang w:eastAsia="hu-HU"/>
+          <w14:ligatures w14:val="standardContextual"/>
+        </w:rPr>
+      </w:pPr>
+      <w:hyperlink w:anchor="_Toc195648536" w:history="1">
         <w:r>
           <w:rPr>
             <w:rStyle w:val="Hiperhivatkozs"/>
@@ -14460,7 +14549,7 @@
             <w:noProof/>
             <w:webHidden/>
           </w:rPr>
-          <w:instrText xml:space="preserve"> PAGEREF _Toc195619196 \h </w:instrText>
+          <w:instrText xml:space="preserve"> PAGEREF _Toc195648536 \h </w:instrText>
         </w:r>
         <w:r>
           <w:rPr>
@@ -14498,10 +14587,16 @@
           <w:tab w:val="right" w:leader="dot" w:pos="9062"/>
         </w:tabs>
         <w:rPr>
+          <w:rFonts w:eastAsiaTheme="minorEastAsia"/>
           <w:noProof/>
-        </w:rPr>
-      </w:pPr>
-      <w:hyperlink w:anchor="_Toc195619197" w:history="1">
+          <w:kern w:val="2"/>
+          <w:sz w:val="24"/>
+          <w:szCs w:val="24"/>
+          <w:lang w:eastAsia="hu-HU"/>
+          <w14:ligatures w14:val="standardContextual"/>
+        </w:rPr>
+      </w:pPr>
+      <w:hyperlink w:anchor="_Toc195648537" w:history="1">
         <w:r>
           <w:rPr>
             <w:rStyle w:val="Hiperhivatkozs"/>
@@ -14528,7 +14623,7 @@
             <w:noProof/>
             <w:webHidden/>
           </w:rPr>
-          <w:instrText xml:space="preserve"> PAGEREF _Toc195619197 \h </w:instrText>
+          <w:instrText xml:space="preserve"> PAGEREF _Toc195648537 \h </w:instrText>
         </w:r>
         <w:r>
           <w:rPr>
@@ -14566,10 +14661,16 @@
           <w:tab w:val="right" w:leader="dot" w:pos="9062"/>
         </w:tabs>
         <w:rPr>
+          <w:rFonts w:eastAsiaTheme="minorEastAsia"/>
           <w:noProof/>
-        </w:rPr>
-      </w:pPr>
-      <w:hyperlink w:anchor="_Toc195619198" w:history="1">
+          <w:kern w:val="2"/>
+          <w:sz w:val="24"/>
+          <w:szCs w:val="24"/>
+          <w:lang w:eastAsia="hu-HU"/>
+          <w14:ligatures w14:val="standardContextual"/>
+        </w:rPr>
+      </w:pPr>
+      <w:hyperlink w:anchor="_Toc195648538" w:history="1">
         <w:r>
           <w:rPr>
             <w:rStyle w:val="Hiperhivatkozs"/>
@@ -14596,7 +14697,7 @@
             <w:noProof/>
             <w:webHidden/>
           </w:rPr>
-          <w:instrText xml:space="preserve"> PAGEREF _Toc195619198 \h </w:instrText>
+          <w:instrText xml:space="preserve"> PAGEREF _Toc195648538 \h </w:instrText>
         </w:r>
         <w:r>
           <w:rPr>
@@ -14634,10 +14735,16 @@
           <w:tab w:val="right" w:leader="dot" w:pos="9062"/>
         </w:tabs>
         <w:rPr>
+          <w:rFonts w:eastAsiaTheme="minorEastAsia"/>
           <w:noProof/>
-        </w:rPr>
-      </w:pPr>
-      <w:hyperlink w:anchor="_Toc195619199" w:history="1">
+          <w:kern w:val="2"/>
+          <w:sz w:val="24"/>
+          <w:szCs w:val="24"/>
+          <w:lang w:eastAsia="hu-HU"/>
+          <w14:ligatures w14:val="standardContextual"/>
+        </w:rPr>
+      </w:pPr>
+      <w:hyperlink w:anchor="_Toc195648539" w:history="1">
         <w:r>
           <w:rPr>
             <w:rStyle w:val="Hiperhivatkozs"/>
@@ -14664,7 +14771,7 @@
             <w:noProof/>
             <w:webHidden/>
           </w:rPr>
-          <w:instrText xml:space="preserve"> PAGEREF _Toc195619199 \h </w:instrText>
+          <w:instrText xml:space="preserve"> PAGEREF _Toc195648539 \h </w:instrText>
         </w:r>
         <w:r>
           <w:rPr>
@@ -14702,10 +14809,16 @@
           <w:tab w:val="right" w:leader="dot" w:pos="9062"/>
         </w:tabs>
         <w:rPr>
+          <w:rFonts w:eastAsiaTheme="minorEastAsia"/>
           <w:noProof/>
-        </w:rPr>
-      </w:pPr>
-      <w:hyperlink w:anchor="_Toc195619200" w:history="1">
+          <w:kern w:val="2"/>
+          <w:sz w:val="24"/>
+          <w:szCs w:val="24"/>
+          <w:lang w:eastAsia="hu-HU"/>
+          <w14:ligatures w14:val="standardContextual"/>
+        </w:rPr>
+      </w:pPr>
+      <w:hyperlink w:anchor="_Toc195648540" w:history="1">
         <w:r>
           <w:rPr>
             <w:rStyle w:val="Hiperhivatkozs"/>
@@ -14732,7 +14845,7 @@
             <w:noProof/>
             <w:webHidden/>
           </w:rPr>
-          <w:instrText xml:space="preserve"> PAGEREF _Toc195619200 \h </w:instrText>
+          <w:instrText xml:space="preserve"> PAGEREF _Toc195648540 \h </w:instrText>
         </w:r>
         <w:r>
           <w:rPr>
@@ -14770,10 +14883,16 @@
           <w:tab w:val="right" w:leader="dot" w:pos="9062"/>
         </w:tabs>
         <w:rPr>
+          <w:rFonts w:eastAsiaTheme="minorEastAsia"/>
           <w:noProof/>
-        </w:rPr>
-      </w:pPr>
-      <w:hyperlink w:anchor="_Toc195619201" w:history="1">
+          <w:kern w:val="2"/>
+          <w:sz w:val="24"/>
+          <w:szCs w:val="24"/>
+          <w:lang w:eastAsia="hu-HU"/>
+          <w14:ligatures w14:val="standardContextual"/>
+        </w:rPr>
+      </w:pPr>
+      <w:hyperlink w:anchor="_Toc195648541" w:history="1">
         <w:r>
           <w:rPr>
             <w:rStyle w:val="Hiperhivatkozs"/>
@@ -14800,7 +14919,7 @@
             <w:noProof/>
             <w:webHidden/>
           </w:rPr>
-          <w:instrText xml:space="preserve"> PAGEREF _Toc195619201 \h </w:instrText>
+          <w:instrText xml:space="preserve"> PAGEREF _Toc195648541 \h </w:instrText>
         </w:r>
         <w:r>
           <w:rPr>
@@ -14838,10 +14957,16 @@
           <w:tab w:val="right" w:leader="dot" w:pos="9062"/>
         </w:tabs>
         <w:rPr>
+          <w:rFonts w:eastAsiaTheme="minorEastAsia"/>
           <w:noProof/>
-        </w:rPr>
-      </w:pPr>
-      <w:hyperlink w:anchor="_Toc195619202" w:history="1">
+          <w:kern w:val="2"/>
+          <w:sz w:val="24"/>
+          <w:szCs w:val="24"/>
+          <w:lang w:eastAsia="hu-HU"/>
+          <w14:ligatures w14:val="standardContextual"/>
+        </w:rPr>
+      </w:pPr>
+      <w:hyperlink w:anchor="_Toc195648542" w:history="1">
         <w:r>
           <w:rPr>
             <w:rStyle w:val="Hiperhivatkozs"/>
@@ -14868,7 +14993,7 @@
             <w:noProof/>
             <w:webHidden/>
           </w:rPr>
-          <w:instrText xml:space="preserve"> PAGEREF _Toc195619202 \h </w:instrText>
+          <w:instrText xml:space="preserve"> PAGEREF _Toc195648542 \h </w:instrText>
         </w:r>
         <w:r>
           <w:rPr>
@@ -14906,10 +15031,16 @@
           <w:tab w:val="right" w:leader="dot" w:pos="9062"/>
         </w:tabs>
         <w:rPr>
+          <w:rFonts w:eastAsiaTheme="minorEastAsia"/>
           <w:noProof/>
-        </w:rPr>
-      </w:pPr>
-      <w:hyperlink w:anchor="_Toc195619203" w:history="1">
+          <w:kern w:val="2"/>
+          <w:sz w:val="24"/>
+          <w:szCs w:val="24"/>
+          <w:lang w:eastAsia="hu-HU"/>
+          <w14:ligatures w14:val="standardContextual"/>
+        </w:rPr>
+      </w:pPr>
+      <w:hyperlink w:anchor="_Toc195648543" w:history="1">
         <w:r>
           <w:rPr>
             <w:rStyle w:val="Hiperhivatkozs"/>
@@ -14936,7 +15067,7 @@
             <w:noProof/>
             <w:webHidden/>
           </w:rPr>
-          <w:instrText xml:space="preserve"> PAGEREF _Toc195619203 \h </w:instrText>
+          <w:instrText xml:space="preserve"> PAGEREF _Toc195648543 \h </w:instrText>
         </w:r>
         <w:r>
           <w:rPr>
@@ -14974,10 +15105,16 @@
           <w:tab w:val="right" w:leader="dot" w:pos="9062"/>
         </w:tabs>
         <w:rPr>
+          <w:rFonts w:eastAsiaTheme="minorEastAsia"/>
           <w:noProof/>
-        </w:rPr>
-      </w:pPr>
-      <w:hyperlink w:anchor="_Toc195619204" w:history="1">
+          <w:kern w:val="2"/>
+          <w:sz w:val="24"/>
+          <w:szCs w:val="24"/>
+          <w:lang w:eastAsia="hu-HU"/>
+          <w14:ligatures w14:val="standardContextual"/>
+        </w:rPr>
+      </w:pPr>
+      <w:hyperlink w:anchor="_Toc195648544" w:history="1">
         <w:r>
           <w:rPr>
             <w:rStyle w:val="Hiperhivatkozs"/>
@@ -15004,7 +15141,7 @@
             <w:noProof/>
             <w:webHidden/>
           </w:rPr>
-          <w:instrText xml:space="preserve"> PAGEREF _Toc195619204 \h </w:instrText>
+          <w:instrText xml:space="preserve"> PAGEREF _Toc195648544 \h </w:instrText>
         </w:r>
         <w:r>
           <w:rPr>
@@ -15042,10 +15179,16 @@
           <w:tab w:val="right" w:leader="dot" w:pos="9062"/>
         </w:tabs>
         <w:rPr>
+          <w:rFonts w:eastAsiaTheme="minorEastAsia"/>
           <w:noProof/>
-        </w:rPr>
-      </w:pPr>
-      <w:hyperlink w:anchor="_Toc195619205" w:history="1">
+          <w:kern w:val="2"/>
+          <w:sz w:val="24"/>
+          <w:szCs w:val="24"/>
+          <w:lang w:eastAsia="hu-HU"/>
+          <w14:ligatures w14:val="standardContextual"/>
+        </w:rPr>
+      </w:pPr>
+      <w:hyperlink w:anchor="_Toc195648545" w:history="1">
         <w:r>
           <w:rPr>
             <w:rStyle w:val="Hiperhivatkozs"/>
@@ -15072,7 +15215,7 @@
             <w:noProof/>
             <w:webHidden/>
           </w:rPr>
-          <w:instrText xml:space="preserve"> PAGEREF _Toc195619205 \h </w:instrText>
+          <w:instrText xml:space="preserve"> PAGEREF _Toc195648545 \h </w:instrText>
         </w:r>
         <w:r>
           <w:rPr>
@@ -15110,10 +15253,16 @@
           <w:tab w:val="right" w:leader="dot" w:pos="9062"/>
         </w:tabs>
         <w:rPr>
+          <w:rFonts w:eastAsiaTheme="minorEastAsia"/>
           <w:noProof/>
-        </w:rPr>
-      </w:pPr>
-      <w:hyperlink w:anchor="_Toc195619206" w:history="1">
+          <w:kern w:val="2"/>
+          <w:sz w:val="24"/>
+          <w:szCs w:val="24"/>
+          <w:lang w:eastAsia="hu-HU"/>
+          <w14:ligatures w14:val="standardContextual"/>
+        </w:rPr>
+      </w:pPr>
+      <w:hyperlink w:anchor="_Toc195648546" w:history="1">
         <w:r>
           <w:rPr>
             <w:rStyle w:val="Hiperhivatkozs"/>
@@ -15140,7 +15289,7 @@
             <w:noProof/>
             <w:webHidden/>
           </w:rPr>
-          <w:instrText xml:space="preserve"> PAGEREF _Toc195619206 \h </w:instrText>
+          <w:instrText xml:space="preserve"> PAGEREF _Toc195648546 \h </w:instrText>
         </w:r>
         <w:r>
           <w:rPr>
@@ -15178,10 +15327,16 @@
           <w:tab w:val="right" w:leader="dot" w:pos="9062"/>
         </w:tabs>
         <w:rPr>
+          <w:rFonts w:eastAsiaTheme="minorEastAsia"/>
           <w:noProof/>
-        </w:rPr>
-      </w:pPr>
-      <w:hyperlink w:anchor="_Toc195619207" w:history="1">
+          <w:kern w:val="2"/>
+          <w:sz w:val="24"/>
+          <w:szCs w:val="24"/>
+          <w:lang w:eastAsia="hu-HU"/>
+          <w14:ligatures w14:val="standardContextual"/>
+        </w:rPr>
+      </w:pPr>
+      <w:hyperlink w:anchor="_Toc195648547" w:history="1">
         <w:r>
           <w:rPr>
             <w:rStyle w:val="Hiperhivatkozs"/>
@@ -15208,7 +15363,7 @@
             <w:noProof/>
             <w:webHidden/>
           </w:rPr>
-          <w:instrText xml:space="preserve"> PAGEREF _Toc195619207 \h </w:instrText>
+          <w:instrText xml:space="preserve"> PAGEREF _Toc195648547 \h </w:instrText>
         </w:r>
         <w:r>
           <w:rPr>
@@ -15246,10 +15401,16 @@
           <w:tab w:val="right" w:leader="dot" w:pos="9062"/>
         </w:tabs>
         <w:rPr>
+          <w:rFonts w:eastAsiaTheme="minorEastAsia"/>
           <w:noProof/>
-        </w:rPr>
-      </w:pPr>
-      <w:hyperlink w:anchor="_Toc195619208" w:history="1">
+          <w:kern w:val="2"/>
+          <w:sz w:val="24"/>
+          <w:szCs w:val="24"/>
+          <w:lang w:eastAsia="hu-HU"/>
+          <w14:ligatures w14:val="standardContextual"/>
+        </w:rPr>
+      </w:pPr>
+      <w:hyperlink w:anchor="_Toc195648548" w:history="1">
         <w:r>
           <w:rPr>
             <w:rStyle w:val="Hiperhivatkozs"/>
@@ -15276,7 +15437,7 @@
             <w:noProof/>
             <w:webHidden/>
           </w:rPr>
-          <w:instrText xml:space="preserve"> PAGEREF _Toc195619208 \h </w:instrText>
+          <w:instrText xml:space="preserve"> PAGEREF _Toc195648548 \h </w:instrText>
         </w:r>
         <w:r>
           <w:rPr>
@@ -15314,10 +15475,16 @@
           <w:tab w:val="right" w:leader="dot" w:pos="9062"/>
         </w:tabs>
         <w:rPr>
+          <w:rFonts w:eastAsiaTheme="minorEastAsia"/>
           <w:noProof/>
-        </w:rPr>
-      </w:pPr>
-      <w:hyperlink w:anchor="_Toc195619209" w:history="1">
+          <w:kern w:val="2"/>
+          <w:sz w:val="24"/>
+          <w:szCs w:val="24"/>
+          <w:lang w:eastAsia="hu-HU"/>
+          <w14:ligatures w14:val="standardContextual"/>
+        </w:rPr>
+      </w:pPr>
+      <w:hyperlink w:anchor="_Toc195648549" w:history="1">
         <w:r>
           <w:rPr>
             <w:rStyle w:val="Hiperhivatkozs"/>
@@ -15344,7 +15511,7 @@
             <w:noProof/>
             <w:webHidden/>
           </w:rPr>
-          <w:instrText xml:space="preserve"> PAGEREF _Toc195619209 \h </w:instrText>
+          <w:instrText xml:space="preserve"> PAGEREF _Toc195648549 \h </w:instrText>
         </w:r>
         <w:r>
           <w:rPr>
@@ -15382,10 +15549,16 @@
           <w:tab w:val="right" w:leader="dot" w:pos="9062"/>
         </w:tabs>
         <w:rPr>
+          <w:rFonts w:eastAsiaTheme="minorEastAsia"/>
           <w:noProof/>
-        </w:rPr>
-      </w:pPr>
-      <w:hyperlink w:anchor="_Toc195619210" w:history="1">
+          <w:kern w:val="2"/>
+          <w:sz w:val="24"/>
+          <w:szCs w:val="24"/>
+          <w:lang w:eastAsia="hu-HU"/>
+          <w14:ligatures w14:val="standardContextual"/>
+        </w:rPr>
+      </w:pPr>
+      <w:hyperlink w:anchor="_Toc195648550" w:history="1">
         <w:r>
           <w:rPr>
             <w:rStyle w:val="Hiperhivatkozs"/>
@@ -15412,7 +15585,7 @@
             <w:noProof/>
             <w:webHidden/>
           </w:rPr>
-          <w:instrText xml:space="preserve"> PAGEREF _Toc195619210 \h </w:instrText>
+          <w:instrText xml:space="preserve"> PAGEREF _Toc195648550 \h </w:instrText>
         </w:r>
         <w:r>
           <w:rPr>
@@ -15450,10 +15623,16 @@
           <w:tab w:val="right" w:leader="dot" w:pos="9062"/>
         </w:tabs>
         <w:rPr>
+          <w:rFonts w:eastAsiaTheme="minorEastAsia"/>
           <w:noProof/>
-        </w:rPr>
-      </w:pPr>
-      <w:hyperlink w:anchor="_Toc195619211" w:history="1">
+          <w:kern w:val="2"/>
+          <w:sz w:val="24"/>
+          <w:szCs w:val="24"/>
+          <w:lang w:eastAsia="hu-HU"/>
+          <w14:ligatures w14:val="standardContextual"/>
+        </w:rPr>
+      </w:pPr>
+      <w:hyperlink w:anchor="_Toc195648551" w:history="1">
         <w:r>
           <w:rPr>
             <w:rStyle w:val="Hiperhivatkozs"/>
@@ -15480,7 +15659,7 @@
             <w:noProof/>
             <w:webHidden/>
           </w:rPr>
-          <w:instrText xml:space="preserve"> PAGEREF _Toc195619211 \h </w:instrText>
+          <w:instrText xml:space="preserve"> PAGEREF _Toc195648551 \h </w:instrText>
         </w:r>
         <w:r>
           <w:rPr>
@@ -15518,10 +15697,16 @@
           <w:tab w:val="right" w:leader="dot" w:pos="9062"/>
         </w:tabs>
         <w:rPr>
+          <w:rFonts w:eastAsiaTheme="minorEastAsia"/>
           <w:noProof/>
-        </w:rPr>
-      </w:pPr>
-      <w:hyperlink w:anchor="_Toc195619212" w:history="1">
+          <w:kern w:val="2"/>
+          <w:sz w:val="24"/>
+          <w:szCs w:val="24"/>
+          <w:lang w:eastAsia="hu-HU"/>
+          <w14:ligatures w14:val="standardContextual"/>
+        </w:rPr>
+      </w:pPr>
+      <w:hyperlink w:anchor="_Toc195648552" w:history="1">
         <w:r>
           <w:rPr>
             <w:rStyle w:val="Hiperhivatkozs"/>
@@ -15548,7 +15733,7 @@
             <w:noProof/>
             <w:webHidden/>
           </w:rPr>
-          <w:instrText xml:space="preserve"> PAGEREF _Toc195619212 \h </w:instrText>
+          <w:instrText xml:space="preserve"> PAGEREF _Toc195648552 \h </w:instrText>
         </w:r>
         <w:r>
           <w:rPr>
@@ -15586,10 +15771,16 @@
           <w:tab w:val="right" w:leader="dot" w:pos="9062"/>
         </w:tabs>
         <w:rPr>
+          <w:rFonts w:eastAsiaTheme="minorEastAsia"/>
           <w:noProof/>
-        </w:rPr>
-      </w:pPr>
-      <w:hyperlink w:anchor="_Toc195619213" w:history="1">
+          <w:kern w:val="2"/>
+          <w:sz w:val="24"/>
+          <w:szCs w:val="24"/>
+          <w:lang w:eastAsia="hu-HU"/>
+          <w14:ligatures w14:val="standardContextual"/>
+        </w:rPr>
+      </w:pPr>
+      <w:hyperlink w:anchor="_Toc195648553" w:history="1">
         <w:r>
           <w:rPr>
             <w:rStyle w:val="Hiperhivatkozs"/>
@@ -15616,7 +15807,7 @@
             <w:noProof/>
             <w:webHidden/>
           </w:rPr>
-          <w:instrText xml:space="preserve"> PAGEREF _Toc195619213 \h </w:instrText>
+          <w:instrText xml:space="preserve"> PAGEREF _Toc195648553 \h </w:instrText>
         </w:r>
         <w:r>
           <w:rPr>
@@ -15654,10 +15845,16 @@
           <w:tab w:val="right" w:leader="dot" w:pos="9062"/>
         </w:tabs>
         <w:rPr>
+          <w:rFonts w:eastAsiaTheme="minorEastAsia"/>
           <w:noProof/>
-        </w:rPr>
-      </w:pPr>
-      <w:hyperlink w:anchor="_Toc195619214" w:history="1">
+          <w:kern w:val="2"/>
+          <w:sz w:val="24"/>
+          <w:szCs w:val="24"/>
+          <w:lang w:eastAsia="hu-HU"/>
+          <w14:ligatures w14:val="standardContextual"/>
+        </w:rPr>
+      </w:pPr>
+      <w:hyperlink w:anchor="_Toc195648554" w:history="1">
         <w:r>
           <w:rPr>
             <w:rStyle w:val="Hiperhivatkozs"/>
@@ -15684,7 +15881,7 @@
             <w:noProof/>
             <w:webHidden/>
           </w:rPr>
-          <w:instrText xml:space="preserve"> PAGEREF _Toc195619214 \h </w:instrText>
+          <w:instrText xml:space="preserve"> PAGEREF _Toc195648554 \h </w:instrText>
         </w:r>
         <w:r>
           <w:rPr>
@@ -15722,10 +15919,16 @@
           <w:tab w:val="right" w:leader="dot" w:pos="9062"/>
         </w:tabs>
         <w:rPr>
+          <w:rFonts w:eastAsiaTheme="minorEastAsia"/>
           <w:noProof/>
-        </w:rPr>
-      </w:pPr>
-      <w:hyperlink w:anchor="_Toc195619215" w:history="1">
+          <w:kern w:val="2"/>
+          <w:sz w:val="24"/>
+          <w:szCs w:val="24"/>
+          <w:lang w:eastAsia="hu-HU"/>
+          <w14:ligatures w14:val="standardContextual"/>
+        </w:rPr>
+      </w:pPr>
+      <w:hyperlink w:anchor="_Toc195648555" w:history="1">
         <w:r>
           <w:rPr>
             <w:rStyle w:val="Hiperhivatkozs"/>
@@ -15752,7 +15955,7 @@
             <w:noProof/>
             <w:webHidden/>
           </w:rPr>
-          <w:instrText xml:space="preserve"> PAGEREF _Toc195619215 \h </w:instrText>
+          <w:instrText xml:space="preserve"> PAGEREF _Toc195648555 \h </w:instrText>
         </w:r>
         <w:r>
           <w:rPr>
@@ -15999,10 +16202,7 @@
         <w:footnoteRef/>
       </w:r>
       <w:r>
-        <w:t xml:space="preserve"> </w:t>
-      </w:r>
-      <w:r>
-        <w:t>provider:</w:t>
+        <w:t xml:space="preserve"> provider:</w:t>
       </w:r>
       <w:r>
         <w:t xml:space="preserve"> Adatok megosztására szolgáló eszköz React-ben.</w:t>
@@ -19968,7 +20168,6 @@
   <w:style w:type="character" w:default="1" w:styleId="Bekezdsalapbettpusa">
     <w:name w:val="Default Paragraph Font"/>
     <w:uiPriority w:val="1"/>
-    <w:semiHidden/>
     <w:unhideWhenUsed/>
   </w:style>
   <w:style w:type="table" w:default="1" w:styleId="Normltblzat">

</xml_diff>

<commit_message>
feat(docs): added more content
</commit_message>
<xml_diff>
--- a/documentation/dokumentacio.docx
+++ b/documentation/dokumentacio.docx
@@ -14,13 +14,8 @@
       <w:pPr>
         <w:pStyle w:val="tajekoztato"/>
       </w:pPr>
-      <w:proofErr w:type="spellStart"/>
-      <w:r>
-        <w:t>Verebély</w:t>
-      </w:r>
-      <w:proofErr w:type="spellEnd"/>
-      <w:r>
-        <w:t xml:space="preserve"> László Technikum</w:t>
+      <w:r>
+        <w:t>Verebély László Technikum</w:t>
       </w:r>
     </w:p>
     <w:p>
@@ -153,27 +148,13 @@
         <w:rPr>
           <w:rFonts w:ascii="Calibri" w:hAnsi="Calibri" w:cs="Calibri"/>
         </w:rPr>
-        <w:t xml:space="preserve">a BMSZC </w:t>
-      </w:r>
-      <w:proofErr w:type="spellStart"/>
+        <w:t>a BMSZC Verebél</w:t>
+      </w:r>
       <w:r>
         <w:rPr>
           <w:rFonts w:ascii="Calibri" w:hAnsi="Calibri" w:cs="Calibri"/>
         </w:rPr>
-        <w:t>Verebél</w:t>
-      </w:r>
-      <w:r>
-        <w:rPr>
-          <w:rFonts w:ascii="Calibri" w:hAnsi="Calibri" w:cs="Calibri"/>
-        </w:rPr>
-        <w:t>y</w:t>
-      </w:r>
-      <w:proofErr w:type="spellEnd"/>
-      <w:r>
-        <w:rPr>
-          <w:rFonts w:ascii="Calibri" w:hAnsi="Calibri" w:cs="Calibri"/>
-        </w:rPr>
-        <w:t xml:space="preserve"> László Technikum 5 0613 12 03</w:t>
+        <w:t>y László Technikum 5 0613 12 03</w:t>
       </w:r>
       <w:r>
         <w:rPr>
@@ -3051,14 +3032,12 @@
         <w:t xml:space="preserve">A vizsgaremek témája egy már meglévő szoftver ihlette, a </w:t>
       </w:r>
       <w:hyperlink r:id="rId10" w:history="1">
-        <w:proofErr w:type="spellStart"/>
         <w:r>
           <w:rPr>
             <w:rStyle w:val="Hiperhivatkozs"/>
           </w:rPr>
           <w:t>Kahoot</w:t>
         </w:r>
-        <w:proofErr w:type="spellEnd"/>
       </w:hyperlink>
       <w:r>
         <w:t>. Az alap elgondolás az volt, hogy a felhasználók kvízeket tudjanak létrehozni, azokat szerkeszteni, megosztani</w:t>
@@ -3067,15 +3046,7 @@
         <w:t>,</w:t>
       </w:r>
       <w:r>
-        <w:t xml:space="preserve"> illetve a legfőbb feladata, hogy lehessen játszani bárkivel bárhol a világon valós időben. Fontosnak tartottuk, hogy ne egy </w:t>
-      </w:r>
-      <w:proofErr w:type="spellStart"/>
-      <w:r>
-        <w:t>Kahoot</w:t>
-      </w:r>
-      <w:proofErr w:type="spellEnd"/>
-      <w:r>
-        <w:t xml:space="preserve"> másolatot készítsünk, hanem az alap elgondolást bővítsük</w:t>
+        <w:t xml:space="preserve"> illetve a legfőbb feladata, hogy lehessen játszani bárkivel bárhol a világon valós időben. Fontosnak tartottuk, hogy ne egy Kahoot másolatot készítsünk, hanem az alap elgondolást bővítsük</w:t>
       </w:r>
       <w:r>
         <w:t xml:space="preserve"> ki a saját elképzeléseinkkel és megoldásainkkal. Szerettünk volna egy korszerűbb kialakítású oldalt, amitől az embernek megjön a kedve ahhoz, hogy bizonyos témaköröket </w:t>
@@ -3093,31 +3064,7 @@
         <w:t>,</w:t>
       </w:r>
       <w:r>
-        <w:t xml:space="preserve"> hogy publikus vagy privát legyen. Privát esetében csak a készítő látja és indíthatja el. A létrehozást követően egyből szerkeszthetjük a kvíz minden elemét, beleértve az előbb felsorolt lehetőségeket is. Úgy nevezett „</w:t>
-      </w:r>
-      <w:proofErr w:type="spellStart"/>
-      <w:r>
-        <w:t>slide</w:t>
-      </w:r>
-      <w:proofErr w:type="spellEnd"/>
-      <w:r>
-        <w:t>” -</w:t>
-      </w:r>
-      <w:proofErr w:type="spellStart"/>
-      <w:r>
-        <w:t>okat</w:t>
-      </w:r>
-      <w:proofErr w:type="spellEnd"/>
-      <w:r>
-        <w:t xml:space="preserve"> hozhatunk létre, amelyek fognak lepörögni a lejátszás alatt. 4 féle </w:t>
-      </w:r>
-      <w:proofErr w:type="spellStart"/>
-      <w:r>
-        <w:t>slide</w:t>
-      </w:r>
-      <w:proofErr w:type="spellEnd"/>
-      <w:r>
-        <w:t xml:space="preserve"> típus közül lehet választani:</w:t>
+        <w:t xml:space="preserve"> hogy publikus vagy privát legyen. Privát esetében csak a készítő látja és indíthatja el. A létrehozást követően egyből szerkeszthetjük a kvíz minden elemét, beleértve az előbb felsorolt lehetőségeket is. Úgy nevezett „slide” -okat hozhatunk létre, amelyek fognak lepörögni a lejátszás alatt. 4 féle slide típus közül lehet választani:</w:t>
       </w:r>
     </w:p>
     <w:p>
@@ -3153,13 +3100,8 @@
         </w:numPr>
       </w:pPr>
       <w:r>
-        <w:t xml:space="preserve">Infó </w:t>
-      </w:r>
-      <w:proofErr w:type="spellStart"/>
-      <w:r>
-        <w:t>slide</w:t>
-      </w:r>
-      <w:proofErr w:type="spellEnd"/>
+        <w:t>Infó slide</w:t>
+      </w:r>
     </w:p>
     <w:p>
       <w:pPr>
@@ -3175,15 +3117,7 @@
     </w:p>
     <w:p>
       <w:r>
-        <w:t xml:space="preserve">Minden slide-ra külön-külön be lehet állítani, hogy hány másodpercig jelenjen meg, milyen sorrendben legyenek a kérdések, sőt még a </w:t>
-      </w:r>
-      <w:proofErr w:type="spellStart"/>
-      <w:r>
-        <w:t>slideokat</w:t>
-      </w:r>
-      <w:proofErr w:type="spellEnd"/>
-      <w:r>
-        <w:t xml:space="preserve"> is egyszerűen tudjuk mozgatni, ha netán nem tetszene a sorrend.</w:t>
+        <w:t>Minden slide-ra külön-külön be lehet állítani, hogy hány másodpercig jelenjen meg, milyen sorrendben legyenek a kérdések, sőt még a slideokat is egyszerűen tudjuk mozgatni, ha netán nem tetszene a sorrend.</w:t>
       </w:r>
     </w:p>
     <w:p>
@@ -3194,6 +3128,28 @@
     <w:p>
       <w:r>
         <w:t>Amellett, hogy milyen összetett egy ilyesféle webapplikáció elkészítése, rendkívül izgalmas és motiváló is, hiszen rengeteg lehetőséget rejt magában a tanulás és a szórakozás ötvözése egy interaktív platformon keresztül.</w:t>
+      </w:r>
+    </w:p>
+    <w:p>
+      <w:r>
+        <w:t xml:space="preserve">A </w:t>
+      </w:r>
+      <w:r>
+        <w:t>web</w:t>
+      </w:r>
+      <w:r>
+        <w:t xml:space="preserve">oldal az </w:t>
+      </w:r>
+      <w:hyperlink r:id="rId11" w:history="1">
+        <w:r>
+          <w:rPr>
+            <w:rStyle w:val="Hiperhivatkozs"/>
+          </w:rPr>
+          <w:t>elmecsata.hu</w:t>
+        </w:r>
+      </w:hyperlink>
+      <w:r>
+        <w:t>-n elérhető és megtekinthető.</w:t>
       </w:r>
     </w:p>
     <w:p/>
@@ -3240,7 +3196,7 @@
       <w:r>
         <w:t xml:space="preserve">IDE (Integrált fejlesztői környezet): </w:t>
       </w:r>
-      <w:hyperlink r:id="rId11" w:history="1">
+      <w:hyperlink r:id="rId12" w:history="1">
         <w:r>
           <w:rPr>
             <w:rStyle w:val="Hiperhivatkozs"/>
@@ -3251,21 +3207,13 @@
       <w:r>
         <w:t xml:space="preserve">, </w:t>
       </w:r>
-      <w:hyperlink r:id="rId12" w:history="1">
+      <w:hyperlink r:id="rId13" w:history="1">
         <w:r>
           <w:rPr>
             <w:rStyle w:val="Hiperhivatkozs"/>
           </w:rPr>
-          <w:t xml:space="preserve">Visual Studio </w:t>
-        </w:r>
-        <w:proofErr w:type="spellStart"/>
-        <w:r>
-          <w:rPr>
-            <w:rStyle w:val="Hiperhivatkozs"/>
-          </w:rPr>
-          <w:t>Code</w:t>
-        </w:r>
-        <w:proofErr w:type="spellEnd"/>
+          <w:t>Visual Studio Code</w:t>
+        </w:r>
       </w:hyperlink>
     </w:p>
     <w:p>
@@ -3277,39 +3225,15 @@
         </w:numPr>
       </w:pPr>
       <w:r>
-        <w:t xml:space="preserve">Csomag és </w:t>
-      </w:r>
-      <w:proofErr w:type="spellStart"/>
-      <w:r>
-        <w:t>monorepo</w:t>
-      </w:r>
-      <w:proofErr w:type="spellEnd"/>
-      <w:r>
-        <w:t xml:space="preserve">-kezelő: </w:t>
-      </w:r>
-      <w:hyperlink r:id="rId13" w:history="1">
-        <w:proofErr w:type="spellStart"/>
+        <w:t xml:space="preserve">Csomag és monorepo-kezelő: </w:t>
+      </w:r>
+      <w:hyperlink r:id="rId14" w:history="1">
         <w:r>
           <w:rPr>
             <w:rStyle w:val="Hiperhivatkozs"/>
           </w:rPr>
-          <w:t>pnpm</w:t>
-        </w:r>
-        <w:proofErr w:type="spellEnd"/>
-        <w:r>
-          <w:rPr>
-            <w:rStyle w:val="Hiperhivatkozs"/>
-          </w:rPr>
-          <w:t xml:space="preserve"> </w:t>
-        </w:r>
-        <w:proofErr w:type="spellStart"/>
-        <w:r>
-          <w:rPr>
-            <w:rStyle w:val="Hiperhivatkozs"/>
-          </w:rPr>
-          <w:t>workspace</w:t>
-        </w:r>
-        <w:proofErr w:type="spellEnd"/>
+          <w:t>pnpm workspace</w:t>
+        </w:r>
       </w:hyperlink>
     </w:p>
     <w:p>
@@ -3323,15 +3247,13 @@
       <w:r>
         <w:t xml:space="preserve">Adatbázis-adminisztrációs eszköz: </w:t>
       </w:r>
-      <w:hyperlink r:id="rId14" w:history="1">
-        <w:proofErr w:type="spellStart"/>
+      <w:hyperlink r:id="rId15" w:history="1">
         <w:r>
           <w:rPr>
             <w:rStyle w:val="Hiperhivatkozs"/>
           </w:rPr>
           <w:t>HeidiSQL</w:t>
         </w:r>
-        <w:proofErr w:type="spellEnd"/>
       </w:hyperlink>
     </w:p>
     <w:p>
@@ -3345,7 +3267,7 @@
       <w:r>
         <w:t xml:space="preserve">Fejlesztői környezet: </w:t>
       </w:r>
-      <w:hyperlink r:id="rId15" w:history="1">
+      <w:hyperlink r:id="rId16" w:history="1">
         <w:r>
           <w:rPr>
             <w:rStyle w:val="Hiperhivatkozs"/>
@@ -3356,7 +3278,7 @@
       <w:r>
         <w:t>, .</w:t>
       </w:r>
-      <w:hyperlink r:id="rId16" w:history="1">
+      <w:hyperlink r:id="rId17" w:history="1">
         <w:r>
           <w:rPr>
             <w:rStyle w:val="Hiperhivatkozs"/>
@@ -3376,28 +3298,24 @@
       <w:r>
         <w:t xml:space="preserve">Kódformázás és ellenőrzés: </w:t>
       </w:r>
-      <w:hyperlink r:id="rId17" w:history="1">
-        <w:proofErr w:type="spellStart"/>
+      <w:hyperlink r:id="rId18" w:history="1">
         <w:r>
           <w:rPr>
             <w:rStyle w:val="Hiperhivatkozs"/>
           </w:rPr>
           <w:t>Prettier</w:t>
         </w:r>
-        <w:proofErr w:type="spellEnd"/>
       </w:hyperlink>
       <w:r>
         <w:t xml:space="preserve">, </w:t>
       </w:r>
-      <w:hyperlink r:id="rId18" w:history="1">
-        <w:proofErr w:type="spellStart"/>
+      <w:hyperlink r:id="rId19" w:history="1">
         <w:r>
           <w:rPr>
             <w:rStyle w:val="Hiperhivatkozs"/>
           </w:rPr>
           <w:t>ESLint</w:t>
         </w:r>
-        <w:proofErr w:type="spellEnd"/>
       </w:hyperlink>
     </w:p>
     <w:p>
@@ -3428,20 +3346,18 @@
       <w:r>
         <w:t xml:space="preserve">Programozási nyelvek: </w:t>
       </w:r>
-      <w:hyperlink r:id="rId19" w:history="1">
-        <w:proofErr w:type="spellStart"/>
+      <w:hyperlink r:id="rId20" w:history="1">
         <w:r>
           <w:rPr>
             <w:rStyle w:val="Hiperhivatkozs"/>
           </w:rPr>
           <w:t>TypeScript</w:t>
         </w:r>
-        <w:proofErr w:type="spellEnd"/>
       </w:hyperlink>
       <w:r>
         <w:t xml:space="preserve">, </w:t>
       </w:r>
-      <w:hyperlink r:id="rId20" w:history="1">
+      <w:hyperlink r:id="rId21" w:history="1">
         <w:r>
           <w:rPr>
             <w:rStyle w:val="Hiperhivatkozs"/>
@@ -3461,7 +3377,7 @@
       <w:r>
         <w:t xml:space="preserve">Webes technológiák: </w:t>
       </w:r>
-      <w:hyperlink r:id="rId21" w:history="1">
+      <w:hyperlink r:id="rId22" w:history="1">
         <w:r>
           <w:rPr>
             <w:rStyle w:val="Hiperhivatkozs"/>
@@ -3472,33 +3388,29 @@
       <w:r>
         <w:t xml:space="preserve">, </w:t>
       </w:r>
-      <w:hyperlink r:id="rId22" w:history="1">
-        <w:proofErr w:type="spellStart"/>
+      <w:hyperlink r:id="rId23" w:history="1">
         <w:r>
           <w:rPr>
             <w:rStyle w:val="Hiperhivatkozs"/>
           </w:rPr>
           <w:t>React</w:t>
         </w:r>
-        <w:proofErr w:type="spellEnd"/>
       </w:hyperlink>
       <w:r>
         <w:t xml:space="preserve">, </w:t>
       </w:r>
-      <w:hyperlink r:id="rId23" w:history="1">
-        <w:proofErr w:type="spellStart"/>
+      <w:hyperlink r:id="rId24" w:history="1">
         <w:r>
           <w:rPr>
             <w:rStyle w:val="Hiperhivatkozs"/>
           </w:rPr>
           <w:t>TailWindCSS</w:t>
         </w:r>
-        <w:proofErr w:type="spellEnd"/>
       </w:hyperlink>
       <w:r>
         <w:t xml:space="preserve">, </w:t>
       </w:r>
-      <w:hyperlink r:id="rId24" w:history="1">
+      <w:hyperlink r:id="rId25" w:history="1">
         <w:r>
           <w:rPr>
             <w:rStyle w:val="Hiperhivatkozs"/>
@@ -3518,47 +3430,23 @@
       <w:r>
         <w:t xml:space="preserve">Adatbáziskezelés és ORM: </w:t>
       </w:r>
-      <w:hyperlink r:id="rId25" w:history="1">
-        <w:proofErr w:type="spellStart"/>
+      <w:hyperlink r:id="rId26" w:history="1">
         <w:r>
           <w:rPr>
             <w:rStyle w:val="Hiperhivatkozs"/>
           </w:rPr>
-          <w:t>MariaDB</w:t>
-        </w:r>
-        <w:proofErr w:type="spellEnd"/>
+          <w:t>MariaDB/MySQL</w:t>
+        </w:r>
+      </w:hyperlink>
+      <w:r>
+        <w:t xml:space="preserve">, </w:t>
+      </w:r>
+      <w:hyperlink r:id="rId27" w:history="1">
         <w:r>
           <w:rPr>
             <w:rStyle w:val="Hiperhivatkozs"/>
           </w:rPr>
-          <w:t>/</w:t>
-        </w:r>
-        <w:proofErr w:type="spellStart"/>
-        <w:r>
-          <w:rPr>
-            <w:rStyle w:val="Hiperhivatkozs"/>
-          </w:rPr>
-          <w:t>MySQL</w:t>
-        </w:r>
-        <w:proofErr w:type="spellEnd"/>
-      </w:hyperlink>
-      <w:r>
-        <w:t xml:space="preserve">, </w:t>
-      </w:r>
-      <w:hyperlink r:id="rId26" w:history="1">
-        <w:proofErr w:type="spellStart"/>
-        <w:r>
-          <w:rPr>
-            <w:rStyle w:val="Hiperhivatkozs"/>
-          </w:rPr>
-          <w:t>Drizzle</w:t>
-        </w:r>
-        <w:proofErr w:type="spellEnd"/>
-        <w:r>
-          <w:rPr>
-            <w:rStyle w:val="Hiperhivatkozs"/>
-          </w:rPr>
-          <w:t xml:space="preserve"> ORM</w:t>
+          <w:t>Drizzle ORM</w:t>
         </w:r>
       </w:hyperlink>
     </w:p>
@@ -3578,58 +3466,40 @@
       <w:r>
         <w:t xml:space="preserve">UI komponens könyvtárak: </w:t>
       </w:r>
-      <w:hyperlink r:id="rId27" w:history="1">
-        <w:proofErr w:type="spellStart"/>
+      <w:hyperlink r:id="rId28" w:history="1">
         <w:r>
           <w:rPr>
             <w:rStyle w:val="Hiperhivatkozs"/>
           </w:rPr>
           <w:t>shadcn</w:t>
         </w:r>
-        <w:proofErr w:type="spellEnd"/>
       </w:hyperlink>
       <w:r>
         <w:t xml:space="preserve">, </w:t>
       </w:r>
-      <w:hyperlink r:id="rId28" w:history="1">
-        <w:proofErr w:type="spellStart"/>
+      <w:hyperlink r:id="rId29" w:history="1">
         <w:r>
           <w:rPr>
             <w:rStyle w:val="Hiperhivatkozs"/>
           </w:rPr>
-          <w:t>Origin</w:t>
-        </w:r>
-        <w:proofErr w:type="spellEnd"/>
+          <w:t>Origin UI</w:t>
+        </w:r>
+      </w:hyperlink>
+      <w:r>
+        <w:t xml:space="preserve">, </w:t>
+      </w:r>
+      <w:hyperlink r:id="rId30" w:history="1">
         <w:r>
           <w:rPr>
             <w:rStyle w:val="Hiperhivatkozs"/>
           </w:rPr>
-          <w:t xml:space="preserve"> UI</w:t>
+          <w:t>Magic UI</w:t>
         </w:r>
       </w:hyperlink>
       <w:r>
         <w:t xml:space="preserve">, </w:t>
       </w:r>
-      <w:hyperlink r:id="rId29" w:history="1">
-        <w:proofErr w:type="spellStart"/>
-        <w:r>
-          <w:rPr>
-            <w:rStyle w:val="Hiperhivatkozs"/>
-          </w:rPr>
-          <w:t>Magic</w:t>
-        </w:r>
-        <w:proofErr w:type="spellEnd"/>
-        <w:r>
-          <w:rPr>
-            <w:rStyle w:val="Hiperhivatkozs"/>
-          </w:rPr>
-          <w:t xml:space="preserve"> UI</w:t>
-        </w:r>
-      </w:hyperlink>
-      <w:r>
-        <w:t xml:space="preserve">, </w:t>
-      </w:r>
-      <w:hyperlink r:id="rId30" w:history="1">
+      <w:hyperlink r:id="rId31" w:history="1">
         <w:r>
           <w:rPr>
             <w:rStyle w:val="Hiperhivatkozs"/>
@@ -3932,21 +3802,7 @@
               <w:rPr>
                 <w:b w:val="0"/>
               </w:rPr>
-              <w:t xml:space="preserve">A weboldal </w:t>
-            </w:r>
-            <w:proofErr w:type="spellStart"/>
-            <w:r>
-              <w:rPr>
-                <w:b w:val="0"/>
-              </w:rPr>
-              <w:t>autentikációjának</w:t>
-            </w:r>
-            <w:proofErr w:type="spellEnd"/>
-            <w:r>
-              <w:rPr>
-                <w:b w:val="0"/>
-              </w:rPr>
-              <w:t xml:space="preserve"> elkészítése</w:t>
+              <w:t>A weboldal autentikációjának elkészítése</w:t>
             </w:r>
           </w:p>
         </w:tc>
@@ -4092,7 +3948,7 @@
     <w:p>
       <w:pPr>
         <w:sectPr>
-          <w:footerReference w:type="default" r:id="rId31"/>
+          <w:footerReference w:type="default" r:id="rId32"/>
           <w:pgSz w:w="11906" w:h="16838"/>
           <w:pgMar w:top="1417" w:right="1417" w:bottom="1417" w:left="1417" w:header="708" w:footer="708" w:gutter="0"/>
           <w:cols w:space="708"/>
@@ -4142,15 +3998,13 @@
       <w:r>
         <w:t xml:space="preserve">használtuk a </w:t>
       </w:r>
-      <w:hyperlink r:id="rId32" w:history="1">
-        <w:proofErr w:type="spellStart"/>
+      <w:hyperlink r:id="rId33" w:history="1">
         <w:r>
           <w:rPr>
             <w:rStyle w:val="Hiperhivatkozs"/>
           </w:rPr>
           <w:t>Figma</w:t>
         </w:r>
-        <w:proofErr w:type="spellEnd"/>
       </w:hyperlink>
       <w:r>
         <w:t xml:space="preserve"> nevű szoftvert, hogy a lehető legjobb képet kapjuk az elképzelé</w:t>
@@ -4186,7 +4040,7 @@
                     </pic:cNvPicPr>
                   </pic:nvPicPr>
                   <pic:blipFill>
-                    <a:blip r:embed="rId33">
+                    <a:blip r:embed="rId34">
                       <a:extLst>
                         <a:ext uri="{28A0092B-C50C-407E-A947-70E740481C1C}">
                           <a14:useLocalDpi xmlns:a14="http://schemas.microsoft.com/office/drawing/2010/main" val="0"/>
@@ -4232,15 +4086,7 @@
         </w:r>
       </w:fldSimple>
       <w:r>
-        <w:t xml:space="preserve">. ábra - A </w:t>
-      </w:r>
-      <w:proofErr w:type="spellStart"/>
-      <w:r>
-        <w:t>Figma</w:t>
-      </w:r>
-      <w:proofErr w:type="spellEnd"/>
-      <w:r>
-        <w:t>-ban készült alap design ötlet</w:t>
+        <w:t>. ábra - A Figma-ban készült alap design ötlet</w:t>
       </w:r>
       <w:bookmarkEnd w:id="7"/>
     </w:p>
@@ -4257,14 +4103,12 @@
       <w:r>
         <w:t xml:space="preserve">-re, amely a </w:t>
       </w:r>
-      <w:proofErr w:type="spellStart"/>
       <w:r>
         <w:rPr>
           <w:b/>
         </w:rPr>
         <w:t>React</w:t>
       </w:r>
-      <w:proofErr w:type="spellEnd"/>
       <w:r>
         <w:t>-alapú webes alkalmazásokat kínál a szerveroldali és statikus megjelenítéssel.</w:t>
       </w:r>
@@ -4303,35 +4147,14 @@
           <w:b w:val="0"/>
           <w:i/>
         </w:rPr>
-        <w:t>(</w:t>
-      </w:r>
-      <w:proofErr w:type="spellStart"/>
-      <w:r>
-        <w:rPr>
-          <w:b w:val="0"/>
-          <w:i/>
-        </w:rPr>
-        <w:t>monorepo</w:t>
-      </w:r>
-      <w:proofErr w:type="spellEnd"/>
-      <w:r>
-        <w:rPr>
-          <w:b w:val="0"/>
-          <w:i/>
-        </w:rPr>
-        <w:t>)</w:t>
+        <w:t>(monorepo)</w:t>
       </w:r>
       <w:bookmarkEnd w:id="8"/>
     </w:p>
     <w:p>
       <w:r>
-        <w:t xml:space="preserve">A projekt egy </w:t>
-      </w:r>
-      <w:proofErr w:type="spellStart"/>
-      <w:r>
-        <w:t>monorepo</w:t>
-      </w:r>
-      <w:proofErr w:type="spellEnd"/>
+        <w:t>A projekt egy monorepo</w:t>
+      </w:r>
       <w:r>
         <w:rPr>
           <w:rStyle w:val="Lbjegyzet-hivatkozs"/>
@@ -4348,19 +4171,11 @@
           <w:b/>
         </w:rPr>
       </w:pPr>
-      <w:proofErr w:type="spellStart"/>
       <w:r>
         <w:rPr>
           <w:b/>
         </w:rPr>
-        <w:t>WebSocket</w:t>
-      </w:r>
-      <w:proofErr w:type="spellEnd"/>
-      <w:r>
-        <w:rPr>
-          <w:b/>
-        </w:rPr>
-        <w:t xml:space="preserve"> alkalmazás:</w:t>
+        <w:t>WebSocket alkalmazás:</w:t>
       </w:r>
     </w:p>
     <w:p>
@@ -4375,15 +4190,7 @@
         </w:rPr>
       </w:pPr>
       <w:r>
-        <w:t xml:space="preserve">Ez az applikáció indít egy HTTP- és egy </w:t>
-      </w:r>
-      <w:proofErr w:type="spellStart"/>
-      <w:r>
-        <w:t>WebSocket</w:t>
-      </w:r>
-      <w:proofErr w:type="spellEnd"/>
-      <w:r>
-        <w:t>-szervert. Fő feladata a valós idejű kommunikáció biztosítása, a folyamatban lévő játékok kezelése, események továbbítása a frontend részére, és a játékmenet logikájának kiszolgálása.</w:t>
+        <w:t>Ez az applikáció indít egy HTTP- és egy WebSocket-szervert. Fő feladata a valós idejű kommunikáció biztosítása, a folyamatban lévő játékok kezelése, események továbbítása a frontend részére, és a játékmenet logikájának kiszolgálása.</w:t>
       </w:r>
     </w:p>
     <w:p>
@@ -4449,23 +4256,7 @@
     </w:p>
     <w:p>
       <w:r>
-        <w:t xml:space="preserve">Mindkét alkalmazás </w:t>
-      </w:r>
-      <w:proofErr w:type="spellStart"/>
-      <w:r>
-        <w:t>TypeScript</w:t>
-      </w:r>
-      <w:proofErr w:type="spellEnd"/>
-      <w:r>
-        <w:t xml:space="preserve"> alapú. A </w:t>
-      </w:r>
-      <w:proofErr w:type="spellStart"/>
-      <w:r>
-        <w:t>TypeScript</w:t>
-      </w:r>
-      <w:proofErr w:type="spellEnd"/>
-      <w:r>
-        <w:t xml:space="preserve"> nagy előnye – ahogy azt a neve is mutatja – a típusbiztonság:</w:t>
+        <w:t>Mindkét alkalmazás TypeScript alapú. A TypeScript nagy előnye – ahogy azt a neve is mutatja – a típusbiztonság:</w:t>
       </w:r>
     </w:p>
     <w:p>
@@ -4491,46 +4282,16 @@
           <w:b/>
         </w:rPr>
       </w:pPr>
-      <w:proofErr w:type="spellStart"/>
       <w:r>
         <w:rPr>
           <w:b/>
         </w:rPr>
-        <w:t>packages</w:t>
-      </w:r>
-      <w:proofErr w:type="spellEnd"/>
-      <w:r>
-        <w:rPr>
-          <w:b/>
-        </w:rPr>
-        <w:t>/</w:t>
-      </w:r>
-      <w:proofErr w:type="spellStart"/>
-      <w:r>
-        <w:rPr>
-          <w:b/>
-        </w:rPr>
-        <w:t>types</w:t>
-      </w:r>
-      <w:proofErr w:type="spellEnd"/>
-      <w:r>
-        <w:rPr>
-          <w:b/>
-        </w:rPr>
-        <w:t>:</w:t>
-      </w:r>
-    </w:p>
-    <w:p>
-      <w:r>
-        <w:t xml:space="preserve">Ebben a csomagban találhatók a projektben használt összetett megosztott </w:t>
-      </w:r>
-      <w:proofErr w:type="spellStart"/>
-      <w:r>
-        <w:t>TypeScript</w:t>
-      </w:r>
-      <w:proofErr w:type="spellEnd"/>
-      <w:r>
-        <w:t xml:space="preserve"> típusdefiníció. Például a játéklogikához, országokhoz, kvízekhez és felhasználókhoz kapcsolódó típusok innen származnak. Ezeket mind a frontend, mind a backend alkalmazás importálja, így garantálható az egységes típushasználat.</w:t>
+        <w:t>packages/types:</w:t>
+      </w:r>
+    </w:p>
+    <w:p>
+      <w:r>
+        <w:t>Ebben a csomagban találhatók a projektben használt összetett megosztott TypeScript típusdefiníció. Például a játéklogikához, országokhoz, kvízekhez és felhasználókhoz kapcsolódó típusok innen származnak. Ezeket mind a frontend, mind a backend alkalmazás importálja, így garantálható az egységes típushasználat.</w:t>
       </w:r>
     </w:p>
     <w:p>
@@ -4549,71 +4310,17 @@
           <w:b/>
         </w:rPr>
       </w:pPr>
-      <w:proofErr w:type="spellStart"/>
       <w:r>
         <w:rPr>
           <w:b/>
         </w:rPr>
         <w:lastRenderedPageBreak/>
-        <w:t>packages</w:t>
-      </w:r>
-      <w:proofErr w:type="spellEnd"/>
-      <w:r>
-        <w:rPr>
-          <w:b/>
-        </w:rPr>
-        <w:t>/</w:t>
-      </w:r>
-      <w:proofErr w:type="spellStart"/>
-      <w:r>
-        <w:rPr>
-          <w:b/>
-        </w:rPr>
-        <w:t>database</w:t>
-      </w:r>
-      <w:proofErr w:type="spellEnd"/>
-      <w:r>
-        <w:rPr>
-          <w:b/>
-        </w:rPr>
-        <w:t>:</w:t>
-      </w:r>
-    </w:p>
-    <w:p>
-      <w:r>
-        <w:t xml:space="preserve">Ez a csomag felel az adatbáziskapcsolatért és a </w:t>
-      </w:r>
-      <w:proofErr w:type="spellStart"/>
-      <w:r>
-        <w:t>Drizzle</w:t>
-      </w:r>
-      <w:proofErr w:type="spellEnd"/>
-      <w:r>
-        <w:t xml:space="preserve"> ORM beállításaiért. Tartalmazza az adatbázis sémáját, a migrációs fájlokat, valamint az SQL-lekérdezéseket. Mivel </w:t>
-      </w:r>
-      <w:proofErr w:type="spellStart"/>
-      <w:r>
-        <w:t>TypeScript</w:t>
-      </w:r>
-      <w:proofErr w:type="spellEnd"/>
-      <w:r>
-        <w:t xml:space="preserve">-ben íródott, a </w:t>
-      </w:r>
-      <w:proofErr w:type="spellStart"/>
-      <w:r>
-        <w:t>types</w:t>
-      </w:r>
-      <w:proofErr w:type="spellEnd"/>
-      <w:r>
-        <w:t xml:space="preserve"> csomag típusait is közvetlenül be lehet benne írni, így az adatbázisos műveletek pontosan olyan típusokkal dolgoznak, amilyenekkel kell. A lekérdezések külön metódusokba vannak rendezve, ezeket a Next.js és a </w:t>
-      </w:r>
-      <w:proofErr w:type="spellStart"/>
-      <w:r>
-        <w:t>WebSocket</w:t>
-      </w:r>
-      <w:proofErr w:type="spellEnd"/>
-      <w:r>
-        <w:t xml:space="preserve"> alkalmazás is ugyanúgy eléri, így nem kell kétszer megírni ugyanazt, és minden ott van, ahol lennie kell.</w:t>
+        <w:t>packages/database:</w:t>
+      </w:r>
+    </w:p>
+    <w:p>
+      <w:r>
+        <w:t>Ez a csomag felel az adatbáziskapcsolatért és a Drizzle ORM beállításaiért. Tartalmazza az adatbázis sémáját, a migrációs fájlokat, valamint az SQL-lekérdezéseket. Mivel TypeScript-ben íródott, a types csomag típusait is közvetlenül be lehet benne írni, így az adatbázisos műveletek pontosan olyan típusokkal dolgoznak, amilyenekkel kell. A lekérdezések külön metódusokba vannak rendezve, ezeket a Next.js és a WebSocket alkalmazás is ugyanúgy eléri, így nem kell kétszer megírni ugyanazt, és minden ott van, ahol lennie kell.</w:t>
       </w:r>
     </w:p>
     <w:p>
@@ -4631,71 +4338,6 @@
             <wp:extent cx="5760128" cy="2717800"/>
             <wp:effectExtent l="0" t="0" r="0" b="6350"/>
             <wp:docPr id="5" name="Kép 5"/>
-            <wp:cNvGraphicFramePr>
-              <a:graphicFrameLocks xmlns:a="http://schemas.openxmlformats.org/drawingml/2006/main" noChangeAspect="1"/>
-            </wp:cNvGraphicFramePr>
-            <a:graphic xmlns:a="http://schemas.openxmlformats.org/drawingml/2006/main">
-              <a:graphicData uri="http://schemas.openxmlformats.org/drawingml/2006/picture">
-                <pic:pic xmlns:pic="http://schemas.openxmlformats.org/drawingml/2006/picture">
-                  <pic:nvPicPr>
-                    <pic:cNvPr id="1" name=""/>
-                    <pic:cNvPicPr/>
-                  </pic:nvPicPr>
-                  <pic:blipFill>
-                    <a:blip r:embed="rId34"/>
-                    <a:stretch>
-                      <a:fillRect/>
-                    </a:stretch>
-                  </pic:blipFill>
-                  <pic:spPr>
-                    <a:xfrm>
-                      <a:off x="0" y="0"/>
-                      <a:ext cx="5808781" cy="2740756"/>
-                    </a:xfrm>
-                    <a:prstGeom prst="rect">
-                      <a:avLst/>
-                    </a:prstGeom>
-                  </pic:spPr>
-                </pic:pic>
-              </a:graphicData>
-            </a:graphic>
-          </wp:inline>
-        </w:drawing>
-      </w:r>
-    </w:p>
-    <w:p>
-      <w:pPr>
-        <w:pStyle w:val="Kpalrs"/>
-      </w:pPr>
-      <w:fldSimple w:instr=" SEQ ábra \* ARABIC ">
-        <w:bookmarkStart w:id="9" w:name="_Toc195648529"/>
-        <w:r>
-          <w:rPr>
-            <w:noProof/>
-          </w:rPr>
-          <w:t>2</w:t>
-        </w:r>
-      </w:fldSimple>
-      <w:r>
-        <w:t>. ábra - Web struktúrája, felépítése</w:t>
-      </w:r>
-      <w:bookmarkEnd w:id="9"/>
-    </w:p>
-    <w:p>
-      <w:pPr>
-        <w:keepNext/>
-        <w:jc w:val="center"/>
-      </w:pPr>
-      <w:r>
-        <w:rPr>
-          <w:noProof/>
-          <w:lang w:eastAsia="hu-HU"/>
-        </w:rPr>
-        <w:drawing>
-          <wp:inline distT="0" distB="0" distL="0" distR="0" wp14:anchorId="54A1DD04" wp14:editId="60A8BC11">
-            <wp:extent cx="4587638" cy="441998"/>
-            <wp:effectExtent l="0" t="0" r="3810" b="0"/>
-            <wp:docPr id="6" name="Kép 6"/>
             <wp:cNvGraphicFramePr>
               <a:graphicFrameLocks xmlns:a="http://schemas.openxmlformats.org/drawingml/2006/main" noChangeAspect="1"/>
             </wp:cNvGraphicFramePr>
@@ -4715,6 +4357,71 @@
                   <pic:spPr>
                     <a:xfrm>
                       <a:off x="0" y="0"/>
+                      <a:ext cx="5808781" cy="2740756"/>
+                    </a:xfrm>
+                    <a:prstGeom prst="rect">
+                      <a:avLst/>
+                    </a:prstGeom>
+                  </pic:spPr>
+                </pic:pic>
+              </a:graphicData>
+            </a:graphic>
+          </wp:inline>
+        </w:drawing>
+      </w:r>
+    </w:p>
+    <w:p>
+      <w:pPr>
+        <w:pStyle w:val="Kpalrs"/>
+      </w:pPr>
+      <w:fldSimple w:instr=" SEQ ábra \* ARABIC ">
+        <w:bookmarkStart w:id="9" w:name="_Toc195648529"/>
+        <w:r>
+          <w:rPr>
+            <w:noProof/>
+          </w:rPr>
+          <w:t>2</w:t>
+        </w:r>
+      </w:fldSimple>
+      <w:r>
+        <w:t>. ábra - Web struktúrája, felépítése</w:t>
+      </w:r>
+      <w:bookmarkEnd w:id="9"/>
+    </w:p>
+    <w:p>
+      <w:pPr>
+        <w:keepNext/>
+        <w:jc w:val="center"/>
+      </w:pPr>
+      <w:r>
+        <w:rPr>
+          <w:noProof/>
+          <w:lang w:eastAsia="hu-HU"/>
+        </w:rPr>
+        <w:drawing>
+          <wp:inline distT="0" distB="0" distL="0" distR="0" wp14:anchorId="54A1DD04" wp14:editId="60A8BC11">
+            <wp:extent cx="4587638" cy="441998"/>
+            <wp:effectExtent l="0" t="0" r="3810" b="0"/>
+            <wp:docPr id="6" name="Kép 6"/>
+            <wp:cNvGraphicFramePr>
+              <a:graphicFrameLocks xmlns:a="http://schemas.openxmlformats.org/drawingml/2006/main" noChangeAspect="1"/>
+            </wp:cNvGraphicFramePr>
+            <a:graphic xmlns:a="http://schemas.openxmlformats.org/drawingml/2006/main">
+              <a:graphicData uri="http://schemas.openxmlformats.org/drawingml/2006/picture">
+                <pic:pic xmlns:pic="http://schemas.openxmlformats.org/drawingml/2006/picture">
+                  <pic:nvPicPr>
+                    <pic:cNvPr id="1" name=""/>
+                    <pic:cNvPicPr/>
+                  </pic:nvPicPr>
+                  <pic:blipFill>
+                    <a:blip r:embed="rId36"/>
+                    <a:stretch>
+                      <a:fillRect/>
+                    </a:stretch>
+                  </pic:blipFill>
+                  <pic:spPr>
+                    <a:xfrm>
+                      <a:off x="0" y="0"/>
                       <a:ext cx="4587638" cy="441998"/>
                     </a:xfrm>
                     <a:prstGeom prst="rect">
@@ -4775,31 +4482,7 @@
     </w:p>
     <w:p>
       <w:r>
-        <w:t xml:space="preserve">Az adatbázismotornak a </w:t>
-      </w:r>
-      <w:proofErr w:type="spellStart"/>
-      <w:r>
-        <w:t>MariaDB</w:t>
-      </w:r>
-      <w:proofErr w:type="spellEnd"/>
-      <w:r>
-        <w:t xml:space="preserve">-t választottuk, ami a </w:t>
-      </w:r>
-      <w:proofErr w:type="spellStart"/>
-      <w:r>
-        <w:t>MySQL</w:t>
-      </w:r>
-      <w:proofErr w:type="spellEnd"/>
-      <w:r>
-        <w:t xml:space="preserve"> egyik változata (úgynevezett „</w:t>
-      </w:r>
-      <w:proofErr w:type="spellStart"/>
-      <w:r>
-        <w:t>fork</w:t>
-      </w:r>
-      <w:proofErr w:type="spellEnd"/>
-      <w:r>
-        <w:t>” -ja). Azért döntöttünk mellette, mert stabil, gyors, és sok projektben bevált megoldás.</w:t>
+        <w:t>Az adatbázismotornak a MariaDB-t választottuk, ami a MySQL egyik változata (úgynevezett „fork” -ja). Azért döntöttünk mellette, mert stabil, gyors, és sok projektben bevált megoldás.</w:t>
       </w:r>
     </w:p>
     <w:p>
@@ -4812,147 +4495,61 @@
         <w:rPr>
           <w:rFonts w:ascii="Calibri" w:hAnsi="Calibri" w:cs="Calibri"/>
         </w:rPr>
-        <w:t xml:space="preserve">Az adatbázis kezelését megkönnyíti a </w:t>
-      </w:r>
-      <w:proofErr w:type="spellStart"/>
+        <w:t>Az adatbázis kezelését megkönnyíti a Drizzle ORM, amit a projektben használtunk. Ez egy TypeScript-alapú eszköz, amit egyszerre lehet lekérdezésekhez (mint egy „query builder”) és ORM-ként is használni. Emellett ez szolgál az SQL séma forrásaként, vagyis ebben írjuk le az adatbázis felépítését. Ráadásul saját parancssoros eszközt (CLI-t) is ad, amivel automatikusan tudunk migrációs fájlokat</w:t>
+      </w:r>
       <w:r>
         <w:rPr>
           <w:rFonts w:ascii="Calibri" w:hAnsi="Calibri" w:cs="Calibri"/>
         </w:rPr>
-        <w:t>Drizzle</w:t>
-      </w:r>
-      <w:proofErr w:type="spellEnd"/>
+        <w:t xml:space="preserve"> generálni, így nem kell kézzel </w:t>
+      </w:r>
       <w:r>
         <w:rPr>
           <w:rFonts w:ascii="Calibri" w:hAnsi="Calibri" w:cs="Calibri"/>
         </w:rPr>
-        <w:t xml:space="preserve"> ORM, amit a projektben használtunk. Ez egy </w:t>
-      </w:r>
-      <w:proofErr w:type="spellStart"/>
+        <w:t>írni őket.</w:t>
+      </w:r>
       <w:r>
         <w:rPr>
           <w:rFonts w:ascii="Calibri" w:hAnsi="Calibri" w:cs="Calibri"/>
         </w:rPr>
-        <w:t>TypeScript</w:t>
-      </w:r>
-      <w:proofErr w:type="spellEnd"/>
+        <w:t xml:space="preserve"> </w:t>
+      </w:r>
       <w:r>
         <w:rPr>
           <w:rFonts w:ascii="Calibri" w:hAnsi="Calibri" w:cs="Calibri"/>
         </w:rPr>
-        <w:t>-alapú eszköz, amit egyszerre lehet lekérdezésekhez (mint egy „</w:t>
-      </w:r>
-      <w:proofErr w:type="spellStart"/>
+        <w:t>Elsőre ezek a fogalmak bonyolultnak tűnhetnek, de a gyakorlatba</w:t>
+      </w:r>
       <w:r>
         <w:rPr>
           <w:rFonts w:ascii="Calibri" w:hAnsi="Calibri" w:cs="Calibri"/>
         </w:rPr>
-        <w:t>query</w:t>
-      </w:r>
-      <w:proofErr w:type="spellEnd"/>
+        <w:t xml:space="preserve">n a működés meglepően egyszerű. </w:t>
+      </w:r>
       <w:r>
         <w:rPr>
           <w:rFonts w:ascii="Calibri" w:hAnsi="Calibri" w:cs="Calibri"/>
         </w:rPr>
-        <w:t xml:space="preserve"> </w:t>
-      </w:r>
-      <w:proofErr w:type="spellStart"/>
+        <w:t xml:space="preserve">Képzeljünk el egy fájlt – a mi esetünkben ez a </w:t>
+      </w:r>
+      <w:r>
+        <w:rPr>
+          <w:rStyle w:val="codeblockChar"/>
+        </w:rPr>
+        <w:t>schema.ts</w:t>
+      </w:r>
       <w:r>
         <w:rPr>
           <w:rFonts w:ascii="Calibri" w:hAnsi="Calibri" w:cs="Calibri"/>
         </w:rPr>
-        <w:t>builder</w:t>
-      </w:r>
-      <w:proofErr w:type="spellEnd"/>
+        <w:t>. Ebben írjuk le az összes adatbázis-táblát, azok mezőit (pl. szöveg, szám, dátum stb.), valamint a táblák közötti kapcsolatokat. Ha valamit módosítunk ebben a fájlban, például új oszlopot adunk hozzá egy táblához, a Drizzle CLI segítségével egyetlen parancs kiadásával generálhatunk egy új migrációs fájlt, ami végrehajtja ezt a változást az adatbáz</w:t>
+      </w:r>
       <w:r>
         <w:rPr>
           <w:rFonts w:ascii="Calibri" w:hAnsi="Calibri" w:cs="Calibri"/>
         </w:rPr>
-        <w:t>”) és ORM-ként is használni. Emellett ez szolgál az SQL séma forrásaként, vagyis ebben írjuk le az adatbázis felépítését. Ráadásul saját parancssoros eszközt (CLI-t) is ad, amivel automatikusan tudunk migrációs fájlokat</w:t>
-      </w:r>
-      <w:r>
-        <w:rPr>
-          <w:rFonts w:ascii="Calibri" w:hAnsi="Calibri" w:cs="Calibri"/>
-        </w:rPr>
-        <w:t xml:space="preserve"> generálni, így nem kell kézzel </w:t>
-      </w:r>
-      <w:r>
-        <w:rPr>
-          <w:rFonts w:ascii="Calibri" w:hAnsi="Calibri" w:cs="Calibri"/>
-        </w:rPr>
-        <w:t>írni őket.</w:t>
-      </w:r>
-      <w:r>
-        <w:rPr>
-          <w:rFonts w:ascii="Calibri" w:hAnsi="Calibri" w:cs="Calibri"/>
-        </w:rPr>
-        <w:t xml:space="preserve"> </w:t>
-      </w:r>
-      <w:r>
-        <w:rPr>
-          <w:rFonts w:ascii="Calibri" w:hAnsi="Calibri" w:cs="Calibri"/>
-        </w:rPr>
-        <w:t>Elsőre ezek a fogalmak bonyolultnak tűnhetnek, de a gyakorlatba</w:t>
-      </w:r>
-      <w:r>
-        <w:rPr>
-          <w:rFonts w:ascii="Calibri" w:hAnsi="Calibri" w:cs="Calibri"/>
-        </w:rPr>
-        <w:t xml:space="preserve">n a működés meglepően egyszerű. </w:t>
-      </w:r>
-      <w:r>
-        <w:rPr>
-          <w:rFonts w:ascii="Calibri" w:hAnsi="Calibri" w:cs="Calibri"/>
-        </w:rPr>
-        <w:t xml:space="preserve">Képzeljünk el egy fájlt – a mi esetünkben ez a </w:t>
-      </w:r>
-      <w:proofErr w:type="spellStart"/>
-      <w:r>
-        <w:rPr>
-          <w:rStyle w:val="codeblockChar"/>
-        </w:rPr>
-        <w:t>schema.ts</w:t>
-      </w:r>
-      <w:proofErr w:type="spellEnd"/>
-      <w:r>
-        <w:rPr>
-          <w:rFonts w:ascii="Calibri" w:hAnsi="Calibri" w:cs="Calibri"/>
-        </w:rPr>
-        <w:t xml:space="preserve">. Ebben írjuk le az összes adatbázis-táblát, azok mezőit (pl. szöveg, szám, dátum stb.), valamint a táblák közötti kapcsolatokat. Ha valamit módosítunk ebben a fájlban, például új oszlopot adunk hozzá egy táblához, a </w:t>
-      </w:r>
-      <w:proofErr w:type="spellStart"/>
-      <w:r>
-        <w:rPr>
-          <w:rFonts w:ascii="Calibri" w:hAnsi="Calibri" w:cs="Calibri"/>
-        </w:rPr>
-        <w:t>Drizzle</w:t>
-      </w:r>
-      <w:proofErr w:type="spellEnd"/>
-      <w:r>
-        <w:rPr>
-          <w:rFonts w:ascii="Calibri" w:hAnsi="Calibri" w:cs="Calibri"/>
-        </w:rPr>
-        <w:t xml:space="preserve"> CLI segítségével egyetlen parancs kiadásával generálhatunk egy új migrációs fájlt, ami végrehajtja ezt a változást az adatbáz</w:t>
-      </w:r>
-      <w:r>
-        <w:rPr>
-          <w:rFonts w:ascii="Calibri" w:hAnsi="Calibri" w:cs="Calibri"/>
-        </w:rPr>
-        <w:t xml:space="preserve">isban. Fontos, hogy ilyenkor csak is a változtatáshoz szükséges SQL parancsokat kapjuk meg: például, hogy ha egy oszlopot adtunk hozzá egy táblához, akkor csak is kizárólag ennek az utasítása lesz a migrációs fájlban. Ahogy a fejlesztés halad úgy a migrációs fájlok alapján visszavezethető a teljes adatbázis struktúra. Ha egy új számítógépre tesszük fel a projektet, akkor a </w:t>
-      </w:r>
-      <w:proofErr w:type="spellStart"/>
-      <w:r>
-        <w:rPr>
-          <w:rFonts w:ascii="Calibri" w:hAnsi="Calibri" w:cs="Calibri"/>
-        </w:rPr>
-        <w:t>migrálást</w:t>
-      </w:r>
-      <w:proofErr w:type="spellEnd"/>
-      <w:r>
-        <w:rPr>
-          <w:rFonts w:ascii="Calibri" w:hAnsi="Calibri" w:cs="Calibri"/>
-        </w:rPr>
-        <w:t xml:space="preserve"> a legelső migrációs fájllal kezdi és így halad egyesével végig az összesen.</w:t>
+        <w:t>isban. Fontos, hogy ilyenkor csak is a változtatáshoz szükséges SQL parancsokat kapjuk meg: például, hogy ha egy oszlopot adtunk hozzá egy táblához, akkor csak is kizárólag ennek az utasítása lesz a migrációs fájlban. Ahogy a fejlesztés halad úgy a migrációs fájlok alapján visszavezethető a teljes adatbázis struktúra. Ha egy új számítógépre tesszük fel a projektet, akkor a migrálást a legelső migrációs fájllal kezdi és így halad egyesével végig az összesen.</w:t>
       </w:r>
     </w:p>
     <w:p>
@@ -5058,15 +4655,7 @@
                               <w:fldChar w:fldCharType="end"/>
                             </w:r>
                             <w:r>
-                              <w:t xml:space="preserve">. ábra - A </w:t>
-                            </w:r>
-                            <w:proofErr w:type="spellStart"/>
-                            <w:r>
-                              <w:t>users</w:t>
-                            </w:r>
-                            <w:proofErr w:type="spellEnd"/>
-                            <w:r>
-                              <w:t xml:space="preserve"> tábla sémája</w:t>
+                              <w:t>. ábra - A users tábla sémája</w:t>
                             </w:r>
                             <w:bookmarkEnd w:id="12"/>
                           </w:p>
@@ -5137,15 +4726,7 @@
                         <w:fldChar w:fldCharType="end"/>
                       </w:r>
                       <w:r>
-                        <w:t xml:space="preserve">. ábra - A </w:t>
-                      </w:r>
-                      <w:proofErr w:type="spellStart"/>
-                      <w:r>
-                        <w:t>users</w:t>
-                      </w:r>
-                      <w:proofErr w:type="spellEnd"/>
-                      <w:r>
-                        <w:t xml:space="preserve"> tábla sémája</w:t>
+                        <w:t>. ábra - A users tábla sémája</w:t>
                       </w:r>
                       <w:bookmarkEnd w:id="13"/>
                     </w:p>
@@ -5196,7 +4777,7 @@
                     </pic:cNvPicPr>
                   </pic:nvPicPr>
                   <pic:blipFill>
-                    <a:blip r:embed="rId36" cstate="print">
+                    <a:blip r:embed="rId37" cstate="print">
                       <a:extLst>
                         <a:ext uri="{28A0092B-C50C-407E-A947-70E740481C1C}">
                           <a14:useLocalDpi xmlns:a14="http://schemas.microsoft.com/office/drawing/2010/main" val="0"/>
@@ -5341,23 +4922,7 @@
                               <w:fldChar w:fldCharType="end"/>
                             </w:r>
                             <w:r>
-                              <w:t xml:space="preserve">. ábra - Kapcsolat a </w:t>
-                            </w:r>
-                            <w:proofErr w:type="spellStart"/>
-                            <w:r>
-                              <w:t>users</w:t>
-                            </w:r>
-                            <w:proofErr w:type="spellEnd"/>
-                            <w:r>
-                              <w:t xml:space="preserve"> és a </w:t>
-                            </w:r>
-                            <w:proofErr w:type="spellStart"/>
-                            <w:r>
-                              <w:t>quiz</w:t>
-                            </w:r>
-                            <w:proofErr w:type="spellEnd"/>
-                            <w:r>
-                              <w:t xml:space="preserve"> tábla között</w:t>
+                              <w:t>. ábra - Kapcsolat a users és a quiz tábla között</w:t>
                             </w:r>
                             <w:bookmarkEnd w:id="14"/>
                           </w:p>
@@ -5423,23 +4988,7 @@
                         <w:fldChar w:fldCharType="end"/>
                       </w:r>
                       <w:r>
-                        <w:t xml:space="preserve">. ábra - Kapcsolat a </w:t>
-                      </w:r>
-                      <w:proofErr w:type="spellStart"/>
-                      <w:r>
-                        <w:t>users</w:t>
-                      </w:r>
-                      <w:proofErr w:type="spellEnd"/>
-                      <w:r>
-                        <w:t xml:space="preserve"> és a </w:t>
-                      </w:r>
-                      <w:proofErr w:type="spellStart"/>
-                      <w:r>
-                        <w:t>quiz</w:t>
-                      </w:r>
-                      <w:proofErr w:type="spellEnd"/>
-                      <w:r>
-                        <w:t xml:space="preserve"> tábla között</w:t>
+                        <w:t>. ábra - Kapcsolat a users és a quiz tábla között</w:t>
                       </w:r>
                       <w:bookmarkEnd w:id="15"/>
                     </w:p>
@@ -5482,7 +5031,7 @@
                     </pic:cNvPicPr>
                   </pic:nvPicPr>
                   <pic:blipFill>
-                    <a:blip r:embed="rId37" cstate="print">
+                    <a:blip r:embed="rId38" cstate="print">
                       <a:extLst>
                         <a:ext uri="{28A0092B-C50C-407E-A947-70E740481C1C}">
                           <a14:useLocalDpi xmlns:a14="http://schemas.microsoft.com/office/drawing/2010/main" val="0"/>
@@ -5714,7 +5263,7 @@
                     </pic:cNvPicPr>
                   </pic:nvPicPr>
                   <pic:blipFill>
-                    <a:blip r:embed="rId38" cstate="print">
+                    <a:blip r:embed="rId39" cstate="print">
                       <a:extLst>
                         <a:ext uri="{28A0092B-C50C-407E-A947-70E740481C1C}">
                           <a14:useLocalDpi xmlns:a14="http://schemas.microsoft.com/office/drawing/2010/main" val="0"/>
@@ -5798,21 +5347,8 @@
     </w:p>
     <w:p>
       <w:r>
-        <w:t xml:space="preserve">A mai modern weboldalakon szerintünk elengedhetetlen az, hogy a felhasználó különböző megjelenési téma között választhasson a felhasználói felületre. Erre a leggyakoribb példa a világos/sötét téma. Ennek tudatában implementáltuk világos és sötét módot minden oldalra. Azt, hogy a felhasználó milyen témát választott ki </w:t>
-      </w:r>
-      <w:proofErr w:type="gramStart"/>
-      <w:r>
-        <w:t>sütikben</w:t>
-      </w:r>
-      <w:proofErr w:type="gramEnd"/>
-      <w:r>
-        <w:t xml:space="preserve"> tároljuk. Ennek az az oka, hogy szerver oldalon a kérés megérkezésekor már megkaphatjuk a választott témát, így „szerver oldali </w:t>
-      </w:r>
-      <w:proofErr w:type="spellStart"/>
-      <w:r>
-        <w:t>renderelés</w:t>
-      </w:r>
-      <w:proofErr w:type="spellEnd"/>
+        <w:t>A mai modern weboldalakon szerintünk elengedhetetlen az, hogy a felhasználó különböző megjelenési téma között választhasson a felhasználói felületre. Erre a leggyakoribb példa a világos/sötét téma. Ennek tudatában implementáltuk világos és sötét módot minden oldalra. Azt, hogy a felhasználó milyen témát választott ki sütikben tároljuk. Ennek az az oka, hogy szerver oldalon a kérés megérkezésekor már megkaphatjuk a választott témát, így „szerver oldali renderelés</w:t>
+      </w:r>
       <w:r>
         <w:rPr>
           <w:rStyle w:val="Lbjegyzet-hivatkozs"/>
@@ -5823,13 +5359,8 @@
         <w:t>”</w:t>
       </w:r>
       <w:r>
-        <w:t xml:space="preserve">-nél már a választott témát tudjuk használni ezzel elősegítve a gyors betöltést. Erre egy úgynevezett </w:t>
-      </w:r>
-      <w:proofErr w:type="spellStart"/>
-      <w:r>
-        <w:t>provider</w:t>
-      </w:r>
-      <w:proofErr w:type="spellEnd"/>
+        <w:t>-nél már a választott témát tudjuk használni ezzel elősegítve a gyors betöltést. Erre egy úgynevezett provider</w:t>
+      </w:r>
       <w:r>
         <w:rPr>
           <w:rStyle w:val="Lbjegyzet-hivatkozs"/>
@@ -5869,7 +5400,7 @@
                     </pic:cNvPicPr>
                   </pic:nvPicPr>
                   <pic:blipFill>
-                    <a:blip r:embed="rId39" cstate="print">
+                    <a:blip r:embed="rId40" cstate="print">
                       <a:extLst>
                         <a:ext uri="{28A0092B-C50C-407E-A947-70E740481C1C}">
                           <a14:useLocalDpi xmlns:a14="http://schemas.microsoft.com/office/drawing/2010/main" val="0"/>
@@ -5989,7 +5520,7 @@
                     </pic:cNvPicPr>
                   </pic:nvPicPr>
                   <pic:blipFill>
-                    <a:blip r:embed="rId40" cstate="print">
+                    <a:blip r:embed="rId41" cstate="print">
                       <a:extLst>
                         <a:ext uri="{28A0092B-C50C-407E-A947-70E740481C1C}">
                           <a14:useLocalDpi xmlns:a14="http://schemas.microsoft.com/office/drawing/2010/main" val="0"/>
@@ -6290,7 +5821,7 @@
                     </pic:cNvPicPr>
                   </pic:nvPicPr>
                   <pic:blipFill>
-                    <a:blip r:embed="rId41" cstate="print">
+                    <a:blip r:embed="rId42" cstate="print">
                       <a:extLst>
                         <a:ext uri="{28A0092B-C50C-407E-A947-70E740481C1C}">
                           <a14:useLocalDpi xmlns:a14="http://schemas.microsoft.com/office/drawing/2010/main" val="0"/>
@@ -6445,134 +5976,76 @@
         <w:rPr>
           <w:rFonts w:ascii="Calibri" w:hAnsi="Calibri" w:cs="Calibri"/>
         </w:rPr>
-        <w:t xml:space="preserve"> hiszen a http protokoll a kérés teljesítése után lezárja a kapcsolatot. Ellentétben a http-vel, a </w:t>
-      </w:r>
-      <w:proofErr w:type="spellStart"/>
-      <w:r>
-        <w:rPr>
-          <w:rFonts w:ascii="Calibri" w:hAnsi="Calibri" w:cs="Calibri"/>
-        </w:rPr>
-        <w:t>WebSocket</w:t>
-      </w:r>
-      <w:proofErr w:type="spellEnd"/>
-      <w:r>
-        <w:rPr>
-          <w:rFonts w:ascii="Calibri" w:hAnsi="Calibri" w:cs="Calibri"/>
-        </w:rPr>
-        <w:t xml:space="preserve"> protokoll kapcsolatot nyit a szerverrel, ami egészen addig marad nyitva, amíg el nem hagyjuk az oldalt. Ez lehetővé teszi, hogy interakciókra, például egy gomb lenyomásra szóljunk a szervernek, hogy: </w:t>
+        <w:t xml:space="preserve"> hiszen a http protokoll a kérés teljesítése után lezárja a kapcsolatot. Ellentétben a http-vel, a WebSocket protokoll kapcsolatot nyit a szerverrel, ami egészen addig marad nyitva, amíg el nem hagyjuk az oldalt. Ez lehetővé teszi, hogy interakciókra, például egy gomb lenyomásra szóljunk a szervernek, hogy: </w:t>
       </w:r>
       <w:r>
         <w:rPr>
           <w:rFonts w:ascii="Calibri" w:hAnsi="Calibri" w:cs="Calibri"/>
           <w:i/>
         </w:rPr>
-        <w:t>„Helló-</w:t>
-      </w:r>
-      <w:proofErr w:type="spellStart"/>
+        <w:t>„Helló-belló, megnyomtam a gombot, értesíts</w:t>
+      </w:r>
       <w:r>
         <w:rPr>
           <w:rFonts w:ascii="Calibri" w:hAnsi="Calibri" w:cs="Calibri"/>
           <w:i/>
         </w:rPr>
-        <w:t>belló</w:t>
-      </w:r>
-      <w:proofErr w:type="spellEnd"/>
+        <w:t>d</w:t>
+      </w:r>
       <w:r>
         <w:rPr>
           <w:rFonts w:ascii="Calibri" w:hAnsi="Calibri" w:cs="Calibri"/>
           <w:i/>
         </w:rPr>
-        <w:t>, megnyomtam a gombot, értesíts</w:t>
+        <w:t xml:space="preserve"> a többi felhasználót.”</w:t>
       </w:r>
       <w:r>
         <w:rPr>
           <w:rFonts w:ascii="Calibri" w:hAnsi="Calibri" w:cs="Calibri"/>
-          <w:i/>
-        </w:rPr>
-        <w:t>d</w:t>
+        </w:rPr>
+        <w:t>. Ez az alapja a játék résznek is. Lejátszás indításakor egy kódot hoz létre</w:t>
       </w:r>
       <w:r>
         <w:rPr>
           <w:rFonts w:ascii="Calibri" w:hAnsi="Calibri" w:cs="Calibri"/>
-          <w:i/>
-        </w:rPr>
-        <w:t xml:space="preserve"> a többi felhasználót.”</w:t>
+        </w:rPr>
+        <w:t>,</w:t>
       </w:r>
       <w:r>
         <w:rPr>
           <w:rFonts w:ascii="Calibri" w:hAnsi="Calibri" w:cs="Calibri"/>
         </w:rPr>
-        <w:t>. Ez az alapja a játék résznek is. Lejátszás indításakor egy kódot hoz létre</w:t>
+        <w:t xml:space="preserve"> amellyel csatlakozni tud bárki. Ezt a kódot használva egy „szobát” hoz létre a WebSocket szerver, amihez csatlakozunk</w:t>
       </w:r>
       <w:r>
         <w:rPr>
           <w:rFonts w:ascii="Calibri" w:hAnsi="Calibri" w:cs="Calibri"/>
         </w:rPr>
+        <w:t xml:space="preserve">. </w:t>
+      </w:r>
+      <w:r>
+        <w:rPr>
+          <w:rFonts w:ascii="Calibri" w:hAnsi="Calibri" w:cs="Calibri"/>
+        </w:rPr>
+        <w:t>Így nyomon tudjuk követni, hogy melyik felhasználó melyik játékhoz csatlakozott, és csak az adott játékuk adatait és eseményeit küldjük le számukra.</w:t>
+      </w:r>
+      <w:r>
+        <w:rPr>
+          <w:rFonts w:ascii="Calibri" w:hAnsi="Calibri" w:cs="Calibri"/>
+        </w:rPr>
+        <w:t xml:space="preserve"> A szerver ilyenkor elindít egy játékot</w:t>
+      </w:r>
+      <w:r>
+        <w:rPr>
+          <w:rFonts w:ascii="Calibri" w:hAnsi="Calibri" w:cs="Calibri"/>
+        </w:rPr>
         <w:t>,</w:t>
       </w:r>
       <w:r>
         <w:rPr>
           <w:rFonts w:ascii="Calibri" w:hAnsi="Calibri" w:cs="Calibri"/>
         </w:rPr>
-        <w:t xml:space="preserve"> amellyel csatlakozni tud bárki. Ezt a kódot használva egy „szobát” hoz létre a </w:t>
-      </w:r>
-      <w:proofErr w:type="spellStart"/>
-      <w:r>
-        <w:rPr>
-          <w:rFonts w:ascii="Calibri" w:hAnsi="Calibri" w:cs="Calibri"/>
-        </w:rPr>
-        <w:t>WebSocket</w:t>
-      </w:r>
-      <w:proofErr w:type="spellEnd"/>
-      <w:r>
-        <w:rPr>
-          <w:rFonts w:ascii="Calibri" w:hAnsi="Calibri" w:cs="Calibri"/>
-        </w:rPr>
-        <w:t xml:space="preserve"> szerver, amihez csatlakozunk</w:t>
-      </w:r>
-      <w:r>
-        <w:rPr>
-          <w:rFonts w:ascii="Calibri" w:hAnsi="Calibri" w:cs="Calibri"/>
-        </w:rPr>
-        <w:t xml:space="preserve">. </w:t>
-      </w:r>
-      <w:r>
-        <w:rPr>
-          <w:rFonts w:ascii="Calibri" w:hAnsi="Calibri" w:cs="Calibri"/>
-        </w:rPr>
-        <w:t>Így nyomon tudjuk követni, hogy melyik felhasználó melyik játékhoz csatlakozott, és csak az adott játékuk adatait és eseményeit küldjük le számukra.</w:t>
-      </w:r>
-      <w:r>
-        <w:rPr>
-          <w:rFonts w:ascii="Calibri" w:hAnsi="Calibri" w:cs="Calibri"/>
-        </w:rPr>
-        <w:t xml:space="preserve"> A szerver ilyenkor elindít egy játékot</w:t>
-      </w:r>
-      <w:r>
-        <w:rPr>
-          <w:rFonts w:ascii="Calibri" w:hAnsi="Calibri" w:cs="Calibri"/>
-        </w:rPr>
-        <w:t>,</w:t>
-      </w:r>
-      <w:r>
-        <w:rPr>
-          <w:rFonts w:ascii="Calibri" w:hAnsi="Calibri" w:cs="Calibri"/>
-        </w:rPr>
-        <w:t xml:space="preserve"> ami gyakorlatilag egy „</w:t>
-      </w:r>
-      <w:proofErr w:type="spellStart"/>
-      <w:r>
-        <w:rPr>
-          <w:rFonts w:ascii="Calibri" w:hAnsi="Calibri" w:cs="Calibri"/>
-        </w:rPr>
-        <w:t>while</w:t>
-      </w:r>
-      <w:proofErr w:type="spellEnd"/>
-      <w:r>
-        <w:rPr>
-          <w:rFonts w:ascii="Calibri" w:hAnsi="Calibri" w:cs="Calibri"/>
-        </w:rPr>
-        <w:t xml:space="preserve"> ciklus”: egészen addig megy, amíg el nem fogynak a kérdések. Folyamatosan gyűjti a beérkező válaszokat, tovább lép</w:t>
+        <w:t xml:space="preserve"> ami gyakorlatilag egy „while ciklus”: egészen addig megy, amíg el nem fogynak a kérdések. Folyamatosan gyűjti a beérkező válaszokat, tovább lép</w:t>
       </w:r>
       <w:r>
         <w:rPr>
@@ -6628,7 +6101,7 @@
                     </pic:cNvPicPr>
                   </pic:nvPicPr>
                   <pic:blipFill>
-                    <a:blip r:embed="rId42" cstate="print">
+                    <a:blip r:embed="rId43" cstate="print">
                       <a:extLst>
                         <a:ext uri="{28A0092B-C50C-407E-A947-70E740481C1C}">
                           <a14:useLocalDpi xmlns:a14="http://schemas.microsoft.com/office/drawing/2010/main" val="0"/>
@@ -6714,7 +6187,7 @@
       <w:r>
         <w:t xml:space="preserve">A felhasználói felület kialakításához kerestünk egy számunkra megfelelő komponenscsomagot, mivel fontosnak tartottuk, hogy a felület – még ha csak egy belső, adminisztrációs célokat szolgáló alkalmazásról is van szó – átlátható és esztétikusan rendezett legyen. Így találtunk rá a </w:t>
       </w:r>
-      <w:hyperlink r:id="rId43" w:history="1">
+      <w:hyperlink r:id="rId44" w:history="1">
         <w:r>
           <w:rPr>
             <w:rStyle w:val="Hiperhivatkozs"/>
@@ -6792,7 +6265,7 @@
                     <pic:cNvPicPr/>
                   </pic:nvPicPr>
                   <pic:blipFill>
-                    <a:blip r:embed="rId44"/>
+                    <a:blip r:embed="rId45"/>
                     <a:stretch>
                       <a:fillRect/>
                     </a:stretch>
@@ -6856,7 +6329,7 @@
                     <pic:cNvPicPr/>
                   </pic:nvPicPr>
                   <pic:blipFill>
-                    <a:blip r:embed="rId45"/>
+                    <a:blip r:embed="rId46"/>
                     <a:stretch>
                       <a:fillRect/>
                     </a:stretch>
@@ -6997,14 +6470,12 @@
       <w:r>
         <w:t xml:space="preserve"> </w:t>
       </w:r>
-      <w:proofErr w:type="spellStart"/>
       <w:r>
         <w:rPr>
           <w:rStyle w:val="codeblockChar"/>
         </w:rPr>
         <w:t>node</w:t>
       </w:r>
-      <w:proofErr w:type="spellEnd"/>
       <w:r>
         <w:t xml:space="preserve"> </w:t>
       </w:r>
@@ -7018,147 +6489,7 @@
         <w:rPr>
           <w:rStyle w:val="codeblockChar"/>
         </w:rPr>
-        <w:t>'</w:t>
-      </w:r>
-      <w:proofErr w:type="spellStart"/>
-      <w:r>
-        <w:rPr>
-          <w:rStyle w:val="codeblockChar"/>
-        </w:rPr>
-        <w:t>qwe</w:t>
-      </w:r>
-      <w:proofErr w:type="spellEnd"/>
-      <w:r>
-        <w:rPr>
-          <w:rStyle w:val="codeblockChar"/>
-        </w:rPr>
-        <w:t xml:space="preserve">' is </w:t>
-      </w:r>
-      <w:proofErr w:type="spellStart"/>
-      <w:r>
-        <w:rPr>
-          <w:rStyle w:val="codeblockChar"/>
-        </w:rPr>
-        <w:t>not</w:t>
-      </w:r>
-      <w:proofErr w:type="spellEnd"/>
-      <w:r>
-        <w:rPr>
-          <w:rStyle w:val="codeblockChar"/>
-        </w:rPr>
-        <w:t xml:space="preserve"> </w:t>
-      </w:r>
-      <w:proofErr w:type="spellStart"/>
-      <w:r>
-        <w:rPr>
-          <w:rStyle w:val="codeblockChar"/>
-        </w:rPr>
-        <w:t>recognized</w:t>
-      </w:r>
-      <w:proofErr w:type="spellEnd"/>
-      <w:r>
-        <w:rPr>
-          <w:rStyle w:val="codeblockChar"/>
-        </w:rPr>
-        <w:t xml:space="preserve"> </w:t>
-      </w:r>
-      <w:proofErr w:type="spellStart"/>
-      <w:r>
-        <w:rPr>
-          <w:rStyle w:val="codeblockChar"/>
-        </w:rPr>
-        <w:t>as</w:t>
-      </w:r>
-      <w:proofErr w:type="spellEnd"/>
-      <w:r>
-        <w:rPr>
-          <w:rStyle w:val="codeblockChar"/>
-        </w:rPr>
-        <w:t xml:space="preserve"> an </w:t>
-      </w:r>
-      <w:proofErr w:type="spellStart"/>
-      <w:r>
-        <w:rPr>
-          <w:rStyle w:val="codeblockChar"/>
-        </w:rPr>
-        <w:t>internal</w:t>
-      </w:r>
-      <w:proofErr w:type="spellEnd"/>
-      <w:r>
-        <w:rPr>
-          <w:rStyle w:val="codeblockChar"/>
-        </w:rPr>
-        <w:t xml:space="preserve"> </w:t>
-      </w:r>
-      <w:proofErr w:type="spellStart"/>
-      <w:r>
-        <w:rPr>
-          <w:rStyle w:val="codeblockChar"/>
-        </w:rPr>
-        <w:t>or</w:t>
-      </w:r>
-      <w:proofErr w:type="spellEnd"/>
-      <w:r>
-        <w:rPr>
-          <w:rStyle w:val="codeblockChar"/>
-        </w:rPr>
-        <w:t xml:space="preserve"> </w:t>
-      </w:r>
-      <w:proofErr w:type="spellStart"/>
-      <w:r>
-        <w:rPr>
-          <w:rStyle w:val="codeblockChar"/>
-        </w:rPr>
-        <w:t>external</w:t>
-      </w:r>
-      <w:proofErr w:type="spellEnd"/>
-      <w:r>
-        <w:rPr>
-          <w:rStyle w:val="codeblockChar"/>
-        </w:rPr>
-        <w:t xml:space="preserve"> </w:t>
-      </w:r>
-      <w:proofErr w:type="spellStart"/>
-      <w:r>
-        <w:rPr>
-          <w:rStyle w:val="codeblockChar"/>
-        </w:rPr>
-        <w:t>command</w:t>
-      </w:r>
-      <w:proofErr w:type="spellEnd"/>
-      <w:r>
-        <w:rPr>
-          <w:rStyle w:val="codeblockChar"/>
-        </w:rPr>
-        <w:t xml:space="preserve">, </w:t>
-      </w:r>
-      <w:proofErr w:type="spellStart"/>
-      <w:r>
-        <w:rPr>
-          <w:rStyle w:val="codeblockChar"/>
-        </w:rPr>
-        <w:t>operable</w:t>
-      </w:r>
-      <w:proofErr w:type="spellEnd"/>
-      <w:r>
-        <w:rPr>
-          <w:rStyle w:val="codeblockChar"/>
-        </w:rPr>
-        <w:t xml:space="preserve"> program </w:t>
-      </w:r>
-      <w:proofErr w:type="spellStart"/>
-      <w:r>
-        <w:rPr>
-          <w:rStyle w:val="codeblockChar"/>
-        </w:rPr>
-        <w:t>or</w:t>
-      </w:r>
-      <w:proofErr w:type="spellEnd"/>
-      <w:r>
-        <w:rPr>
-          <w:rStyle w:val="codeblockChar"/>
-        </w:rPr>
-        <w:t xml:space="preserve"> batch file.</w:t>
+        <w:t>'qwe' is not recognized as an internal or external command, operable program or batch file.</w:t>
       </w:r>
       <w:r>
         <w:rPr>
@@ -7166,7 +6497,7 @@
         </w:rPr>
         <w:t xml:space="preserve">) telepítsük </w:t>
       </w:r>
-      <w:hyperlink r:id="rId46" w:history="1">
+      <w:hyperlink r:id="rId47" w:history="1">
         <w:r>
           <w:rPr>
             <w:rStyle w:val="Hiperhivatkozs"/>
@@ -7191,66 +6522,14 @@
         </w:numPr>
       </w:pPr>
       <w:r>
-        <w:t xml:space="preserve">Telepítsük a </w:t>
-      </w:r>
-      <w:proofErr w:type="spellStart"/>
-      <w:r>
-        <w:t>pnpm</w:t>
-      </w:r>
-      <w:proofErr w:type="spellEnd"/>
-      <w:r>
-        <w:t xml:space="preserve"> csomag-kezelőt a </w:t>
-      </w:r>
-      <w:proofErr w:type="spellStart"/>
+        <w:t xml:space="preserve">Telepítsük a pnpm csomag-kezelőt a </w:t>
+      </w:r>
       <w:r>
         <w:rPr>
           <w:rStyle w:val="codeblockChar"/>
         </w:rPr>
-        <w:t>winget</w:t>
-      </w:r>
-      <w:proofErr w:type="spellEnd"/>
-      <w:r>
-        <w:rPr>
-          <w:rStyle w:val="codeblockChar"/>
-        </w:rPr>
-        <w:t xml:space="preserve"> </w:t>
-      </w:r>
-      <w:proofErr w:type="spellStart"/>
-      <w:r>
-        <w:rPr>
-          <w:rStyle w:val="codeblockChar"/>
-        </w:rPr>
-        <w:t>install</w:t>
-      </w:r>
-      <w:proofErr w:type="spellEnd"/>
-      <w:r>
-        <w:rPr>
-          <w:rStyle w:val="codeblockChar"/>
-        </w:rPr>
-        <w:t xml:space="preserve"> -e --</w:t>
-      </w:r>
-      <w:proofErr w:type="spellStart"/>
-      <w:r>
-        <w:rPr>
-          <w:rStyle w:val="codeblockChar"/>
-        </w:rPr>
-        <w:t>id</w:t>
-      </w:r>
-      <w:proofErr w:type="spellEnd"/>
-      <w:r>
-        <w:rPr>
-          <w:rStyle w:val="codeblockChar"/>
-        </w:rPr>
-        <w:t xml:space="preserve"> </w:t>
-      </w:r>
-      <w:proofErr w:type="spellStart"/>
-      <w:r>
-        <w:rPr>
-          <w:rStyle w:val="codeblockChar"/>
-        </w:rPr>
-        <w:t>pnpm.pnpm</w:t>
-      </w:r>
-      <w:proofErr w:type="spellEnd"/>
+        <w:t>winget install -e --id pnpm.pnpm</w:t>
+      </w:r>
       <w:r>
         <w:t xml:space="preserve"> paranccsal.</w:t>
       </w:r>
@@ -7267,106 +6546,20 @@
         <w:rPr>
           <w:rFonts w:ascii="Calibri" w:hAnsi="Calibri" w:cs="Calibri"/>
         </w:rPr>
-        <w:t xml:space="preserve">Telepítsük a </w:t>
-      </w:r>
-      <w:proofErr w:type="spellStart"/>
-      <w:r>
-        <w:rPr>
-          <w:rFonts w:ascii="Calibri" w:hAnsi="Calibri" w:cs="Calibri"/>
+        <w:t xml:space="preserve">Telepítsük a Bun Node runtime-ot a </w:t>
+      </w:r>
+      <w:r>
+        <w:rPr>
+          <w:rStyle w:val="codeblockChar"/>
+        </w:rPr>
+        <w:t>winget install --id=Oven-sh.</w:t>
+      </w:r>
+      <w:r>
+        <w:rPr>
+          <w:rStyle w:val="codeblockChar"/>
         </w:rPr>
         <w:t>Bun</w:t>
       </w:r>
-      <w:proofErr w:type="spellEnd"/>
-      <w:r>
-        <w:rPr>
-          <w:rFonts w:ascii="Calibri" w:hAnsi="Calibri" w:cs="Calibri"/>
-        </w:rPr>
-        <w:t xml:space="preserve"> </w:t>
-      </w:r>
-      <w:proofErr w:type="spellStart"/>
-      <w:r>
-        <w:rPr>
-          <w:rFonts w:ascii="Calibri" w:hAnsi="Calibri" w:cs="Calibri"/>
-        </w:rPr>
-        <w:t>Node</w:t>
-      </w:r>
-      <w:proofErr w:type="spellEnd"/>
-      <w:r>
-        <w:rPr>
-          <w:rFonts w:ascii="Calibri" w:hAnsi="Calibri" w:cs="Calibri"/>
-        </w:rPr>
-        <w:t xml:space="preserve"> </w:t>
-      </w:r>
-      <w:proofErr w:type="spellStart"/>
-      <w:r>
-        <w:rPr>
-          <w:rFonts w:ascii="Calibri" w:hAnsi="Calibri" w:cs="Calibri"/>
-        </w:rPr>
-        <w:t>runtime</w:t>
-      </w:r>
-      <w:proofErr w:type="spellEnd"/>
-      <w:r>
-        <w:rPr>
-          <w:rFonts w:ascii="Calibri" w:hAnsi="Calibri" w:cs="Calibri"/>
-        </w:rPr>
-        <w:t xml:space="preserve">-ot a </w:t>
-      </w:r>
-      <w:proofErr w:type="spellStart"/>
-      <w:r>
-        <w:rPr>
-          <w:rStyle w:val="codeblockChar"/>
-        </w:rPr>
-        <w:t>winget</w:t>
-      </w:r>
-      <w:proofErr w:type="spellEnd"/>
-      <w:r>
-        <w:rPr>
-          <w:rStyle w:val="codeblockChar"/>
-        </w:rPr>
-        <w:t xml:space="preserve"> </w:t>
-      </w:r>
-      <w:proofErr w:type="spellStart"/>
-      <w:r>
-        <w:rPr>
-          <w:rStyle w:val="codeblockChar"/>
-        </w:rPr>
-        <w:t>install</w:t>
-      </w:r>
-      <w:proofErr w:type="spellEnd"/>
-      <w:r>
-        <w:rPr>
-          <w:rStyle w:val="codeblockChar"/>
-        </w:rPr>
-        <w:t xml:space="preserve"> --</w:t>
-      </w:r>
-      <w:proofErr w:type="spellStart"/>
-      <w:r>
-        <w:rPr>
-          <w:rStyle w:val="codeblockChar"/>
-        </w:rPr>
-        <w:t>id</w:t>
-      </w:r>
-      <w:proofErr w:type="spellEnd"/>
-      <w:r>
-        <w:rPr>
-          <w:rStyle w:val="codeblockChar"/>
-        </w:rPr>
-        <w:t>=</w:t>
-      </w:r>
-      <w:proofErr w:type="spellStart"/>
-      <w:r>
-        <w:rPr>
-          <w:rStyle w:val="codeblockChar"/>
-        </w:rPr>
-        <w:t>Oven-sh.</w:t>
-      </w:r>
-      <w:r>
-        <w:rPr>
-          <w:rStyle w:val="codeblockChar"/>
-        </w:rPr>
-        <w:t>Bun</w:t>
-      </w:r>
-      <w:proofErr w:type="spellEnd"/>
       <w:r>
         <w:rPr>
           <w:rStyle w:val="codeblockChar"/>
@@ -7401,28 +6594,12 @@
         <w:lastRenderedPageBreak/>
         <w:t xml:space="preserve">Telepítsük a függőségeket a </w:t>
       </w:r>
-      <w:proofErr w:type="spellStart"/>
       <w:r>
         <w:rPr>
           <w:rStyle w:val="codeblockChar"/>
         </w:rPr>
-        <w:t>pnpm</w:t>
-      </w:r>
-      <w:proofErr w:type="spellEnd"/>
-      <w:r>
-        <w:rPr>
-          <w:rStyle w:val="codeblockChar"/>
-        </w:rPr>
-        <w:t xml:space="preserve"> </w:t>
-      </w:r>
-      <w:proofErr w:type="spellStart"/>
-      <w:r>
-        <w:rPr>
-          <w:rStyle w:val="codeblockChar"/>
-        </w:rPr>
-        <w:t>install</w:t>
-      </w:r>
-      <w:proofErr w:type="spellEnd"/>
+        <w:t>pnpm install</w:t>
+      </w:r>
       <w:r>
         <w:rPr>
           <w:rFonts w:ascii="Calibri" w:hAnsi="Calibri" w:cs="Calibri"/>
@@ -7466,77 +6643,39 @@
         <w:rPr>
           <w:rStyle w:val="codeblockChar"/>
         </w:rPr>
-        <w:t>./web/</w:t>
-      </w:r>
-      <w:proofErr w:type="spellStart"/>
+        <w:t>./web/apps/next</w:t>
+      </w:r>
+      <w:r>
+        <w:rPr>
+          <w:rFonts w:ascii="Calibri" w:hAnsi="Calibri" w:cs="Calibri"/>
+        </w:rPr>
+        <w:t xml:space="preserve"> mappába. Hozzunk létre egy </w:t>
+      </w:r>
       <w:r>
         <w:rPr>
           <w:rStyle w:val="codeblockChar"/>
         </w:rPr>
-        <w:t>apps</w:t>
-      </w:r>
-      <w:proofErr w:type="spellEnd"/>
+        <w:t>.env</w:t>
+      </w:r>
+      <w:r>
+        <w:rPr>
+          <w:rFonts w:ascii="Calibri" w:hAnsi="Calibri" w:cs="Calibri"/>
+        </w:rPr>
+        <w:t xml:space="preserve"> fájlt és illesszük bele a </w:t>
+      </w:r>
       <w:r>
         <w:rPr>
           <w:rStyle w:val="codeblockChar"/>
         </w:rPr>
-        <w:t>/</w:t>
-      </w:r>
-      <w:proofErr w:type="spellStart"/>
-      <w:r>
-        <w:rPr>
-          <w:rStyle w:val="codeblockChar"/>
-        </w:rPr>
-        <w:t>next</w:t>
-      </w:r>
-      <w:proofErr w:type="spellEnd"/>
+        <w:t>.env.example</w:t>
+      </w:r>
       <w:r>
         <w:rPr>
           <w:rFonts w:ascii="Calibri" w:hAnsi="Calibri" w:cs="Calibri"/>
         </w:rPr>
-        <w:t xml:space="preserve"> mappába. Hozzunk létre egy </w:t>
-      </w:r>
-      <w:r>
-        <w:rPr>
-          <w:rStyle w:val="codeblockChar"/>
-        </w:rPr>
-        <w:t>.</w:t>
-      </w:r>
-      <w:proofErr w:type="spellStart"/>
-      <w:r>
-        <w:rPr>
-          <w:rStyle w:val="codeblockChar"/>
-        </w:rPr>
-        <w:t>env</w:t>
-      </w:r>
-      <w:proofErr w:type="spellEnd"/>
-      <w:r>
-        <w:rPr>
-          <w:rFonts w:ascii="Calibri" w:hAnsi="Calibri" w:cs="Calibri"/>
-        </w:rPr>
-        <w:t xml:space="preserve"> fájlt és illesszük bele a </w:t>
-      </w:r>
-      <w:r>
-        <w:rPr>
-          <w:rStyle w:val="codeblockChar"/>
-        </w:rPr>
-        <w:t>.</w:t>
-      </w:r>
-      <w:proofErr w:type="spellStart"/>
-      <w:r>
-        <w:rPr>
-          <w:rStyle w:val="codeblockChar"/>
-        </w:rPr>
-        <w:t>env.example</w:t>
-      </w:r>
-      <w:proofErr w:type="spellEnd"/>
-      <w:r>
-        <w:rPr>
-          <w:rFonts w:ascii="Calibri" w:hAnsi="Calibri" w:cs="Calibri"/>
-        </w:rPr>
         <w:t xml:space="preserve"> fájl tartalmát. A </w:t>
       </w:r>
-      <w:hyperlink r:id="rId47" w:anchor="nextauth_secret" w:history="1">
+      <w:hyperlink r:id="rId48" w:anchor="nextauth_secret" w:history="1">
         <w:r>
           <w:rPr>
             <w:rStyle w:val="Hiperhivatkozs"/>
@@ -7551,8 +6690,7 @@
         </w:rPr>
         <w:t xml:space="preserve"> környezeti változó értéke bármi lehet, csak lényeg, hogy legyen benne valami. Szerezzünk ingyenesen egy kulcsot az </w:t>
       </w:r>
-      <w:hyperlink r:id="rId48" w:history="1">
-        <w:proofErr w:type="spellStart"/>
+      <w:hyperlink r:id="rId49" w:history="1">
         <w:r>
           <w:rPr>
             <w:rStyle w:val="Hiperhivatkozs"/>
@@ -7560,7 +6698,6 @@
           </w:rPr>
           <w:t>Uploadthing</w:t>
         </w:r>
-        <w:proofErr w:type="spellEnd"/>
       </w:hyperlink>
       <w:r>
         <w:rPr>
@@ -7590,21 +6727,7 @@
         <w:rPr>
           <w:rFonts w:ascii="Calibri" w:hAnsi="Calibri" w:cs="Calibri"/>
         </w:rPr>
-        <w:t xml:space="preserve"> legyen az </w:t>
-      </w:r>
-      <w:proofErr w:type="spellStart"/>
-      <w:r>
-        <w:rPr>
-          <w:rFonts w:ascii="Calibri" w:hAnsi="Calibri" w:cs="Calibri"/>
-        </w:rPr>
-        <w:t>Uploadthing</w:t>
-      </w:r>
-      <w:proofErr w:type="spellEnd"/>
-      <w:r>
-        <w:rPr>
-          <w:rFonts w:ascii="Calibri" w:hAnsi="Calibri" w:cs="Calibri"/>
-        </w:rPr>
-        <w:t>-es projekt id.</w:t>
+        <w:t xml:space="preserve"> legyen az Uploadthing-es projekt id.</w:t>
       </w:r>
     </w:p>
     <w:p>
@@ -7628,70 +6751,32 @@
         <w:rPr>
           <w:rStyle w:val="codeblockChar"/>
         </w:rPr>
-        <w:t>./web/</w:t>
-      </w:r>
-      <w:proofErr w:type="spellStart"/>
+        <w:t>./web/apps/ws</w:t>
+      </w:r>
+      <w:r>
+        <w:rPr>
+          <w:rFonts w:ascii="Calibri" w:hAnsi="Calibri" w:cs="Calibri"/>
+        </w:rPr>
+        <w:t xml:space="preserve"> mappába. Hozzunk létre egy </w:t>
+      </w:r>
       <w:r>
         <w:rPr>
           <w:rStyle w:val="codeblockChar"/>
         </w:rPr>
-        <w:t>apps</w:t>
-      </w:r>
-      <w:proofErr w:type="spellEnd"/>
+        <w:t>.env</w:t>
+      </w:r>
+      <w:r>
+        <w:rPr>
+          <w:rFonts w:ascii="Calibri" w:hAnsi="Calibri" w:cs="Calibri"/>
+        </w:rPr>
+        <w:t xml:space="preserve"> fájlt és illesszük bele a </w:t>
+      </w:r>
       <w:r>
         <w:rPr>
           <w:rStyle w:val="codeblockChar"/>
         </w:rPr>
-        <w:t>/</w:t>
-      </w:r>
-      <w:proofErr w:type="spellStart"/>
-      <w:r>
-        <w:rPr>
-          <w:rStyle w:val="codeblockChar"/>
-        </w:rPr>
-        <w:t>ws</w:t>
-      </w:r>
-      <w:proofErr w:type="spellEnd"/>
-      <w:r>
-        <w:rPr>
-          <w:rFonts w:ascii="Calibri" w:hAnsi="Calibri" w:cs="Calibri"/>
-        </w:rPr>
-        <w:t xml:space="preserve"> mappába. Hozzunk létre egy </w:t>
-      </w:r>
-      <w:r>
-        <w:rPr>
-          <w:rStyle w:val="codeblockChar"/>
-        </w:rPr>
-        <w:t>.</w:t>
-      </w:r>
-      <w:proofErr w:type="spellStart"/>
-      <w:r>
-        <w:rPr>
-          <w:rStyle w:val="codeblockChar"/>
-        </w:rPr>
-        <w:t>env</w:t>
-      </w:r>
-      <w:proofErr w:type="spellEnd"/>
-      <w:r>
-        <w:rPr>
-          <w:rFonts w:ascii="Calibri" w:hAnsi="Calibri" w:cs="Calibri"/>
-        </w:rPr>
-        <w:t xml:space="preserve"> fájlt és illesszük bele a </w:t>
-      </w:r>
-      <w:r>
-        <w:rPr>
-          <w:rStyle w:val="codeblockChar"/>
-        </w:rPr>
-        <w:t>.</w:t>
-      </w:r>
-      <w:proofErr w:type="spellStart"/>
-      <w:r>
-        <w:rPr>
-          <w:rStyle w:val="codeblockChar"/>
-        </w:rPr>
-        <w:t>env.example</w:t>
-      </w:r>
-      <w:proofErr w:type="spellEnd"/>
+        <w:t>.env.example</w:t>
+      </w:r>
       <w:r>
         <w:rPr>
           <w:rFonts w:ascii="Calibri" w:hAnsi="Calibri" w:cs="Calibri"/>
@@ -7720,70 +6805,32 @@
         <w:rPr>
           <w:rStyle w:val="codeblockChar"/>
         </w:rPr>
-        <w:t>./web/</w:t>
-      </w:r>
-      <w:proofErr w:type="spellStart"/>
+        <w:t>./web/packages/database</w:t>
+      </w:r>
+      <w:r>
+        <w:rPr>
+          <w:rFonts w:ascii="Calibri" w:hAnsi="Calibri" w:cs="Calibri"/>
+        </w:rPr>
+        <w:t xml:space="preserve"> mappába. Hozzunk létre egy </w:t>
+      </w:r>
       <w:r>
         <w:rPr>
           <w:rStyle w:val="codeblockChar"/>
         </w:rPr>
-        <w:t>packages</w:t>
-      </w:r>
-      <w:proofErr w:type="spellEnd"/>
+        <w:t>.env</w:t>
+      </w:r>
+      <w:r>
+        <w:rPr>
+          <w:rFonts w:ascii="Calibri" w:hAnsi="Calibri" w:cs="Calibri"/>
+        </w:rPr>
+        <w:t xml:space="preserve"> fájlt és illesszük bele a </w:t>
+      </w:r>
       <w:r>
         <w:rPr>
           <w:rStyle w:val="codeblockChar"/>
         </w:rPr>
-        <w:t>/</w:t>
-      </w:r>
-      <w:proofErr w:type="spellStart"/>
-      <w:r>
-        <w:rPr>
-          <w:rStyle w:val="codeblockChar"/>
-        </w:rPr>
-        <w:t>database</w:t>
-      </w:r>
-      <w:proofErr w:type="spellEnd"/>
-      <w:r>
-        <w:rPr>
-          <w:rFonts w:ascii="Calibri" w:hAnsi="Calibri" w:cs="Calibri"/>
-        </w:rPr>
-        <w:t xml:space="preserve"> mappába. Hozzunk létre egy </w:t>
-      </w:r>
-      <w:r>
-        <w:rPr>
-          <w:rStyle w:val="codeblockChar"/>
-        </w:rPr>
-        <w:t>.</w:t>
-      </w:r>
-      <w:proofErr w:type="spellStart"/>
-      <w:r>
-        <w:rPr>
-          <w:rStyle w:val="codeblockChar"/>
-        </w:rPr>
-        <w:t>env</w:t>
-      </w:r>
-      <w:proofErr w:type="spellEnd"/>
-      <w:r>
-        <w:rPr>
-          <w:rFonts w:ascii="Calibri" w:hAnsi="Calibri" w:cs="Calibri"/>
-        </w:rPr>
-        <w:t xml:space="preserve"> fájlt és illesszük bele a </w:t>
-      </w:r>
-      <w:r>
-        <w:rPr>
-          <w:rStyle w:val="codeblockChar"/>
-        </w:rPr>
-        <w:t>.</w:t>
-      </w:r>
-      <w:proofErr w:type="spellStart"/>
-      <w:r>
-        <w:rPr>
-          <w:rStyle w:val="codeblockChar"/>
-        </w:rPr>
-        <w:t>env.example</w:t>
-      </w:r>
-      <w:proofErr w:type="spellEnd"/>
+        <w:t>.env.example</w:t>
+      </w:r>
       <w:r>
         <w:rPr>
           <w:rFonts w:ascii="Calibri" w:hAnsi="Calibri" w:cs="Calibri"/>
@@ -7803,78 +6850,14 @@
         <w:rPr>
           <w:rFonts w:ascii="Calibri" w:hAnsi="Calibri" w:cs="Calibri"/>
         </w:rPr>
-        <w:t xml:space="preserve">Indítsunk el egy helyi </w:t>
-      </w:r>
-      <w:proofErr w:type="spellStart"/>
-      <w:r>
-        <w:rPr>
-          <w:rFonts w:ascii="Calibri" w:hAnsi="Calibri" w:cs="Calibri"/>
-        </w:rPr>
-        <w:t>MariaDB</w:t>
-      </w:r>
-      <w:proofErr w:type="spellEnd"/>
-      <w:r>
-        <w:rPr>
-          <w:rFonts w:ascii="Calibri" w:hAnsi="Calibri" w:cs="Calibri"/>
-        </w:rPr>
-        <w:t xml:space="preserve"> vagy </w:t>
-      </w:r>
-      <w:proofErr w:type="spellStart"/>
-      <w:r>
-        <w:rPr>
-          <w:rFonts w:ascii="Calibri" w:hAnsi="Calibri" w:cs="Calibri"/>
-        </w:rPr>
-        <w:t>MySQL</w:t>
-      </w:r>
-      <w:proofErr w:type="spellEnd"/>
-      <w:r>
-        <w:rPr>
-          <w:rFonts w:ascii="Calibri" w:hAnsi="Calibri" w:cs="Calibri"/>
-        </w:rPr>
-        <w:t xml:space="preserve"> szervert a 3306-os alapértelmezett </w:t>
-      </w:r>
-      <w:proofErr w:type="spellStart"/>
-      <w:r>
-        <w:rPr>
-          <w:rFonts w:ascii="Calibri" w:hAnsi="Calibri" w:cs="Calibri"/>
-        </w:rPr>
-        <w:t>porton</w:t>
-      </w:r>
-      <w:proofErr w:type="spellEnd"/>
-      <w:r>
-        <w:rPr>
-          <w:rFonts w:ascii="Calibri" w:hAnsi="Calibri" w:cs="Calibri"/>
-        </w:rPr>
-        <w:t xml:space="preserve">. (Ha valamilyen okból kifolyólag más a port vagy a </w:t>
-      </w:r>
-      <w:proofErr w:type="spellStart"/>
-      <w:r>
-        <w:rPr>
-          <w:rFonts w:ascii="Calibri" w:hAnsi="Calibri" w:cs="Calibri"/>
-        </w:rPr>
-        <w:t>hosztnév</w:t>
-      </w:r>
-      <w:proofErr w:type="spellEnd"/>
-      <w:r>
-        <w:rPr>
-          <w:rFonts w:ascii="Calibri" w:hAnsi="Calibri" w:cs="Calibri"/>
-        </w:rPr>
-        <w:t xml:space="preserve">, akkor értelemszerűen a </w:t>
+        <w:t xml:space="preserve">Indítsunk el egy helyi MariaDB vagy MySQL szervert a 3306-os alapértelmezett porton. (Ha valamilyen okból kifolyólag más a port vagy a hosztnév, akkor értelemszerűen a </w:t>
       </w:r>
       <w:r>
         <w:rPr>
           <w:rStyle w:val="codeblockChar"/>
         </w:rPr>
-        <w:t>.</w:t>
-      </w:r>
-      <w:proofErr w:type="spellStart"/>
-      <w:r>
-        <w:rPr>
-          <w:rStyle w:val="codeblockChar"/>
-        </w:rPr>
-        <w:t>env</w:t>
-      </w:r>
-      <w:proofErr w:type="spellEnd"/>
+        <w:t>.env</w:t>
+      </w:r>
       <w:r>
         <w:rPr>
           <w:rFonts w:ascii="Calibri" w:hAnsi="Calibri" w:cs="Calibri"/>
@@ -7911,42 +6894,12 @@
         </w:rPr>
         <w:t xml:space="preserve">Futtassuk a migrációkat, hogy legenerálódjanak a táblák a séma alapján a </w:t>
       </w:r>
-      <w:proofErr w:type="spellStart"/>
       <w:r>
         <w:rPr>
           <w:rStyle w:val="codeblockChar"/>
         </w:rPr>
-        <w:t>pnpm</w:t>
-      </w:r>
-      <w:proofErr w:type="spellEnd"/>
-      <w:r>
-        <w:rPr>
-          <w:rStyle w:val="codeblockChar"/>
-        </w:rPr>
-        <w:t xml:space="preserve"> </w:t>
-      </w:r>
-      <w:proofErr w:type="spellStart"/>
-      <w:r>
-        <w:rPr>
-          <w:rStyle w:val="codeblockChar"/>
-        </w:rPr>
-        <w:t>run</w:t>
-      </w:r>
-      <w:proofErr w:type="spellEnd"/>
-      <w:r>
-        <w:rPr>
-          <w:rStyle w:val="codeblockChar"/>
-        </w:rPr>
-        <w:t xml:space="preserve"> </w:t>
-      </w:r>
-      <w:proofErr w:type="spellStart"/>
-      <w:r>
-        <w:rPr>
-          <w:rStyle w:val="codeblockChar"/>
-        </w:rPr>
-        <w:t>migrations:migrate</w:t>
-      </w:r>
-      <w:proofErr w:type="spellEnd"/>
+        <w:t>pnpm run migrations:migrate</w:t>
+      </w:r>
       <w:r>
         <w:rPr>
           <w:rFonts w:ascii="Calibri" w:hAnsi="Calibri" w:cs="Calibri"/>
@@ -7983,75 +6936,17 @@
         </w:rPr>
         <w:t xml:space="preserve">Indítsuk el a projektet fejlesztői módban a </w:t>
       </w:r>
-      <w:proofErr w:type="spellStart"/>
       <w:r>
         <w:rPr>
           <w:rStyle w:val="codeblockChar"/>
         </w:rPr>
-        <w:t>pnpm</w:t>
-      </w:r>
-      <w:proofErr w:type="spellEnd"/>
-      <w:r>
-        <w:rPr>
-          <w:rStyle w:val="codeblockChar"/>
-        </w:rPr>
-        <w:t xml:space="preserve"> </w:t>
-      </w:r>
-      <w:proofErr w:type="spellStart"/>
-      <w:r>
-        <w:rPr>
-          <w:rStyle w:val="codeblockChar"/>
-        </w:rPr>
-        <w:t>run</w:t>
-      </w:r>
-      <w:proofErr w:type="spellEnd"/>
-      <w:r>
-        <w:rPr>
-          <w:rStyle w:val="codeblockChar"/>
-        </w:rPr>
-        <w:t xml:space="preserve"> </w:t>
-      </w:r>
-      <w:proofErr w:type="spellStart"/>
-      <w:r>
-        <w:rPr>
-          <w:rStyle w:val="codeblockChar"/>
-        </w:rPr>
-        <w:t>dev</w:t>
-      </w:r>
-      <w:proofErr w:type="spellEnd"/>
+        <w:t>pnpm run dev</w:t>
+      </w:r>
       <w:r>
         <w:rPr>
           <w:rFonts w:ascii="Calibri" w:hAnsi="Calibri" w:cs="Calibri"/>
         </w:rPr>
-        <w:t xml:space="preserve"> paranccsal. Ilyenkor mind a </w:t>
-      </w:r>
-      <w:proofErr w:type="spellStart"/>
-      <w:r>
-        <w:rPr>
-          <w:rFonts w:ascii="Calibri" w:hAnsi="Calibri" w:cs="Calibri"/>
-        </w:rPr>
-        <w:t>WebSocket</w:t>
-      </w:r>
-      <w:proofErr w:type="spellEnd"/>
-      <w:r>
-        <w:rPr>
-          <w:rFonts w:ascii="Calibri" w:hAnsi="Calibri" w:cs="Calibri"/>
-        </w:rPr>
-        <w:t xml:space="preserve"> szerver és a </w:t>
-      </w:r>
-      <w:proofErr w:type="spellStart"/>
-      <w:r>
-        <w:rPr>
-          <w:rFonts w:ascii="Calibri" w:hAnsi="Calibri" w:cs="Calibri"/>
-        </w:rPr>
-        <w:t>Next</w:t>
-      </w:r>
-      <w:proofErr w:type="spellEnd"/>
-      <w:r>
-        <w:rPr>
-          <w:rFonts w:ascii="Calibri" w:hAnsi="Calibri" w:cs="Calibri"/>
-        </w:rPr>
-        <w:t xml:space="preserve"> applikáció is elindul. A konzolba érkező üzeneteket színük alapján tudjuk megítélni, hogy honnan érkezik:</w:t>
+        <w:t xml:space="preserve"> paranccsal. Ilyenkor mind a WebSocket szerver és a Next applikáció is elindul. A konzolba érkező üzeneteket színük alapján tudjuk megítélni, hogy honnan érkezik:</w:t>
       </w:r>
     </w:p>
     <w:p>
@@ -8065,19 +6960,11 @@
           <w:rFonts w:ascii="Calibri" w:hAnsi="Calibri" w:cs="Calibri"/>
         </w:rPr>
       </w:pPr>
-      <w:proofErr w:type="spellStart"/>
       <w:r>
         <w:rPr>
           <w:rFonts w:ascii="Calibri" w:hAnsi="Calibri" w:cs="Calibri"/>
         </w:rPr>
-        <w:t>Next</w:t>
-      </w:r>
-      <w:proofErr w:type="spellEnd"/>
-      <w:r>
-        <w:rPr>
-          <w:rFonts w:ascii="Calibri" w:hAnsi="Calibri" w:cs="Calibri"/>
-        </w:rPr>
-        <w:t>: Magenta</w:t>
+        <w:t>Next: Magenta</w:t>
       </w:r>
     </w:p>
     <w:p>
@@ -8091,19 +6978,11 @@
           <w:rFonts w:ascii="Calibri" w:hAnsi="Calibri" w:cs="Calibri"/>
         </w:rPr>
       </w:pPr>
-      <w:proofErr w:type="spellStart"/>
       <w:r>
         <w:rPr>
           <w:rFonts w:ascii="Calibri" w:hAnsi="Calibri" w:cs="Calibri"/>
         </w:rPr>
-        <w:t>WebSocket</w:t>
-      </w:r>
-      <w:proofErr w:type="spellEnd"/>
-      <w:r>
-        <w:rPr>
-          <w:rFonts w:ascii="Calibri" w:hAnsi="Calibri" w:cs="Calibri"/>
-        </w:rPr>
-        <w:t>: Kék</w:t>
+        <w:t>WebSocket: Kék</w:t>
       </w:r>
     </w:p>
     <w:p>
@@ -8165,7 +7044,7 @@
       <w:r>
         <w:t xml:space="preserve"> fülre. Itt megjelennek a projektben jelenleg telepített NuGet-csomagok, így egyszerűen megtalálhatja a </w:t>
       </w:r>
-      <w:hyperlink r:id="rId49" w:history="1">
+      <w:hyperlink r:id="rId50" w:history="1">
         <w:r>
           <w:rPr>
             <w:rStyle w:val="Hiperhivatkozs"/>
@@ -8485,7 +7364,7 @@
                           </pic:cNvPicPr>
                         </pic:nvPicPr>
                         <pic:blipFill>
-                          <a:blip r:embed="rId50">
+                          <a:blip r:embed="rId51">
                             <a:extLst>
                               <a:ext uri="{28A0092B-C50C-407E-A947-70E740481C1C}">
                                 <a14:useLocalDpi xmlns:a14="http://schemas.microsoft.com/office/drawing/2010/main" val="0"/>
@@ -8689,7 +7568,7 @@
                   <o:lock v:ext="edit" aspectratio="t"/>
                 </v:shapetype>
                 <v:shape id="Kép 1" o:spid="_x0000_s1027" type="#_x0000_t75" alt="A képen szöveg, képernyőkép, Betűtípus, tervezés látható&#10;&#10;Előfordulhat, hogy a mesterséges intelligencia által létrehozott tartalom helytelen." style="position:absolute;left:95;top:-95;width:28861;height:13811;visibility:visible;mso-wrap-style:square" o:gfxdata="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">
-                  <v:imagedata r:id="rId51" o:title="A képen szöveg, képernyőkép, Betűtípus, tervezés látható&#10;&#10;Előfordulhat, hogy a mesterséges intelligencia által létrehozott tartalom helytelen"/>
+                  <v:imagedata r:id="rId52" o:title="A képen szöveg, képernyőkép, Betűtípus, tervezés látható&#10;&#10;Előfordulhat, hogy a mesterséges intelligencia által létrehozott tartalom helytelen"/>
                 </v:shape>
                 <v:oval id="Ellipszis 3" o:spid="_x0000_s1028" style="position:absolute;left:7720;top:1845;width:4001;height:3810;visibility:visible;mso-wrap-style:square;v-text-anchor:middle" o:gfxdata="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" filled="f" strokecolor="#c00000" strokeweight="2.25pt"/>
                 <v:shapetype id="_x0000_t32" coordsize="21600,21600" o:spt="32" o:oned="t" path="m,l21600,21600e" filled="f">
@@ -8798,7 +7677,7 @@
                           </pic:cNvPicPr>
                         </pic:nvPicPr>
                         <pic:blipFill>
-                          <a:blip r:embed="rId52">
+                          <a:blip r:embed="rId53">
                             <a:extLst>
                               <a:ext uri="{28A0092B-C50C-407E-A947-70E740481C1C}">
                                 <a14:useLocalDpi xmlns:a14="http://schemas.microsoft.com/office/drawing/2010/main" val="0"/>
@@ -8872,7 +7751,7 @@
             <w:pict>
               <v:group w14:anchorId="4656B909" id="Csoportba foglalás 10" o:spid="_x0000_s1026" style="position:absolute;margin-left:109.3pt;margin-top:.45pt;width:160.5pt;height:181.25pt;z-index:251668480;mso-position-horizontal:right;mso-position-horizontal-relative:margin" coordsize="20383,23018" o:gfxdata="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">
                 <v:shape id="Kép 1" o:spid="_x0000_s1027" type="#_x0000_t75" style="position:absolute;width:20383;height:23018;visibility:visible;mso-wrap-style:square" o:gfxdata="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">
-                  <v:imagedata r:id="rId53" o:title=""/>
+                  <v:imagedata r:id="rId54" o:title=""/>
                 </v:shape>
                 <v:oval id="Ellipszis 9" o:spid="_x0000_s1028" style="position:absolute;left:16383;top:18764;width:2484;height:2196;visibility:visible;mso-wrap-style:square;v-text-anchor:middle" o:gfxdata="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" filled="f" strokecolor="#c00000" strokeweight="1.5pt"/>
                 <w10:wrap type="through" anchorx="margin"/>
@@ -9398,7 +8277,7 @@
                           </pic:cNvPicPr>
                         </pic:nvPicPr>
                         <pic:blipFill>
-                          <a:blip r:embed="rId54">
+                          <a:blip r:embed="rId55">
                             <a:extLst>
                               <a:ext uri="{28A0092B-C50C-407E-A947-70E740481C1C}">
                                 <a14:useLocalDpi xmlns:a14="http://schemas.microsoft.com/office/drawing/2010/main" val="0"/>
@@ -9558,7 +8437,7 @@
             <w:pict>
               <v:group w14:anchorId="1681B7C2" id="Csoportba foglalás 12" o:spid="_x0000_s1026" style="position:absolute;margin-left:271.9pt;margin-top:.45pt;width:202.5pt;height:170.1pt;z-index:251675648" coordsize="25717,21602" o:gfxdata="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">
                 <v:shape id="Kép 1" o:spid="_x0000_s1027" type="#_x0000_t75" alt="A képen szöveg, képernyőkép, Betűtípus, multimédia látható&#10;&#10;Előfordulhat, hogy a mesterséges intelligencia által létrehozott tartalom helytelen." style="position:absolute;width:25717;height:21602;visibility:visible;mso-wrap-style:square" o:gfxdata="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">
-                  <v:imagedata r:id="rId55" o:title="A képen szöveg, képernyőkép, Betűtípus, multimédia látható&#10;&#10;Előfordulhat, hogy a mesterséges intelligencia által létrehozott tartalom helytelen"/>
+                  <v:imagedata r:id="rId56" o:title="A képen szöveg, képernyőkép, Betűtípus, multimédia látható&#10;&#10;Előfordulhat, hogy a mesterséges intelligencia által létrehozott tartalom helytelen"/>
                 </v:shape>
                 <v:rect id="Téglalap 11" o:spid="_x0000_s1028" style="position:absolute;left:2762;top:6477;width:13906;height:3143;visibility:visible;mso-wrap-style:square;v-text-anchor:middle" o:gfxdata="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" filled="f" strokecolor="#c00000">
                   <v:stroke joinstyle="round"/>
@@ -9663,15 +8542,7 @@
         </w:numPr>
       </w:pPr>
       <w:r>
-        <w:t>Az első pontnál van lehetőség szerkeszteni a profilt. A felhasználónév, bemutatkozás (</w:t>
-      </w:r>
-      <w:proofErr w:type="spellStart"/>
-      <w:r>
-        <w:t>bio</w:t>
-      </w:r>
-      <w:proofErr w:type="spellEnd"/>
-      <w:r>
-        <w:t>), esetleg egy új jelszó beállítására is van opció. Nem utolsó sorban a regisztrált fiókot törölni is lehet, azonban ilyenkor az összes profilhoz tartozó kvíz is törlődni fog.</w:t>
+        <w:t>Az első pontnál van lehetőség szerkeszteni a profilt. A felhasználónév, bemutatkozás (bio), esetleg egy új jelszó beállítására is van opció. Nem utolsó sorban a regisztrált fiókot törölni is lehet, azonban ilyenkor az összes profilhoz tartozó kvíz is törlődni fog.</w:t>
       </w:r>
     </w:p>
     <w:p>
@@ -10203,7 +9074,7 @@
                     <pic:cNvPicPr/>
                   </pic:nvPicPr>
                   <pic:blipFill>
-                    <a:blip r:embed="rId56" cstate="print">
+                    <a:blip r:embed="rId57" cstate="print">
                       <a:extLst>
                         <a:ext uri="{28A0092B-C50C-407E-A947-70E740481C1C}">
                           <a14:useLocalDpi xmlns:a14="http://schemas.microsoft.com/office/drawing/2010/main" val="0"/>
@@ -10406,7 +9277,7 @@
                     <pic:cNvPicPr/>
                   </pic:nvPicPr>
                   <pic:blipFill>
-                    <a:blip r:embed="rId57">
+                    <a:blip r:embed="rId58">
                       <a:extLst>
                         <a:ext uri="{28A0092B-C50C-407E-A947-70E740481C1C}">
                           <a14:useLocalDpi xmlns:a14="http://schemas.microsoft.com/office/drawing/2010/main" val="0"/>
@@ -10673,7 +9544,7 @@
                     <pic:cNvPicPr/>
                   </pic:nvPicPr>
                   <pic:blipFill>
-                    <a:blip r:embed="rId58">
+                    <a:blip r:embed="rId59">
                       <a:extLst>
                         <a:ext uri="{28A0092B-C50C-407E-A947-70E740481C1C}">
                           <a14:useLocalDpi xmlns:a14="http://schemas.microsoft.com/office/drawing/2010/main" val="0"/>
@@ -10869,7 +9740,7 @@
                     <pic:cNvPicPr/>
                   </pic:nvPicPr>
                   <pic:blipFill>
-                    <a:blip r:embed="rId59">
+                    <a:blip r:embed="rId60">
                       <a:extLst>
                         <a:ext uri="{28A0092B-C50C-407E-A947-70E740481C1C}">
                           <a14:useLocalDpi xmlns:a14="http://schemas.microsoft.com/office/drawing/2010/main" val="0"/>
@@ -11119,7 +9990,7 @@
                     <pic:cNvPicPr/>
                   </pic:nvPicPr>
                   <pic:blipFill>
-                    <a:blip r:embed="rId60">
+                    <a:blip r:embed="rId61">
                       <a:extLst>
                         <a:ext uri="{28A0092B-C50C-407E-A947-70E740481C1C}">
                           <a14:useLocalDpi xmlns:a14="http://schemas.microsoft.com/office/drawing/2010/main" val="0"/>
@@ -11152,15 +10023,7 @@
         </w:drawing>
       </w:r>
       <w:r>
-        <w:t>Elsőként az úgynevezett „banner” -</w:t>
-      </w:r>
-      <w:proofErr w:type="spellStart"/>
-      <w:r>
-        <w:t>nek</w:t>
-      </w:r>
-      <w:proofErr w:type="spellEnd"/>
-      <w:r>
-        <w:t xml:space="preserve"> választ</w:t>
+        <w:t>Elsőként az úgynevezett „banner” -nek választ</w:t>
       </w:r>
       <w:r>
         <w:t>ható</w:t>
@@ -11287,15 +10150,7 @@
         <w:t>Ezen az oldalon van lehetőség a kvíz kérdéseidet létrehozni, hozzáadni és szerkeszteni őket. Ha a kérdéseknél bármilyen változtatás történt azonnal felugrik egy „mentés” gomb, amivel a szerkesztés</w:t>
       </w:r>
       <w:r>
-        <w:t xml:space="preserve">eket </w:t>
-      </w:r>
-      <w:proofErr w:type="gramStart"/>
-      <w:r>
-        <w:t>van</w:t>
-      </w:r>
-      <w:proofErr w:type="gramEnd"/>
-      <w:r>
-        <w:t xml:space="preserve"> lehetőség elmenteni</w:t>
+        <w:t>eket van lehetőség elmenteni</w:t>
       </w:r>
       <w:r>
         <w:t>.</w:t>
@@ -11405,7 +10260,7 @@
                     <pic:cNvPicPr/>
                   </pic:nvPicPr>
                   <pic:blipFill>
-                    <a:blip r:embed="rId61"/>
+                    <a:blip r:embed="rId62"/>
                     <a:stretch>
                       <a:fillRect/>
                     </a:stretch>
@@ -11661,13 +10516,8 @@
                               </w:r>
                             </w:fldSimple>
                             <w:r>
-                              <w:t xml:space="preserve">. ábra - a négy </w:t>
+                              <w:t>. ábra - a négy slide</w:t>
                             </w:r>
-                            <w:proofErr w:type="spellStart"/>
-                            <w:r>
-                              <w:t>slide</w:t>
-                            </w:r>
-                            <w:proofErr w:type="spellEnd"/>
                             <w:r>
                               <w:t xml:space="preserve"> lehetőség</w:t>
                             </w:r>
@@ -11710,13 +10560,8 @@
                         </w:r>
                       </w:fldSimple>
                       <w:r>
-                        <w:t xml:space="preserve">. ábra - a négy </w:t>
+                        <w:t>. ábra - a négy slide</w:t>
                       </w:r>
-                      <w:proofErr w:type="spellStart"/>
-                      <w:r>
-                        <w:t>slide</w:t>
-                      </w:r>
-                      <w:proofErr w:type="spellEnd"/>
                       <w:r>
                         <w:t xml:space="preserve"> lehetőség</w:t>
                       </w:r>
@@ -11767,7 +10612,7 @@
                     <pic:cNvPicPr/>
                   </pic:nvPicPr>
                   <pic:blipFill>
-                    <a:blip r:embed="rId62">
+                    <a:blip r:embed="rId63">
                       <a:extLst>
                         <a:ext uri="{28A0092B-C50C-407E-A947-70E740481C1C}">
                           <a14:useLocalDpi xmlns:a14="http://schemas.microsoft.com/office/drawing/2010/main" val="0"/>
@@ -11808,13 +10653,8 @@
       <w:r>
         <w:t xml:space="preserve"> „+ Új kérdés hozzáadása” -</w:t>
       </w:r>
-      <w:proofErr w:type="spellStart"/>
-      <w:r>
-        <w:t>ra</w:t>
-      </w:r>
-      <w:proofErr w:type="spellEnd"/>
-      <w:r>
-        <w:t xml:space="preserve"> kattintva,</w:t>
+      <w:r>
+        <w:t>ra kattintva,</w:t>
       </w:r>
       <w:r>
         <w:t xml:space="preserve"> négy úgynevezett kérdéslap</w:t>
@@ -12456,23 +11296,7 @@
         </w:sectPr>
       </w:pPr>
       <w:r>
-        <w:t>Az infó lap, általános tájékoztatásra, úgynevezett „</w:t>
-      </w:r>
-      <w:proofErr w:type="spellStart"/>
-      <w:r>
-        <w:t>fun</w:t>
-      </w:r>
-      <w:proofErr w:type="spellEnd"/>
-      <w:r>
-        <w:t xml:space="preserve"> </w:t>
-      </w:r>
-      <w:proofErr w:type="spellStart"/>
-      <w:r>
-        <w:t>fact</w:t>
-      </w:r>
-      <w:proofErr w:type="spellEnd"/>
-      <w:r>
-        <w:t>” -re használható, vagy csak a játékosok bíztatására</w:t>
+        <w:t>Az infó lap, általános tájékoztatásra, úgynevezett „fun fact” -re használható, vagy csak a játékosok bíztatására</w:t>
       </w:r>
       <w:r>
         <w:t>.</w:t>
@@ -12517,7 +11341,7 @@
                     <pic:cNvPicPr/>
                   </pic:nvPicPr>
                   <pic:blipFill>
-                    <a:blip r:embed="rId63">
+                    <a:blip r:embed="rId64">
                       <a:extLst>
                         <a:ext uri="{28A0092B-C50C-407E-A947-70E740481C1C}">
                           <a14:useLocalDpi xmlns:a14="http://schemas.microsoft.com/office/drawing/2010/main" val="0"/>
@@ -12707,7 +11531,7 @@
                     <pic:cNvPicPr/>
                   </pic:nvPicPr>
                   <pic:blipFill>
-                    <a:blip r:embed="rId64">
+                    <a:blip r:embed="rId65">
                       <a:extLst>
                         <a:ext uri="{28A0092B-C50C-407E-A947-70E740481C1C}">
                           <a14:useLocalDpi xmlns:a14="http://schemas.microsoft.com/office/drawing/2010/main" val="0"/>
@@ -12897,7 +11721,7 @@
                     <pic:cNvPicPr/>
                   </pic:nvPicPr>
                   <pic:blipFill>
-                    <a:blip r:embed="rId65">
+                    <a:blip r:embed="rId66">
                       <a:extLst>
                         <a:ext uri="{28A0092B-C50C-407E-A947-70E740481C1C}">
                           <a14:useLocalDpi xmlns:a14="http://schemas.microsoft.com/office/drawing/2010/main" val="0"/>
@@ -13266,7 +12090,7 @@
                     <pic:cNvPicPr/>
                   </pic:nvPicPr>
                   <pic:blipFill>
-                    <a:blip r:embed="rId66">
+                    <a:blip r:embed="rId67">
                       <a:extLst>
                         <a:ext uri="{28A0092B-C50C-407E-A947-70E740481C1C}">
                           <a14:useLocalDpi xmlns:a14="http://schemas.microsoft.com/office/drawing/2010/main" val="0"/>
@@ -13455,7 +12279,7 @@
                     <pic:cNvPicPr/>
                   </pic:nvPicPr>
                   <pic:blipFill>
-                    <a:blip r:embed="rId67">
+                    <a:blip r:embed="rId68">
                       <a:extLst>
                         <a:ext uri="{28A0092B-C50C-407E-A947-70E740481C1C}">
                           <a14:useLocalDpi xmlns:a14="http://schemas.microsoft.com/office/drawing/2010/main" val="0"/>
@@ -13690,7 +12514,7 @@
                     <pic:cNvPicPr/>
                   </pic:nvPicPr>
                   <pic:blipFill>
-                    <a:blip r:embed="rId68">
+                    <a:blip r:embed="rId69">
                       <a:extLst>
                         <a:ext uri="{28A0092B-C50C-407E-A947-70E740481C1C}">
                           <a14:useLocalDpi xmlns:a14="http://schemas.microsoft.com/office/drawing/2010/main" val="0"/>
@@ -13859,13 +12683,7 @@
     </w:p>
     <w:p>
       <w:r>
-        <w:t xml:space="preserve">A jövőben szeretnénk elkészíteni egy mobilalkalmazást is, amely még kényelmesebbé tenné a </w:t>
-      </w:r>
-      <w:r>
-        <w:t>kvízek</w:t>
-      </w:r>
-      <w:r>
-        <w:t xml:space="preserve"> elérését, akár útközben is. Az alkalmazás lehetőséget adna</w:t>
+        <w:t>A jövőben szeretnénk elkészíteni egy mobilalkalmazást is, amely még kényelmesebbé tenné a kvízek elérését, akár útközben is. Az alkalmazás lehetőséget adna</w:t>
       </w:r>
       <w:r>
         <w:t xml:space="preserve"> akár</w:t>
@@ -20168,6 +18986,7 @@
   <w:style w:type="character" w:default="1" w:styleId="Bekezdsalapbettpusa">
     <w:name w:val="Default Paragraph Font"/>
     <w:uiPriority w:val="1"/>
+    <w:semiHidden/>
     <w:unhideWhenUsed/>
   </w:style>
   <w:style w:type="table" w:default="1" w:styleId="Normltblzat">

</xml_diff>

<commit_message>
feat(docs): add more content
</commit_message>
<xml_diff>
--- a/documentation/dokumentacio.docx
+++ b/documentation/dokumentacio.docx
@@ -14,13 +14,8 @@
       <w:pPr>
         <w:pStyle w:val="tajekoztato"/>
       </w:pPr>
-      <w:proofErr w:type="spellStart"/>
-      <w:r>
-        <w:t>Verebély</w:t>
-      </w:r>
-      <w:proofErr w:type="spellEnd"/>
-      <w:r>
-        <w:t xml:space="preserve"> László Technikum</w:t>
+      <w:r>
+        <w:t>Verebély László Technikum</w:t>
       </w:r>
     </w:p>
     <w:p>
@@ -153,27 +148,13 @@
         <w:rPr>
           <w:rFonts w:ascii="Calibri" w:hAnsi="Calibri" w:cs="Calibri"/>
         </w:rPr>
-        <w:t xml:space="preserve">a BMSZC </w:t>
-      </w:r>
-      <w:proofErr w:type="spellStart"/>
+        <w:t>a BMSZC Verebél</w:t>
+      </w:r>
       <w:r>
         <w:rPr>
           <w:rFonts w:ascii="Calibri" w:hAnsi="Calibri" w:cs="Calibri"/>
         </w:rPr>
-        <w:t>Verebél</w:t>
-      </w:r>
-      <w:r>
-        <w:rPr>
-          <w:rFonts w:ascii="Calibri" w:hAnsi="Calibri" w:cs="Calibri"/>
-        </w:rPr>
-        <w:t>y</w:t>
-      </w:r>
-      <w:proofErr w:type="spellEnd"/>
-      <w:r>
-        <w:rPr>
-          <w:rFonts w:ascii="Calibri" w:hAnsi="Calibri" w:cs="Calibri"/>
-        </w:rPr>
-        <w:t xml:space="preserve"> László Technikum 5 0613 12 03</w:t>
+        <w:t>y László Technikum 5 0613 12 03</w:t>
       </w:r>
       <w:r>
         <w:rPr>
@@ -3051,14 +3032,12 @@
         <w:t xml:space="preserve">A vizsgaremek témája egy már meglévő szoftver ihlette, a </w:t>
       </w:r>
       <w:hyperlink r:id="rId10" w:history="1">
-        <w:proofErr w:type="spellStart"/>
         <w:r>
           <w:rPr>
             <w:rStyle w:val="Hiperhivatkozs"/>
           </w:rPr>
           <w:t>Kahoot</w:t>
         </w:r>
-        <w:proofErr w:type="spellEnd"/>
       </w:hyperlink>
       <w:r>
         <w:t>. Az alap elgondolás az volt, hogy a felhasználók kvízeket tudjanak létrehozni, azokat szerkeszteni, megosztani</w:t>
@@ -3067,15 +3046,7 @@
         <w:t>,</w:t>
       </w:r>
       <w:r>
-        <w:t xml:space="preserve"> illetve a legfőbb feladata, hogy lehessen játszani bárkivel bárhol a világon valós időben. Fontosnak tartottuk, hogy ne egy </w:t>
-      </w:r>
-      <w:proofErr w:type="spellStart"/>
-      <w:r>
-        <w:t>Kahoot</w:t>
-      </w:r>
-      <w:proofErr w:type="spellEnd"/>
-      <w:r>
-        <w:t xml:space="preserve"> másolatot készítsünk, hanem az alap elgondolást bővítsük</w:t>
+        <w:t xml:space="preserve"> illetve a legfőbb feladata, hogy lehessen játszani bárkivel bárhol a világon valós időben. Fontosnak tartottuk, hogy ne egy Kahoot másolatot készítsünk, hanem az alap elgondolást bővítsük</w:t>
       </w:r>
       <w:r>
         <w:t xml:space="preserve"> ki a saját elképzeléseinkkel és megoldásainkkal. Szerettünk volna egy korszerűbb kialakítású oldalt, amitől az embernek megjön a kedve ahhoz, hogy bizonyos témaköröket </w:t>
@@ -3093,31 +3064,7 @@
         <w:t>,</w:t>
       </w:r>
       <w:r>
-        <w:t xml:space="preserve"> hogy publikus vagy privát legyen. Privát esetében csak a készítő látja és indíthatja el. A létrehozást követően egyből szerkeszthetjük a kvíz minden elemét, beleértve az előbb felsorolt lehetőségeket is. Úgy nevezett „</w:t>
-      </w:r>
-      <w:proofErr w:type="spellStart"/>
-      <w:r>
-        <w:t>slide</w:t>
-      </w:r>
-      <w:proofErr w:type="spellEnd"/>
-      <w:r>
-        <w:t>” -</w:t>
-      </w:r>
-      <w:proofErr w:type="spellStart"/>
-      <w:r>
-        <w:t>okat</w:t>
-      </w:r>
-      <w:proofErr w:type="spellEnd"/>
-      <w:r>
-        <w:t xml:space="preserve"> hozhatunk létre, amelyek fognak lepörögni a lejátszás alatt. 4 féle </w:t>
-      </w:r>
-      <w:proofErr w:type="spellStart"/>
-      <w:r>
-        <w:t>slide</w:t>
-      </w:r>
-      <w:proofErr w:type="spellEnd"/>
-      <w:r>
-        <w:t xml:space="preserve"> típus közül lehet választani:</w:t>
+        <w:t xml:space="preserve"> hogy publikus vagy privát legyen. Privát esetében csak a készítő látja és indíthatja el. A létrehozást követően egyből szerkeszthetjük a kvíz minden elemét, beleértve az előbb felsorolt lehetőségeket is. Úgy nevezett „slide” -okat hozhatunk létre, amelyek fognak lepörögni a lejátszás alatt. 4 féle slide típus közül lehet választani:</w:t>
       </w:r>
     </w:p>
     <w:p>
@@ -3153,13 +3100,8 @@
         </w:numPr>
       </w:pPr>
       <w:r>
-        <w:t xml:space="preserve">Infó </w:t>
-      </w:r>
-      <w:proofErr w:type="spellStart"/>
-      <w:r>
-        <w:t>slide</w:t>
-      </w:r>
-      <w:proofErr w:type="spellEnd"/>
+        <w:t>Infó slide</w:t>
+      </w:r>
     </w:p>
     <w:p>
       <w:pPr>
@@ -3175,15 +3117,7 @@
     </w:p>
     <w:p>
       <w:r>
-        <w:t xml:space="preserve">Minden slide-ra külön-külön be lehet állítani, hogy hány másodpercig jelenjen meg, milyen sorrendben legyenek a kérdések, sőt még a </w:t>
-      </w:r>
-      <w:proofErr w:type="spellStart"/>
-      <w:r>
-        <w:t>slideokat</w:t>
-      </w:r>
-      <w:proofErr w:type="spellEnd"/>
-      <w:r>
-        <w:t xml:space="preserve"> is egyszerűen tudjuk mozgatni, ha netán nem tetszene a sorrend.</w:t>
+        <w:t>Minden slide-ra külön-külön be lehet állítani, hogy hány másodpercig jelenjen meg, milyen sorrendben legyenek a kérdések, sőt még a slideokat is egyszerűen tudjuk mozgatni, ha netán nem tetszene a sorrend.</w:t>
       </w:r>
     </w:p>
     <w:p>
@@ -3299,16 +3233,8 @@
           <w:rPr>
             <w:rStyle w:val="Hiperhivatkozs"/>
           </w:rPr>
-          <w:t xml:space="preserve">Visual Studio </w:t>
-        </w:r>
-        <w:proofErr w:type="spellStart"/>
-        <w:r>
-          <w:rPr>
-            <w:rStyle w:val="Hiperhivatkozs"/>
-          </w:rPr>
-          <w:t>Code</w:t>
-        </w:r>
-        <w:proofErr w:type="spellEnd"/>
+          <w:t>Visual Studio Code</w:t>
+        </w:r>
       </w:hyperlink>
     </w:p>
     <w:p>
@@ -3320,39 +3246,15 @@
         </w:numPr>
       </w:pPr>
       <w:r>
-        <w:t xml:space="preserve">Csomag és </w:t>
-      </w:r>
-      <w:proofErr w:type="spellStart"/>
-      <w:r>
-        <w:t>monorepo</w:t>
-      </w:r>
-      <w:proofErr w:type="spellEnd"/>
-      <w:r>
-        <w:t xml:space="preserve">-kezelő: </w:t>
+        <w:t xml:space="preserve">Csomag és monorepo-kezelő: </w:t>
       </w:r>
       <w:hyperlink r:id="rId14" w:history="1">
-        <w:proofErr w:type="spellStart"/>
         <w:r>
           <w:rPr>
             <w:rStyle w:val="Hiperhivatkozs"/>
           </w:rPr>
-          <w:t>pnpm</w:t>
-        </w:r>
-        <w:proofErr w:type="spellEnd"/>
-        <w:r>
-          <w:rPr>
-            <w:rStyle w:val="Hiperhivatkozs"/>
-          </w:rPr>
-          <w:t xml:space="preserve"> </w:t>
-        </w:r>
-        <w:proofErr w:type="spellStart"/>
-        <w:r>
-          <w:rPr>
-            <w:rStyle w:val="Hiperhivatkozs"/>
-          </w:rPr>
-          <w:t>workspace</w:t>
-        </w:r>
-        <w:proofErr w:type="spellEnd"/>
+          <w:t>pnpm workspace</w:t>
+        </w:r>
       </w:hyperlink>
     </w:p>
     <w:p>
@@ -3367,14 +3269,12 @@
         <w:t xml:space="preserve">Adatbázis-adminisztrációs eszköz: </w:t>
       </w:r>
       <w:hyperlink r:id="rId15" w:history="1">
-        <w:proofErr w:type="spellStart"/>
         <w:r>
           <w:rPr>
             <w:rStyle w:val="Hiperhivatkozs"/>
           </w:rPr>
           <w:t>HeidiSQL</w:t>
         </w:r>
-        <w:proofErr w:type="spellEnd"/>
       </w:hyperlink>
     </w:p>
     <w:p>
@@ -3420,27 +3320,23 @@
         <w:t xml:space="preserve">Kódformázás és ellenőrzés: </w:t>
       </w:r>
       <w:hyperlink r:id="rId18" w:history="1">
-        <w:proofErr w:type="spellStart"/>
         <w:r>
           <w:rPr>
             <w:rStyle w:val="Hiperhivatkozs"/>
           </w:rPr>
           <w:t>Prettier</w:t>
         </w:r>
-        <w:proofErr w:type="spellEnd"/>
       </w:hyperlink>
       <w:r>
         <w:t xml:space="preserve">, </w:t>
       </w:r>
       <w:hyperlink r:id="rId19" w:history="1">
-        <w:proofErr w:type="spellStart"/>
         <w:r>
           <w:rPr>
             <w:rStyle w:val="Hiperhivatkozs"/>
           </w:rPr>
           <w:t>ESLint</w:t>
         </w:r>
-        <w:proofErr w:type="spellEnd"/>
       </w:hyperlink>
     </w:p>
     <w:p>
@@ -3472,14 +3368,12 @@
         <w:t xml:space="preserve">Programozási nyelvek: </w:t>
       </w:r>
       <w:hyperlink r:id="rId20" w:history="1">
-        <w:proofErr w:type="spellStart"/>
         <w:r>
           <w:rPr>
             <w:rStyle w:val="Hiperhivatkozs"/>
           </w:rPr>
           <w:t>TypeScript</w:t>
         </w:r>
-        <w:proofErr w:type="spellEnd"/>
       </w:hyperlink>
       <w:r>
         <w:t xml:space="preserve">, </w:t>
@@ -3516,27 +3410,23 @@
         <w:t xml:space="preserve">, </w:t>
       </w:r>
       <w:hyperlink r:id="rId23" w:history="1">
-        <w:proofErr w:type="spellStart"/>
         <w:r>
           <w:rPr>
             <w:rStyle w:val="Hiperhivatkozs"/>
           </w:rPr>
           <w:t>React</w:t>
         </w:r>
-        <w:proofErr w:type="spellEnd"/>
       </w:hyperlink>
       <w:r>
         <w:t xml:space="preserve">, </w:t>
       </w:r>
       <w:hyperlink r:id="rId24" w:history="1">
-        <w:proofErr w:type="spellStart"/>
         <w:r>
           <w:rPr>
             <w:rStyle w:val="Hiperhivatkozs"/>
           </w:rPr>
           <w:t>TailWindCSS</w:t>
         </w:r>
-        <w:proofErr w:type="spellEnd"/>
       </w:hyperlink>
       <w:r>
         <w:t xml:space="preserve">, </w:t>
@@ -3562,46 +3452,22 @@
         <w:t xml:space="preserve">Adatbáziskezelés és ORM: </w:t>
       </w:r>
       <w:hyperlink r:id="rId26" w:history="1">
-        <w:proofErr w:type="spellStart"/>
         <w:r>
           <w:rPr>
             <w:rStyle w:val="Hiperhivatkozs"/>
           </w:rPr>
-          <w:t>MariaDB</w:t>
-        </w:r>
-        <w:proofErr w:type="spellEnd"/>
+          <w:t>MariaDB/MySQL</w:t>
+        </w:r>
+      </w:hyperlink>
+      <w:r>
+        <w:t xml:space="preserve">, </w:t>
+      </w:r>
+      <w:hyperlink r:id="rId27" w:history="1">
         <w:r>
           <w:rPr>
             <w:rStyle w:val="Hiperhivatkozs"/>
           </w:rPr>
-          <w:t>/</w:t>
-        </w:r>
-        <w:proofErr w:type="spellStart"/>
-        <w:r>
-          <w:rPr>
-            <w:rStyle w:val="Hiperhivatkozs"/>
-          </w:rPr>
-          <w:t>MySQL</w:t>
-        </w:r>
-        <w:proofErr w:type="spellEnd"/>
-      </w:hyperlink>
-      <w:r>
-        <w:t xml:space="preserve">, </w:t>
-      </w:r>
-      <w:hyperlink r:id="rId27" w:history="1">
-        <w:proofErr w:type="spellStart"/>
-        <w:r>
-          <w:rPr>
-            <w:rStyle w:val="Hiperhivatkozs"/>
-          </w:rPr>
-          <w:t>Drizzle</w:t>
-        </w:r>
-        <w:proofErr w:type="spellEnd"/>
-        <w:r>
-          <w:rPr>
-            <w:rStyle w:val="Hiperhivatkozs"/>
-          </w:rPr>
-          <w:t xml:space="preserve"> ORM</w:t>
+          <w:t>Drizzle ORM</w:t>
         </w:r>
       </w:hyperlink>
     </w:p>
@@ -3622,51 +3488,33 @@
         <w:t xml:space="preserve">UI komponens könyvtárak: </w:t>
       </w:r>
       <w:hyperlink r:id="rId28" w:history="1">
-        <w:proofErr w:type="spellStart"/>
         <w:r>
           <w:rPr>
             <w:rStyle w:val="Hiperhivatkozs"/>
           </w:rPr>
           <w:t>shadcn</w:t>
         </w:r>
-        <w:proofErr w:type="spellEnd"/>
       </w:hyperlink>
       <w:r>
         <w:t xml:space="preserve">, </w:t>
       </w:r>
       <w:hyperlink r:id="rId29" w:history="1">
-        <w:proofErr w:type="spellStart"/>
         <w:r>
           <w:rPr>
             <w:rStyle w:val="Hiperhivatkozs"/>
           </w:rPr>
-          <w:t>Origin</w:t>
-        </w:r>
-        <w:proofErr w:type="spellEnd"/>
+          <w:t>Origin UI</w:t>
+        </w:r>
+      </w:hyperlink>
+      <w:r>
+        <w:t xml:space="preserve">, </w:t>
+      </w:r>
+      <w:hyperlink r:id="rId30" w:history="1">
         <w:r>
           <w:rPr>
             <w:rStyle w:val="Hiperhivatkozs"/>
           </w:rPr>
-          <w:t xml:space="preserve"> UI</w:t>
-        </w:r>
-      </w:hyperlink>
-      <w:r>
-        <w:t xml:space="preserve">, </w:t>
-      </w:r>
-      <w:hyperlink r:id="rId30" w:history="1">
-        <w:proofErr w:type="spellStart"/>
-        <w:r>
-          <w:rPr>
-            <w:rStyle w:val="Hiperhivatkozs"/>
-          </w:rPr>
-          <w:t>Magic</w:t>
-        </w:r>
-        <w:proofErr w:type="spellEnd"/>
-        <w:r>
-          <w:rPr>
-            <w:rStyle w:val="Hiperhivatkozs"/>
-          </w:rPr>
-          <w:t xml:space="preserve"> UI</w:t>
+          <w:t>Magic UI</w:t>
         </w:r>
       </w:hyperlink>
       <w:r>
@@ -3975,21 +3823,7 @@
               <w:rPr>
                 <w:b w:val="0"/>
               </w:rPr>
-              <w:t xml:space="preserve">A weboldal </w:t>
-            </w:r>
-            <w:proofErr w:type="spellStart"/>
-            <w:r>
-              <w:rPr>
-                <w:b w:val="0"/>
-              </w:rPr>
-              <w:t>autentikációjának</w:t>
-            </w:r>
-            <w:proofErr w:type="spellEnd"/>
-            <w:r>
-              <w:rPr>
-                <w:b w:val="0"/>
-              </w:rPr>
-              <w:t xml:space="preserve"> elkészítése</w:t>
+              <w:t>A weboldal autentikációjának elkészítése</w:t>
             </w:r>
           </w:p>
         </w:tc>
@@ -4212,14 +4046,12 @@
       <w:r>
         <w:t xml:space="preserve"> </w:t>
       </w:r>
-      <w:proofErr w:type="spellStart"/>
       <w:r>
         <w:rPr>
           <w:rStyle w:val="codeblockChar"/>
         </w:rPr>
         <w:t>node</w:t>
       </w:r>
-      <w:proofErr w:type="spellEnd"/>
       <w:r>
         <w:t xml:space="preserve"> paranccsal.</w:t>
       </w:r>
@@ -4230,147 +4062,7 @@
         <w:rPr>
           <w:rStyle w:val="codeblockChar"/>
         </w:rPr>
-        <w:t>'</w:t>
-      </w:r>
-      <w:proofErr w:type="spellStart"/>
-      <w:r>
-        <w:rPr>
-          <w:rStyle w:val="codeblockChar"/>
-        </w:rPr>
-        <w:t>qwe</w:t>
-      </w:r>
-      <w:proofErr w:type="spellEnd"/>
-      <w:r>
-        <w:rPr>
-          <w:rStyle w:val="codeblockChar"/>
-        </w:rPr>
-        <w:t xml:space="preserve">' is </w:t>
-      </w:r>
-      <w:proofErr w:type="spellStart"/>
-      <w:r>
-        <w:rPr>
-          <w:rStyle w:val="codeblockChar"/>
-        </w:rPr>
-        <w:t>not</w:t>
-      </w:r>
-      <w:proofErr w:type="spellEnd"/>
-      <w:r>
-        <w:rPr>
-          <w:rStyle w:val="codeblockChar"/>
-        </w:rPr>
-        <w:t xml:space="preserve"> </w:t>
-      </w:r>
-      <w:proofErr w:type="spellStart"/>
-      <w:r>
-        <w:rPr>
-          <w:rStyle w:val="codeblockChar"/>
-        </w:rPr>
-        <w:t>recognized</w:t>
-      </w:r>
-      <w:proofErr w:type="spellEnd"/>
-      <w:r>
-        <w:rPr>
-          <w:rStyle w:val="codeblockChar"/>
-        </w:rPr>
-        <w:t xml:space="preserve"> </w:t>
-      </w:r>
-      <w:proofErr w:type="spellStart"/>
-      <w:r>
-        <w:rPr>
-          <w:rStyle w:val="codeblockChar"/>
-        </w:rPr>
-        <w:t>as</w:t>
-      </w:r>
-      <w:proofErr w:type="spellEnd"/>
-      <w:r>
-        <w:rPr>
-          <w:rStyle w:val="codeblockChar"/>
-        </w:rPr>
-        <w:t xml:space="preserve"> an </w:t>
-      </w:r>
-      <w:proofErr w:type="spellStart"/>
-      <w:r>
-        <w:rPr>
-          <w:rStyle w:val="codeblockChar"/>
-        </w:rPr>
-        <w:t>internal</w:t>
-      </w:r>
-      <w:proofErr w:type="spellEnd"/>
-      <w:r>
-        <w:rPr>
-          <w:rStyle w:val="codeblockChar"/>
-        </w:rPr>
-        <w:t xml:space="preserve"> </w:t>
-      </w:r>
-      <w:proofErr w:type="spellStart"/>
-      <w:r>
-        <w:rPr>
-          <w:rStyle w:val="codeblockChar"/>
-        </w:rPr>
-        <w:t>or</w:t>
-      </w:r>
-      <w:proofErr w:type="spellEnd"/>
-      <w:r>
-        <w:rPr>
-          <w:rStyle w:val="codeblockChar"/>
-        </w:rPr>
-        <w:t xml:space="preserve"> </w:t>
-      </w:r>
-      <w:proofErr w:type="spellStart"/>
-      <w:r>
-        <w:rPr>
-          <w:rStyle w:val="codeblockChar"/>
-        </w:rPr>
-        <w:t>external</w:t>
-      </w:r>
-      <w:proofErr w:type="spellEnd"/>
-      <w:r>
-        <w:rPr>
-          <w:rStyle w:val="codeblockChar"/>
-        </w:rPr>
-        <w:t xml:space="preserve"> </w:t>
-      </w:r>
-      <w:proofErr w:type="spellStart"/>
-      <w:r>
-        <w:rPr>
-          <w:rStyle w:val="codeblockChar"/>
-        </w:rPr>
-        <w:t>command</w:t>
-      </w:r>
-      <w:proofErr w:type="spellEnd"/>
-      <w:r>
-        <w:rPr>
-          <w:rStyle w:val="codeblockChar"/>
-        </w:rPr>
-        <w:t xml:space="preserve">, </w:t>
-      </w:r>
-      <w:proofErr w:type="spellStart"/>
-      <w:r>
-        <w:rPr>
-          <w:rStyle w:val="codeblockChar"/>
-        </w:rPr>
-        <w:t>operable</w:t>
-      </w:r>
-      <w:proofErr w:type="spellEnd"/>
-      <w:r>
-        <w:rPr>
-          <w:rStyle w:val="codeblockChar"/>
-        </w:rPr>
-        <w:t xml:space="preserve"> program </w:t>
-      </w:r>
-      <w:proofErr w:type="spellStart"/>
-      <w:r>
-        <w:rPr>
-          <w:rStyle w:val="codeblockChar"/>
-        </w:rPr>
-        <w:t>or</w:t>
-      </w:r>
-      <w:proofErr w:type="spellEnd"/>
-      <w:r>
-        <w:rPr>
-          <w:rStyle w:val="codeblockChar"/>
-        </w:rPr>
-        <w:t xml:space="preserve"> batch file.</w:t>
+        <w:t>'qwe' is not recognized as an internal or external command, operable program or batch file.</w:t>
       </w:r>
       <w:r>
         <w:rPr>
@@ -4403,66 +4095,14 @@
         </w:numPr>
       </w:pPr>
       <w:r>
-        <w:t xml:space="preserve">Telepítsük a </w:t>
-      </w:r>
-      <w:proofErr w:type="spellStart"/>
-      <w:r>
-        <w:t>pnpm</w:t>
-      </w:r>
-      <w:proofErr w:type="spellEnd"/>
-      <w:r>
-        <w:t xml:space="preserve"> csomag-kezelőt a </w:t>
-      </w:r>
-      <w:proofErr w:type="spellStart"/>
+        <w:t xml:space="preserve">Telepítsük a pnpm csomag-kezelőt a </w:t>
+      </w:r>
       <w:r>
         <w:rPr>
           <w:rStyle w:val="codeblockChar"/>
         </w:rPr>
-        <w:t>winget</w:t>
-      </w:r>
-      <w:proofErr w:type="spellEnd"/>
-      <w:r>
-        <w:rPr>
-          <w:rStyle w:val="codeblockChar"/>
-        </w:rPr>
-        <w:t xml:space="preserve"> </w:t>
-      </w:r>
-      <w:proofErr w:type="spellStart"/>
-      <w:r>
-        <w:rPr>
-          <w:rStyle w:val="codeblockChar"/>
-        </w:rPr>
-        <w:t>install</w:t>
-      </w:r>
-      <w:proofErr w:type="spellEnd"/>
-      <w:r>
-        <w:rPr>
-          <w:rStyle w:val="codeblockChar"/>
-        </w:rPr>
-        <w:t xml:space="preserve"> -e --</w:t>
-      </w:r>
-      <w:proofErr w:type="spellStart"/>
-      <w:r>
-        <w:rPr>
-          <w:rStyle w:val="codeblockChar"/>
-        </w:rPr>
-        <w:t>id</w:t>
-      </w:r>
-      <w:proofErr w:type="spellEnd"/>
-      <w:r>
-        <w:rPr>
-          <w:rStyle w:val="codeblockChar"/>
-        </w:rPr>
-        <w:t xml:space="preserve"> </w:t>
-      </w:r>
-      <w:proofErr w:type="spellStart"/>
-      <w:r>
-        <w:rPr>
-          <w:rStyle w:val="codeblockChar"/>
-        </w:rPr>
-        <w:t>pnpm.pnpm</w:t>
-      </w:r>
-      <w:proofErr w:type="spellEnd"/>
+        <w:t>winget install -e --id pnpm.pnpm</w:t>
+      </w:r>
       <w:r>
         <w:t xml:space="preserve"> paranccsal.</w:t>
       </w:r>
@@ -4479,106 +4119,20 @@
         <w:rPr>
           <w:rFonts w:ascii="Calibri" w:hAnsi="Calibri" w:cs="Calibri"/>
         </w:rPr>
-        <w:t xml:space="preserve">Telepítsük a </w:t>
-      </w:r>
-      <w:proofErr w:type="spellStart"/>
-      <w:r>
-        <w:rPr>
-          <w:rFonts w:ascii="Calibri" w:hAnsi="Calibri" w:cs="Calibri"/>
+        <w:t xml:space="preserve">Telepítsük a Bun Node runtime-ot a </w:t>
+      </w:r>
+      <w:r>
+        <w:rPr>
+          <w:rStyle w:val="codeblockChar"/>
+        </w:rPr>
+        <w:t>winget install --id=Oven-sh.</w:t>
+      </w:r>
+      <w:r>
+        <w:rPr>
+          <w:rStyle w:val="codeblockChar"/>
         </w:rPr>
         <w:t>Bun</w:t>
       </w:r>
-      <w:proofErr w:type="spellEnd"/>
-      <w:r>
-        <w:rPr>
-          <w:rFonts w:ascii="Calibri" w:hAnsi="Calibri" w:cs="Calibri"/>
-        </w:rPr>
-        <w:t xml:space="preserve"> </w:t>
-      </w:r>
-      <w:proofErr w:type="spellStart"/>
-      <w:r>
-        <w:rPr>
-          <w:rFonts w:ascii="Calibri" w:hAnsi="Calibri" w:cs="Calibri"/>
-        </w:rPr>
-        <w:t>Node</w:t>
-      </w:r>
-      <w:proofErr w:type="spellEnd"/>
-      <w:r>
-        <w:rPr>
-          <w:rFonts w:ascii="Calibri" w:hAnsi="Calibri" w:cs="Calibri"/>
-        </w:rPr>
-        <w:t xml:space="preserve"> </w:t>
-      </w:r>
-      <w:proofErr w:type="spellStart"/>
-      <w:r>
-        <w:rPr>
-          <w:rFonts w:ascii="Calibri" w:hAnsi="Calibri" w:cs="Calibri"/>
-        </w:rPr>
-        <w:t>runtime</w:t>
-      </w:r>
-      <w:proofErr w:type="spellEnd"/>
-      <w:r>
-        <w:rPr>
-          <w:rFonts w:ascii="Calibri" w:hAnsi="Calibri" w:cs="Calibri"/>
-        </w:rPr>
-        <w:t xml:space="preserve">-ot a </w:t>
-      </w:r>
-      <w:proofErr w:type="spellStart"/>
-      <w:r>
-        <w:rPr>
-          <w:rStyle w:val="codeblockChar"/>
-        </w:rPr>
-        <w:t>winget</w:t>
-      </w:r>
-      <w:proofErr w:type="spellEnd"/>
-      <w:r>
-        <w:rPr>
-          <w:rStyle w:val="codeblockChar"/>
-        </w:rPr>
-        <w:t xml:space="preserve"> </w:t>
-      </w:r>
-      <w:proofErr w:type="spellStart"/>
-      <w:r>
-        <w:rPr>
-          <w:rStyle w:val="codeblockChar"/>
-        </w:rPr>
-        <w:t>install</w:t>
-      </w:r>
-      <w:proofErr w:type="spellEnd"/>
-      <w:r>
-        <w:rPr>
-          <w:rStyle w:val="codeblockChar"/>
-        </w:rPr>
-        <w:t xml:space="preserve"> --</w:t>
-      </w:r>
-      <w:proofErr w:type="spellStart"/>
-      <w:r>
-        <w:rPr>
-          <w:rStyle w:val="codeblockChar"/>
-        </w:rPr>
-        <w:t>id</w:t>
-      </w:r>
-      <w:proofErr w:type="spellEnd"/>
-      <w:r>
-        <w:rPr>
-          <w:rStyle w:val="codeblockChar"/>
-        </w:rPr>
-        <w:t>=</w:t>
-      </w:r>
-      <w:proofErr w:type="spellStart"/>
-      <w:r>
-        <w:rPr>
-          <w:rStyle w:val="codeblockChar"/>
-        </w:rPr>
-        <w:t>Oven-sh.</w:t>
-      </w:r>
-      <w:r>
-        <w:rPr>
-          <w:rStyle w:val="codeblockChar"/>
-        </w:rPr>
-        <w:t>Bun</w:t>
-      </w:r>
-      <w:proofErr w:type="spellEnd"/>
       <w:r>
         <w:rPr>
           <w:rStyle w:val="codeblockChar"/>
@@ -4612,28 +4166,12 @@
         </w:rPr>
         <w:t xml:space="preserve">Telepítsük a függőségeket a </w:t>
       </w:r>
-      <w:proofErr w:type="spellStart"/>
       <w:r>
         <w:rPr>
           <w:rStyle w:val="codeblockChar"/>
         </w:rPr>
-        <w:t>pnpm</w:t>
-      </w:r>
-      <w:proofErr w:type="spellEnd"/>
-      <w:r>
-        <w:rPr>
-          <w:rStyle w:val="codeblockChar"/>
-        </w:rPr>
-        <w:t xml:space="preserve"> </w:t>
-      </w:r>
-      <w:proofErr w:type="spellStart"/>
-      <w:r>
-        <w:rPr>
-          <w:rStyle w:val="codeblockChar"/>
-        </w:rPr>
-        <w:t>install</w:t>
-      </w:r>
-      <w:proofErr w:type="spellEnd"/>
+        <w:t>pnpm install</w:t>
+      </w:r>
       <w:r>
         <w:rPr>
           <w:rFonts w:ascii="Calibri" w:hAnsi="Calibri" w:cs="Calibri"/>
@@ -4677,70 +4215,32 @@
         <w:rPr>
           <w:rStyle w:val="codeblockChar"/>
         </w:rPr>
-        <w:t>./web/</w:t>
-      </w:r>
-      <w:proofErr w:type="spellStart"/>
+        <w:t>./web/apps/next</w:t>
+      </w:r>
+      <w:r>
+        <w:rPr>
+          <w:rFonts w:ascii="Calibri" w:hAnsi="Calibri" w:cs="Calibri"/>
+        </w:rPr>
+        <w:t xml:space="preserve"> mappába. Hozzunk létre egy </w:t>
+      </w:r>
       <w:r>
         <w:rPr>
           <w:rStyle w:val="codeblockChar"/>
         </w:rPr>
-        <w:t>apps</w:t>
-      </w:r>
-      <w:proofErr w:type="spellEnd"/>
+        <w:t>.env</w:t>
+      </w:r>
+      <w:r>
+        <w:rPr>
+          <w:rFonts w:ascii="Calibri" w:hAnsi="Calibri" w:cs="Calibri"/>
+        </w:rPr>
+        <w:t xml:space="preserve"> fájlt és illesszük bele a </w:t>
+      </w:r>
       <w:r>
         <w:rPr>
           <w:rStyle w:val="codeblockChar"/>
         </w:rPr>
-        <w:t>/</w:t>
-      </w:r>
-      <w:proofErr w:type="spellStart"/>
-      <w:r>
-        <w:rPr>
-          <w:rStyle w:val="codeblockChar"/>
-        </w:rPr>
-        <w:t>next</w:t>
-      </w:r>
-      <w:proofErr w:type="spellEnd"/>
-      <w:r>
-        <w:rPr>
-          <w:rFonts w:ascii="Calibri" w:hAnsi="Calibri" w:cs="Calibri"/>
-        </w:rPr>
-        <w:t xml:space="preserve"> mappába. Hozzunk létre egy </w:t>
-      </w:r>
-      <w:r>
-        <w:rPr>
-          <w:rStyle w:val="codeblockChar"/>
-        </w:rPr>
-        <w:t>.</w:t>
-      </w:r>
-      <w:proofErr w:type="spellStart"/>
-      <w:r>
-        <w:rPr>
-          <w:rStyle w:val="codeblockChar"/>
-        </w:rPr>
-        <w:t>env</w:t>
-      </w:r>
-      <w:proofErr w:type="spellEnd"/>
-      <w:r>
-        <w:rPr>
-          <w:rFonts w:ascii="Calibri" w:hAnsi="Calibri" w:cs="Calibri"/>
-        </w:rPr>
-        <w:t xml:space="preserve"> fájlt és illesszük bele a </w:t>
-      </w:r>
-      <w:r>
-        <w:rPr>
-          <w:rStyle w:val="codeblockChar"/>
-        </w:rPr>
-        <w:t>.</w:t>
-      </w:r>
-      <w:proofErr w:type="spellStart"/>
-      <w:r>
-        <w:rPr>
-          <w:rStyle w:val="codeblockChar"/>
-        </w:rPr>
-        <w:t>env.example</w:t>
-      </w:r>
-      <w:proofErr w:type="spellEnd"/>
+        <w:t>.env.example</w:t>
+      </w:r>
       <w:r>
         <w:rPr>
           <w:rFonts w:ascii="Calibri" w:hAnsi="Calibri" w:cs="Calibri"/>
@@ -4763,7 +4263,6 @@
         <w:t xml:space="preserve"> környezeti változó értéke bármi lehet, csak lényeg, hogy legyen benne valami. Szerezzünk ingyenesen egy kulcsot az </w:t>
       </w:r>
       <w:hyperlink r:id="rId35" w:history="1">
-        <w:proofErr w:type="spellStart"/>
         <w:r>
           <w:rPr>
             <w:rStyle w:val="Hiperhivatkozs"/>
@@ -4771,7 +4270,6 @@
           </w:rPr>
           <w:t>Uploadthing</w:t>
         </w:r>
-        <w:proofErr w:type="spellEnd"/>
       </w:hyperlink>
       <w:r>
         <w:rPr>
@@ -4801,21 +4299,7 @@
         <w:rPr>
           <w:rFonts w:ascii="Calibri" w:hAnsi="Calibri" w:cs="Calibri"/>
         </w:rPr>
-        <w:t xml:space="preserve"> legyen az </w:t>
-      </w:r>
-      <w:proofErr w:type="spellStart"/>
-      <w:r>
-        <w:rPr>
-          <w:rFonts w:ascii="Calibri" w:hAnsi="Calibri" w:cs="Calibri"/>
-        </w:rPr>
-        <w:t>Uploadthing</w:t>
-      </w:r>
-      <w:proofErr w:type="spellEnd"/>
-      <w:r>
-        <w:rPr>
-          <w:rFonts w:ascii="Calibri" w:hAnsi="Calibri" w:cs="Calibri"/>
-        </w:rPr>
-        <w:t>-es projekt id.</w:t>
+        <w:t xml:space="preserve"> legyen az Uploadthing-es projekt id.</w:t>
       </w:r>
     </w:p>
     <w:p>
@@ -4839,70 +4323,32 @@
         <w:rPr>
           <w:rStyle w:val="codeblockChar"/>
         </w:rPr>
-        <w:t>./web/</w:t>
-      </w:r>
-      <w:proofErr w:type="spellStart"/>
+        <w:t>./web/apps/ws</w:t>
+      </w:r>
+      <w:r>
+        <w:rPr>
+          <w:rFonts w:ascii="Calibri" w:hAnsi="Calibri" w:cs="Calibri"/>
+        </w:rPr>
+        <w:t xml:space="preserve"> mappába. Hozzunk létre egy </w:t>
+      </w:r>
       <w:r>
         <w:rPr>
           <w:rStyle w:val="codeblockChar"/>
         </w:rPr>
-        <w:t>apps</w:t>
-      </w:r>
-      <w:proofErr w:type="spellEnd"/>
+        <w:t>.env</w:t>
+      </w:r>
+      <w:r>
+        <w:rPr>
+          <w:rFonts w:ascii="Calibri" w:hAnsi="Calibri" w:cs="Calibri"/>
+        </w:rPr>
+        <w:t xml:space="preserve"> fájlt és illesszük bele a </w:t>
+      </w:r>
       <w:r>
         <w:rPr>
           <w:rStyle w:val="codeblockChar"/>
         </w:rPr>
-        <w:t>/</w:t>
-      </w:r>
-      <w:proofErr w:type="spellStart"/>
-      <w:r>
-        <w:rPr>
-          <w:rStyle w:val="codeblockChar"/>
-        </w:rPr>
-        <w:t>ws</w:t>
-      </w:r>
-      <w:proofErr w:type="spellEnd"/>
-      <w:r>
-        <w:rPr>
-          <w:rFonts w:ascii="Calibri" w:hAnsi="Calibri" w:cs="Calibri"/>
-        </w:rPr>
-        <w:t xml:space="preserve"> mappába. Hozzunk létre egy </w:t>
-      </w:r>
-      <w:r>
-        <w:rPr>
-          <w:rStyle w:val="codeblockChar"/>
-        </w:rPr>
-        <w:t>.</w:t>
-      </w:r>
-      <w:proofErr w:type="spellStart"/>
-      <w:r>
-        <w:rPr>
-          <w:rStyle w:val="codeblockChar"/>
-        </w:rPr>
-        <w:t>env</w:t>
-      </w:r>
-      <w:proofErr w:type="spellEnd"/>
-      <w:r>
-        <w:rPr>
-          <w:rFonts w:ascii="Calibri" w:hAnsi="Calibri" w:cs="Calibri"/>
-        </w:rPr>
-        <w:t xml:space="preserve"> fájlt és illesszük bele a </w:t>
-      </w:r>
-      <w:r>
-        <w:rPr>
-          <w:rStyle w:val="codeblockChar"/>
-        </w:rPr>
-        <w:t>.</w:t>
-      </w:r>
-      <w:proofErr w:type="spellStart"/>
-      <w:r>
-        <w:rPr>
-          <w:rStyle w:val="codeblockChar"/>
-        </w:rPr>
-        <w:t>env.example</w:t>
-      </w:r>
-      <w:proofErr w:type="spellEnd"/>
+        <w:t>.env.example</w:t>
+      </w:r>
       <w:r>
         <w:rPr>
           <w:rFonts w:ascii="Calibri" w:hAnsi="Calibri" w:cs="Calibri"/>
@@ -4931,70 +4377,32 @@
         <w:rPr>
           <w:rStyle w:val="codeblockChar"/>
         </w:rPr>
-        <w:t>./web/</w:t>
-      </w:r>
-      <w:proofErr w:type="spellStart"/>
+        <w:t>./web/packages/database</w:t>
+      </w:r>
+      <w:r>
+        <w:rPr>
+          <w:rFonts w:ascii="Calibri" w:hAnsi="Calibri" w:cs="Calibri"/>
+        </w:rPr>
+        <w:t xml:space="preserve"> mappába. Hozzunk létre egy </w:t>
+      </w:r>
       <w:r>
         <w:rPr>
           <w:rStyle w:val="codeblockChar"/>
         </w:rPr>
-        <w:t>packages</w:t>
-      </w:r>
-      <w:proofErr w:type="spellEnd"/>
+        <w:t>.env</w:t>
+      </w:r>
+      <w:r>
+        <w:rPr>
+          <w:rFonts w:ascii="Calibri" w:hAnsi="Calibri" w:cs="Calibri"/>
+        </w:rPr>
+        <w:t xml:space="preserve"> fájlt és illesszük bele a </w:t>
+      </w:r>
       <w:r>
         <w:rPr>
           <w:rStyle w:val="codeblockChar"/>
         </w:rPr>
-        <w:t>/</w:t>
-      </w:r>
-      <w:proofErr w:type="spellStart"/>
-      <w:r>
-        <w:rPr>
-          <w:rStyle w:val="codeblockChar"/>
-        </w:rPr>
-        <w:t>database</w:t>
-      </w:r>
-      <w:proofErr w:type="spellEnd"/>
-      <w:r>
-        <w:rPr>
-          <w:rFonts w:ascii="Calibri" w:hAnsi="Calibri" w:cs="Calibri"/>
-        </w:rPr>
-        <w:t xml:space="preserve"> mappába. Hozzunk létre egy </w:t>
-      </w:r>
-      <w:r>
-        <w:rPr>
-          <w:rStyle w:val="codeblockChar"/>
-        </w:rPr>
-        <w:t>.</w:t>
-      </w:r>
-      <w:proofErr w:type="spellStart"/>
-      <w:r>
-        <w:rPr>
-          <w:rStyle w:val="codeblockChar"/>
-        </w:rPr>
-        <w:t>env</w:t>
-      </w:r>
-      <w:proofErr w:type="spellEnd"/>
-      <w:r>
-        <w:rPr>
-          <w:rFonts w:ascii="Calibri" w:hAnsi="Calibri" w:cs="Calibri"/>
-        </w:rPr>
-        <w:t xml:space="preserve"> fájlt és illesszük bele a </w:t>
-      </w:r>
-      <w:r>
-        <w:rPr>
-          <w:rStyle w:val="codeblockChar"/>
-        </w:rPr>
-        <w:t>.</w:t>
-      </w:r>
-      <w:proofErr w:type="spellStart"/>
-      <w:r>
-        <w:rPr>
-          <w:rStyle w:val="codeblockChar"/>
-        </w:rPr>
-        <w:t>env.example</w:t>
-      </w:r>
-      <w:proofErr w:type="spellEnd"/>
+        <w:t>.env.example</w:t>
+      </w:r>
       <w:r>
         <w:rPr>
           <w:rFonts w:ascii="Calibri" w:hAnsi="Calibri" w:cs="Calibri"/>
@@ -5014,78 +4422,14 @@
         <w:rPr>
           <w:rFonts w:ascii="Calibri" w:hAnsi="Calibri" w:cs="Calibri"/>
         </w:rPr>
-        <w:t xml:space="preserve">Indítsunk el egy helyi </w:t>
-      </w:r>
-      <w:proofErr w:type="spellStart"/>
-      <w:r>
-        <w:rPr>
-          <w:rFonts w:ascii="Calibri" w:hAnsi="Calibri" w:cs="Calibri"/>
-        </w:rPr>
-        <w:t>MariaDB</w:t>
-      </w:r>
-      <w:proofErr w:type="spellEnd"/>
-      <w:r>
-        <w:rPr>
-          <w:rFonts w:ascii="Calibri" w:hAnsi="Calibri" w:cs="Calibri"/>
-        </w:rPr>
-        <w:t xml:space="preserve"> vagy </w:t>
-      </w:r>
-      <w:proofErr w:type="spellStart"/>
-      <w:r>
-        <w:rPr>
-          <w:rFonts w:ascii="Calibri" w:hAnsi="Calibri" w:cs="Calibri"/>
-        </w:rPr>
-        <w:t>MySQL</w:t>
-      </w:r>
-      <w:proofErr w:type="spellEnd"/>
-      <w:r>
-        <w:rPr>
-          <w:rFonts w:ascii="Calibri" w:hAnsi="Calibri" w:cs="Calibri"/>
-        </w:rPr>
-        <w:t xml:space="preserve"> szervert a 3306-os alapértelmezett </w:t>
-      </w:r>
-      <w:proofErr w:type="spellStart"/>
-      <w:r>
-        <w:rPr>
-          <w:rFonts w:ascii="Calibri" w:hAnsi="Calibri" w:cs="Calibri"/>
-        </w:rPr>
-        <w:t>porton</w:t>
-      </w:r>
-      <w:proofErr w:type="spellEnd"/>
-      <w:r>
-        <w:rPr>
-          <w:rFonts w:ascii="Calibri" w:hAnsi="Calibri" w:cs="Calibri"/>
-        </w:rPr>
-        <w:t xml:space="preserve">. (Ha valamilyen okból kifolyólag más a port vagy a </w:t>
-      </w:r>
-      <w:proofErr w:type="spellStart"/>
-      <w:r>
-        <w:rPr>
-          <w:rFonts w:ascii="Calibri" w:hAnsi="Calibri" w:cs="Calibri"/>
-        </w:rPr>
-        <w:t>hosztnév</w:t>
-      </w:r>
-      <w:proofErr w:type="spellEnd"/>
-      <w:r>
-        <w:rPr>
-          <w:rFonts w:ascii="Calibri" w:hAnsi="Calibri" w:cs="Calibri"/>
-        </w:rPr>
-        <w:t xml:space="preserve">, akkor értelemszerűen a </w:t>
+        <w:t xml:space="preserve">Indítsunk el egy helyi MariaDB vagy MySQL szervert a 3306-os alapértelmezett porton. (Ha valamilyen okból kifolyólag más a port vagy a hosztnév, akkor értelemszerűen a </w:t>
       </w:r>
       <w:r>
         <w:rPr>
           <w:rStyle w:val="codeblockChar"/>
         </w:rPr>
-        <w:t>.</w:t>
-      </w:r>
-      <w:proofErr w:type="spellStart"/>
-      <w:r>
-        <w:rPr>
-          <w:rStyle w:val="codeblockChar"/>
-        </w:rPr>
-        <w:t>env</w:t>
-      </w:r>
-      <w:proofErr w:type="spellEnd"/>
+        <w:t>.env</w:t>
+      </w:r>
       <w:r>
         <w:rPr>
           <w:rFonts w:ascii="Calibri" w:hAnsi="Calibri" w:cs="Calibri"/>
@@ -5122,42 +4466,12 @@
         </w:rPr>
         <w:t xml:space="preserve">Futtassuk a migrációkat, hogy legenerálódjanak a táblák a séma alapján a </w:t>
       </w:r>
-      <w:proofErr w:type="spellStart"/>
       <w:r>
         <w:rPr>
           <w:rStyle w:val="codeblockChar"/>
         </w:rPr>
-        <w:t>pnpm</w:t>
-      </w:r>
-      <w:proofErr w:type="spellEnd"/>
-      <w:r>
-        <w:rPr>
-          <w:rStyle w:val="codeblockChar"/>
-        </w:rPr>
-        <w:t xml:space="preserve"> </w:t>
-      </w:r>
-      <w:proofErr w:type="spellStart"/>
-      <w:r>
-        <w:rPr>
-          <w:rStyle w:val="codeblockChar"/>
-        </w:rPr>
-        <w:t>run</w:t>
-      </w:r>
-      <w:proofErr w:type="spellEnd"/>
-      <w:r>
-        <w:rPr>
-          <w:rStyle w:val="codeblockChar"/>
-        </w:rPr>
-        <w:t xml:space="preserve"> </w:t>
-      </w:r>
-      <w:proofErr w:type="spellStart"/>
-      <w:r>
-        <w:rPr>
-          <w:rStyle w:val="codeblockChar"/>
-        </w:rPr>
-        <w:t>migrations:migrate</w:t>
-      </w:r>
-      <w:proofErr w:type="spellEnd"/>
+        <w:t>pnpm run migrations:migrate</w:t>
+      </w:r>
       <w:r>
         <w:rPr>
           <w:rFonts w:ascii="Calibri" w:hAnsi="Calibri" w:cs="Calibri"/>
@@ -5194,75 +4508,17 @@
         </w:rPr>
         <w:t xml:space="preserve">Indítsuk el a projektet fejlesztői módban a </w:t>
       </w:r>
-      <w:proofErr w:type="spellStart"/>
       <w:r>
         <w:rPr>
           <w:rStyle w:val="codeblockChar"/>
         </w:rPr>
-        <w:t>pnpm</w:t>
-      </w:r>
-      <w:proofErr w:type="spellEnd"/>
-      <w:r>
-        <w:rPr>
-          <w:rStyle w:val="codeblockChar"/>
-        </w:rPr>
-        <w:t xml:space="preserve"> </w:t>
-      </w:r>
-      <w:proofErr w:type="spellStart"/>
-      <w:r>
-        <w:rPr>
-          <w:rStyle w:val="codeblockChar"/>
-        </w:rPr>
-        <w:t>run</w:t>
-      </w:r>
-      <w:proofErr w:type="spellEnd"/>
-      <w:r>
-        <w:rPr>
-          <w:rStyle w:val="codeblockChar"/>
-        </w:rPr>
-        <w:t xml:space="preserve"> </w:t>
-      </w:r>
-      <w:proofErr w:type="spellStart"/>
-      <w:r>
-        <w:rPr>
-          <w:rStyle w:val="codeblockChar"/>
-        </w:rPr>
-        <w:t>dev</w:t>
-      </w:r>
-      <w:proofErr w:type="spellEnd"/>
+        <w:t>pnpm run dev</w:t>
+      </w:r>
       <w:r>
         <w:rPr>
           <w:rFonts w:ascii="Calibri" w:hAnsi="Calibri" w:cs="Calibri"/>
         </w:rPr>
-        <w:t xml:space="preserve"> paranccsal. Ilyenkor mind a </w:t>
-      </w:r>
-      <w:proofErr w:type="spellStart"/>
-      <w:r>
-        <w:rPr>
-          <w:rFonts w:ascii="Calibri" w:hAnsi="Calibri" w:cs="Calibri"/>
-        </w:rPr>
-        <w:t>WebSocket</w:t>
-      </w:r>
-      <w:proofErr w:type="spellEnd"/>
-      <w:r>
-        <w:rPr>
-          <w:rFonts w:ascii="Calibri" w:hAnsi="Calibri" w:cs="Calibri"/>
-        </w:rPr>
-        <w:t xml:space="preserve"> szerver és a </w:t>
-      </w:r>
-      <w:proofErr w:type="spellStart"/>
-      <w:r>
-        <w:rPr>
-          <w:rFonts w:ascii="Calibri" w:hAnsi="Calibri" w:cs="Calibri"/>
-        </w:rPr>
-        <w:t>Next</w:t>
-      </w:r>
-      <w:proofErr w:type="spellEnd"/>
-      <w:r>
-        <w:rPr>
-          <w:rFonts w:ascii="Calibri" w:hAnsi="Calibri" w:cs="Calibri"/>
-        </w:rPr>
-        <w:t xml:space="preserve"> applikáció is elindul. A konzolba érkező üzeneteket színük alapján tudjuk megítélni, hogy honnan érkezik:</w:t>
+        <w:t xml:space="preserve"> paranccsal. Ilyenkor mind a WebSocket szerver és a Next applikáció is elindul. A konzolba érkező üzeneteket színük alapján tudjuk megítélni, hogy honnan érkezik:</w:t>
       </w:r>
     </w:p>
     <w:p>
@@ -5276,19 +4532,11 @@
           <w:rFonts w:ascii="Calibri" w:hAnsi="Calibri" w:cs="Calibri"/>
         </w:rPr>
       </w:pPr>
-      <w:proofErr w:type="spellStart"/>
       <w:r>
         <w:rPr>
           <w:rFonts w:ascii="Calibri" w:hAnsi="Calibri" w:cs="Calibri"/>
         </w:rPr>
-        <w:t>Next</w:t>
-      </w:r>
-      <w:proofErr w:type="spellEnd"/>
-      <w:r>
-        <w:rPr>
-          <w:rFonts w:ascii="Calibri" w:hAnsi="Calibri" w:cs="Calibri"/>
-        </w:rPr>
-        <w:t>: Magenta</w:t>
+        <w:t>Next: Magenta</w:t>
       </w:r>
     </w:p>
     <w:p>
@@ -5302,19 +4550,11 @@
           <w:rFonts w:ascii="Calibri" w:hAnsi="Calibri" w:cs="Calibri"/>
         </w:rPr>
       </w:pPr>
-      <w:proofErr w:type="spellStart"/>
       <w:r>
         <w:rPr>
           <w:rFonts w:ascii="Calibri" w:hAnsi="Calibri" w:cs="Calibri"/>
         </w:rPr>
-        <w:t>WebSocket</w:t>
-      </w:r>
-      <w:proofErr w:type="spellEnd"/>
-      <w:r>
-        <w:rPr>
-          <w:rFonts w:ascii="Calibri" w:hAnsi="Calibri" w:cs="Calibri"/>
-        </w:rPr>
-        <w:t>: Kék</w:t>
+        <w:t>WebSocket: Kék</w:t>
       </w:r>
     </w:p>
     <w:p>
@@ -5517,14 +4757,12 @@
         <w:t xml:space="preserve">használtuk a </w:t>
       </w:r>
       <w:hyperlink r:id="rId37" w:history="1">
-        <w:proofErr w:type="spellStart"/>
         <w:r>
           <w:rPr>
             <w:rStyle w:val="Hiperhivatkozs"/>
           </w:rPr>
           <w:t>Figma</w:t>
         </w:r>
-        <w:proofErr w:type="spellEnd"/>
       </w:hyperlink>
       <w:r>
         <w:t xml:space="preserve"> nevű szoftvert, hogy a lehető legjobb képet kapjuk az elképzelé</w:t>
@@ -5620,15 +4858,7 @@
         <w:fldChar w:fldCharType="end"/>
       </w:r>
       <w:r>
-        <w:t xml:space="preserve">. ábra - A </w:t>
-      </w:r>
-      <w:proofErr w:type="spellStart"/>
-      <w:r>
-        <w:t>Figma</w:t>
-      </w:r>
-      <w:proofErr w:type="spellEnd"/>
-      <w:r>
-        <w:t>-ban készült alap design ötlet</w:t>
+        <w:t>. ábra - A Figma-ban készült alap design ötlet</w:t>
       </w:r>
       <w:bookmarkEnd w:id="10"/>
     </w:p>
@@ -5645,14 +4875,12 @@
       <w:r>
         <w:t xml:space="preserve">-re, amely a </w:t>
       </w:r>
-      <w:proofErr w:type="spellStart"/>
       <w:r>
         <w:rPr>
           <w:b/>
         </w:rPr>
         <w:t>React</w:t>
       </w:r>
-      <w:proofErr w:type="spellEnd"/>
       <w:r>
         <w:t>-alapú webes alkalmazásokat kínál a szerveroldali és statikus megjelenítéssel.</w:t>
       </w:r>
@@ -5691,35 +4919,14 @@
           <w:b w:val="0"/>
           <w:i/>
         </w:rPr>
-        <w:t>(</w:t>
-      </w:r>
-      <w:proofErr w:type="spellStart"/>
-      <w:r>
-        <w:rPr>
-          <w:b w:val="0"/>
-          <w:i/>
-        </w:rPr>
-        <w:t>monorepo</w:t>
-      </w:r>
-      <w:proofErr w:type="spellEnd"/>
-      <w:r>
-        <w:rPr>
-          <w:b w:val="0"/>
-          <w:i/>
-        </w:rPr>
-        <w:t>)</w:t>
+        <w:t>(monorepo)</w:t>
       </w:r>
       <w:bookmarkEnd w:id="11"/>
     </w:p>
     <w:p>
       <w:r>
-        <w:t xml:space="preserve">A projekt egy </w:t>
-      </w:r>
-      <w:proofErr w:type="spellStart"/>
-      <w:r>
-        <w:t>monorepo</w:t>
-      </w:r>
-      <w:proofErr w:type="spellEnd"/>
+        <w:t>A projekt egy monorepo</w:t>
+      </w:r>
       <w:r>
         <w:rPr>
           <w:rStyle w:val="Lbjegyzet-hivatkozs"/>
@@ -5736,19 +4943,11 @@
           <w:b/>
         </w:rPr>
       </w:pPr>
-      <w:proofErr w:type="spellStart"/>
       <w:r>
         <w:rPr>
           <w:b/>
         </w:rPr>
-        <w:t>WebSocket</w:t>
-      </w:r>
-      <w:proofErr w:type="spellEnd"/>
-      <w:r>
-        <w:rPr>
-          <w:b/>
-        </w:rPr>
-        <w:t xml:space="preserve"> alkalmazás:</w:t>
+        <w:t>WebSocket alkalmazás:</w:t>
       </w:r>
     </w:p>
     <w:p>
@@ -5763,15 +4962,7 @@
         </w:rPr>
       </w:pPr>
       <w:r>
-        <w:t xml:space="preserve">Ez az applikáció indít egy HTTP- és egy </w:t>
-      </w:r>
-      <w:proofErr w:type="spellStart"/>
-      <w:r>
-        <w:t>WebSocket</w:t>
-      </w:r>
-      <w:proofErr w:type="spellEnd"/>
-      <w:r>
-        <w:t>-szervert. Fő feladata a valós idejű kommunikáció biztosítása, a folyamatban lévő játékok kezelése, események továbbítása a frontend részére, és a játékmenet logikájának kiszolgálása.</w:t>
+        <w:t>Ez az applikáció indít egy HTTP- és egy WebSocket-szervert. Fő feladata a valós idejű kommunikáció biztosítása, a folyamatban lévő játékok kezelése, események továbbítása a frontend részére, és a játékmenet logikájának kiszolgálása.</w:t>
       </w:r>
     </w:p>
     <w:p>
@@ -5837,23 +5028,7 @@
     </w:p>
     <w:p>
       <w:r>
-        <w:t xml:space="preserve">Mindkét alkalmazás </w:t>
-      </w:r>
-      <w:proofErr w:type="spellStart"/>
-      <w:r>
-        <w:t>TypeScript</w:t>
-      </w:r>
-      <w:proofErr w:type="spellEnd"/>
-      <w:r>
-        <w:t xml:space="preserve"> alapú. A </w:t>
-      </w:r>
-      <w:proofErr w:type="spellStart"/>
-      <w:r>
-        <w:t>TypeScript</w:t>
-      </w:r>
-      <w:proofErr w:type="spellEnd"/>
-      <w:r>
-        <w:t xml:space="preserve"> nagy előnye – ahogy azt a neve is mutatja – a típusbiztonság:</w:t>
+        <w:t>Mindkét alkalmazás TypeScript alapú. A TypeScript nagy előnye – ahogy azt a neve is mutatja – a típusbiztonság:</w:t>
       </w:r>
     </w:p>
     <w:p>
@@ -5879,46 +5054,16 @@
           <w:b/>
         </w:rPr>
       </w:pPr>
-      <w:proofErr w:type="spellStart"/>
       <w:r>
         <w:rPr>
           <w:b/>
         </w:rPr>
-        <w:t>packages</w:t>
-      </w:r>
-      <w:proofErr w:type="spellEnd"/>
-      <w:r>
-        <w:rPr>
-          <w:b/>
-        </w:rPr>
-        <w:t>/</w:t>
-      </w:r>
-      <w:proofErr w:type="spellStart"/>
-      <w:r>
-        <w:rPr>
-          <w:b/>
-        </w:rPr>
-        <w:t>types</w:t>
-      </w:r>
-      <w:proofErr w:type="spellEnd"/>
-      <w:r>
-        <w:rPr>
-          <w:b/>
-        </w:rPr>
-        <w:t>:</w:t>
-      </w:r>
-    </w:p>
-    <w:p>
-      <w:r>
-        <w:t xml:space="preserve">Ebben a csomagban találhatók a projektben használt összetett megosztott </w:t>
-      </w:r>
-      <w:proofErr w:type="spellStart"/>
-      <w:r>
-        <w:t>TypeScript</w:t>
-      </w:r>
-      <w:proofErr w:type="spellEnd"/>
-      <w:r>
-        <w:t xml:space="preserve"> típusdefiníció. Például a játéklogikához, országokhoz, kvízekhez és felhasználókhoz kapcsolódó típusok innen származnak. Ezeket mind a frontend, mind a backend alkalmazás importálja, így garantálható az egységes típushasználat.</w:t>
+        <w:t>packages/types:</w:t>
+      </w:r>
+    </w:p>
+    <w:p>
+      <w:r>
+        <w:t>Ebben a csomagban találhatók a projektben használt összetett megosztott TypeScript típusdefiníció. Például a játéklogikához, országokhoz, kvízekhez és felhasználókhoz kapcsolódó típusok innen származnak. Ezeket mind a frontend, mind a backend alkalmazás importálja, így garantálható az egységes típushasználat.</w:t>
       </w:r>
     </w:p>
     <w:p>
@@ -5937,71 +5082,17 @@
           <w:b/>
         </w:rPr>
       </w:pPr>
-      <w:proofErr w:type="spellStart"/>
       <w:r>
         <w:rPr>
           <w:b/>
         </w:rPr>
         <w:lastRenderedPageBreak/>
-        <w:t>packages</w:t>
-      </w:r>
-      <w:proofErr w:type="spellEnd"/>
-      <w:r>
-        <w:rPr>
-          <w:b/>
-        </w:rPr>
-        <w:t>/</w:t>
-      </w:r>
-      <w:proofErr w:type="spellStart"/>
-      <w:r>
-        <w:rPr>
-          <w:b/>
-        </w:rPr>
-        <w:t>database</w:t>
-      </w:r>
-      <w:proofErr w:type="spellEnd"/>
-      <w:r>
-        <w:rPr>
-          <w:b/>
-        </w:rPr>
-        <w:t>:</w:t>
-      </w:r>
-    </w:p>
-    <w:p>
-      <w:r>
-        <w:t xml:space="preserve">Ez a csomag felel az adatbáziskapcsolatért és a </w:t>
-      </w:r>
-      <w:proofErr w:type="spellStart"/>
-      <w:r>
-        <w:t>Drizzle</w:t>
-      </w:r>
-      <w:proofErr w:type="spellEnd"/>
-      <w:r>
-        <w:t xml:space="preserve"> ORM beállításaiért. Tartalmazza az adatbázis sémáját, a migrációs fájlokat, valamint az SQL-lekérdezéseket. Mivel </w:t>
-      </w:r>
-      <w:proofErr w:type="spellStart"/>
-      <w:r>
-        <w:t>TypeScript</w:t>
-      </w:r>
-      <w:proofErr w:type="spellEnd"/>
-      <w:r>
-        <w:t xml:space="preserve">-ben íródott, a </w:t>
-      </w:r>
-      <w:proofErr w:type="spellStart"/>
-      <w:r>
-        <w:t>types</w:t>
-      </w:r>
-      <w:proofErr w:type="spellEnd"/>
-      <w:r>
-        <w:t xml:space="preserve"> csomag típusait is közvetlenül be lehet benne írni, így az adatbázisos műveletek pontosan olyan típusokkal dolgoznak, amilyenekkel kell. A lekérdezések külön metódusokba vannak rendezve, ezeket a Next.js és a </w:t>
-      </w:r>
-      <w:proofErr w:type="spellStart"/>
-      <w:r>
-        <w:t>WebSocket</w:t>
-      </w:r>
-      <w:proofErr w:type="spellEnd"/>
-      <w:r>
-        <w:t xml:space="preserve"> alkalmazás is ugyanúgy eléri, így nem kell kétszer megírni ugyanazt, és minden ott van, ahol lennie kell.</w:t>
+        <w:t>packages/database:</w:t>
+      </w:r>
+    </w:p>
+    <w:p>
+      <w:r>
+        <w:t>Ez a csomag felel az adatbáziskapcsolatért és a Drizzle ORM beállításaiért. Tartalmazza az adatbázis sémáját, a migrációs fájlokat, valamint az SQL-lekérdezéseket. Mivel TypeScript-ben íródott, a types csomag típusait is közvetlenül be lehet benne írni, így az adatbázisos műveletek pontosan olyan típusokkal dolgoznak, amilyenekkel kell. A lekérdezések külön metódusokba vannak rendezve, ezeket a Next.js és a WebSocket alkalmazás is ugyanúgy eléri, így nem kell kétszer megírni ugyanazt, és minden ott van, ahol lennie kell.</w:t>
       </w:r>
     </w:p>
     <w:p>
@@ -6189,31 +5280,7 @@
     </w:p>
     <w:p>
       <w:r>
-        <w:t xml:space="preserve">Az adatbázismotornak a </w:t>
-      </w:r>
-      <w:proofErr w:type="spellStart"/>
-      <w:r>
-        <w:t>MariaDB</w:t>
-      </w:r>
-      <w:proofErr w:type="spellEnd"/>
-      <w:r>
-        <w:t xml:space="preserve">-t választottuk, ami a </w:t>
-      </w:r>
-      <w:proofErr w:type="spellStart"/>
-      <w:r>
-        <w:t>MySQL</w:t>
-      </w:r>
-      <w:proofErr w:type="spellEnd"/>
-      <w:r>
-        <w:t xml:space="preserve"> egyik változata (úgynevezett „</w:t>
-      </w:r>
-      <w:proofErr w:type="spellStart"/>
-      <w:r>
-        <w:t>fork</w:t>
-      </w:r>
-      <w:proofErr w:type="spellEnd"/>
-      <w:r>
-        <w:t>” -ja). Azért döntöttünk mellette, mert stabil, gyors, és sok projektben bevált megoldás.</w:t>
+        <w:t>Az adatbázismotornak a MariaDB-t választottuk, ami a MySQL egyik változata (úgynevezett „fork” -ja). Azért döntöttünk mellette, mert stabil, gyors, és sok projektben bevált megoldás.</w:t>
       </w:r>
     </w:p>
     <w:p>
@@ -6226,147 +5293,61 @@
         <w:rPr>
           <w:rFonts w:ascii="Calibri" w:hAnsi="Calibri" w:cs="Calibri"/>
         </w:rPr>
-        <w:t xml:space="preserve">Az adatbázis kezelését megkönnyíti a </w:t>
-      </w:r>
-      <w:proofErr w:type="spellStart"/>
+        <w:t>Az adatbázis kezelését megkönnyíti a Drizzle ORM, amit a projektben használtunk. Ez egy TypeScript-alapú eszköz, amit egyszerre lehet lekérdezésekhez (mint egy „query builder”) és ORM-ként is használni. Emellett ez szolgál az SQL séma forrásaként, vagyis ebben írjuk le az adatbázis felépítését. Ráadásul saját parancssoros eszközt (CLI-t) is ad, amivel automatikusan tudunk migrációs fájlokat</w:t>
+      </w:r>
       <w:r>
         <w:rPr>
           <w:rFonts w:ascii="Calibri" w:hAnsi="Calibri" w:cs="Calibri"/>
         </w:rPr>
-        <w:t>Drizzle</w:t>
-      </w:r>
-      <w:proofErr w:type="spellEnd"/>
+        <w:t xml:space="preserve"> generálni, így nem kell kézzel </w:t>
+      </w:r>
       <w:r>
         <w:rPr>
           <w:rFonts w:ascii="Calibri" w:hAnsi="Calibri" w:cs="Calibri"/>
         </w:rPr>
-        <w:t xml:space="preserve"> ORM, amit a projektben használtunk. Ez egy </w:t>
-      </w:r>
-      <w:proofErr w:type="spellStart"/>
+        <w:t>írni őket.</w:t>
+      </w:r>
       <w:r>
         <w:rPr>
           <w:rFonts w:ascii="Calibri" w:hAnsi="Calibri" w:cs="Calibri"/>
         </w:rPr>
-        <w:t>TypeScript</w:t>
-      </w:r>
-      <w:proofErr w:type="spellEnd"/>
+        <w:t xml:space="preserve"> </w:t>
+      </w:r>
       <w:r>
         <w:rPr>
           <w:rFonts w:ascii="Calibri" w:hAnsi="Calibri" w:cs="Calibri"/>
         </w:rPr>
-        <w:t>-alapú eszköz, amit egyszerre lehet lekérdezésekhez (mint egy „</w:t>
-      </w:r>
-      <w:proofErr w:type="spellStart"/>
+        <w:t>Elsőre ezek a fogalmak bonyolultnak tűnhetnek, de a gyakorlatba</w:t>
+      </w:r>
       <w:r>
         <w:rPr>
           <w:rFonts w:ascii="Calibri" w:hAnsi="Calibri" w:cs="Calibri"/>
         </w:rPr>
-        <w:t>query</w:t>
-      </w:r>
-      <w:proofErr w:type="spellEnd"/>
+        <w:t xml:space="preserve">n a működés meglepően egyszerű. </w:t>
+      </w:r>
       <w:r>
         <w:rPr>
           <w:rFonts w:ascii="Calibri" w:hAnsi="Calibri" w:cs="Calibri"/>
         </w:rPr>
-        <w:t xml:space="preserve"> </w:t>
-      </w:r>
-      <w:proofErr w:type="spellStart"/>
+        <w:t xml:space="preserve">Képzeljünk el egy fájlt – a mi esetünkben ez a </w:t>
+      </w:r>
+      <w:r>
+        <w:rPr>
+          <w:rStyle w:val="codeblockChar"/>
+        </w:rPr>
+        <w:t>schema.ts</w:t>
+      </w:r>
       <w:r>
         <w:rPr>
           <w:rFonts w:ascii="Calibri" w:hAnsi="Calibri" w:cs="Calibri"/>
         </w:rPr>
-        <w:t>builder</w:t>
-      </w:r>
-      <w:proofErr w:type="spellEnd"/>
+        <w:t>. Ebben írjuk le az összes adatbázis-táblát, azok mezőit (pl. szöveg, szám, dátum stb.), valamint a táblák közötti kapcsolatokat. Ha valamit módosítunk ebben a fájlban, például új oszlopot adunk hozzá egy táblához, a Drizzle CLI segítségével egyetlen parancs kiadásával generálhatunk egy új migrációs fájlt, ami végrehajtja ezt a változást az adatbáz</w:t>
+      </w:r>
       <w:r>
         <w:rPr>
           <w:rFonts w:ascii="Calibri" w:hAnsi="Calibri" w:cs="Calibri"/>
         </w:rPr>
-        <w:t>”) és ORM-ként is használni. Emellett ez szolgál az SQL séma forrásaként, vagyis ebben írjuk le az adatbázis felépítését. Ráadásul saját parancssoros eszközt (CLI-t) is ad, amivel automatikusan tudunk migrációs fájlokat</w:t>
-      </w:r>
-      <w:r>
-        <w:rPr>
-          <w:rFonts w:ascii="Calibri" w:hAnsi="Calibri" w:cs="Calibri"/>
-        </w:rPr>
-        <w:t xml:space="preserve"> generálni, így nem kell kézzel </w:t>
-      </w:r>
-      <w:r>
-        <w:rPr>
-          <w:rFonts w:ascii="Calibri" w:hAnsi="Calibri" w:cs="Calibri"/>
-        </w:rPr>
-        <w:t>írni őket.</w:t>
-      </w:r>
-      <w:r>
-        <w:rPr>
-          <w:rFonts w:ascii="Calibri" w:hAnsi="Calibri" w:cs="Calibri"/>
-        </w:rPr>
-        <w:t xml:space="preserve"> </w:t>
-      </w:r>
-      <w:r>
-        <w:rPr>
-          <w:rFonts w:ascii="Calibri" w:hAnsi="Calibri" w:cs="Calibri"/>
-        </w:rPr>
-        <w:t>Elsőre ezek a fogalmak bonyolultnak tűnhetnek, de a gyakorlatba</w:t>
-      </w:r>
-      <w:r>
-        <w:rPr>
-          <w:rFonts w:ascii="Calibri" w:hAnsi="Calibri" w:cs="Calibri"/>
-        </w:rPr>
-        <w:t xml:space="preserve">n a működés meglepően egyszerű. </w:t>
-      </w:r>
-      <w:r>
-        <w:rPr>
-          <w:rFonts w:ascii="Calibri" w:hAnsi="Calibri" w:cs="Calibri"/>
-        </w:rPr>
-        <w:t xml:space="preserve">Képzeljünk el egy fájlt – a mi esetünkben ez a </w:t>
-      </w:r>
-      <w:proofErr w:type="spellStart"/>
-      <w:r>
-        <w:rPr>
-          <w:rStyle w:val="codeblockChar"/>
-        </w:rPr>
-        <w:t>schema.ts</w:t>
-      </w:r>
-      <w:proofErr w:type="spellEnd"/>
-      <w:r>
-        <w:rPr>
-          <w:rFonts w:ascii="Calibri" w:hAnsi="Calibri" w:cs="Calibri"/>
-        </w:rPr>
-        <w:t xml:space="preserve">. Ebben írjuk le az összes adatbázis-táblát, azok mezőit (pl. szöveg, szám, dátum stb.), valamint a táblák közötti kapcsolatokat. Ha valamit módosítunk ebben a fájlban, például új oszlopot adunk hozzá egy táblához, a </w:t>
-      </w:r>
-      <w:proofErr w:type="spellStart"/>
-      <w:r>
-        <w:rPr>
-          <w:rFonts w:ascii="Calibri" w:hAnsi="Calibri" w:cs="Calibri"/>
-        </w:rPr>
-        <w:t>Drizzle</w:t>
-      </w:r>
-      <w:proofErr w:type="spellEnd"/>
-      <w:r>
-        <w:rPr>
-          <w:rFonts w:ascii="Calibri" w:hAnsi="Calibri" w:cs="Calibri"/>
-        </w:rPr>
-        <w:t xml:space="preserve"> CLI segítségével egyetlen parancs kiadásával generálhatunk egy új migrációs fájlt, ami végrehajtja ezt a változást az adatbáz</w:t>
-      </w:r>
-      <w:r>
-        <w:rPr>
-          <w:rFonts w:ascii="Calibri" w:hAnsi="Calibri" w:cs="Calibri"/>
-        </w:rPr>
-        <w:t xml:space="preserve">isban. Fontos, hogy ilyenkor csak is a változtatáshoz szükséges SQL parancsokat kapjuk meg: például, hogy ha egy oszlopot adtunk hozzá egy táblához, akkor csak is kizárólag ennek az utasítása lesz a migrációs fájlban. Ahogy a fejlesztés halad úgy a migrációs fájlok alapján visszavezethető a teljes adatbázis struktúra. Ha egy új számítógépre tesszük fel a projektet, akkor a </w:t>
-      </w:r>
-      <w:proofErr w:type="spellStart"/>
-      <w:r>
-        <w:rPr>
-          <w:rFonts w:ascii="Calibri" w:hAnsi="Calibri" w:cs="Calibri"/>
-        </w:rPr>
-        <w:t>migrálást</w:t>
-      </w:r>
-      <w:proofErr w:type="spellEnd"/>
-      <w:r>
-        <w:rPr>
-          <w:rFonts w:ascii="Calibri" w:hAnsi="Calibri" w:cs="Calibri"/>
-        </w:rPr>
-        <w:t xml:space="preserve"> a legelső migrációs fájllal kezdi és így halad egyesével végig az összesen.</w:t>
+        <w:t>isban. Fontos, hogy ilyenkor csak is a változtatáshoz szükséges SQL parancsokat kapjuk meg: például, hogy ha egy oszlopot adtunk hozzá egy táblához, akkor csak is kizárólag ennek az utasítása lesz a migrációs fájlban. Ahogy a fejlesztés halad úgy a migrációs fájlok alapján visszavezethető a teljes adatbázis struktúra. Ha egy új számítógépre tesszük fel a projektet, akkor a migrálást a legelső migrációs fájllal kezdi és így halad egyesével végig az összesen.</w:t>
       </w:r>
     </w:p>
     <w:p>
@@ -6472,15 +5453,7 @@
                               <w:fldChar w:fldCharType="end"/>
                             </w:r>
                             <w:r>
-                              <w:t xml:space="preserve">. ábra - A </w:t>
-                            </w:r>
-                            <w:proofErr w:type="spellStart"/>
-                            <w:r>
-                              <w:t>users</w:t>
-                            </w:r>
-                            <w:proofErr w:type="spellEnd"/>
-                            <w:r>
-                              <w:t xml:space="preserve"> tábla sémája</w:t>
+                              <w:t>. ábra - A users tábla sémája</w:t>
                             </w:r>
                             <w:bookmarkEnd w:id="15"/>
                           </w:p>
@@ -6551,15 +5524,7 @@
                         <w:fldChar w:fldCharType="end"/>
                       </w:r>
                       <w:r>
-                        <w:t xml:space="preserve">. ábra - A </w:t>
-                      </w:r>
-                      <w:proofErr w:type="spellStart"/>
-                      <w:r>
-                        <w:t>users</w:t>
-                      </w:r>
-                      <w:proofErr w:type="spellEnd"/>
-                      <w:r>
-                        <w:t xml:space="preserve"> tábla sémája</w:t>
+                        <w:t>. ábra - A users tábla sémája</w:t>
                       </w:r>
                       <w:bookmarkEnd w:id="16"/>
                     </w:p>
@@ -6657,7 +5622,6 @@
           <w:szCs w:val="24"/>
         </w:rPr>
       </w:pPr>
-      <w:proofErr w:type="spellStart"/>
       <w:r>
         <w:rPr>
           <w:b/>
@@ -6666,17 +5630,7 @@
           <w:szCs w:val="24"/>
         </w:rPr>
         <w:lastRenderedPageBreak/>
-        <w:t>Users</w:t>
-      </w:r>
-      <w:proofErr w:type="spellEnd"/>
-      <w:r>
-        <w:rPr>
-          <w:b/>
-          <w:bCs/>
-          <w:sz w:val="24"/>
-          <w:szCs w:val="24"/>
-        </w:rPr>
-        <w:t xml:space="preserve"> tábla:</w:t>
+        <w:t>Users tábla:</w:t>
       </w:r>
     </w:p>
     <w:p>
@@ -6690,21 +5644,8 @@
         <w:spacing w:line="259" w:lineRule="auto"/>
         <w:jc w:val="left"/>
       </w:pPr>
-      <w:proofErr w:type="spellStart"/>
-      <w:r>
-        <w:t>user_id</w:t>
-      </w:r>
-      <w:proofErr w:type="spellEnd"/>
-      <w:r>
-        <w:t xml:space="preserve"> → felhasználó egyedi azonosítója, int, </w:t>
-      </w:r>
-      <w:proofErr w:type="spellStart"/>
-      <w:r>
-        <w:t>auto_increment</w:t>
-      </w:r>
-      <w:proofErr w:type="spellEnd"/>
-      <w:r>
-        <w:t xml:space="preserve">, </w:t>
+      <w:r>
+        <w:t xml:space="preserve">user_id → felhasználó egyedi azonosítója, int, auto_increment, </w:t>
       </w:r>
       <w:r>
         <w:t>PK</w:t>
@@ -6721,29 +5662,8 @@
         <w:spacing w:line="259" w:lineRule="auto"/>
         <w:jc w:val="left"/>
       </w:pPr>
-      <w:proofErr w:type="spellStart"/>
-      <w:r>
-        <w:t>username</w:t>
-      </w:r>
-      <w:proofErr w:type="spellEnd"/>
-      <w:r>
-        <w:t xml:space="preserve"> → felhasználó felhasználóneve, </w:t>
-      </w:r>
-      <w:proofErr w:type="spellStart"/>
-      <w:r>
-        <w:t>varchar</w:t>
-      </w:r>
-      <w:proofErr w:type="spellEnd"/>
-      <w:r>
-        <w:t xml:space="preserve">(15), </w:t>
-      </w:r>
-      <w:proofErr w:type="spellStart"/>
-      <w:r>
-        <w:t>not</w:t>
-      </w:r>
-      <w:proofErr w:type="spellEnd"/>
-      <w:r>
-        <w:t xml:space="preserve"> null</w:t>
+      <w:r>
+        <w:t>username → felhasználó felhasználóneve, varchar(15), not null</w:t>
       </w:r>
     </w:p>
     <w:p>
@@ -6757,37 +5677,8 @@
         <w:spacing w:line="259" w:lineRule="auto"/>
         <w:jc w:val="left"/>
       </w:pPr>
-      <w:proofErr w:type="spellStart"/>
-      <w:r>
-        <w:t>password</w:t>
-      </w:r>
-      <w:proofErr w:type="spellEnd"/>
-      <w:r>
-        <w:t xml:space="preserve"> → felhasználó </w:t>
-      </w:r>
-      <w:proofErr w:type="spellStart"/>
-      <w:r>
-        <w:t>jelszava</w:t>
-      </w:r>
-      <w:proofErr w:type="spellEnd"/>
-      <w:r>
-        <w:t xml:space="preserve">, </w:t>
-      </w:r>
-      <w:proofErr w:type="spellStart"/>
-      <w:r>
-        <w:t>varchar</w:t>
-      </w:r>
-      <w:proofErr w:type="spellEnd"/>
-      <w:r>
-        <w:t xml:space="preserve">(60), </w:t>
-      </w:r>
-      <w:proofErr w:type="spellStart"/>
-      <w:r>
-        <w:t>not</w:t>
-      </w:r>
-      <w:proofErr w:type="spellEnd"/>
-      <w:r>
-        <w:t xml:space="preserve"> null</w:t>
+      <w:r>
+        <w:t>password → felhasználó jelszava, varchar(60), not null</w:t>
       </w:r>
     </w:p>
     <w:p>
@@ -6801,29 +5692,8 @@
         <w:spacing w:line="259" w:lineRule="auto"/>
         <w:jc w:val="left"/>
       </w:pPr>
-      <w:proofErr w:type="spellStart"/>
-      <w:r>
-        <w:t>bio</w:t>
-      </w:r>
-      <w:proofErr w:type="spellEnd"/>
-      <w:r>
-        <w:t xml:space="preserve"> → felhasználó bemutatkozó szövege, </w:t>
-      </w:r>
-      <w:proofErr w:type="spellStart"/>
-      <w:r>
-        <w:t>varchar</w:t>
-      </w:r>
-      <w:proofErr w:type="spellEnd"/>
-      <w:r>
-        <w:t xml:space="preserve">(100), </w:t>
-      </w:r>
-      <w:proofErr w:type="spellStart"/>
-      <w:r>
-        <w:t>not</w:t>
-      </w:r>
-      <w:proofErr w:type="spellEnd"/>
-      <w:r>
-        <w:t xml:space="preserve"> null</w:t>
+      <w:r>
+        <w:t>bio → felhasználó bemutatkozó szövege, varchar(100), not null</w:t>
       </w:r>
     </w:p>
     <w:p>
@@ -6837,29 +5707,8 @@
         <w:spacing w:line="259" w:lineRule="auto"/>
         <w:jc w:val="left"/>
       </w:pPr>
-      <w:proofErr w:type="spellStart"/>
-      <w:r>
-        <w:t>avatar</w:t>
-      </w:r>
-      <w:proofErr w:type="spellEnd"/>
-      <w:r>
-        <w:t xml:space="preserve"> → profilkép fájlazonosítója, </w:t>
-      </w:r>
-      <w:proofErr w:type="spellStart"/>
-      <w:r>
-        <w:t>varchar</w:t>
-      </w:r>
-      <w:proofErr w:type="spellEnd"/>
-      <w:r>
-        <w:t xml:space="preserve">(48), </w:t>
-      </w:r>
-      <w:proofErr w:type="spellStart"/>
-      <w:r>
-        <w:t>not</w:t>
-      </w:r>
-      <w:proofErr w:type="spellEnd"/>
-      <w:r>
-        <w:t xml:space="preserve"> null</w:t>
+      <w:r>
+        <w:t>avatar → profilkép fájlazonosítója, varchar(48), not null</w:t>
       </w:r>
     </w:p>
     <w:p>
@@ -6873,32 +5722,17 @@
         <w:spacing w:line="259" w:lineRule="auto"/>
         <w:jc w:val="left"/>
       </w:pPr>
-      <w:proofErr w:type="spellStart"/>
-      <w:r>
-        <w:t>created_at</w:t>
-      </w:r>
-      <w:proofErr w:type="spellEnd"/>
-      <w:r>
-        <w:t xml:space="preserve"> → regisztráció időpontja, </w:t>
-      </w:r>
-      <w:proofErr w:type="spellStart"/>
-      <w:r>
-        <w:t>timestamp</w:t>
-      </w:r>
-      <w:proofErr w:type="spellEnd"/>
+      <w:r>
+        <w:t>created_at → regisztráció időpontja, timestamp</w:t>
+      </w:r>
       <w:r>
         <w:t>,</w:t>
       </w:r>
       <w:r>
         <w:t xml:space="preserve"> </w:t>
       </w:r>
-      <w:proofErr w:type="spellStart"/>
-      <w:r>
-        <w:t>defaultNow</w:t>
-      </w:r>
-      <w:proofErr w:type="spellEnd"/>
-      <w:r>
-        <w:t>()</w:t>
+      <w:r>
+        <w:t>defaultNow()</w:t>
       </w:r>
     </w:p>
     <w:p>
@@ -6912,40 +5746,17 @@
         <w:spacing w:line="259" w:lineRule="auto"/>
         <w:jc w:val="left"/>
       </w:pPr>
-      <w:proofErr w:type="spellStart"/>
-      <w:r>
-        <w:t>updated_at</w:t>
-      </w:r>
-      <w:proofErr w:type="spellEnd"/>
-      <w:r>
-        <w:t xml:space="preserve"> → utolsó módosítás időpontja, </w:t>
-      </w:r>
-      <w:proofErr w:type="spellStart"/>
-      <w:r>
-        <w:t>timestamp</w:t>
-      </w:r>
-      <w:proofErr w:type="spellEnd"/>
+      <w:r>
+        <w:t>updated_at → utolsó módosítás időpontja, timestamp</w:t>
+      </w:r>
       <w:r>
         <w:t>,</w:t>
       </w:r>
       <w:r>
         <w:t xml:space="preserve"> </w:t>
       </w:r>
-      <w:proofErr w:type="spellStart"/>
-      <w:r>
-        <w:t>defaultNow</w:t>
-      </w:r>
-      <w:proofErr w:type="spellEnd"/>
-      <w:r>
-        <w:t xml:space="preserve">(), </w:t>
-      </w:r>
-      <w:proofErr w:type="spellStart"/>
-      <w:r>
-        <w:t>onUpdateNow</w:t>
-      </w:r>
-      <w:proofErr w:type="spellEnd"/>
-      <w:r>
-        <w:t>()</w:t>
+      <w:r>
+        <w:t>defaultNow(), onUpdateNow()</w:t>
       </w:r>
     </w:p>
     <w:p>
@@ -6963,23 +5774,18 @@
         <w:rPr>
           <w:b/>
           <w:bCs/>
-        </w:rPr>
-      </w:pPr>
-      <w:proofErr w:type="spellStart"/>
+          <w:sz w:val="24"/>
+          <w:szCs w:val="24"/>
+        </w:rPr>
+      </w:pPr>
       <w:r>
         <w:rPr>
           <w:b/>
           <w:bCs/>
-        </w:rPr>
-        <w:t>Quizzes</w:t>
-      </w:r>
-      <w:proofErr w:type="spellEnd"/>
-      <w:r>
-        <w:rPr>
-          <w:b/>
-          <w:bCs/>
-        </w:rPr>
-        <w:t xml:space="preserve"> tábla:</w:t>
+          <w:sz w:val="24"/>
+          <w:szCs w:val="24"/>
+        </w:rPr>
+        <w:t>Quizzes tábla:</w:t>
       </w:r>
     </w:p>
     <w:p>
@@ -6993,21 +5799,8 @@
         <w:spacing w:line="259" w:lineRule="auto"/>
         <w:jc w:val="left"/>
       </w:pPr>
-      <w:proofErr w:type="spellStart"/>
-      <w:r>
-        <w:t>quiz_id</w:t>
-      </w:r>
-      <w:proofErr w:type="spellEnd"/>
-      <w:r>
-        <w:t xml:space="preserve"> → kvíz egyedi azonosítója, int, </w:t>
-      </w:r>
-      <w:proofErr w:type="spellStart"/>
-      <w:r>
-        <w:t>auto_increment</w:t>
-      </w:r>
-      <w:proofErr w:type="spellEnd"/>
-      <w:r>
-        <w:t xml:space="preserve">, </w:t>
+      <w:r>
+        <w:t xml:space="preserve">quiz_id → kvíz egyedi azonosítója, int, auto_increment, </w:t>
       </w:r>
       <w:r>
         <w:t>PK</w:t>
@@ -7024,29 +5817,8 @@
         <w:spacing w:line="259" w:lineRule="auto"/>
         <w:jc w:val="left"/>
       </w:pPr>
-      <w:proofErr w:type="spellStart"/>
-      <w:r>
-        <w:t>name</w:t>
-      </w:r>
-      <w:proofErr w:type="spellEnd"/>
-      <w:r>
-        <w:t xml:space="preserve"> → kvíz címe, </w:t>
-      </w:r>
-      <w:proofErr w:type="spellStart"/>
-      <w:r>
-        <w:t>varchar</w:t>
-      </w:r>
-      <w:proofErr w:type="spellEnd"/>
-      <w:r>
-        <w:t xml:space="preserve">(30), </w:t>
-      </w:r>
-      <w:proofErr w:type="spellStart"/>
-      <w:r>
-        <w:t>not</w:t>
-      </w:r>
-      <w:proofErr w:type="spellEnd"/>
-      <w:r>
-        <w:t xml:space="preserve"> null</w:t>
+      <w:r>
+        <w:t>name → kvíz címe, varchar(30), not null</w:t>
       </w:r>
     </w:p>
     <w:p>
@@ -7060,29 +5832,8 @@
         <w:spacing w:line="259" w:lineRule="auto"/>
         <w:jc w:val="left"/>
       </w:pPr>
-      <w:proofErr w:type="spellStart"/>
-      <w:r>
-        <w:t>icon</w:t>
-      </w:r>
-      <w:proofErr w:type="spellEnd"/>
-      <w:r>
-        <w:t xml:space="preserve"> → kvízhez tartozó ikon fájlazonosítója, </w:t>
-      </w:r>
-      <w:proofErr w:type="spellStart"/>
-      <w:r>
-        <w:t>varchar</w:t>
-      </w:r>
-      <w:proofErr w:type="spellEnd"/>
-      <w:r>
-        <w:t xml:space="preserve">(48), </w:t>
-      </w:r>
-      <w:proofErr w:type="spellStart"/>
-      <w:r>
-        <w:t>not</w:t>
-      </w:r>
-      <w:proofErr w:type="spellEnd"/>
-      <w:r>
-        <w:t xml:space="preserve"> null</w:t>
+      <w:r>
+        <w:t>icon → kvízhez tartozó ikon fájlazonosítója, varchar(48), not null</w:t>
       </w:r>
     </w:p>
     <w:p>
@@ -7097,23 +5848,7 @@
         <w:jc w:val="left"/>
       </w:pPr>
       <w:r>
-        <w:t xml:space="preserve">banner → kvíz borítóképe, </w:t>
-      </w:r>
-      <w:proofErr w:type="spellStart"/>
-      <w:r>
-        <w:t>varchar</w:t>
-      </w:r>
-      <w:proofErr w:type="spellEnd"/>
-      <w:r>
-        <w:t xml:space="preserve">(48), </w:t>
-      </w:r>
-      <w:proofErr w:type="spellStart"/>
-      <w:r>
-        <w:t>not</w:t>
-      </w:r>
-      <w:proofErr w:type="spellEnd"/>
-      <w:r>
-        <w:t xml:space="preserve"> null</w:t>
+        <w:t>banner → kvíz borítóképe, varchar(48), not null</w:t>
       </w:r>
     </w:p>
     <w:p>
@@ -7127,29 +5862,8 @@
         <w:spacing w:line="259" w:lineRule="auto"/>
         <w:jc w:val="left"/>
       </w:pPr>
-      <w:proofErr w:type="spellStart"/>
-      <w:r>
-        <w:t>description</w:t>
-      </w:r>
-      <w:proofErr w:type="spellEnd"/>
-      <w:r>
-        <w:t xml:space="preserve"> → kvíz leírása, </w:t>
-      </w:r>
-      <w:proofErr w:type="spellStart"/>
-      <w:r>
-        <w:t>varchar</w:t>
-      </w:r>
-      <w:proofErr w:type="spellEnd"/>
-      <w:r>
-        <w:t xml:space="preserve">(255), </w:t>
-      </w:r>
-      <w:proofErr w:type="spellStart"/>
-      <w:r>
-        <w:t>not</w:t>
-      </w:r>
-      <w:proofErr w:type="spellEnd"/>
-      <w:r>
-        <w:t xml:space="preserve"> null</w:t>
+      <w:r>
+        <w:t>description → kvíz leírása, varchar(255), not null</w:t>
       </w:r>
     </w:p>
     <w:p>
@@ -7163,27 +5877,14 @@
         <w:spacing w:line="259" w:lineRule="auto"/>
         <w:jc w:val="left"/>
       </w:pPr>
-      <w:proofErr w:type="spellStart"/>
-      <w:r>
-        <w:t>creator</w:t>
-      </w:r>
-      <w:proofErr w:type="spellEnd"/>
-      <w:r>
-        <w:t xml:space="preserve"> → kvízt létrehozó felhasználó azonosítója, int, </w:t>
+      <w:r>
+        <w:t xml:space="preserve">creator → kvízt létrehozó felhasználó azonosítója, int, </w:t>
       </w:r>
       <w:r>
         <w:t>FK</w:t>
       </w:r>
       <w:r>
-        <w:t xml:space="preserve">, </w:t>
-      </w:r>
-      <w:proofErr w:type="spellStart"/>
-      <w:r>
-        <w:t>not</w:t>
-      </w:r>
-      <w:proofErr w:type="spellEnd"/>
-      <w:r>
-        <w:t xml:space="preserve"> null</w:t>
+        <w:t>, not null</w:t>
       </w:r>
     </w:p>
     <w:p>
@@ -7197,21 +5898,8 @@
         <w:spacing w:line="259" w:lineRule="auto"/>
         <w:jc w:val="left"/>
       </w:pPr>
-      <w:proofErr w:type="spellStart"/>
-      <w:r>
-        <w:t>tags</w:t>
-      </w:r>
-      <w:proofErr w:type="spellEnd"/>
-      <w:r>
-        <w:t xml:space="preserve"> → kvízhez tartozó címkék, </w:t>
-      </w:r>
-      <w:proofErr w:type="spellStart"/>
-      <w:r>
-        <w:t>not</w:t>
-      </w:r>
-      <w:proofErr w:type="spellEnd"/>
-      <w:r>
-        <w:t xml:space="preserve"> null</w:t>
+      <w:r>
+        <w:t>tags → kvízhez tartozó címkék, not null</w:t>
       </w:r>
     </w:p>
     <w:p>
@@ -7232,15 +5920,7 @@
         <w:t>FK,</w:t>
       </w:r>
       <w:r>
-        <w:t xml:space="preserve"> </w:t>
-      </w:r>
-      <w:proofErr w:type="spellStart"/>
-      <w:r>
-        <w:t>not</w:t>
-      </w:r>
-      <w:proofErr w:type="spellEnd"/>
-      <w:r>
-        <w:t xml:space="preserve"> null</w:t>
+        <w:t xml:space="preserve"> not null</w:t>
       </w:r>
     </w:p>
     <w:p>
@@ -7254,27 +5934,14 @@
         <w:spacing w:line="259" w:lineRule="auto"/>
         <w:jc w:val="left"/>
       </w:pPr>
-      <w:proofErr w:type="spellStart"/>
-      <w:r>
-        <w:t>isPrivate</w:t>
-      </w:r>
-      <w:proofErr w:type="spellEnd"/>
-      <w:r>
-        <w:t xml:space="preserve"> → kvíz privát állapotát jelző mező, int</w:t>
+      <w:r>
+        <w:t>isPrivate → kvíz privát állapotát jelző mező, int</w:t>
       </w:r>
       <w:r>
         <w:t>,</w:t>
       </w:r>
       <w:r>
-        <w:t xml:space="preserve"> </w:t>
-      </w:r>
-      <w:proofErr w:type="spellStart"/>
-      <w:r>
-        <w:t>not</w:t>
-      </w:r>
-      <w:proofErr w:type="spellEnd"/>
-      <w:r>
-        <w:t xml:space="preserve"> null</w:t>
+        <w:t xml:space="preserve"> not null</w:t>
       </w:r>
     </w:p>
     <w:p>
@@ -7288,21 +5955,8 @@
         <w:spacing w:line="259" w:lineRule="auto"/>
         <w:jc w:val="left"/>
       </w:pPr>
-      <w:proofErr w:type="spellStart"/>
-      <w:r>
-        <w:t>questions</w:t>
-      </w:r>
-      <w:proofErr w:type="spellEnd"/>
-      <w:r>
-        <w:t xml:space="preserve"> → kvíz kérdései, </w:t>
-      </w:r>
-      <w:proofErr w:type="spellStart"/>
-      <w:r>
-        <w:t>not</w:t>
-      </w:r>
-      <w:proofErr w:type="spellEnd"/>
-      <w:r>
-        <w:t xml:space="preserve"> null</w:t>
+      <w:r>
+        <w:t>questions → kvíz kérdései, not null</w:t>
       </w:r>
     </w:p>
     <w:p>
@@ -7317,15 +5971,7 @@
         <w:jc w:val="left"/>
       </w:pPr>
       <w:r>
-        <w:t xml:space="preserve">played → kvíz lejátszásainak száma, int, </w:t>
-      </w:r>
-      <w:proofErr w:type="spellStart"/>
-      <w:r>
-        <w:t>not</w:t>
-      </w:r>
-      <w:proofErr w:type="spellEnd"/>
-      <w:r>
-        <w:t xml:space="preserve"> null</w:t>
+        <w:t>played → kvíz lejátszásainak száma, int, not null</w:t>
       </w:r>
     </w:p>
     <w:p>
@@ -7339,29 +5985,8 @@
         <w:spacing w:line="259" w:lineRule="auto"/>
         <w:jc w:val="left"/>
       </w:pPr>
-      <w:proofErr w:type="spellStart"/>
-      <w:r>
-        <w:t>created_at</w:t>
-      </w:r>
-      <w:proofErr w:type="spellEnd"/>
-      <w:r>
-        <w:t xml:space="preserve"> → kvíz létrehozásának időpontja, </w:t>
-      </w:r>
-      <w:proofErr w:type="spellStart"/>
-      <w:r>
-        <w:t>timestamp</w:t>
-      </w:r>
-      <w:proofErr w:type="spellEnd"/>
-      <w:r>
-        <w:t xml:space="preserve">, </w:t>
-      </w:r>
-      <w:proofErr w:type="spellStart"/>
-      <w:r>
-        <w:t>defaultNow</w:t>
-      </w:r>
-      <w:proofErr w:type="spellEnd"/>
-      <w:r>
-        <w:t>()</w:t>
+      <w:r>
+        <w:t>created_at → kvíz létrehozásának időpontja, timestamp, defaultNow()</w:t>
       </w:r>
     </w:p>
     <w:p>
@@ -7375,37 +6000,8 @@
         <w:spacing w:line="259" w:lineRule="auto"/>
         <w:jc w:val="left"/>
       </w:pPr>
-      <w:proofErr w:type="spellStart"/>
-      <w:r>
-        <w:t>updated_at</w:t>
-      </w:r>
-      <w:proofErr w:type="spellEnd"/>
-      <w:r>
-        <w:t xml:space="preserve"> → utolsó módosítás időpontja, </w:t>
-      </w:r>
-      <w:proofErr w:type="spellStart"/>
-      <w:r>
-        <w:t>timestamp</w:t>
-      </w:r>
-      <w:proofErr w:type="spellEnd"/>
-      <w:r>
-        <w:t xml:space="preserve">, </w:t>
-      </w:r>
-      <w:proofErr w:type="spellStart"/>
-      <w:r>
-        <w:t>defaultNow</w:t>
-      </w:r>
-      <w:proofErr w:type="spellEnd"/>
-      <w:r>
-        <w:t xml:space="preserve">(), </w:t>
-      </w:r>
-      <w:proofErr w:type="spellStart"/>
-      <w:r>
-        <w:t>onUpdateNow</w:t>
-      </w:r>
-      <w:proofErr w:type="spellEnd"/>
-      <w:r>
-        <w:t>()</w:t>
+      <w:r>
+        <w:t>updated_at → utolsó módosítás időpontja, timestamp, defaultNow(), onUpdateNow()</w:t>
       </w:r>
     </w:p>
     <w:p>
@@ -7423,23 +6019,18 @@
         <w:rPr>
           <w:b/>
           <w:bCs/>
-        </w:rPr>
-      </w:pPr>
-      <w:proofErr w:type="spellStart"/>
+          <w:sz w:val="24"/>
+          <w:szCs w:val="24"/>
+        </w:rPr>
+      </w:pPr>
       <w:r>
         <w:rPr>
           <w:b/>
           <w:bCs/>
-        </w:rPr>
-        <w:t>Quiz_tags</w:t>
-      </w:r>
-      <w:proofErr w:type="spellEnd"/>
-      <w:r>
-        <w:rPr>
-          <w:b/>
-          <w:bCs/>
-        </w:rPr>
-        <w:t xml:space="preserve"> tábla:</w:t>
+          <w:sz w:val="24"/>
+          <w:szCs w:val="24"/>
+        </w:rPr>
+        <w:t>Quiz_tags tábla:</w:t>
       </w:r>
     </w:p>
     <w:p>
@@ -7453,21 +6044,8 @@
         <w:spacing w:line="259" w:lineRule="auto"/>
         <w:jc w:val="left"/>
       </w:pPr>
-      <w:proofErr w:type="spellStart"/>
-      <w:r>
-        <w:t>quiz_tag_id</w:t>
-      </w:r>
-      <w:proofErr w:type="spellEnd"/>
-      <w:r>
-        <w:t xml:space="preserve"> → címke egyedi azonosítója, int, </w:t>
-      </w:r>
-      <w:proofErr w:type="spellStart"/>
-      <w:r>
-        <w:t>auto_increment</w:t>
-      </w:r>
-      <w:proofErr w:type="spellEnd"/>
-      <w:r>
-        <w:t xml:space="preserve">, </w:t>
+      <w:r>
+        <w:t xml:space="preserve">quiz_tag_id → címke egyedi azonosítója, int, auto_increment, </w:t>
       </w:r>
       <w:r>
         <w:t>PK</w:t>
@@ -7485,23 +6063,7 @@
         <w:jc w:val="left"/>
       </w:pPr>
       <w:r>
-        <w:t xml:space="preserve">tag → címke értéke, </w:t>
-      </w:r>
-      <w:proofErr w:type="spellStart"/>
-      <w:r>
-        <w:t>varchar</w:t>
-      </w:r>
-      <w:proofErr w:type="spellEnd"/>
-      <w:r>
-        <w:t xml:space="preserve">(50), </w:t>
-      </w:r>
-      <w:proofErr w:type="spellStart"/>
-      <w:r>
-        <w:t>not</w:t>
-      </w:r>
-      <w:proofErr w:type="spellEnd"/>
-      <w:r>
-        <w:t xml:space="preserve"> null</w:t>
+        <w:t>tag → címke értéke, varchar(50), not null</w:t>
       </w:r>
     </w:p>
     <w:p>
@@ -7515,29 +6077,8 @@
         <w:spacing w:line="259" w:lineRule="auto"/>
         <w:jc w:val="left"/>
       </w:pPr>
-      <w:proofErr w:type="spellStart"/>
-      <w:r>
-        <w:t>label</w:t>
-      </w:r>
-      <w:proofErr w:type="spellEnd"/>
-      <w:r>
-        <w:t xml:space="preserve"> → címke megjelenített neve, </w:t>
-      </w:r>
-      <w:proofErr w:type="spellStart"/>
-      <w:r>
-        <w:t>varchar</w:t>
-      </w:r>
-      <w:proofErr w:type="spellEnd"/>
-      <w:r>
-        <w:t xml:space="preserve">(50), </w:t>
-      </w:r>
-      <w:proofErr w:type="spellStart"/>
-      <w:r>
-        <w:t>not</w:t>
-      </w:r>
-      <w:proofErr w:type="spellEnd"/>
-      <w:r>
-        <w:t xml:space="preserve"> null</w:t>
+      <w:r>
+        <w:t>label → címke megjelenített neve, varchar(50), not null</w:t>
       </w:r>
     </w:p>
     <w:p>
@@ -7551,35 +6092,14 @@
         <w:spacing w:line="259" w:lineRule="auto"/>
         <w:jc w:val="left"/>
       </w:pPr>
-      <w:proofErr w:type="spellStart"/>
-      <w:r>
-        <w:t>color</w:t>
-      </w:r>
-      <w:proofErr w:type="spellEnd"/>
-      <w:r>
-        <w:t xml:space="preserve"> → címk</w:t>
+      <w:r>
+        <w:t>color → címk</w:t>
       </w:r>
       <w:r>
         <w:t>é</w:t>
       </w:r>
       <w:r>
-        <w:t xml:space="preserve">hez tartozó színkód, </w:t>
-      </w:r>
-      <w:proofErr w:type="spellStart"/>
-      <w:r>
-        <w:t>varchar</w:t>
-      </w:r>
-      <w:proofErr w:type="spellEnd"/>
-      <w:r>
-        <w:t xml:space="preserve">(50), </w:t>
-      </w:r>
-      <w:proofErr w:type="spellStart"/>
-      <w:r>
-        <w:t>not</w:t>
-      </w:r>
-      <w:proofErr w:type="spellEnd"/>
-      <w:r>
-        <w:t xml:space="preserve"> null</w:t>
+        <w:t>hez tartozó színkód, varchar(50), not null</w:t>
       </w:r>
     </w:p>
     <w:p>
@@ -7597,23 +6117,18 @@
         <w:rPr>
           <w:b/>
           <w:bCs/>
-        </w:rPr>
-      </w:pPr>
-      <w:proofErr w:type="spellStart"/>
+          <w:sz w:val="24"/>
+          <w:szCs w:val="24"/>
+        </w:rPr>
+      </w:pPr>
       <w:r>
         <w:rPr>
           <w:b/>
           <w:bCs/>
-        </w:rPr>
-        <w:t>Countries</w:t>
-      </w:r>
-      <w:proofErr w:type="spellEnd"/>
-      <w:r>
-        <w:rPr>
-          <w:b/>
-          <w:bCs/>
-        </w:rPr>
-        <w:t xml:space="preserve"> tábla:</w:t>
+          <w:sz w:val="24"/>
+          <w:szCs w:val="24"/>
+        </w:rPr>
+        <w:t>Countries tábla:</w:t>
       </w:r>
     </w:p>
     <w:p>
@@ -7627,21 +6142,8 @@
         <w:spacing w:line="259" w:lineRule="auto"/>
         <w:jc w:val="left"/>
       </w:pPr>
-      <w:proofErr w:type="spellStart"/>
-      <w:r>
-        <w:t>country_id</w:t>
-      </w:r>
-      <w:proofErr w:type="spellEnd"/>
-      <w:r>
-        <w:t xml:space="preserve"> → ország egyedi azonosítója, int, </w:t>
-      </w:r>
-      <w:proofErr w:type="spellStart"/>
-      <w:r>
-        <w:t>auto_increment</w:t>
-      </w:r>
-      <w:proofErr w:type="spellEnd"/>
-      <w:r>
-        <w:t xml:space="preserve">, </w:t>
+      <w:r>
+        <w:t xml:space="preserve">country_id → ország egyedi azonosítója, int, auto_increment, </w:t>
       </w:r>
       <w:r>
         <w:t>PK</w:t>
@@ -7658,27 +6160,14 @@
         <w:spacing w:line="259" w:lineRule="auto"/>
         <w:jc w:val="left"/>
       </w:pPr>
-      <w:proofErr w:type="spellStart"/>
-      <w:r>
-        <w:t>continent</w:t>
-      </w:r>
-      <w:proofErr w:type="spellEnd"/>
-      <w:r>
-        <w:t xml:space="preserve"> → kontinens azonosítója, int, </w:t>
+      <w:r>
+        <w:t xml:space="preserve">continent → kontinens azonosítója, int, </w:t>
       </w:r>
       <w:r>
         <w:t>FK</w:t>
       </w:r>
       <w:r>
-        <w:t xml:space="preserve">, </w:t>
-      </w:r>
-      <w:proofErr w:type="spellStart"/>
-      <w:r>
-        <w:t>not</w:t>
-      </w:r>
-      <w:proofErr w:type="spellEnd"/>
-      <w:r>
-        <w:t xml:space="preserve"> null</w:t>
+        <w:t>, not null</w:t>
       </w:r>
     </w:p>
     <w:p>
@@ -7693,23 +6182,7 @@
         <w:jc w:val="left"/>
       </w:pPr>
       <w:r>
-        <w:t xml:space="preserve">country → ország neve, </w:t>
-      </w:r>
-      <w:proofErr w:type="spellStart"/>
-      <w:r>
-        <w:t>varchar</w:t>
-      </w:r>
-      <w:proofErr w:type="spellEnd"/>
-      <w:r>
-        <w:t xml:space="preserve">(20), </w:t>
-      </w:r>
-      <w:proofErr w:type="spellStart"/>
-      <w:r>
-        <w:t>not</w:t>
-      </w:r>
-      <w:proofErr w:type="spellEnd"/>
-      <w:r>
-        <w:t xml:space="preserve"> null</w:t>
+        <w:t>country → ország neve, varchar(20), not null</w:t>
       </w:r>
     </w:p>
     <w:p>
@@ -7723,29 +6196,8 @@
         <w:spacing w:line="259" w:lineRule="auto"/>
         <w:jc w:val="left"/>
       </w:pPr>
-      <w:proofErr w:type="spellStart"/>
-      <w:r>
-        <w:t>country_code</w:t>
-      </w:r>
-      <w:proofErr w:type="spellEnd"/>
-      <w:r>
-        <w:t xml:space="preserve"> → ország kétbetűs kódja, </w:t>
-      </w:r>
-      <w:proofErr w:type="spellStart"/>
-      <w:r>
-        <w:t>varchar</w:t>
-      </w:r>
-      <w:proofErr w:type="spellEnd"/>
-      <w:r>
-        <w:t xml:space="preserve">(2), </w:t>
-      </w:r>
-      <w:proofErr w:type="spellStart"/>
-      <w:r>
-        <w:t>not</w:t>
-      </w:r>
-      <w:proofErr w:type="spellEnd"/>
-      <w:r>
-        <w:t xml:space="preserve"> null</w:t>
+      <w:r>
+        <w:t>country_code → ország kétbetűs kódja, varchar(2), not null</w:t>
       </w:r>
     </w:p>
     <w:p>
@@ -7796,24 +6248,19 @@
         <w:rPr>
           <w:b/>
           <w:bCs/>
-        </w:rPr>
-      </w:pPr>
-      <w:proofErr w:type="spellStart"/>
+          <w:sz w:val="24"/>
+          <w:szCs w:val="24"/>
+        </w:rPr>
+      </w:pPr>
       <w:r>
         <w:rPr>
           <w:b/>
           <w:bCs/>
+          <w:sz w:val="24"/>
+          <w:szCs w:val="24"/>
         </w:rPr>
         <w:lastRenderedPageBreak/>
-        <w:t>Continents</w:t>
-      </w:r>
-      <w:proofErr w:type="spellEnd"/>
-      <w:r>
-        <w:rPr>
-          <w:b/>
-          <w:bCs/>
-        </w:rPr>
-        <w:t xml:space="preserve"> tábla:</w:t>
+        <w:t>Continents tábla:</w:t>
       </w:r>
     </w:p>
     <w:p>
@@ -7827,21 +6274,8 @@
         <w:spacing w:line="259" w:lineRule="auto"/>
         <w:jc w:val="left"/>
       </w:pPr>
-      <w:proofErr w:type="spellStart"/>
-      <w:r>
-        <w:t>continent_id</w:t>
-      </w:r>
-      <w:proofErr w:type="spellEnd"/>
-      <w:r>
-        <w:t xml:space="preserve"> → kontinens egyedi azonosítója, int, </w:t>
-      </w:r>
-      <w:proofErr w:type="spellStart"/>
-      <w:r>
-        <w:t>auto_increment</w:t>
-      </w:r>
-      <w:proofErr w:type="spellEnd"/>
-      <w:r>
-        <w:t xml:space="preserve">, </w:t>
+      <w:r>
+        <w:t xml:space="preserve">continent_id → kontinens egyedi azonosítója, int, auto_increment, </w:t>
       </w:r>
       <w:r>
         <w:t>PK</w:t>
@@ -7858,62 +6292,20 @@
         <w:spacing w:line="259" w:lineRule="auto"/>
         <w:jc w:val="left"/>
       </w:pPr>
-      <w:proofErr w:type="spellStart"/>
-      <w:r>
-        <w:t>continent</w:t>
-      </w:r>
-      <w:proofErr w:type="spellEnd"/>
-      <w:r>
-        <w:t xml:space="preserve"> → kontinens neve, </w:t>
-      </w:r>
-      <w:proofErr w:type="spellStart"/>
-      <w:r>
-        <w:t>varchar</w:t>
-      </w:r>
-      <w:proofErr w:type="spellEnd"/>
-      <w:r>
-        <w:t>(20</w:t>
+      <w:r>
+        <w:t>continent → kontinens neve, varchar(20</w:t>
       </w:r>
       <w:r>
         <w:t>)</w:t>
       </w:r>
       <w:r>
-        <w:t xml:space="preserve">, </w:t>
-      </w:r>
-      <w:proofErr w:type="spellStart"/>
-      <w:r>
-        <w:t>not</w:t>
-      </w:r>
-      <w:proofErr w:type="spellEnd"/>
-      <w:r>
-        <w:t xml:space="preserve"> null</w:t>
-      </w:r>
-    </w:p>
-    <w:p>
-      <w:pPr>
-        <w:keepNext/>
-        <w:spacing w:line="259" w:lineRule="auto"/>
-        <w:jc w:val="left"/>
-        <w:rPr>
-          <w:b/>
-          <w:bCs/>
-        </w:rPr>
-      </w:pPr>
-    </w:p>
-    <w:p>
-      <w:pPr>
-        <w:keepNext/>
-        <w:spacing w:line="259" w:lineRule="auto"/>
-        <w:jc w:val="left"/>
-        <w:rPr>
-          <w:b/>
-          <w:bCs/>
-        </w:rPr>
-      </w:pPr>
+        <w:t>, not null</w:t>
+      </w:r>
     </w:p>
     <w:p>
       <w:pPr>
         <w:pStyle w:val="Kpalrs"/>
+        <w:jc w:val="both"/>
         <w:sectPr>
           <w:pgSz w:w="11906" w:h="16838"/>
           <w:pgMar w:top="1417" w:right="1417" w:bottom="1417" w:left="1417" w:header="708" w:footer="708" w:gutter="0"/>
@@ -8014,23 +6406,7 @@
                               <w:fldChar w:fldCharType="end"/>
                             </w:r>
                             <w:r>
-                              <w:t xml:space="preserve">. ábra - Kapcsolat a </w:t>
-                            </w:r>
-                            <w:proofErr w:type="spellStart"/>
-                            <w:r>
-                              <w:t>users</w:t>
-                            </w:r>
-                            <w:proofErr w:type="spellEnd"/>
-                            <w:r>
-                              <w:t xml:space="preserve"> és a </w:t>
-                            </w:r>
-                            <w:proofErr w:type="spellStart"/>
-                            <w:r>
-                              <w:t>quiz</w:t>
-                            </w:r>
-                            <w:proofErr w:type="spellEnd"/>
-                            <w:r>
-                              <w:t xml:space="preserve"> tábla között</w:t>
+                              <w:t>. ábra - Kapcsolat a users és a quiz tábla között</w:t>
                             </w:r>
                             <w:bookmarkEnd w:id="17"/>
                           </w:p>
@@ -8096,23 +6472,7 @@
                         <w:fldChar w:fldCharType="end"/>
                       </w:r>
                       <w:r>
-                        <w:t xml:space="preserve">. ábra - Kapcsolat a </w:t>
-                      </w:r>
-                      <w:proofErr w:type="spellStart"/>
-                      <w:r>
-                        <w:t>users</w:t>
-                      </w:r>
-                      <w:proofErr w:type="spellEnd"/>
-                      <w:r>
-                        <w:t xml:space="preserve"> és a </w:t>
-                      </w:r>
-                      <w:proofErr w:type="spellStart"/>
-                      <w:r>
-                        <w:t>quiz</w:t>
-                      </w:r>
-                      <w:proofErr w:type="spellEnd"/>
-                      <w:r>
-                        <w:t xml:space="preserve"> tábla között</w:t>
+                        <w:t>. ábra - Kapcsolat a users és a quiz tábla között</w:t>
                       </w:r>
                       <w:bookmarkEnd w:id="18"/>
                     </w:p>
@@ -8471,21 +6831,8 @@
     </w:p>
     <w:p>
       <w:r>
-        <w:t xml:space="preserve">A mai modern weboldalakon szerintünk elengedhetetlen az, hogy a felhasználó különböző megjelenési téma között választhasson a felhasználói felületre. Erre a leggyakoribb példa a világos/sötét téma. Ennek tudatában implementáltuk világos és sötét módot minden oldalra. Azt, hogy a felhasználó milyen témát választott ki </w:t>
-      </w:r>
-      <w:proofErr w:type="gramStart"/>
-      <w:r>
-        <w:t>sütikben</w:t>
-      </w:r>
-      <w:proofErr w:type="gramEnd"/>
-      <w:r>
-        <w:t xml:space="preserve"> tároljuk. Ennek az az oka, hogy szerver oldalon a kérés megérkezésekor már megkaphatjuk a választott témát, így „szerver oldali </w:t>
-      </w:r>
-      <w:proofErr w:type="spellStart"/>
-      <w:r>
-        <w:t>renderelés</w:t>
-      </w:r>
-      <w:proofErr w:type="spellEnd"/>
+        <w:t>A mai modern weboldalakon szerintünk elengedhetetlen az, hogy a felhasználó különböző megjelenési téma között választhasson a felhasználói felületre. Erre a leggyakoribb példa a világos/sötét téma. Ennek tudatában implementáltuk világos és sötét módot minden oldalra. Azt, hogy a felhasználó milyen témát választott ki sütikben tároljuk. Ennek az az oka, hogy szerver oldalon a kérés megérkezésekor már megkaphatjuk a választott témát, így „szerver oldali renderelés</w:t>
+      </w:r>
       <w:r>
         <w:rPr>
           <w:rStyle w:val="Lbjegyzet-hivatkozs"/>
@@ -8496,13 +6843,8 @@
         <w:t>”</w:t>
       </w:r>
       <w:r>
-        <w:t xml:space="preserve">-nél már a választott témát tudjuk használni ezzel elősegítve a gyors betöltést. Erre egy úgynevezett </w:t>
-      </w:r>
-      <w:proofErr w:type="spellStart"/>
-      <w:r>
-        <w:t>provider</w:t>
-      </w:r>
-      <w:proofErr w:type="spellEnd"/>
+        <w:t>-nél már a választott témát tudjuk használni ezzel elősegítve a gyors betöltést. Erre egy úgynevezett provider</w:t>
+      </w:r>
       <w:r>
         <w:rPr>
           <w:rStyle w:val="Lbjegyzet-hivatkozs"/>
@@ -9144,134 +7486,76 @@
         <w:rPr>
           <w:rFonts w:ascii="Calibri" w:hAnsi="Calibri" w:cs="Calibri"/>
         </w:rPr>
-        <w:t xml:space="preserve"> hiszen a http protokoll a kérés teljesítése után lezárja a kapcsolatot. Ellentétben a http-vel, a </w:t>
-      </w:r>
-      <w:proofErr w:type="spellStart"/>
-      <w:r>
-        <w:rPr>
-          <w:rFonts w:ascii="Calibri" w:hAnsi="Calibri" w:cs="Calibri"/>
-        </w:rPr>
-        <w:t>WebSocket</w:t>
-      </w:r>
-      <w:proofErr w:type="spellEnd"/>
-      <w:r>
-        <w:rPr>
-          <w:rFonts w:ascii="Calibri" w:hAnsi="Calibri" w:cs="Calibri"/>
-        </w:rPr>
-        <w:t xml:space="preserve"> protokoll kapcsolatot nyit a szerverrel, ami egészen addig marad nyitva, amíg el nem hagyjuk az oldalt. Ez lehetővé teszi, hogy interakciókra, például egy gomb lenyomásra szóljunk a szervernek, hogy: </w:t>
+        <w:t xml:space="preserve"> hiszen a http protokoll a kérés teljesítése után lezárja a kapcsolatot. Ellentétben a http-vel, a WebSocket protokoll kapcsolatot nyit a szerverrel, ami egészen addig marad nyitva, amíg el nem hagyjuk az oldalt. Ez lehetővé teszi, hogy interakciókra, például egy gomb lenyomásra szóljunk a szervernek, hogy: </w:t>
       </w:r>
       <w:r>
         <w:rPr>
           <w:rFonts w:ascii="Calibri" w:hAnsi="Calibri" w:cs="Calibri"/>
           <w:i/>
         </w:rPr>
-        <w:t>„Helló-</w:t>
-      </w:r>
-      <w:proofErr w:type="spellStart"/>
+        <w:t>„Helló-belló, megnyomtam a gombot, értesíts</w:t>
+      </w:r>
       <w:r>
         <w:rPr>
           <w:rFonts w:ascii="Calibri" w:hAnsi="Calibri" w:cs="Calibri"/>
           <w:i/>
         </w:rPr>
-        <w:t>belló</w:t>
-      </w:r>
-      <w:proofErr w:type="spellEnd"/>
+        <w:t>d</w:t>
+      </w:r>
       <w:r>
         <w:rPr>
           <w:rFonts w:ascii="Calibri" w:hAnsi="Calibri" w:cs="Calibri"/>
           <w:i/>
         </w:rPr>
-        <w:t>, megnyomtam a gombot, értesíts</w:t>
+        <w:t xml:space="preserve"> a többi felhasználót.”</w:t>
       </w:r>
       <w:r>
         <w:rPr>
           <w:rFonts w:ascii="Calibri" w:hAnsi="Calibri" w:cs="Calibri"/>
-          <w:i/>
-        </w:rPr>
-        <w:t>d</w:t>
+        </w:rPr>
+        <w:t>. Ez az alapja a játék résznek is. Lejátszás indításakor egy kódot hoz létre</w:t>
       </w:r>
       <w:r>
         <w:rPr>
           <w:rFonts w:ascii="Calibri" w:hAnsi="Calibri" w:cs="Calibri"/>
-          <w:i/>
-        </w:rPr>
-        <w:t xml:space="preserve"> a többi felhasználót.”</w:t>
+        </w:rPr>
+        <w:t>,</w:t>
       </w:r>
       <w:r>
         <w:rPr>
           <w:rFonts w:ascii="Calibri" w:hAnsi="Calibri" w:cs="Calibri"/>
         </w:rPr>
-        <w:t>. Ez az alapja a játék résznek is. Lejátszás indításakor egy kódot hoz létre</w:t>
+        <w:t xml:space="preserve"> amellyel csatlakozni tud bárki. Ezt a kódot használva egy „szobát” hoz létre a WebSocket szerver, amihez csatlakozunk</w:t>
       </w:r>
       <w:r>
         <w:rPr>
           <w:rFonts w:ascii="Calibri" w:hAnsi="Calibri" w:cs="Calibri"/>
         </w:rPr>
+        <w:t xml:space="preserve">. </w:t>
+      </w:r>
+      <w:r>
+        <w:rPr>
+          <w:rFonts w:ascii="Calibri" w:hAnsi="Calibri" w:cs="Calibri"/>
+        </w:rPr>
+        <w:t>Így nyomon tudjuk követni, hogy melyik felhasználó melyik játékhoz csatlakozott, és csak az adott játékuk adatait és eseményeit küldjük le számukra.</w:t>
+      </w:r>
+      <w:r>
+        <w:rPr>
+          <w:rFonts w:ascii="Calibri" w:hAnsi="Calibri" w:cs="Calibri"/>
+        </w:rPr>
+        <w:t xml:space="preserve"> A szerver ilyenkor elindít egy játékot</w:t>
+      </w:r>
+      <w:r>
+        <w:rPr>
+          <w:rFonts w:ascii="Calibri" w:hAnsi="Calibri" w:cs="Calibri"/>
+        </w:rPr>
         <w:t>,</w:t>
       </w:r>
       <w:r>
         <w:rPr>
           <w:rFonts w:ascii="Calibri" w:hAnsi="Calibri" w:cs="Calibri"/>
         </w:rPr>
-        <w:t xml:space="preserve"> amellyel csatlakozni tud bárki. Ezt a kódot használva egy „szobát” hoz létre a </w:t>
-      </w:r>
-      <w:proofErr w:type="spellStart"/>
-      <w:r>
-        <w:rPr>
-          <w:rFonts w:ascii="Calibri" w:hAnsi="Calibri" w:cs="Calibri"/>
-        </w:rPr>
-        <w:t>WebSocket</w:t>
-      </w:r>
-      <w:proofErr w:type="spellEnd"/>
-      <w:r>
-        <w:rPr>
-          <w:rFonts w:ascii="Calibri" w:hAnsi="Calibri" w:cs="Calibri"/>
-        </w:rPr>
-        <w:t xml:space="preserve"> szerver, amihez csatlakozunk</w:t>
-      </w:r>
-      <w:r>
-        <w:rPr>
-          <w:rFonts w:ascii="Calibri" w:hAnsi="Calibri" w:cs="Calibri"/>
-        </w:rPr>
-        <w:t xml:space="preserve">. </w:t>
-      </w:r>
-      <w:r>
-        <w:rPr>
-          <w:rFonts w:ascii="Calibri" w:hAnsi="Calibri" w:cs="Calibri"/>
-        </w:rPr>
-        <w:t>Így nyomon tudjuk követni, hogy melyik felhasználó melyik játékhoz csatlakozott, és csak az adott játékuk adatait és eseményeit küldjük le számukra.</w:t>
-      </w:r>
-      <w:r>
-        <w:rPr>
-          <w:rFonts w:ascii="Calibri" w:hAnsi="Calibri" w:cs="Calibri"/>
-        </w:rPr>
-        <w:t xml:space="preserve"> A szerver ilyenkor elindít egy játékot</w:t>
-      </w:r>
-      <w:r>
-        <w:rPr>
-          <w:rFonts w:ascii="Calibri" w:hAnsi="Calibri" w:cs="Calibri"/>
-        </w:rPr>
-        <w:t>,</w:t>
-      </w:r>
-      <w:r>
-        <w:rPr>
-          <w:rFonts w:ascii="Calibri" w:hAnsi="Calibri" w:cs="Calibri"/>
-        </w:rPr>
-        <w:t xml:space="preserve"> ami gyakorlatilag egy „</w:t>
-      </w:r>
-      <w:proofErr w:type="spellStart"/>
-      <w:r>
-        <w:rPr>
-          <w:rFonts w:ascii="Calibri" w:hAnsi="Calibri" w:cs="Calibri"/>
-        </w:rPr>
-        <w:t>while</w:t>
-      </w:r>
-      <w:proofErr w:type="spellEnd"/>
-      <w:r>
-        <w:rPr>
-          <w:rFonts w:ascii="Calibri" w:hAnsi="Calibri" w:cs="Calibri"/>
-        </w:rPr>
-        <w:t xml:space="preserve"> ciklus”: egészen addig megy, amíg el nem fogynak a kérdések. Folyamatosan gyűjti a beérkező válaszokat, tovább lép</w:t>
+        <w:t xml:space="preserve"> ami gyakorlatilag egy „while ciklus”: egészen addig megy, amíg el nem fogynak a kérdések. Folyamatosan gyűjti a beérkező válaszokat, tovább lép</w:t>
       </w:r>
       <w:r>
         <w:rPr>
@@ -11388,15 +9672,7 @@
         </w:numPr>
       </w:pPr>
       <w:r>
-        <w:t>Az első pontnál van lehetőség szerkeszteni a profilt. A felhasználónév, bemutatkozás (</w:t>
-      </w:r>
-      <w:proofErr w:type="spellStart"/>
-      <w:r>
-        <w:t>bio</w:t>
-      </w:r>
-      <w:proofErr w:type="spellEnd"/>
-      <w:r>
-        <w:t>), esetleg egy új jelszó beállítására is van opció. Nem utolsó sorban a regisztrált fiókot törölni is lehet, azonban ilyenkor az összes profilhoz tartozó kvíz is törlődni fog.</w:t>
+        <w:t>Az első pontnál van lehetőség szerkeszteni a profilt. A felhasználónév, bemutatkozás (bio), esetleg egy új jelszó beállítására is van opció. Nem utolsó sorban a regisztrált fiókot törölni is lehet, azonban ilyenkor az összes profilhoz tartozó kvíz is törlődni fog.</w:t>
       </w:r>
     </w:p>
     <w:p>
@@ -12994,15 +11270,7 @@
         </w:drawing>
       </w:r>
       <w:r>
-        <w:t>Elsőként az úgynevezett „banner” -</w:t>
-      </w:r>
-      <w:proofErr w:type="spellStart"/>
-      <w:r>
-        <w:t>nek</w:t>
-      </w:r>
-      <w:proofErr w:type="spellEnd"/>
-      <w:r>
-        <w:t xml:space="preserve"> választ</w:t>
+        <w:t>Elsőként az úgynevezett „banner” -nek választ</w:t>
       </w:r>
       <w:r>
         <w:t>ható</w:t>
@@ -13129,15 +11397,7 @@
         <w:t>Ezen az oldalon van lehetőség a kvíz kérdéseidet létrehozni, hozzáadni és szerkeszteni őket. Ha a kérdéseknél bármilyen változtatás történt azonnal felugrik egy „mentés” gomb, amivel a szerkesztés</w:t>
       </w:r>
       <w:r>
-        <w:t xml:space="preserve">eket </w:t>
-      </w:r>
-      <w:proofErr w:type="gramStart"/>
-      <w:r>
-        <w:t>van</w:t>
-      </w:r>
-      <w:proofErr w:type="gramEnd"/>
-      <w:r>
-        <w:t xml:space="preserve"> lehetőség elmenteni</w:t>
+        <w:t>eket van lehetőség elmenteni</w:t>
       </w:r>
       <w:r>
         <w:t>.</w:t>
@@ -13529,13 +11789,8 @@
                               <w:fldChar w:fldCharType="end"/>
                             </w:r>
                             <w:r>
-                              <w:t xml:space="preserve">. ábra - a négy </w:t>
+                              <w:t>. ábra - a négy slide</w:t>
                             </w:r>
-                            <w:proofErr w:type="spellStart"/>
-                            <w:r>
-                              <w:t>slide</w:t>
-                            </w:r>
-                            <w:proofErr w:type="spellEnd"/>
                             <w:r>
                               <w:t xml:space="preserve"> lehetőség</w:t>
                             </w:r>
@@ -13591,13 +11846,8 @@
                         <w:fldChar w:fldCharType="end"/>
                       </w:r>
                       <w:r>
-                        <w:t xml:space="preserve">. ábra - a négy </w:t>
+                        <w:t>. ábra - a négy slide</w:t>
                       </w:r>
-                      <w:proofErr w:type="spellStart"/>
-                      <w:r>
-                        <w:t>slide</w:t>
-                      </w:r>
-                      <w:proofErr w:type="spellEnd"/>
                       <w:r>
                         <w:t xml:space="preserve"> lehetőség</w:t>
                       </w:r>
@@ -13689,13 +11939,8 @@
       <w:r>
         <w:t xml:space="preserve"> „+ Új kérdés hozzáadása” -</w:t>
       </w:r>
-      <w:proofErr w:type="spellStart"/>
-      <w:r>
-        <w:t>ra</w:t>
-      </w:r>
-      <w:proofErr w:type="spellEnd"/>
-      <w:r>
-        <w:t xml:space="preserve"> kattintva,</w:t>
+      <w:r>
+        <w:t>ra kattintva,</w:t>
       </w:r>
       <w:r>
         <w:t xml:space="preserve"> négy úgynevezett kérdéslap</w:t>
@@ -14337,23 +12582,7 @@
         </w:sectPr>
       </w:pPr>
       <w:r>
-        <w:t>Az infó lap, általános tájékoztatásra, úgynevezett „</w:t>
-      </w:r>
-      <w:proofErr w:type="spellStart"/>
-      <w:r>
-        <w:t>fun</w:t>
-      </w:r>
-      <w:proofErr w:type="spellEnd"/>
-      <w:r>
-        <w:t xml:space="preserve"> </w:t>
-      </w:r>
-      <w:proofErr w:type="spellStart"/>
-      <w:r>
-        <w:t>fact</w:t>
-      </w:r>
-      <w:proofErr w:type="spellEnd"/>
-      <w:r>
-        <w:t>” -re használható, vagy csak a játékosok bíztatására</w:t>
+        <w:t>Az infó lap, általános tájékoztatásra, úgynevezett „fun fact” -re használható, vagy csak a játékosok bíztatására</w:t>
       </w:r>
       <w:r>
         <w:t>.</w:t>

</xml_diff>

<commit_message>
feat(docs): remove unsued pic
</commit_message>
<xml_diff>
--- a/documentation/dokumentacio.docx
+++ b/documentation/dokumentacio.docx
@@ -7,59 +7,6 @@
         <w:pStyle w:val="tajekoztato"/>
       </w:pPr>
       <w:r>
-        <w:rPr>
-          <w:noProof/>
-        </w:rPr>
-        <w:drawing>
-          <wp:inline distT="0" distB="0" distL="0" distR="0" wp14:anchorId="0982606C" wp14:editId="23A9446C">
-            <wp:extent cx="5752465" cy="3529965"/>
-            <wp:effectExtent l="0" t="0" r="635" b="0"/>
-            <wp:docPr id="648464603" name="Kép 39"/>
-            <wp:cNvGraphicFramePr>
-              <a:graphicFrameLocks xmlns:a="http://schemas.openxmlformats.org/drawingml/2006/main" noChangeAspect="1"/>
-            </wp:cNvGraphicFramePr>
-            <a:graphic xmlns:a="http://schemas.openxmlformats.org/drawingml/2006/main">
-              <a:graphicData uri="http://schemas.openxmlformats.org/drawingml/2006/picture">
-                <pic:pic xmlns:pic="http://schemas.openxmlformats.org/drawingml/2006/picture">
-                  <pic:nvPicPr>
-                    <pic:cNvPr id="0" name="Picture 1"/>
-                    <pic:cNvPicPr>
-                      <a:picLocks noChangeAspect="1" noChangeArrowheads="1"/>
-                    </pic:cNvPicPr>
-                  </pic:nvPicPr>
-                  <pic:blipFill>
-                    <a:blip r:embed="rId8" cstate="print">
-                      <a:extLst>
-                        <a:ext uri="{28A0092B-C50C-407E-A947-70E740481C1C}">
-                          <a14:useLocalDpi xmlns:a14="http://schemas.microsoft.com/office/drawing/2010/main" val="0"/>
-                        </a:ext>
-                      </a:extLst>
-                    </a:blip>
-                    <a:srcRect/>
-                    <a:stretch>
-                      <a:fillRect/>
-                    </a:stretch>
-                  </pic:blipFill>
-                  <pic:spPr bwMode="auto">
-                    <a:xfrm>
-                      <a:off x="0" y="0"/>
-                      <a:ext cx="5752465" cy="3529965"/>
-                    </a:xfrm>
-                    <a:prstGeom prst="rect">
-                      <a:avLst/>
-                    </a:prstGeom>
-                    <a:noFill/>
-                    <a:ln>
-                      <a:noFill/>
-                    </a:ln>
-                  </pic:spPr>
-                </pic:pic>
-              </a:graphicData>
-            </a:graphic>
-          </wp:inline>
-        </w:drawing>
-      </w:r>
-      <w:r>
         <w:t>Budapesti Műszaki Szakképzési Centrum</w:t>
       </w:r>
     </w:p>
@@ -121,7 +68,6 @@
         <w:pStyle w:val="tajekoztato"/>
       </w:pPr>
       <w:r>
-        <w:lastRenderedPageBreak/>
         <w:t>Készítette: Rostás András Péter, Digruber Emese</w:t>
       </w:r>
     </w:p>
@@ -744,7 +690,7 @@
         <w:pStyle w:val="tajekoztato"/>
         <w:jc w:val="left"/>
         <w:sectPr>
-          <w:footerReference w:type="default" r:id="rId9"/>
+          <w:footerReference w:type="default" r:id="rId8"/>
           <w:pgSz w:w="11906" w:h="16838"/>
           <w:pgMar w:top="1417" w:right="1417" w:bottom="1417" w:left="1417" w:header="708" w:footer="708" w:gutter="0"/>
           <w:cols w:space="708"/>
@@ -3077,7 +3023,7 @@
         <w:pStyle w:val="tajekoztato"/>
         <w:jc w:val="left"/>
         <w:sectPr>
-          <w:footerReference w:type="default" r:id="rId10"/>
+          <w:footerReference w:type="default" r:id="rId9"/>
           <w:pgSz w:w="11906" w:h="16838"/>
           <w:pgMar w:top="1417" w:right="1417" w:bottom="1417" w:left="1417" w:header="708" w:footer="708" w:gutter="0"/>
           <w:cols w:space="708"/>
@@ -3104,7 +3050,7 @@
       <w:r>
         <w:t xml:space="preserve">A vizsgaremek témája egy már meglévő szoftver ihlette, a </w:t>
       </w:r>
-      <w:hyperlink r:id="rId11" w:history="1">
+      <w:hyperlink r:id="rId10" w:history="1">
         <w:proofErr w:type="spellStart"/>
         <w:r>
           <w:rPr>
@@ -3280,7 +3226,7 @@
         </w:rPr>
         <w:t xml:space="preserve">oldal az </w:t>
       </w:r>
-      <w:hyperlink r:id="rId12" w:history="1">
+      <w:hyperlink r:id="rId11" w:history="1">
         <w:r>
           <w:rPr>
             <w:rStyle w:val="Hiperhivatkozs"/>
@@ -3345,18 +3291,18 @@
       <w:r>
         <w:t xml:space="preserve">IDE (Integrált fejlesztői környezet): </w:t>
       </w:r>
+      <w:hyperlink r:id="rId12" w:history="1">
+        <w:r>
+          <w:rPr>
+            <w:rStyle w:val="Hiperhivatkozs"/>
+          </w:rPr>
+          <w:t>Visual Studio 2022</w:t>
+        </w:r>
+      </w:hyperlink>
+      <w:r>
+        <w:t xml:space="preserve">, </w:t>
+      </w:r>
       <w:hyperlink r:id="rId13" w:history="1">
-        <w:r>
-          <w:rPr>
-            <w:rStyle w:val="Hiperhivatkozs"/>
-          </w:rPr>
-          <w:t>Visual Studio 2022</w:t>
-        </w:r>
-      </w:hyperlink>
-      <w:r>
-        <w:t xml:space="preserve">, </w:t>
-      </w:r>
-      <w:hyperlink r:id="rId14" w:history="1">
         <w:r>
           <w:rPr>
             <w:rStyle w:val="Hiperhivatkozs"/>
@@ -3392,7 +3338,7 @@
       <w:r>
         <w:t xml:space="preserve">-kezelő: </w:t>
       </w:r>
-      <w:hyperlink r:id="rId15" w:history="1">
+      <w:hyperlink r:id="rId14" w:history="1">
         <w:proofErr w:type="spellStart"/>
         <w:r>
           <w:rPr>
@@ -3428,7 +3374,7 @@
       <w:r>
         <w:t xml:space="preserve">Adatbázis-adminisztrációs eszköz: </w:t>
       </w:r>
-      <w:hyperlink r:id="rId16" w:history="1">
+      <w:hyperlink r:id="rId15" w:history="1">
         <w:proofErr w:type="spellStart"/>
         <w:r>
           <w:rPr>
@@ -3450,18 +3396,18 @@
       <w:r>
         <w:t xml:space="preserve">Fejlesztői környezet: </w:t>
       </w:r>
+      <w:hyperlink r:id="rId16" w:history="1">
+        <w:r>
+          <w:rPr>
+            <w:rStyle w:val="Hiperhivatkozs"/>
+          </w:rPr>
+          <w:t>Node.js</w:t>
+        </w:r>
+      </w:hyperlink>
+      <w:r>
+        <w:t>, .</w:t>
+      </w:r>
       <w:hyperlink r:id="rId17" w:history="1">
-        <w:r>
-          <w:rPr>
-            <w:rStyle w:val="Hiperhivatkozs"/>
-          </w:rPr>
-          <w:t>Node.js</w:t>
-        </w:r>
-      </w:hyperlink>
-      <w:r>
-        <w:t>, .</w:t>
-      </w:r>
-      <w:hyperlink r:id="rId18" w:history="1">
         <w:r>
           <w:rPr>
             <w:rStyle w:val="Hiperhivatkozs"/>
@@ -3481,7 +3427,7 @@
       <w:r>
         <w:t xml:space="preserve">Kódformázás és ellenőrzés: </w:t>
       </w:r>
-      <w:hyperlink r:id="rId19" w:history="1">
+      <w:hyperlink r:id="rId18" w:history="1">
         <w:proofErr w:type="spellStart"/>
         <w:r>
           <w:rPr>
@@ -3494,7 +3440,7 @@
       <w:r>
         <w:t xml:space="preserve">, </w:t>
       </w:r>
-      <w:hyperlink r:id="rId20" w:history="1">
+      <w:hyperlink r:id="rId19" w:history="1">
         <w:proofErr w:type="spellStart"/>
         <w:r>
           <w:rPr>
@@ -3533,7 +3479,7 @@
       <w:r>
         <w:t xml:space="preserve">Programozási nyelvek: </w:t>
       </w:r>
-      <w:hyperlink r:id="rId21" w:history="1">
+      <w:hyperlink r:id="rId20" w:history="1">
         <w:proofErr w:type="spellStart"/>
         <w:r>
           <w:rPr>
@@ -3546,7 +3492,7 @@
       <w:r>
         <w:t xml:space="preserve">, </w:t>
       </w:r>
-      <w:hyperlink r:id="rId22" w:history="1">
+      <w:hyperlink r:id="rId21" w:history="1">
         <w:r>
           <w:rPr>
             <w:rStyle w:val="Hiperhivatkozs"/>
@@ -3566,13 +3512,26 @@
       <w:r>
         <w:t xml:space="preserve">Webes technológiák: </w:t>
       </w:r>
+      <w:hyperlink r:id="rId22" w:history="1">
+        <w:r>
+          <w:rPr>
+            <w:rStyle w:val="Hiperhivatkozs"/>
+          </w:rPr>
+          <w:t>Next.js</w:t>
+        </w:r>
+      </w:hyperlink>
+      <w:r>
+        <w:t xml:space="preserve">, </w:t>
+      </w:r>
       <w:hyperlink r:id="rId23" w:history="1">
+        <w:proofErr w:type="spellStart"/>
         <w:r>
           <w:rPr>
             <w:rStyle w:val="Hiperhivatkozs"/>
           </w:rPr>
-          <w:t>Next.js</w:t>
-        </w:r>
+          <w:t>React</w:t>
+        </w:r>
+        <w:proofErr w:type="spellEnd"/>
       </w:hyperlink>
       <w:r>
         <w:t xml:space="preserve">, </w:t>
@@ -3583,7 +3542,7 @@
           <w:rPr>
             <w:rStyle w:val="Hiperhivatkozs"/>
           </w:rPr>
-          <w:t>React</w:t>
+          <w:t>TailWindCSS</w:t>
         </w:r>
         <w:proofErr w:type="spellEnd"/>
       </w:hyperlink>
@@ -3591,19 +3550,6 @@
         <w:t xml:space="preserve">, </w:t>
       </w:r>
       <w:hyperlink r:id="rId25" w:history="1">
-        <w:proofErr w:type="spellStart"/>
-        <w:r>
-          <w:rPr>
-            <w:rStyle w:val="Hiperhivatkozs"/>
-          </w:rPr>
-          <w:t>TailWindCSS</w:t>
-        </w:r>
-        <w:proofErr w:type="spellEnd"/>
-      </w:hyperlink>
-      <w:r>
-        <w:t xml:space="preserve">, </w:t>
-      </w:r>
-      <w:hyperlink r:id="rId26" w:history="1">
         <w:r>
           <w:rPr>
             <w:rStyle w:val="Hiperhivatkozs"/>
@@ -3623,7 +3569,7 @@
       <w:r>
         <w:t xml:space="preserve">Adatbáziskezelés és ORM: </w:t>
       </w:r>
-      <w:hyperlink r:id="rId27" w:history="1">
+      <w:hyperlink r:id="rId26" w:history="1">
         <w:proofErr w:type="spellStart"/>
         <w:r>
           <w:rPr>
@@ -3650,7 +3596,7 @@
       <w:r>
         <w:t xml:space="preserve">, </w:t>
       </w:r>
-      <w:hyperlink r:id="rId28" w:history="1">
+      <w:hyperlink r:id="rId27" w:history="1">
         <w:proofErr w:type="spellStart"/>
         <w:r>
           <w:rPr>
@@ -3683,15 +3629,34 @@
       <w:r>
         <w:t xml:space="preserve">UI komponens könyvtárak: </w:t>
       </w:r>
+      <w:hyperlink r:id="rId28" w:history="1">
+        <w:proofErr w:type="spellStart"/>
+        <w:r>
+          <w:rPr>
+            <w:rStyle w:val="Hiperhivatkozs"/>
+          </w:rPr>
+          <w:t>shadcn</w:t>
+        </w:r>
+        <w:proofErr w:type="spellEnd"/>
+      </w:hyperlink>
+      <w:r>
+        <w:t xml:space="preserve">, </w:t>
+      </w:r>
       <w:hyperlink r:id="rId29" w:history="1">
         <w:proofErr w:type="spellStart"/>
         <w:r>
           <w:rPr>
             <w:rStyle w:val="Hiperhivatkozs"/>
           </w:rPr>
-          <w:t>shadcn</w:t>
+          <w:t>Origin</w:t>
         </w:r>
         <w:proofErr w:type="spellEnd"/>
+        <w:r>
+          <w:rPr>
+            <w:rStyle w:val="Hiperhivatkozs"/>
+          </w:rPr>
+          <w:t xml:space="preserve"> UI</w:t>
+        </w:r>
       </w:hyperlink>
       <w:r>
         <w:t xml:space="preserve">, </w:t>
@@ -3702,7 +3667,7 @@
           <w:rPr>
             <w:rStyle w:val="Hiperhivatkozs"/>
           </w:rPr>
-          <w:t>Origin</w:t>
+          <w:t>Magic</w:t>
         </w:r>
         <w:proofErr w:type="spellEnd"/>
         <w:r>
@@ -3716,25 +3681,6 @@
         <w:t xml:space="preserve">, </w:t>
       </w:r>
       <w:hyperlink r:id="rId31" w:history="1">
-        <w:proofErr w:type="spellStart"/>
-        <w:r>
-          <w:rPr>
-            <w:rStyle w:val="Hiperhivatkozs"/>
-          </w:rPr>
-          <w:t>Magic</w:t>
-        </w:r>
-        <w:proofErr w:type="spellEnd"/>
-        <w:r>
-          <w:rPr>
-            <w:rStyle w:val="Hiperhivatkozs"/>
-          </w:rPr>
-          <w:t xml:space="preserve"> UI</w:t>
-        </w:r>
-      </w:hyperlink>
-      <w:r>
-        <w:t xml:space="preserve">, </w:t>
-      </w:r>
-      <w:hyperlink r:id="rId32" w:history="1">
         <w:r>
           <w:rPr>
             <w:rStyle w:val="Hiperhivatkozs"/>
@@ -4197,7 +4143,7 @@
     <w:p>
       <w:pPr>
         <w:sectPr>
-          <w:footerReference w:type="default" r:id="rId33"/>
+          <w:footerReference w:type="default" r:id="rId32"/>
           <w:pgSz w:w="11906" w:h="16838"/>
           <w:pgMar w:top="1417" w:right="1417" w:bottom="1417" w:left="1417" w:header="708" w:footer="708" w:gutter="0"/>
           <w:cols w:space="708"/>
@@ -4440,7 +4386,7 @@
         </w:rPr>
         <w:t xml:space="preserve">) telepítsük </w:t>
       </w:r>
-      <w:hyperlink r:id="rId34" w:history="1">
+      <w:hyperlink r:id="rId33" w:history="1">
         <w:r>
           <w:rPr>
             <w:rStyle w:val="Hiperhivatkozs"/>
@@ -4809,7 +4755,7 @@
         </w:rPr>
         <w:t xml:space="preserve"> fájl tartalmát. A </w:t>
       </w:r>
-      <w:hyperlink r:id="rId35" w:anchor="nextauth_secret" w:history="1">
+      <w:hyperlink r:id="rId34" w:anchor="nextauth_secret" w:history="1">
         <w:r>
           <w:rPr>
             <w:rStyle w:val="Hiperhivatkozs"/>
@@ -4824,7 +4770,7 @@
         </w:rPr>
         <w:t xml:space="preserve"> környezeti változó értéke bármi lehet, csak lényeg, hogy legyen benne valami. Szerezzünk ingyenesen egy kulcsot az </w:t>
       </w:r>
-      <w:hyperlink r:id="rId36" w:history="1">
+      <w:hyperlink r:id="rId35" w:history="1">
         <w:proofErr w:type="spellStart"/>
         <w:r>
           <w:rPr>
@@ -5439,7 +5385,7 @@
       <w:r>
         <w:t xml:space="preserve"> fülre. Itt megjelennek a projektben jelenleg telepített NuGet-csomagok, így egyszerűen megtalálhatja a </w:t>
       </w:r>
-      <w:hyperlink r:id="rId37" w:history="1">
+      <w:hyperlink r:id="rId36" w:history="1">
         <w:r>
           <w:rPr>
             <w:rStyle w:val="Hiperhivatkozs"/>
@@ -5578,7 +5524,7 @@
       <w:r>
         <w:t xml:space="preserve">használtuk a </w:t>
       </w:r>
-      <w:hyperlink r:id="rId38" w:history="1">
+      <w:hyperlink r:id="rId37" w:history="1">
         <w:proofErr w:type="spellStart"/>
         <w:r>
           <w:rPr>
@@ -5623,7 +5569,7 @@
                     </pic:cNvPicPr>
                   </pic:nvPicPr>
                   <pic:blipFill>
-                    <a:blip r:embed="rId39">
+                    <a:blip r:embed="rId38">
                       <a:extLst>
                         <a:ext uri="{28A0092B-C50C-407E-A947-70E740481C1C}">
                           <a14:useLocalDpi xmlns:a14="http://schemas.microsoft.com/office/drawing/2010/main" val="0"/>
@@ -6079,7 +6025,7 @@
                     <pic:cNvPicPr/>
                   </pic:nvPicPr>
                   <pic:blipFill>
-                    <a:blip r:embed="rId40"/>
+                    <a:blip r:embed="rId39"/>
                     <a:stretch>
                       <a:fillRect/>
                     </a:stretch>
@@ -6144,7 +6090,7 @@
                     <pic:cNvPicPr/>
                   </pic:nvPicPr>
                   <pic:blipFill>
-                    <a:blip r:embed="rId41"/>
+                    <a:blip r:embed="rId40"/>
                     <a:stretch>
                       <a:fillRect/>
                     </a:stretch>
@@ -6495,15 +6441,7 @@
                               <w:fldChar w:fldCharType="end"/>
                             </w:r>
                             <w:r>
-                              <w:t xml:space="preserve">. ábra - A </w:t>
-                            </w:r>
-                            <w:proofErr w:type="spellStart"/>
-                            <w:r>
-                              <w:t>users</w:t>
-                            </w:r>
-                            <w:proofErr w:type="spellEnd"/>
-                            <w:r>
-                              <w:t xml:space="preserve"> tábla sémája</w:t>
+                              <w:t>. ábra - A users tábla sémája</w:t>
                             </w:r>
                             <w:bookmarkEnd w:id="15"/>
                           </w:p>
@@ -6574,15 +6512,7 @@
                         <w:fldChar w:fldCharType="end"/>
                       </w:r>
                       <w:r>
-                        <w:t xml:space="preserve">. ábra - A </w:t>
-                      </w:r>
-                      <w:proofErr w:type="spellStart"/>
-                      <w:r>
-                        <w:t>users</w:t>
-                      </w:r>
-                      <w:proofErr w:type="spellEnd"/>
-                      <w:r>
-                        <w:t xml:space="preserve"> tábla sémája</w:t>
+                        <w:t>. ábra - A users tábla sémája</w:t>
                       </w:r>
                       <w:bookmarkEnd w:id="16"/>
                     </w:p>
@@ -6633,7 +6563,7 @@
                     </pic:cNvPicPr>
                   </pic:nvPicPr>
                   <pic:blipFill>
-                    <a:blip r:embed="rId42" cstate="print">
+                    <a:blip r:embed="rId41" cstate="print">
                       <a:extLst>
                         <a:ext uri="{28A0092B-C50C-407E-A947-70E740481C1C}">
                           <a14:useLocalDpi xmlns:a14="http://schemas.microsoft.com/office/drawing/2010/main" val="0"/>
@@ -8042,21 +7972,8 @@
                             <w:r>
                               <w:t xml:space="preserve">. ábra - Kapcsolat a </w:t>
                             </w:r>
-                            <w:proofErr w:type="spellStart"/>
                             <w:r>
-                              <w:t>users</w:t>
-                            </w:r>
-                            <w:proofErr w:type="spellEnd"/>
-                            <w:r>
-                              <w:t xml:space="preserve"> és a </w:t>
-                            </w:r>
-                            <w:proofErr w:type="spellStart"/>
-                            <w:r>
-                              <w:t>quiz</w:t>
-                            </w:r>
-                            <w:proofErr w:type="spellEnd"/>
-                            <w:r>
-                              <w:t xml:space="preserve"> tábla között</w:t>
+                              <w:t>users és a quiz tábla között</w:t>
                             </w:r>
                             <w:bookmarkEnd w:id="17"/>
                           </w:p>
@@ -8124,21 +8041,8 @@
                       <w:r>
                         <w:t xml:space="preserve">. ábra - Kapcsolat a </w:t>
                       </w:r>
-                      <w:proofErr w:type="spellStart"/>
                       <w:r>
-                        <w:t>users</w:t>
-                      </w:r>
-                      <w:proofErr w:type="spellEnd"/>
-                      <w:r>
-                        <w:t xml:space="preserve"> és a </w:t>
-                      </w:r>
-                      <w:proofErr w:type="spellStart"/>
-                      <w:r>
-                        <w:t>quiz</w:t>
-                      </w:r>
-                      <w:proofErr w:type="spellEnd"/>
-                      <w:r>
-                        <w:t xml:space="preserve"> tábla között</w:t>
+                        <w:t>users és a quiz tábla között</w:t>
                       </w:r>
                       <w:bookmarkEnd w:id="18"/>
                     </w:p>
@@ -8181,7 +8085,7 @@
                     </pic:cNvPicPr>
                   </pic:nvPicPr>
                   <pic:blipFill>
-                    <a:blip r:embed="rId43" cstate="print">
+                    <a:blip r:embed="rId42" cstate="print">
                       <a:extLst>
                         <a:ext uri="{28A0092B-C50C-407E-A947-70E740481C1C}">
                           <a14:useLocalDpi xmlns:a14="http://schemas.microsoft.com/office/drawing/2010/main" val="0"/>
@@ -8413,7 +8317,7 @@
                     </pic:cNvPicPr>
                   </pic:nvPicPr>
                   <pic:blipFill>
-                    <a:blip r:embed="rId44" cstate="print">
+                    <a:blip r:embed="rId43" cstate="print">
                       <a:extLst>
                         <a:ext uri="{28A0092B-C50C-407E-A947-70E740481C1C}">
                           <a14:useLocalDpi xmlns:a14="http://schemas.microsoft.com/office/drawing/2010/main" val="0"/>
@@ -8568,7 +8472,7 @@
                     </pic:cNvPicPr>
                   </pic:nvPicPr>
                   <pic:blipFill>
-                    <a:blip r:embed="rId45" cstate="print">
+                    <a:blip r:embed="rId44" cstate="print">
                       <a:extLst>
                         <a:ext uri="{28A0092B-C50C-407E-A947-70E740481C1C}">
                           <a14:useLocalDpi xmlns:a14="http://schemas.microsoft.com/office/drawing/2010/main" val="0"/>
@@ -8688,7 +8592,7 @@
                     </pic:cNvPicPr>
                   </pic:nvPicPr>
                   <pic:blipFill>
-                    <a:blip r:embed="rId46" cstate="print">
+                    <a:blip r:embed="rId45" cstate="print">
                       <a:extLst>
                         <a:ext uri="{28A0092B-C50C-407E-A947-70E740481C1C}">
                           <a14:useLocalDpi xmlns:a14="http://schemas.microsoft.com/office/drawing/2010/main" val="0"/>
@@ -8989,7 +8893,7 @@
                     </pic:cNvPicPr>
                   </pic:nvPicPr>
                   <pic:blipFill>
-                    <a:blip r:embed="rId47" cstate="print">
+                    <a:blip r:embed="rId46" cstate="print">
                       <a:extLst>
                         <a:ext uri="{28A0092B-C50C-407E-A947-70E740481C1C}">
                           <a14:useLocalDpi xmlns:a14="http://schemas.microsoft.com/office/drawing/2010/main" val="0"/>
@@ -9327,7 +9231,7 @@
                     </pic:cNvPicPr>
                   </pic:nvPicPr>
                   <pic:blipFill>
-                    <a:blip r:embed="rId48" cstate="print">
+                    <a:blip r:embed="rId47" cstate="print">
                       <a:extLst>
                         <a:ext uri="{28A0092B-C50C-407E-A947-70E740481C1C}">
                           <a14:useLocalDpi xmlns:a14="http://schemas.microsoft.com/office/drawing/2010/main" val="0"/>
@@ -9413,7 +9317,7 @@
       <w:r>
         <w:t xml:space="preserve">A felhasználói felület kialakításához kerestünk egy számunkra megfelelő komponenscsomagot, mivel fontosnak tartottuk, hogy a felület – még ha csak egy belső, adminisztrációs célokat szolgáló alkalmazásról is van szó – átlátható és esztétikusan rendezett legyen. Így találtunk rá a </w:t>
       </w:r>
-      <w:hyperlink r:id="rId49" w:history="1">
+      <w:hyperlink r:id="rId48" w:history="1">
         <w:r>
           <w:rPr>
             <w:rStyle w:val="Hiperhivatkozs"/>
@@ -9491,7 +9395,7 @@
                     <pic:cNvPicPr/>
                   </pic:nvPicPr>
                   <pic:blipFill>
-                    <a:blip r:embed="rId50"/>
+                    <a:blip r:embed="rId49"/>
                     <a:stretch>
                       <a:fillRect/>
                     </a:stretch>
@@ -9555,7 +9459,7 @@
                     <pic:cNvPicPr/>
                   </pic:nvPicPr>
                   <pic:blipFill>
-                    <a:blip r:embed="rId51"/>
+                    <a:blip r:embed="rId50"/>
                     <a:stretch>
                       <a:fillRect/>
                     </a:stretch>
@@ -9840,7 +9744,7 @@
                           </pic:cNvPicPr>
                         </pic:nvPicPr>
                         <pic:blipFill>
-                          <a:blip r:embed="rId52">
+                          <a:blip r:embed="rId51">
                             <a:extLst>
                               <a:ext uri="{28A0092B-C50C-407E-A947-70E740481C1C}">
                                 <a14:useLocalDpi xmlns:a14="http://schemas.microsoft.com/office/drawing/2010/main" val="0"/>
@@ -10471,7 +10375,7 @@
                     </pic:cNvPicPr>
                   </pic:nvPicPr>
                   <pic:blipFill>
-                    <a:blip r:embed="rId8" cstate="print">
+                    <a:blip r:embed="rId56" cstate="print">
                       <a:extLst>
                         <a:ext uri="{28A0092B-C50C-407E-A947-70E740481C1C}">
                           <a14:useLocalDpi xmlns:a14="http://schemas.microsoft.com/office/drawing/2010/main" val="0"/>
@@ -10549,7 +10453,7 @@
                     </pic:cNvPicPr>
                   </pic:nvPicPr>
                   <pic:blipFill>
-                    <a:blip r:embed="rId56">
+                    <a:blip r:embed="rId57">
                       <a:extLst>
                         <a:ext uri="{28A0092B-C50C-407E-A947-70E740481C1C}">
                           <a14:useLocalDpi xmlns:a14="http://schemas.microsoft.com/office/drawing/2010/main" val="0"/>
@@ -10626,7 +10530,7 @@
                     </pic:cNvPicPr>
                   </pic:nvPicPr>
                   <pic:blipFill>
-                    <a:blip r:embed="rId57">
+                    <a:blip r:embed="rId58">
                       <a:extLst>
                         <a:ext uri="{28A0092B-C50C-407E-A947-70E740481C1C}">
                           <a14:useLocalDpi xmlns:a14="http://schemas.microsoft.com/office/drawing/2010/main" val="0"/>
@@ -10989,7 +10893,7 @@
                           </pic:cNvPicPr>
                         </pic:nvPicPr>
                         <pic:blipFill>
-                          <a:blip r:embed="rId58">
+                          <a:blip r:embed="rId59">
                             <a:extLst>
                               <a:ext uri="{28A0092B-C50C-407E-A947-70E740481C1C}">
                                 <a14:useLocalDpi xmlns:a14="http://schemas.microsoft.com/office/drawing/2010/main" val="0"/>
@@ -11149,7 +11053,7 @@
             <w:pict>
               <v:group w14:anchorId="1681B7C2" id="Csoportba foglalás 12" o:spid="_x0000_s1026" style="position:absolute;margin-left:271.9pt;margin-top:.45pt;width:202.5pt;height:170.1pt;z-index:251675648" coordsize="25717,21602" o:gfxdata="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">
                 <v:shape id="Kép 1" o:spid="_x0000_s1027" type="#_x0000_t75" alt="A képen szöveg, képernyőkép, Betűtípus, multimédia látható&#10;&#10;Előfordulhat, hogy a mesterséges intelligencia által létrehozott tartalom helytelen." style="position:absolute;width:25717;height:21602;visibility:visible;mso-wrap-style:square" o:gfxdata="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">
-                  <v:imagedata r:id="rId59" o:title="A képen szöveg, képernyőkép, Betűtípus, multimédia látható&#10;&#10;Előfordulhat, hogy a mesterséges intelligencia által létrehozott tartalom helytelen"/>
+                  <v:imagedata r:id="rId60" o:title="A képen szöveg, képernyőkép, Betűtípus, multimédia látható&#10;&#10;Előfordulhat, hogy a mesterséges intelligencia által létrehozott tartalom helytelen"/>
                 </v:shape>
                 <v:rect id="Téglalap 11" o:spid="_x0000_s1028" style="position:absolute;left:2762;top:6477;width:13906;height:3143;visibility:visible;mso-wrap-style:square;v-text-anchor:middle" o:gfxdata="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" filled="f" strokecolor="#c00000">
                   <v:stroke joinstyle="round"/>
@@ -11252,7 +11156,7 @@
                     </pic:cNvPicPr>
                   </pic:nvPicPr>
                   <pic:blipFill>
-                    <a:blip r:embed="rId60" cstate="print">
+                    <a:blip r:embed="rId61" cstate="print">
                       <a:extLst>
                         <a:ext uri="{28A0092B-C50C-407E-A947-70E740481C1C}">
                           <a14:useLocalDpi xmlns:a14="http://schemas.microsoft.com/office/drawing/2010/main" val="0"/>
@@ -12041,7 +11945,7 @@
                     <pic:cNvPicPr/>
                   </pic:nvPicPr>
                   <pic:blipFill>
-                    <a:blip r:embed="rId61" cstate="print">
+                    <a:blip r:embed="rId62" cstate="print">
                       <a:extLst>
                         <a:ext uri="{28A0092B-C50C-407E-A947-70E740481C1C}">
                           <a14:useLocalDpi xmlns:a14="http://schemas.microsoft.com/office/drawing/2010/main" val="0"/>
@@ -12244,7 +12148,7 @@
                     <pic:cNvPicPr/>
                   </pic:nvPicPr>
                   <pic:blipFill>
-                    <a:blip r:embed="rId62">
+                    <a:blip r:embed="rId63">
                       <a:extLst>
                         <a:ext uri="{28A0092B-C50C-407E-A947-70E740481C1C}">
                           <a14:useLocalDpi xmlns:a14="http://schemas.microsoft.com/office/drawing/2010/main" val="0"/>
@@ -12511,7 +12415,7 @@
                     <pic:cNvPicPr/>
                   </pic:nvPicPr>
                   <pic:blipFill>
-                    <a:blip r:embed="rId63">
+                    <a:blip r:embed="rId64">
                       <a:extLst>
                         <a:ext uri="{28A0092B-C50C-407E-A947-70E740481C1C}">
                           <a14:useLocalDpi xmlns:a14="http://schemas.microsoft.com/office/drawing/2010/main" val="0"/>
@@ -12707,7 +12611,7 @@
                     <pic:cNvPicPr/>
                   </pic:nvPicPr>
                   <pic:blipFill>
-                    <a:blip r:embed="rId64">
+                    <a:blip r:embed="rId65">
                       <a:extLst>
                         <a:ext uri="{28A0092B-C50C-407E-A947-70E740481C1C}">
                           <a14:useLocalDpi xmlns:a14="http://schemas.microsoft.com/office/drawing/2010/main" val="0"/>
@@ -12957,7 +12861,7 @@
                     <pic:cNvPicPr/>
                   </pic:nvPicPr>
                   <pic:blipFill>
-                    <a:blip r:embed="rId65">
+                    <a:blip r:embed="rId66">
                       <a:extLst>
                         <a:ext uri="{28A0092B-C50C-407E-A947-70E740481C1C}">
                           <a14:useLocalDpi xmlns:a14="http://schemas.microsoft.com/office/drawing/2010/main" val="0"/>
@@ -13243,7 +13147,7 @@
                     <pic:cNvPicPr/>
                   </pic:nvPicPr>
                   <pic:blipFill>
-                    <a:blip r:embed="rId66"/>
+                    <a:blip r:embed="rId67"/>
                     <a:stretch>
                       <a:fillRect/>
                     </a:stretch>
@@ -13501,11 +13405,9 @@
                             <w:r>
                               <w:t xml:space="preserve">. ábra - a négy </w:t>
                             </w:r>
-                            <w:proofErr w:type="spellStart"/>
                             <w:r>
                               <w:t>slide</w:t>
                             </w:r>
-                            <w:proofErr w:type="spellEnd"/>
                             <w:r>
                               <w:t xml:space="preserve"> lehetőség</w:t>
                             </w:r>
@@ -13550,11 +13452,9 @@
                       <w:r>
                         <w:t xml:space="preserve">. ábra - a négy </w:t>
                       </w:r>
-                      <w:proofErr w:type="spellStart"/>
                       <w:r>
                         <w:t>slide</w:t>
                       </w:r>
-                      <w:proofErr w:type="spellEnd"/>
                       <w:r>
                         <w:t xml:space="preserve"> lehetőség</w:t>
                       </w:r>
@@ -13605,7 +13505,7 @@
                     <pic:cNvPicPr/>
                   </pic:nvPicPr>
                   <pic:blipFill>
-                    <a:blip r:embed="rId67">
+                    <a:blip r:embed="rId68">
                       <a:extLst>
                         <a:ext uri="{28A0092B-C50C-407E-A947-70E740481C1C}">
                           <a14:useLocalDpi xmlns:a14="http://schemas.microsoft.com/office/drawing/2010/main" val="0"/>
@@ -14355,7 +14255,7 @@
                     <pic:cNvPicPr/>
                   </pic:nvPicPr>
                   <pic:blipFill>
-                    <a:blip r:embed="rId68">
+                    <a:blip r:embed="rId69">
                       <a:extLst>
                         <a:ext uri="{28A0092B-C50C-407E-A947-70E740481C1C}">
                           <a14:useLocalDpi xmlns:a14="http://schemas.microsoft.com/office/drawing/2010/main" val="0"/>
@@ -14545,7 +14445,7 @@
                     <pic:cNvPicPr/>
                   </pic:nvPicPr>
                   <pic:blipFill>
-                    <a:blip r:embed="rId69">
+                    <a:blip r:embed="rId70">
                       <a:extLst>
                         <a:ext uri="{28A0092B-C50C-407E-A947-70E740481C1C}">
                           <a14:useLocalDpi xmlns:a14="http://schemas.microsoft.com/office/drawing/2010/main" val="0"/>
@@ -14735,7 +14635,7 @@
                     <pic:cNvPicPr/>
                   </pic:nvPicPr>
                   <pic:blipFill>
-                    <a:blip r:embed="rId70">
+                    <a:blip r:embed="rId71">
                       <a:extLst>
                         <a:ext uri="{28A0092B-C50C-407E-A947-70E740481C1C}">
                           <a14:useLocalDpi xmlns:a14="http://schemas.microsoft.com/office/drawing/2010/main" val="0"/>
@@ -15104,7 +15004,7 @@
                     <pic:cNvPicPr/>
                   </pic:nvPicPr>
                   <pic:blipFill>
-                    <a:blip r:embed="rId71">
+                    <a:blip r:embed="rId72">
                       <a:extLst>
                         <a:ext uri="{28A0092B-C50C-407E-A947-70E740481C1C}">
                           <a14:useLocalDpi xmlns:a14="http://schemas.microsoft.com/office/drawing/2010/main" val="0"/>
@@ -15293,7 +15193,7 @@
                     <pic:cNvPicPr/>
                   </pic:nvPicPr>
                   <pic:blipFill>
-                    <a:blip r:embed="rId72">
+                    <a:blip r:embed="rId73">
                       <a:extLst>
                         <a:ext uri="{28A0092B-C50C-407E-A947-70E740481C1C}">
                           <a14:useLocalDpi xmlns:a14="http://schemas.microsoft.com/office/drawing/2010/main" val="0"/>
@@ -15528,7 +15428,7 @@
                     <pic:cNvPicPr/>
                   </pic:nvPicPr>
                   <pic:blipFill>
-                    <a:blip r:embed="rId73">
+                    <a:blip r:embed="rId74">
                       <a:extLst>
                         <a:ext uri="{28A0092B-C50C-407E-A947-70E740481C1C}">
                           <a14:useLocalDpi xmlns:a14="http://schemas.microsoft.com/office/drawing/2010/main" val="0"/>

</xml_diff>